<commit_message>
Add control center monitor and updated documentation
</commit_message>
<xml_diff>
--- a/docs/memoria-final.docx
+++ b/docs/memoria-final.docx
@@ -10,8 +10,8 @@
   <dc:title>Memoria final TFG</dc:title>
   <dc:creator>Luis Angel</dc:creator>
   <cp:lastModifiedBy>Codex</cp:lastModifiedBy>
-  <dcterms:created xsi:type="dcterms:W3CDTF">2026-03-10T20:08:21.215Z</dcterms:created>
-  <dcterms:modified xsi:type="dcterms:W3CDTF">2026-03-10T20:08:21.215Z</dcterms:modified>
+  <dcterms:created xsi:type="dcterms:W3CDTF">2026-03-17T22:08:56.060Z</dcterms:created>
+  <dcterms:modified xsi:type="dcterms:W3CDTF">2026-03-17T22:08:56.060Z</dcterms:modified>
 </cp:coreProperties>
 </file>
 
@@ -47,7 +47,7 @@
         <w:pStyle w:val="List"/>
       </w:pPr>
       <w:r>
-        <w:t xml:space="preserve">- Fecha de revision: 10/03/2026</w:t>
+        <w:t xml:space="preserve">- Fecha de revision: 17/03/2026</w:t>
       </w:r>
     </w:p>
     <w:p>
@@ -71,7 +71,7 @@
         <w:pStyle w:val="Normal"/>
       </w:pPr>
       <w:r>
-        <w:t xml:space="preserve">Titulo: Gestion de Empresas Colaboradoras para FP Dual Autor: Luis Angel Tutora: Elena Fecha: 10/03/2026</w:t>
+        <w:t xml:space="preserve">Titulo: Gestion de Empresas Colaboradoras para FP Dual Autor: Luis Angel Tutora: Elena Fecha: 17/03/2026</w:t>
       </w:r>
     </w:p>
     <w:p>
@@ -175,7 +175,7 @@
         <w:pStyle w:val="Normal"/>
       </w:pPr>
       <w:r>
-        <w:t xml:space="preserve">Este proyecto desarrolla una plataforma web para gestionar empresas colaboradoras, convenios, estudiantes, tutores y solicitudes externas en un entorno de FP Dual. La solucion combina una API en Symfony, un panel interno en React/TypeScript y un portal externo para empresas. El sistema permite CRUD de entidades principales, seguimiento documental, workflow de convenios, mensajeria asociada a solicitudes y control de acceso por roles. La validacion tecnica actual confirma 47 pruebas backend superadas y compilacion correcta de ambos frontends.</w:t>
+        <w:t xml:space="preserve">Este proyecto desarrolla una plataforma web para gestionar empresas colaboradoras, convenios, estudiantes, tutores y solicitudes externas en un entorno de FP Dual. La solucion combina una API en Symfony, un panel interno en React/TypeScript y un portal externo para empresas. El sistema permite CRUD de entidades principales, seguimiento documental, workflow de convenios, mensajeria asociada a solicitudes, exportacion CSV y supervision operativa del despliegue. La validacion tecnica actual confirma 61 pruebas backend superadas, 13 pruebas frontend y compilacion correcta de la build integrada.</w:t>
       </w:r>
     </w:p>
     <w:p>
@@ -199,7 +199,7 @@
         <w:pStyle w:val="Normal"/>
       </w:pPr>
       <w:r>
-        <w:t xml:space="preserve">This project delivers a web platform to manage partner companies, agreements, students, mentors, and external registration requests for dual training. The solution combines a Symfony API, an internal React/TypeScript dashboard, and an external company portal. The system supports CRUD operations for the main entities, document handling, agreement workflow, request messaging, and role-based access control. Current technical validation confirms 47 passing backend tests and successful production builds for both frontends.</w:t>
+        <w:t xml:space="preserve">This project delivers a web platform to manage partner companies, agreements, students, mentors, and external registration requests for dual training. The solution combines a Symfony API, an internal React/TypeScript dashboard, and an external company portal. The system supports CRUD operations for the main entities, document handling, agreement workflow, request messaging, CSV exports, and operational supervision for demo deployment. Current technical validation confirms 61 passing backend tests, 13 frontend tests, and successful integrated production builds.</w:t>
       </w:r>
     </w:p>
     <w:p>
@@ -877,7 +877,7 @@
         <w:pStyle w:val="List"/>
       </w:pPr>
       <w:r>
-        <w:t xml:space="preserve">- El panel principal se organiza en modulos: dashboard, empresas, convenios, estudiantes, asignaciones, tutores, solicitudes y documentacion.</w:t>
+        <w:t xml:space="preserve">- El panel principal se organiza en modulos: dashboard, empresas, convenios, estudiantes, asignaciones, tutores, solicitudes y una guia de documentacion separada del centro privado de control y del monitor operativo.</w:t>
       </w:r>
     </w:p>
     <w:p>
@@ -1090,7 +1090,7 @@
         <w:pStyle w:val="Normal"/>
       </w:pPr>
       <w:r>
-        <w:t xml:space="preserve">- App.tsx actua como shell del panel, dashboard y modulos de detalle. - Formularios modales reutilizables para empresas, convenios, estudiantes y asignaciones. - Cliente API con helpers apiGet, apiPost, apiPut, PATCH y soporte para subida de documentos.</w:t>
+        <w:t xml:space="preserve">- App.tsx actua como shell del panel, dashboard y modulos de detalle. - Formularios modales reutilizables para empresas, convenios, estudiantes y asignaciones. - Cliente API con helpers apiGet, apiPost, apiPut, PATCH, soporte para subida de documentos y descarga de CSV desde endpoints dedicados. - Separacion entre guia funcional (/app/documentacion), centro privado de control (/app/control) y monitor operativo (/app/monitor).</w:t>
       </w:r>
     </w:p>
     <w:p>
@@ -1130,39 +1130,39 @@
         <w:pStyle w:val="Normal"/>
       </w:pPr>
       <w:r>
-        <w:t xml:space="preserve">El panel interno incorpora exportacion CSV como funcionalidad transversal. La utilidad frontend/app/src/utils/csv.ts transforma los datos mostrados en pantalla en un fichero descargable desde el navegador. El flujo aplicado es el siguiente:</w:t>
-      </w:r>
-    </w:p>
-    <w:p>
-      <w:pPr>
-        <w:pStyle w:val="List"/>
-      </w:pPr>
-      <w:r>
-        <w:t xml:space="preserve">1. El usuario visualiza un modulo como dashboard, empresas, convenios o solicitudes.</w:t>
-      </w:r>
-    </w:p>
-    <w:p>
-      <w:pPr>
-        <w:pStyle w:val="List"/>
-      </w:pPr>
-      <w:r>
-        <w:t xml:space="preserve">2. El frontend compone un conjunto de filas normalizadas a partir del estado cargado desde la API.</w:t>
-      </w:r>
-    </w:p>
-    <w:p>
-      <w:pPr>
-        <w:pStyle w:val="List"/>
-      </w:pPr>
-      <w:r>
-        <w:t xml:space="preserve">3. La utilidad CSV escapa campos, genera el contenido con cabeceras y dispara la descarga local.</w:t>
-      </w:r>
-    </w:p>
-    <w:p>
-      <w:pPr>
-        <w:pStyle w:val="List"/>
-      </w:pPr>
-      <w:r>
-        <w:t xml:space="preserve">4. El resultado permite conservar una evidencia operativa fuera de la aplicacion, util para seguimiento o revision academica.</w:t>
+        <w:t xml:space="preserve">El panel interno incorpora exportacion CSV como funcionalidad transversal. En la version actual conviven dos flujos complementarios:</w:t>
+      </w:r>
+    </w:p>
+    <w:p>
+      <w:pPr>
+        <w:pStyle w:val="List"/>
+      </w:pPr>
+      <w:r>
+        <w:t xml:space="preserve">1. El dashboard genera un resumen CSV desde frontend para exportar rapidamente los KPI principales.</w:t>
+      </w:r>
+    </w:p>
+    <w:p>
+      <w:pPr>
+        <w:pStyle w:val="List"/>
+      </w:pPr>
+      <w:r>
+        <w:t xml:space="preserve">2. Los listados operativos de empresas, convenios, estudiantes, asignaciones, tutores y solicitudes consumen endpoints CSV especificos del backend.</w:t>
+      </w:r>
+    </w:p>
+    <w:p>
+      <w:pPr>
+        <w:pStyle w:val="List"/>
+      </w:pPr>
+      <w:r>
+        <w:t xml:space="preserve">3. El frontend invoca esas rutas, descarga el blob y asigna un nombre de fichero coherente para la evidencia.</w:t>
+      </w:r>
+    </w:p>
+    <w:p>
+      <w:pPr>
+        <w:pStyle w:val="List"/>
+      </w:pPr>
+      <w:r>
+        <w:t xml:space="preserve">4. El resultado permite conservar una traza operativa externa a la aplicacion, util para seguimiento, revision academica o defensa del proyecto.</w:t>
       </w:r>
     </w:p>
     <w:p>
@@ -1178,7 +1178,7 @@
         <w:pStyle w:val="List"/>
       </w:pPr>
       <w:r>
-        <w:t xml:space="preserve">- El backend dispone de una suite automatizada con 47 pruebas y 264 aserciones.</w:t>
+        <w:t xml:space="preserve">- El backend dispone de una suite automatizada con 61 pruebas y 344 aserciones.</w:t>
       </w:r>
     </w:p>
     <w:p>
@@ -1194,23 +1194,31 @@
         <w:pStyle w:val="List"/>
       </w:pPr>
       <w:r>
-        <w:t xml:space="preserve">- El 10/03/2026 se verifico ademas el arranque real de los tres servicios locales:</w:t>
-      </w:r>
-    </w:p>
-    <w:p>
-      <w:pPr>
-        <w:pStyle w:val="Normal"/>
-      </w:pPr>
-      <w:r>
-        <w:t xml:space="preserve">- API Symfony en http://127.0.0.1:8000 - Panel interno en http://localhost:5173 - Portal externo en http://localhost:5174</w:t>
-      </w:r>
-    </w:p>
-    <w:p>
-      <w:pPr>
-        <w:pStyle w:val="List"/>
-      </w:pPr>
-      <w:r>
-        <w:t xml:space="preserve">- Ambos frontends generan build de produccion sin errores con npm run build.</w:t>
+        <w:t xml:space="preserve">- El 17/03/2026 se verifico ademas el arranque real de los servicios locales integrados:</w:t>
+      </w:r>
+    </w:p>
+    <w:p>
+      <w:pPr>
+        <w:pStyle w:val="Normal"/>
+      </w:pPr>
+      <w:r>
+        <w:t xml:space="preserve">- API Symfony en http://127.0.0.1:8000 - Panel interno en http://127.0.0.1:8000/app - Portal externo en http://127.0.0.1:8000/externo - Guia de documentacion en http://127.0.0.1:8000/app/documentacion - Centro privado de control en http://127.0.0.1:8000/app/control - Monitor operativo en http://127.0.0.1:8000/app/monitor</w:t>
+      </w:r>
+    </w:p>
+    <w:p>
+      <w:pPr>
+        <w:pStyle w:val="List"/>
+      </w:pPr>
+      <w:r>
+        <w:t xml:space="preserve">- Se valido tambien que la documentacion local sigue accesible aunque el acceso publico temporal se encuentre apagado.</w:t>
+      </w:r>
+    </w:p>
+    <w:p>
+      <w:pPr>
+        <w:pStyle w:val="List"/>
+      </w:pPr>
+      <w:r>
+        <w:t xml:space="preserve">- El frontend genera build de produccion sin errores con npm run build y npm run build:backend.</w:t>
       </w:r>
     </w:p>
     <w:p>
@@ -1250,7 +1258,7 @@
         <w:pStyle w:val="List"/>
       </w:pPr>
       <w:r>
-        <w:t xml:space="preserve">- El backend puede iniciarse con Symfony CLI o servidor PHP local; los dos frontends se ejecutan con Vite en puertos separados.</w:t>
+        <w:t xml:space="preserve">- El backend puede iniciarse con Symfony CLI o servidor PHP local; para la defensa se utiliza una build integrada en modo URL unica bajo /app y /externo.</w:t>
       </w:r>
     </w:p>
     <w:p>
@@ -1266,6 +1274,14 @@
         <w:pStyle w:val="List"/>
       </w:pPr>
       <w:r>
+        <w:t xml:space="preserve">- El acceso externo temporal puede exponerse mediante tunel Cloudflare, gestionado desde el centro privado de control.</w:t>
+      </w:r>
+    </w:p>
+    <w:p>
+      <w:pPr>
+        <w:pStyle w:val="List"/>
+      </w:pPr>
+      <w:r>
         <w:t xml:space="preserve">- Para una entrega productiva se recomienda separar frontends estaticos, API Symfony y almacenamiento documental, ademas de sustituir Basic auth por un mecanismo mas robusto.</w:t>
       </w:r>
     </w:p>
@@ -1274,15 +1290,15 @@
         <w:pStyle w:val="Heading3"/>
       </w:pPr>
       <w:r>
-        <w:t xml:space="preserve">9.9 Resultados y metricas (10/03/2026)</w:t>
-      </w:r>
-    </w:p>
-    <w:p>
-      <w:pPr>
-        <w:pStyle w:val="List"/>
-      </w:pPr>
-      <w:r>
-        <w:t xml:space="preserve">- Tres servicios levantados y accesibles de forma concurrente: backend, panel interno y portal externo.</w:t>
+        <w:t xml:space="preserve">9.9 Resultados y metricas (17/03/2026)</w:t>
+      </w:r>
+    </w:p>
+    <w:p>
+      <w:pPr>
+        <w:pStyle w:val="List"/>
+      </w:pPr>
+      <w:r>
+        <w:t xml:space="preserve">- Servicios locales levantados y accesibles de forma concurrente: backend, panel interno integrado, portal externo, guia de documentacion, centro privado y monitor.</w:t>
       </w:r>
     </w:p>
     <w:p>
@@ -1298,15 +1314,15 @@
         <w:pStyle w:val="List"/>
       </w:pPr>
       <w:r>
-        <w:t xml:space="preserve">- php bin/phpunit finaliza en verde con 47 pruebas y 264 aserciones.</w:t>
-      </w:r>
-    </w:p>
-    <w:p>
-      <w:pPr>
-        <w:pStyle w:val="List"/>
-      </w:pPr>
-      <w:r>
-        <w:t xml:space="preserve">- npm run build se completa correctamente en frontend/app y frontend/company-portal.</w:t>
+        <w:t xml:space="preserve">- php bin/phpunit finaliza en verde con 61 pruebas y 344 aserciones.</w:t>
+      </w:r>
+    </w:p>
+    <w:p>
+      <w:pPr>
+        <w:pStyle w:val="List"/>
+      </w:pPr>
+      <w:r>
+        <w:t xml:space="preserve">- npm test, npm run build y npm run build:backend se completan correctamente en frontend/app.</w:t>
       </w:r>
     </w:p>
     <w:p>
@@ -1322,7 +1338,7 @@
         <w:pStyle w:val="List"/>
       </w:pPr>
       <w:r>
-        <w:t xml:space="preserve">- El flujo funcional mas relevante queda cubierto: solicitud externa, confirmacion por token, aprobacion interna, consulta de detalle, workflow de convenios persistido y gestion documental basica.</w:t>
+        <w:t xml:space="preserve">- El flujo funcional mas relevante queda cubierto: solicitud externa, confirmacion por token, aprobacion interna, consulta de detalle, workflow de convenios persistido, gestion documental basica y supervision de acceso publico.</w:t>
       </w:r>
     </w:p>
     <w:p>
@@ -1402,7 +1418,7 @@
         <w:pStyle w:val="Heading3"/>
       </w:pPr>
       <w:r>
-        <w:t xml:space="preserve">9.11 Verificacion tecnica (10/03/2026)</w:t>
+        <w:t xml:space="preserve">9.11 Verificacion tecnica (17/03/2026)</w:t>
       </w:r>
     </w:p>
     <w:p>
@@ -1418,7 +1434,7 @@
         <w:pStyle w:val="Normal"/>
       </w:pPr>
       <w:r>
-        <w:t xml:space="preserve">- php bin/phpunit -&gt; OK, 47 tests, 264 assertions. - symfony server:start --no-tls -d --port=8000 -&gt; servicio operativo.</w:t>
+        <w:t xml:space="preserve">- php bin/phpunit -&gt; OK, 61 tests, 344 assertions. - symfony server:start --no-tls -d --port=8000 -&gt; servicio operativo.</w:t>
       </w:r>
     </w:p>
     <w:p>
@@ -1434,7 +1450,7 @@
         <w:pStyle w:val="Normal"/>
       </w:pPr>
       <w:r>
-        <w:t xml:space="preserve">- npm run dev -- --host --port 5173 --strictPort -&gt; servicio operativo. - npm run build -&gt; compilacion correcta.</w:t>
+        <w:t xml:space="preserve">- npm test -&gt; validacion de utilidades y endpoints de control. - npm run build -&gt; compilacion correcta. - npm run build:backend -&gt; build integrada publicada en backend/public/app.</w:t>
       </w:r>
     </w:p>
     <w:p>
@@ -1450,7 +1466,7 @@
         <w:pStyle w:val="Normal"/>
       </w:pPr>
       <w:r>
-        <w:t xml:space="preserve">- npm run dev -- --host --port 5174 --strictPort -&gt; servicio operativo. - npm run build -&gt; compilacion correcta.</w:t>
+        <w:t xml:space="preserve">- GET /externo en la URL integrada -&gt; 200 OK.</w:t>
       </w:r>
     </w:p>
     <w:p>
@@ -1466,7 +1482,7 @@
         <w:pStyle w:val="Normal"/>
       </w:pPr>
       <w:r>
-        <w:t xml:space="preserve">- GET /api/empresas con admin/admin123 -&gt; 200 OK. - GET / en 5173 y 5174 -&gt; 200 OK.</w:t>
+        <w:t xml:space="preserve">- GET /api/empresas con admin/admin123 -&gt; 200 OK. - GET /app, /app/documentacion, /app/control y /app/monitor -&gt; 200 OK. - GET /api/monitor y GET /api/public-access -&gt; 200 OK.</w:t>
       </w:r>
     </w:p>
     <w:p>
@@ -3502,6 +3518,22 @@
     </w:p>
     <w:p>
       <w:pPr>
+        <w:pStyle w:val="List"/>
+      </w:pPr>
+      <w:r>
+        <w:t xml:space="preserve">11. Guia de documentacion con recorrido funcional.</w:t>
+      </w:r>
+    </w:p>
+    <w:p>
+      <w:pPr>
+        <w:pStyle w:val="List"/>
+      </w:pPr>
+      <w:r>
+        <w:t xml:space="preserve">12. Centro privado de control o monitor operativo, solo como apoyo tecnico.</w:t>
+      </w:r>
+    </w:p>
+    <w:p>
+      <w:pPr>
         <w:pStyle w:val="Heading2"/>
       </w:pPr>
       <w:r>
@@ -3638,6 +3670,22 @@
     </w:p>
     <w:p>
       <w:pPr>
+        <w:pStyle w:val="List"/>
+      </w:pPr>
+      <w:r>
+        <w:t xml:space="preserve">- 11-documentacion-guia.png</w:t>
+      </w:r>
+    </w:p>
+    <w:p>
+      <w:pPr>
+        <w:pStyle w:val="List"/>
+      </w:pPr>
+      <w:r>
+        <w:t xml:space="preserve">- 12-control-monitor.png</w:t>
+      </w:r>
+    </w:p>
+    <w:p>
+      <w:pPr>
         <w:pStyle w:val="Heading2"/>
       </w:pPr>
       <w:r>
@@ -3665,7 +3713,95 @@
         <w:pStyle w:val="Heading2"/>
       </w:pPr>
       <w:r>
-        <w:t xml:space="preserve">5. Comprobacion antes de incrustar en la memoria</w:t>
+        <w:t xml:space="preserve">5. Indice actual y objetivo de capturas</w:t>
+      </w:r>
+    </w:p>
+    <w:p>
+      <w:pPr>
+        <w:pStyle w:val="List"/>
+      </w:pPr>
+      <w:r>
+        <w:t xml:space="preserve">- 01-bloques-funcionalidad.png: vista general de bloques funcionales.</w:t>
+      </w:r>
+    </w:p>
+    <w:p>
+      <w:pPr>
+        <w:pStyle w:val="List"/>
+      </w:pPr>
+      <w:r>
+        <w:t xml:space="preserve">- 02-esquema-relacional.png: esquema relacional de entidades y tablas.</w:t>
+      </w:r>
+    </w:p>
+    <w:p>
+      <w:pPr>
+        <w:pStyle w:val="List"/>
+      </w:pPr>
+      <w:r>
+        <w:t xml:space="preserve">- 03-panel-interno-dashboard.png: dashboard del panel interno.</w:t>
+      </w:r>
+    </w:p>
+    <w:p>
+      <w:pPr>
+        <w:pStyle w:val="List"/>
+      </w:pPr>
+      <w:r>
+        <w:t xml:space="preserve">- 04-panel-interno-solicitudes.png: modulo de solicitudes del panel interno.</w:t>
+      </w:r>
+    </w:p>
+    <w:p>
+      <w:pPr>
+        <w:pStyle w:val="List"/>
+      </w:pPr>
+      <w:r>
+        <w:t xml:space="preserve">- 05-portal-externo.png: portada operativa del portal externo.</w:t>
+      </w:r>
+    </w:p>
+    <w:p>
+      <w:pPr>
+        <w:pStyle w:val="List"/>
+      </w:pPr>
+      <w:r>
+        <w:t xml:space="preserve">- 06-documentacion-guia.png: guia funcional de la plataforma. Pendiente de refresco visual final.</w:t>
+      </w:r>
+    </w:p>
+    <w:p>
+      <w:pPr>
+        <w:pStyle w:val="List"/>
+      </w:pPr>
+      <w:r>
+        <w:t xml:space="preserve">- 07-centro-control.png: panel privado para acceso publico y soporte de demo. Pendiente de refresco visual final.</w:t>
+      </w:r>
+    </w:p>
+    <w:p>
+      <w:pPr>
+        <w:pStyle w:val="List"/>
+      </w:pPr>
+      <w:r>
+        <w:t xml:space="preserve">- 08-monitor-operativo.png: supervision operativa, tests y logs. Pendiente de refresco visual final.</w:t>
+      </w:r>
+    </w:p>
+    <w:p>
+      <w:pPr>
+        <w:pStyle w:val="List"/>
+      </w:pPr>
+      <w:r>
+        <w:t xml:space="preserve">- 03-panel-interno-dashboard.html: copia HTML de apoyo para la captura 03.</w:t>
+      </w:r>
+    </w:p>
+    <w:p>
+      <w:pPr>
+        <w:pStyle w:val="List"/>
+      </w:pPr>
+      <w:r>
+        <w:t xml:space="preserve">- 04-panel-interno-solicitudes.html: copia HTML de apoyo para la captura 04.</w:t>
+      </w:r>
+    </w:p>
+    <w:p>
+      <w:pPr>
+        <w:pStyle w:val="Heading2"/>
+      </w:pPr>
+      <w:r>
+        <w:t xml:space="preserve">6. Comprobacion antes de incrustar en la memoria</w:t>
       </w:r>
     </w:p>
     <w:p>
@@ -3706,6 +3842,14 @@
       </w:pPr>
       <w:r>
         <w:t xml:space="preserve">- capturar tambien una exportacion CSV descargada como prueba funcional.</w:t>
+      </w:r>
+    </w:p>
+    <w:p>
+      <w:pPr>
+        <w:pStyle w:val="List"/>
+      </w:pPr>
+      <w:r>
+        <w:t xml:space="preserve">- comprobar que la guia publica y el centro privado son paginas distintas antes de capturar.</w:t>
       </w:r>
     </w:p>
     <w:p>

</xml_diff>

<commit_message>
Finalize portals monitoring and delivery polish
</commit_message>
<xml_diff>
--- a/docs/memoria-final.docx
+++ b/docs/memoria-final.docx
@@ -10,8 +10,8 @@
   <dc:title>Memoria final TFG</dc:title>
   <dc:creator>Luis Angel</dc:creator>
   <cp:lastModifiedBy>Codex</cp:lastModifiedBy>
-  <dcterms:created xsi:type="dcterms:W3CDTF">2026-03-23T20:13:30.365Z</dcterms:created>
-  <dcterms:modified xsi:type="dcterms:W3CDTF">2026-03-23T20:13:30.365Z</dcterms:modified>
+  <dcterms:created xsi:type="dcterms:W3CDTF">2026-03-24T21:44:43.013Z</dcterms:created>
+  <dcterms:modified xsi:type="dcterms:W3CDTF">2026-03-24T21:44:43.013Z</dcterms:modified>
 </cp:coreProperties>
 </file>
 
@@ -60,7 +60,7 @@
         <w:jc w:val="center"/>
       </w:pPr>
       <w:r>
-        <w:t xml:space="preserve">Fecha de revision: 23/03/2026</w:t>
+        <w:t xml:space="preserve">Fecha de revision: 24/03/2026</w:t>
       </w:r>
     </w:p>
     <w:p>
@@ -534,6 +534,20 @@
           <w:rPr>
             <w:rStyle w:val="Hyperlink"/>
           </w:rPr>
+          <w:t xml:space="preserve">Rendimiento operativo</w:t>
+        </w:r>
+      </w:hyperlink>
+    </w:p>
+    <w:p>
+      <w:pPr>
+        <w:pStyle w:val="TocEntry"/>
+        <w:ind w:left="360"/>
+      </w:pPr>
+      <w:hyperlink w:anchor="bk_memoria_final_34" w:history="1">
+        <w:r>
+          <w:rPr>
+            <w:rStyle w:val="Hyperlink"/>
+          </w:rPr>
           <w:t xml:space="preserve">Limitaciones de prueba</w:t>
         </w:r>
       </w:hyperlink>
@@ -542,7 +556,7 @@
       <w:pPr>
         <w:pStyle w:val="TocEntry"/>
       </w:pPr>
-      <w:hyperlink w:anchor="bk_memoria_final_34" w:history="1">
+      <w:hyperlink w:anchor="bk_memoria_final_35" w:history="1">
         <w:r>
           <w:rPr>
             <w:rStyle w:val="Hyperlink"/>
@@ -556,7 +570,7 @@
         <w:pStyle w:val="TocEntry"/>
         <w:ind w:left="360"/>
       </w:pPr>
-      <w:hyperlink w:anchor="bk_memoria_final_35" w:history="1">
+      <w:hyperlink w:anchor="bk_memoria_final_36" w:history="1">
         <w:r>
           <w:rPr>
             <w:rStyle w:val="Hyperlink"/>
@@ -570,7 +584,7 @@
         <w:pStyle w:val="TocEntry"/>
         <w:ind w:left="360"/>
       </w:pPr>
-      <w:hyperlink w:anchor="bk_memoria_final_36" w:history="1">
+      <w:hyperlink w:anchor="bk_memoria_final_37" w:history="1">
         <w:r>
           <w:rPr>
             <w:rStyle w:val="Hyperlink"/>
@@ -584,7 +598,7 @@
         <w:pStyle w:val="TocEntry"/>
         <w:ind w:left="360"/>
       </w:pPr>
-      <w:hyperlink w:anchor="bk_memoria_final_37" w:history="1">
+      <w:hyperlink w:anchor="bk_memoria_final_38" w:history="1">
         <w:r>
           <w:rPr>
             <w:rStyle w:val="Hyperlink"/>
@@ -597,7 +611,7 @@
       <w:pPr>
         <w:pStyle w:val="TocEntry"/>
       </w:pPr>
-      <w:hyperlink w:anchor="bk_memoria_final_38" w:history="1">
+      <w:hyperlink w:anchor="bk_memoria_final_39" w:history="1">
         <w:r>
           <w:rPr>
             <w:rStyle w:val="Hyperlink"/>
@@ -610,7 +624,7 @@
       <w:pPr>
         <w:pStyle w:val="TocEntry"/>
       </w:pPr>
-      <w:hyperlink w:anchor="bk_memoria_final_39" w:history="1">
+      <w:hyperlink w:anchor="bk_memoria_final_40" w:history="1">
         <w:r>
           <w:rPr>
             <w:rStyle w:val="Hyperlink"/>
@@ -623,7 +637,7 @@
       <w:pPr>
         <w:pStyle w:val="TocEntry"/>
       </w:pPr>
-      <w:hyperlink w:anchor="bk_memoria_final_40" w:history="1">
+      <w:hyperlink w:anchor="bk_memoria_final_41" w:history="1">
         <w:r>
           <w:rPr>
             <w:rStyle w:val="Hyperlink"/>
@@ -637,7 +651,7 @@
         <w:pStyle w:val="TocEntry"/>
         <w:ind w:left="360"/>
       </w:pPr>
-      <w:hyperlink w:anchor="bk_memoria_final_41" w:history="1">
+      <w:hyperlink w:anchor="bk_memoria_final_42" w:history="1">
         <w:r>
           <w:rPr>
             <w:rStyle w:val="Hyperlink"/>
@@ -651,7 +665,7 @@
         <w:pStyle w:val="TocEntry"/>
         <w:ind w:left="360"/>
       </w:pPr>
-      <w:hyperlink w:anchor="bk_memoria_final_42" w:history="1">
+      <w:hyperlink w:anchor="bk_memoria_final_43" w:history="1">
         <w:r>
           <w:rPr>
             <w:rStyle w:val="Hyperlink"/>
@@ -665,7 +679,7 @@
         <w:pStyle w:val="TocEntry"/>
         <w:ind w:left="360"/>
       </w:pPr>
-      <w:hyperlink w:anchor="bk_memoria_final_43" w:history="1">
+      <w:hyperlink w:anchor="bk_memoria_final_44" w:history="1">
         <w:r>
           <w:rPr>
             <w:rStyle w:val="Hyperlink"/>
@@ -679,7 +693,7 @@
         <w:pStyle w:val="TocEntry"/>
         <w:ind w:left="360"/>
       </w:pPr>
-      <w:hyperlink w:anchor="bk_memoria_final_44" w:history="1">
+      <w:hyperlink w:anchor="bk_memoria_final_45" w:history="1">
         <w:r>
           <w:rPr>
             <w:rStyle w:val="Hyperlink"/>
@@ -1384,7 +1398,7 @@
         <w:pStyle w:val="Normal"/>
       </w:pPr>
       <w:r>
-        <w:t xml:space="preserve">Este proyecto desarrolla una plataforma web para gestionar empresas colaboradoras, convenios, estudiantes, tutores y solicitudes externas en un entorno de FP Dual. La solucion se compone de una API en Symfony, un portal interno en React y TypeScript y un portal externo orientado a empresas interesadas en colaborar con el centro. La aplicacion centraliza el ciclo operativo completo: alta de empresas, revision de solicitudes, gestion de convenios, asignacion de estudiantes, supervision documental y exportacion CSV de datos operativos. La entrega final prioriza una arquitectura mantenible, separacion clara de responsabilidades y un entorno de uso demostrable con build integrada bajo una unica URL local.</w:t>
+        <w:t xml:space="preserve">Este proyecto desarrolla una plataforma web para gestionar empresas colaboradoras, convenios, estudiantes, tutores y solicitudes externas en un entorno de FP Dual. La solucion se compone de una API en Symfony, un portal interno en React y TypeScript, un portal externo orientado a empresas interesadas en colaborar con el centro y dos espacios complementarios separados: documentacion y monitor privado. La aplicacion centraliza el ciclo operativo completo: alta de empresas, verificacion por correo, seguimiento de solicitudes, gestion de convenios, asignacion de estudiantes, supervision documental y exportacion CSV de datos operativos. La entrega final prioriza una arquitectura mantenible, separacion clara de responsabilidades y un entorno de uso demostrable con build integrada bajo una unica URL local.</w:t>
       </w:r>
     </w:p>
     <w:p>
@@ -1410,7 +1424,7 @@
         <w:pStyle w:val="Normal"/>
       </w:pPr>
       <w:r>
-        <w:t xml:space="preserve">This project delivers a web platform to manage partner companies, agreements, students, mentors, and external registration requests for dual training. The solution combines a Symfony API, an internal React and TypeScript portal, and an external company portal. The platform centralizes the full operational workflow: company registration, request review, agreement management, student assignment, document supervision, and CSV export of operational records. The final delivery prioritizes maintainable architecture, clear separation of responsibilities, and a demonstrable integrated build under a single local URL.</w:t>
+        <w:t xml:space="preserve">This project delivers a web platform to manage partner companies, agreements, students, mentors, and external registration requests for dual training. The solution combines a Symfony API, an internal React and TypeScript portal, an external company portal, and two separated support spaces for documentation and private monitoring. The platform centralizes the full operational workflow: company registration, email verification, request tracking, agreement management, student assignment, document supervision, and CSV export of operational records. The final delivery prioritizes maintainable architecture, clear separation of responsibilities, and a demonstrable integrated build under a single local URL.</w:t>
       </w:r>
     </w:p>
     <w:p>
@@ -1548,7 +1562,7 @@
         <w:pStyle w:val="Normal"/>
       </w:pPr>
       <w:r>
-        <w:t xml:space="preserve">Dentro del alcance actual se incluyen el portal interno, el portal externo, la API REST, la persistencia relacional, la autenticacion del panel, la gestion de solicitudes externas, la mensajeria asociada, el control documental y la exportacion CSV de listados operativos. Quedan fuera de alcance, en esta entrega, la firma electronica avanzada, las integraciones con sistemas corporativos, un portal postaprobacion para empresas consolidadas, el almacenamiento documental en nube y una bateria E2E completa de navegador.</w:t>
+        <w:t xml:space="preserve">Dentro del alcance actual se incluyen el portal interno, el portal externo, la API REST, la persistencia relacional, la autenticacion del panel, la gestion de solicitudes externas, la verificacion por correo, el seguimiento de estado, la mensajeria asociada, el control documental, la exportacion CSV y un monitor privado separado para operacion tecnica. Quedan fuera de alcance, en esta entrega, la firma electronica avanzada, las integraciones con sistemas corporativos, un area postaprobacion completa para empresas consolidadas con cuentas persistentes, el almacenamiento documental en nube y una bateria E2E completa de navegador.</w:t>
       </w:r>
     </w:p>
     <w:p>
@@ -1762,15 +1776,15 @@
         <w:pStyle w:val="Normal"/>
       </w:pPr>
       <w:r>
-        <w:t xml:space="preserve">La solucion se estructura en tres piezas principales. La primera es una API REST construida con Symfony, responsable de la seguridad, la logica de negocio, la persistencia y la exposicion de endpoints. La segunda es un portal interno desarrollado con React, TypeScript y Vite, orientado a coordinacion academica y gestion operativa. La tercera es un portal externo, tambien basado en React y TypeScript, que permite registrar nuevas empresas, verificar el correo de contacto y mantener una mensajeria asociada a la solicitud.</w:t>
-      </w:r>
-    </w:p>
-    <w:p>
-      <w:pPr>
-        <w:pStyle w:val="Normal"/>
-      </w:pPr>
-      <w:r>
-        <w:t xml:space="preserve">El backend publica rutas protegidas bajo /api y rutas publicas para el registro externo y el acceso por token. En la entrega integrada, el panel interno se sirve bajo /app, la documentacion bajo /documentacion, el monitor privado bajo /monitor y el portal externo bajo /externo.</w:t>
+        <w:t xml:space="preserve">La solucion se estructura en cuatro bloques principales. La primera es una API REST construida con Symfony, responsable de la seguridad, la logica de negocio, la persistencia y la exposicion de endpoints. La segunda es un portal interno desarrollado con React, TypeScript y Vite, orientado a coordinacion academica y gestion operativa. La tercera es un portal externo, tambien basado en React y TypeScript, que permite registrar nuevas empresas, verificar el correo de contacto, consultar el estado de la solicitud y mantener una mensajeria asociada. La cuarta se divide en dos shells complementarias: una pagina documental para memoria y anexos, y un monitor privado para supervision tecnica.</w:t>
+      </w:r>
+    </w:p>
+    <w:p>
+      <w:pPr>
+        <w:pStyle w:val="Normal"/>
+      </w:pPr>
+      <w:r>
+        <w:t xml:space="preserve">El backend publica rutas protegidas bajo /api y rutas publicas para el registro externo, la confirmacion por correo y el acceso por token al portal de solicitud. En la entrega integrada, el panel interno se sirve bajo /app, la documentacion bajo /documentacion, el monitor privado bajo /monitor y el portal externo bajo /externo.</w:t>
       </w:r>
     </w:p>
     <w:p>
@@ -1940,7 +1954,7 @@
         <w:pStyle w:val="Normal"/>
       </w:pPr>
       <w:r>
-        <w:t xml:space="preserve">El portal interno se estructura por modulos: dashboard, empresas, convenios, estudiantes, asignaciones, tutores, solicitudes, documentacion y monitor privado. La interfaz combina tablas, tarjetas de resumen, vistas de detalle, formularios modales y exportaciones CSV desde varios puntos del sistema. El portal externo simplifica la experiencia para centrarla en el alta de empresa, la verificacion y la mensajeria. La documentacion y el monitor se separan del flujo principal para no mezclar uso funcional con supervision tecnica.</w:t>
+        <w:t xml:space="preserve">El portal interno se estructura por modulos: dashboard, empresas, convenios, estudiantes, asignaciones, tutores, solicitudes, documentacion y monitor privado. La interfaz combina tablas, tarjetas de resumen, vistas de detalle, formularios modales y exportaciones CSV desde varios puntos del sistema. El portal externo se organiza en varias rutas coordinadas: registro, correo, estado de solicitud, verificacion, mensajeria y recursos. La documentacion y el monitor se separan del flujo principal para no mezclar uso funcional con supervision tecnica, y el monitor privado se ordena en secciones de sistemas, acceso, logs, errores y calidad documental.</w:t>
       </w:r>
     </w:p>
     <w:p>
@@ -2249,7 +2263,7 @@
         <w:pStyle w:val="Normal"/>
       </w:pPr>
       <w:r>
-        <w:t xml:space="preserve">El portal externo ofrece una entrada clara para empresas interesadas en colaborar. Incluye formulario de alta, bandeja de verificacion, confirmacion por enlace y una mensajeria ligada a la solicitud. Su diseno es deliberadamente mas simple que el portal interno para reducir friccion en el primer contacto con la plataforma.</w:t>
+        <w:t xml:space="preserve">El portal externo ofrece una entrada clara para empresas interesadas en colaborar. Incluye formulario de alta, pagina de correo, confirmacion por enlace, seguimiento del estado de la solicitud, mensajeria ligada al token del portal y una pagina de recursos de apoyo. El flujo queda conectado de extremo a extremo con la API: registro publico, emision del correo de verificacion, consulta del estado por token y conversacion asociada con el centro. Su diseno es deliberadamente mas simple que el portal interno para reducir friccion en el primer contacto con la plataforma sin perder trazabilidad.</w:t>
       </w:r>
     </w:p>
     <w:p>
@@ -2359,7 +2373,7 @@
         <w:pStyle w:val="Normal"/>
       </w:pPr>
       <w:r>
-        <w:t xml:space="preserve">La validacion del proyecto combina compilacion de frontends, pruebas automatizadas disponibles, comprobaciones HTTP sobre las rutas integradas y revisiones funcionales de navegacion, documentacion y exportacion CSV. El backend dispone de pruebas orientadas a autenticacion y controladores clave, mientras que el frontend incorpora pruebas de utilidades y servicios.</w:t>
+        <w:t xml:space="preserve">La validacion del proyecto combina compilacion de frontends, pruebas automatizadas disponibles, comprobaciones HTTP sobre las rutas integradas y revisiones funcionales de navegacion, documentacion, monitorizacion y exportacion CSV. El backend dispone de pruebas orientadas a autenticacion y controladores clave, mientras que el frontend incorpora pruebas de utilidades y servicios.</w:t>
       </w:r>
     </w:p>
     <w:p>
@@ -2377,7 +2391,7 @@
         <w:pStyle w:val="Normal"/>
       </w:pPr>
       <w:r>
-        <w:t xml:space="preserve">La build integrada de los dos frontends se genera correctamente y se publica en las rutas del backend. El panel interno y el portal externo quedan accesibles desde la URL local integrada, y la documentacion se mantiene separada del monitor privado. La exportacion CSV puede mostrarse como ejemplo funcional completo durante la defensa.</w:t>
+        <w:t xml:space="preserve">La build integrada de los dos frontends se genera correctamente y se publica en las rutas del backend. El panel interno, el portal externo, la documentacion y el monitor privado quedan accesibles desde la URL local integrada. La exportacion CSV puede mostrarse como ejemplo funcional completo durante la defensa, y el arranque del panel interno mejora mediante un snapshot cacheado de bootstrap con invalidacion tras cambios de empresas, estudiantes, convenios y asignaciones.</w:t>
       </w:r>
     </w:p>
     <w:p>
@@ -2386,9 +2400,27 @@
       </w:pPr>
       <w:bookmarkStart w:id="40" w:name="bk_memoria_final_33"/>
       <w:r>
+        <w:t xml:space="preserve">Rendimiento operativo</w:t>
+      </w:r>
+      <w:bookmarkEnd w:id="40"/>
+    </w:p>
+    <w:p>
+      <w:pPr>
+        <w:pStyle w:val="Normal"/>
+      </w:pPr>
+      <w:r>
+        <w:t xml:space="preserve">Durante la fase final se ha optimizado el endpoint /api/bootstrap, que era el principal cuello de botella percibido al cargar el portal interno. La solucion aplicada cachea un snapshot del panel y lo invalida cuando cambian las entidades que alimentan dashboard y listados principales. En mediciones locales, el tiempo de respuesta en frio se redujo desde varios segundos hasta un entorno cercano al segundo largo, mientras que la carga HTML de /app se mantiene claramente por debajo del segundo en caliente. Esta mejora no sustituye a una estrategia completa de cache y perfilado en produccion real, pero si deja la navegacion de defensa en un estado considerablemente mas fluido.</w:t>
+      </w:r>
+    </w:p>
+    <w:p>
+      <w:pPr>
+        <w:pStyle w:val="Heading2"/>
+      </w:pPr>
+      <w:bookmarkStart w:id="41" w:name="bk_memoria_final_34"/>
+      <w:r>
         <w:t xml:space="preserve">Limitaciones de prueba</w:t>
       </w:r>
-      <w:bookmarkEnd w:id="40"/>
+      <w:bookmarkEnd w:id="41"/>
     </w:p>
     <w:p>
       <w:pPr>
@@ -2402,39 +2434,39 @@
       <w:pPr>
         <w:pStyle w:val="Heading1"/>
       </w:pPr>
-      <w:bookmarkStart w:id="41" w:name="bk_memoria_final_34"/>
+      <w:bookmarkStart w:id="42" w:name="bk_memoria_final_35"/>
       <w:r>
         <w:t xml:space="preserve">Resultados, limitaciones y lineas futuras</w:t>
       </w:r>
-      <w:bookmarkEnd w:id="41"/>
-    </w:p>
-    <w:p>
-      <w:pPr>
-        <w:pStyle w:val="Heading2"/>
-      </w:pPr>
-      <w:bookmarkStart w:id="42" w:name="bk_memoria_final_35"/>
+      <w:bookmarkEnd w:id="42"/>
+    </w:p>
+    <w:p>
+      <w:pPr>
+        <w:pStyle w:val="Heading2"/>
+      </w:pPr>
+      <w:bookmarkStart w:id="43" w:name="bk_memoria_final_36"/>
       <w:r>
         <w:t xml:space="preserve">Resultados principales</w:t>
       </w:r>
-      <w:bookmarkEnd w:id="42"/>
-    </w:p>
-    <w:p>
-      <w:pPr>
-        <w:pStyle w:val="Normal"/>
-      </w:pPr>
-      <w:r>
-        <w:t xml:space="preserve">El proyecto cumple el objetivo principal de centralizar la gestion de empresas colaboradoras y practicas en una sola plataforma, diferenciando correctamente el espacio interno, el espacio externo, la documentacion y la supervision tecnica. Ademas, deja preparado un flujo demostrable y comprensible para la tutora: solicitud externa, revision interna, gestion de entidades y exportacion de datos.</w:t>
-      </w:r>
-    </w:p>
-    <w:p>
-      <w:pPr>
-        <w:pStyle w:val="Heading2"/>
-      </w:pPr>
-      <w:bookmarkStart w:id="43" w:name="bk_memoria_final_36"/>
+      <w:bookmarkEnd w:id="43"/>
+    </w:p>
+    <w:p>
+      <w:pPr>
+        <w:pStyle w:val="Normal"/>
+      </w:pPr>
+      <w:r>
+        <w:t xml:space="preserve">El proyecto cumple el objetivo principal de centralizar la gestion de empresas colaboradoras y practicas en una sola plataforma, diferenciando correctamente el espacio interno, el espacio externo, la documentacion y la supervision tecnica. Ademas, deja preparado un flujo demostrable y comprensible para la tutora: registro externo, verificacion por correo, seguimiento de solicitud, revision interna, gestion de entidades y exportacion de datos.</w:t>
+      </w:r>
+    </w:p>
+    <w:p>
+      <w:pPr>
+        <w:pStyle w:val="Heading2"/>
+      </w:pPr>
+      <w:bookmarkStart w:id="44" w:name="bk_memoria_final_37"/>
       <w:r>
         <w:t xml:space="preserve">Limitaciones actuales</w:t>
       </w:r>
-      <w:bookmarkEnd w:id="43"/>
+      <w:bookmarkEnd w:id="44"/>
     </w:p>
     <w:p>
       <w:pPr>
@@ -2472,11 +2504,11 @@
       <w:pPr>
         <w:pStyle w:val="Heading2"/>
       </w:pPr>
-      <w:bookmarkStart w:id="44" w:name="bk_memoria_final_37"/>
+      <w:bookmarkStart w:id="45" w:name="bk_memoria_final_38"/>
       <w:r>
         <w:t xml:space="preserve">Mejoras futuras</w:t>
       </w:r>
-      <w:bookmarkEnd w:id="44"/>
+      <w:bookmarkEnd w:id="45"/>
     </w:p>
     <w:p>
       <w:pPr>
@@ -2490,11 +2522,11 @@
       <w:pPr>
         <w:pStyle w:val="Heading1"/>
       </w:pPr>
-      <w:bookmarkStart w:id="45" w:name="bk_memoria_final_38"/>
+      <w:bookmarkStart w:id="46" w:name="bk_memoria_final_39"/>
       <w:r>
         <w:t xml:space="preserve">Conclusiones</w:t>
       </w:r>
-      <w:bookmarkEnd w:id="45"/>
+      <w:bookmarkEnd w:id="46"/>
     </w:p>
     <w:p>
       <w:pPr>
@@ -2508,11 +2540,11 @@
       <w:pPr>
         <w:pStyle w:val="Heading1"/>
       </w:pPr>
-      <w:bookmarkStart w:id="46" w:name="bk_memoria_final_39"/>
+      <w:bookmarkStart w:id="47" w:name="bk_memoria_final_40"/>
       <w:r>
         <w:t xml:space="preserve">Referencias</w:t>
       </w:r>
-      <w:bookmarkEnd w:id="46"/>
+      <w:bookmarkEnd w:id="47"/>
     </w:p>
     <w:p>
       <w:pPr>
@@ -2566,21 +2598,21 @@
       <w:pPr>
         <w:pStyle w:val="Heading1"/>
       </w:pPr>
-      <w:bookmarkStart w:id="47" w:name="bk_memoria_final_40"/>
+      <w:bookmarkStart w:id="48" w:name="bk_memoria_final_41"/>
       <w:r>
         <w:t xml:space="preserve">Anexos</w:t>
       </w:r>
-      <w:bookmarkEnd w:id="47"/>
-    </w:p>
-    <w:p>
-      <w:pPr>
-        <w:pStyle w:val="Heading2"/>
-      </w:pPr>
-      <w:bookmarkStart w:id="48" w:name="bk_memoria_final_41"/>
+      <w:bookmarkEnd w:id="48"/>
+    </w:p>
+    <w:p>
+      <w:pPr>
+        <w:pStyle w:val="Heading2"/>
+      </w:pPr>
+      <w:bookmarkStart w:id="49" w:name="bk_memoria_final_42"/>
       <w:r>
         <w:t xml:space="preserve">Anexo A. Manual de usuario</w:t>
       </w:r>
-      <w:bookmarkEnd w:id="48"/>
+      <w:bookmarkEnd w:id="49"/>
     </w:p>
     <w:p>
       <w:pPr>
@@ -2594,11 +2626,11 @@
       <w:pPr>
         <w:pStyle w:val="Heading2"/>
       </w:pPr>
-      <w:bookmarkStart w:id="49" w:name="bk_memoria_final_42"/>
+      <w:bookmarkStart w:id="50" w:name="bk_memoria_final_43"/>
       <w:r>
         <w:t xml:space="preserve">Anexo B. Manual tecnico</w:t>
       </w:r>
-      <w:bookmarkEnd w:id="49"/>
+      <w:bookmarkEnd w:id="50"/>
     </w:p>
     <w:p>
       <w:pPr>
@@ -2612,11 +2644,11 @@
       <w:pPr>
         <w:pStyle w:val="Heading2"/>
       </w:pPr>
-      <w:bookmarkStart w:id="50" w:name="bk_memoria_final_43"/>
+      <w:bookmarkStart w:id="51" w:name="bk_memoria_final_44"/>
       <w:r>
         <w:t xml:space="preserve">Anexo C. Capturas y evidencias</w:t>
       </w:r>
-      <w:bookmarkEnd w:id="50"/>
+      <w:bookmarkEnd w:id="51"/>
     </w:p>
     <w:p>
       <w:pPr>
@@ -2630,11 +2662,11 @@
       <w:pPr>
         <w:pStyle w:val="Heading2"/>
       </w:pPr>
-      <w:bookmarkStart w:id="51" w:name="bk_memoria_final_44"/>
+      <w:bookmarkStart w:id="52" w:name="bk_memoria_final_45"/>
       <w:r>
         <w:t xml:space="preserve">Anexo D. Codigo relevante y artefactos de apoyo</w:t>
       </w:r>
-      <w:bookmarkEnd w:id="51"/>
+      <w:bookmarkEnd w:id="52"/>
     </w:p>
     <w:p>
       <w:pPr>
@@ -2677,21 +2709,21 @@
       <w:pPr>
         <w:pStyle w:val="Heading1"/>
       </w:pPr>
-      <w:bookmarkStart w:id="52" w:name="bk_anexo_a_manual_usu_1"/>
+      <w:bookmarkStart w:id="53" w:name="bk_anexo_a_manual_usu_1"/>
       <w:r>
         <w:t xml:space="preserve">Anexo A. Manual de Usuario</w:t>
       </w:r>
-      <w:bookmarkEnd w:id="52"/>
-    </w:p>
-    <w:p>
-      <w:pPr>
-        <w:pStyle w:val="Heading2"/>
-      </w:pPr>
-      <w:bookmarkStart w:id="53" w:name="bk_anexo_a_manual_usu_2"/>
+      <w:bookmarkEnd w:id="53"/>
+    </w:p>
+    <w:p>
+      <w:pPr>
+        <w:pStyle w:val="Heading2"/>
+      </w:pPr>
+      <w:bookmarkStart w:id="54" w:name="bk_anexo_a_manual_usu_2"/>
       <w:r>
         <w:t xml:space="preserve">1. Objetivo</w:t>
       </w:r>
-      <w:bookmarkEnd w:id="53"/>
+      <w:bookmarkEnd w:id="54"/>
     </w:p>
     <w:p>
       <w:pPr>
@@ -2705,11 +2737,11 @@
       <w:pPr>
         <w:pStyle w:val="Heading2"/>
       </w:pPr>
-      <w:bookmarkStart w:id="54" w:name="bk_anexo_a_manual_usu_3"/>
+      <w:bookmarkStart w:id="55" w:name="bk_anexo_a_manual_usu_3"/>
       <w:r>
         <w:t xml:space="preserve">2. Perfiles de uso</w:t>
       </w:r>
-      <w:bookmarkEnd w:id="54"/>
+      <w:bookmarkEnd w:id="55"/>
     </w:p>
     <w:p>
       <w:pPr>
@@ -2739,21 +2771,21 @@
       <w:pPr>
         <w:pStyle w:val="Heading2"/>
       </w:pPr>
-      <w:bookmarkStart w:id="55" w:name="bk_anexo_a_manual_usu_4"/>
+      <w:bookmarkStart w:id="56" w:name="bk_anexo_a_manual_usu_4"/>
       <w:r>
         <w:t xml:space="preserve">3. Acceso al sistema</w:t>
       </w:r>
-      <w:bookmarkEnd w:id="55"/>
+      <w:bookmarkEnd w:id="56"/>
     </w:p>
     <w:p>
       <w:pPr>
         <w:pStyle w:val="Heading3"/>
       </w:pPr>
-      <w:bookmarkStart w:id="56" w:name="bk_anexo_a_manual_usu_5"/>
+      <w:bookmarkStart w:id="57" w:name="bk_anexo_a_manual_usu_5"/>
       <w:r>
         <w:t xml:space="preserve">3.1 Panel interno</w:t>
       </w:r>
-      <w:bookmarkEnd w:id="56"/>
+      <w:bookmarkEnd w:id="57"/>
     </w:p>
     <w:p>
       <w:pPr>
@@ -2783,11 +2815,11 @@
       <w:pPr>
         <w:pStyle w:val="Heading3"/>
       </w:pPr>
-      <w:bookmarkStart w:id="57" w:name="bk_anexo_a_manual_usu_6"/>
+      <w:bookmarkStart w:id="58" w:name="bk_anexo_a_manual_usu_6"/>
       <w:r>
         <w:t xml:space="preserve">3.2 Portal externo</w:t>
       </w:r>
-      <w:bookmarkEnd w:id="57"/>
+      <w:bookmarkEnd w:id="58"/>
     </w:p>
     <w:p>
       <w:pPr>
@@ -2809,11 +2841,11 @@
       <w:pPr>
         <w:pStyle w:val="Heading2"/>
       </w:pPr>
-      <w:bookmarkStart w:id="58" w:name="bk_anexo_a_manual_usu_7"/>
+      <w:bookmarkStart w:id="59" w:name="bk_anexo_a_manual_usu_7"/>
       <w:r>
         <w:t xml:space="preserve">4. Navegacion principal del panel interno</w:t>
       </w:r>
-      <w:bookmarkEnd w:id="58"/>
+      <w:bookmarkEnd w:id="59"/>
     </w:p>
     <w:p>
       <w:pPr>
@@ -2891,11 +2923,11 @@
       <w:pPr>
         <w:pStyle w:val="Heading2"/>
       </w:pPr>
-      <w:bookmarkStart w:id="59" w:name="bk_anexo_a_manual_usu_8"/>
+      <w:bookmarkStart w:id="60" w:name="bk_anexo_a_manual_usu_8"/>
       <w:r>
         <w:t xml:space="preserve">5. Dashboard</w:t>
       </w:r>
-      <w:bookmarkEnd w:id="59"/>
+      <w:bookmarkEnd w:id="60"/>
     </w:p>
     <w:p>
       <w:pPr>
@@ -2941,11 +2973,11 @@
       <w:pPr>
         <w:pStyle w:val="Heading2"/>
       </w:pPr>
-      <w:bookmarkStart w:id="60" w:name="bk_anexo_a_manual_usu_9"/>
+      <w:bookmarkStart w:id="61" w:name="bk_anexo_a_manual_usu_9"/>
       <w:r>
         <w:t xml:space="preserve">6. Gestion de empresas</w:t>
       </w:r>
-      <w:bookmarkEnd w:id="60"/>
+      <w:bookmarkEnd w:id="61"/>
     </w:p>
     <w:p>
       <w:pPr>
@@ -3023,11 +3055,11 @@
       <w:pPr>
         <w:pStyle w:val="Heading2"/>
       </w:pPr>
-      <w:bookmarkStart w:id="61" w:name="bk_anexo_a_manual_usu_10"/>
+      <w:bookmarkStart w:id="62" w:name="bk_anexo_a_manual_usu_10"/>
       <w:r>
         <w:t xml:space="preserve">7. Gestion de convenios</w:t>
       </w:r>
-      <w:bookmarkEnd w:id="61"/>
+      <w:bookmarkEnd w:id="62"/>
     </w:p>
     <w:p>
       <w:pPr>
@@ -3089,11 +3121,11 @@
       <w:pPr>
         <w:pStyle w:val="Heading2"/>
       </w:pPr>
-      <w:bookmarkStart w:id="62" w:name="bk_anexo_a_manual_usu_11"/>
+      <w:bookmarkStart w:id="63" w:name="bk_anexo_a_manual_usu_11"/>
       <w:r>
         <w:t xml:space="preserve">8. Gestion de estudiantes</w:t>
       </w:r>
-      <w:bookmarkEnd w:id="62"/>
+      <w:bookmarkEnd w:id="63"/>
     </w:p>
     <w:p>
       <w:pPr>
@@ -3147,11 +3179,11 @@
       <w:pPr>
         <w:pStyle w:val="Heading2"/>
       </w:pPr>
-      <w:bookmarkStart w:id="63" w:name="bk_anexo_a_manual_usu_12"/>
+      <w:bookmarkStart w:id="64" w:name="bk_anexo_a_manual_usu_12"/>
       <w:r>
         <w:t xml:space="preserve">9. Gestion de asignaciones</w:t>
       </w:r>
-      <w:bookmarkEnd w:id="63"/>
+      <w:bookmarkEnd w:id="64"/>
     </w:p>
     <w:p>
       <w:pPr>
@@ -3213,11 +3245,11 @@
       <w:pPr>
         <w:pStyle w:val="Heading2"/>
       </w:pPr>
-      <w:bookmarkStart w:id="64" w:name="bk_anexo_a_manual_usu_13"/>
+      <w:bookmarkStart w:id="65" w:name="bk_anexo_a_manual_usu_13"/>
       <w:r>
         <w:t xml:space="preserve">10. Gestion de tutores</w:t>
       </w:r>
-      <w:bookmarkEnd w:id="64"/>
+      <w:bookmarkEnd w:id="65"/>
     </w:p>
     <w:p>
       <w:pPr>
@@ -3263,11 +3295,11 @@
       <w:pPr>
         <w:pStyle w:val="Heading2"/>
       </w:pPr>
-      <w:bookmarkStart w:id="65" w:name="bk_anexo_a_manual_usu_14"/>
+      <w:bookmarkStart w:id="66" w:name="bk_anexo_a_manual_usu_14"/>
       <w:r>
         <w:t xml:space="preserve">11. Solicitudes de empresa</w:t>
       </w:r>
-      <w:bookmarkEnd w:id="65"/>
+      <w:bookmarkEnd w:id="66"/>
     </w:p>
     <w:p>
       <w:pPr>
@@ -3321,11 +3353,11 @@
       <w:pPr>
         <w:pStyle w:val="Heading2"/>
       </w:pPr>
-      <w:bookmarkStart w:id="66" w:name="bk_anexo_a_manual_usu_15"/>
+      <w:bookmarkStart w:id="67" w:name="bk_anexo_a_manual_usu_15"/>
       <w:r>
         <w:t xml:space="preserve">12. Portal externo</w:t>
       </w:r>
-      <w:bookmarkEnd w:id="66"/>
+      <w:bookmarkEnd w:id="67"/>
     </w:p>
     <w:p>
       <w:pPr>
@@ -3371,11 +3403,11 @@
       <w:pPr>
         <w:pStyle w:val="Heading2"/>
       </w:pPr>
-      <w:bookmarkStart w:id="67" w:name="bk_anexo_a_manual_usu_16"/>
+      <w:bookmarkStart w:id="68" w:name="bk_anexo_a_manual_usu_16"/>
       <w:r>
         <w:t xml:space="preserve">13. Errores y validaciones comunes</w:t>
       </w:r>
-      <w:bookmarkEnd w:id="67"/>
+      <w:bookmarkEnd w:id="68"/>
     </w:p>
     <w:p>
       <w:pPr>
@@ -3405,11 +3437,11 @@
       <w:pPr>
         <w:pStyle w:val="Heading2"/>
       </w:pPr>
-      <w:bookmarkStart w:id="68" w:name="bk_anexo_a_manual_usu_17"/>
+      <w:bookmarkStart w:id="69" w:name="bk_anexo_a_manual_usu_17"/>
       <w:r>
         <w:t xml:space="preserve">14. Recomendaciones de uso</w:t>
       </w:r>
-      <w:bookmarkEnd w:id="68"/>
+      <w:bookmarkEnd w:id="69"/>
     </w:p>
     <w:p>
       <w:pPr>
@@ -3444,21 +3476,21 @@
       <w:pPr>
         <w:pStyle w:val="Heading1"/>
       </w:pPr>
-      <w:bookmarkStart w:id="69" w:name="bk_anexo_b_manual_tec_1"/>
+      <w:bookmarkStart w:id="70" w:name="bk_anexo_b_manual_tec_1"/>
       <w:r>
         <w:t xml:space="preserve">Anexo B. Manual Tecnico</w:t>
       </w:r>
-      <w:bookmarkEnd w:id="69"/>
-    </w:p>
-    <w:p>
-      <w:pPr>
-        <w:pStyle w:val="Heading2"/>
-      </w:pPr>
-      <w:bookmarkStart w:id="70" w:name="bk_anexo_b_manual_tec_2"/>
+      <w:bookmarkEnd w:id="70"/>
+    </w:p>
+    <w:p>
+      <w:pPr>
+        <w:pStyle w:val="Heading2"/>
+      </w:pPr>
+      <w:bookmarkStart w:id="71" w:name="bk_anexo_b_manual_tec_2"/>
       <w:r>
         <w:t xml:space="preserve">1. Arquitectura general</w:t>
       </w:r>
-      <w:bookmarkEnd w:id="70"/>
+      <w:bookmarkEnd w:id="71"/>
     </w:p>
     <w:p>
       <w:pPr>
@@ -3496,11 +3528,11 @@
       <w:pPr>
         <w:pStyle w:val="Heading2"/>
       </w:pPr>
-      <w:bookmarkStart w:id="71" w:name="bk_anexo_b_manual_tec_3"/>
+      <w:bookmarkStart w:id="72" w:name="bk_anexo_b_manual_tec_3"/>
       <w:r>
         <w:t xml:space="preserve">2. Requisitos locales</w:t>
       </w:r>
-      <w:bookmarkEnd w:id="71"/>
+      <w:bookmarkEnd w:id="72"/>
     </w:p>
     <w:p>
       <w:pPr>
@@ -3554,11 +3586,11 @@
       <w:pPr>
         <w:pStyle w:val="Heading2"/>
       </w:pPr>
-      <w:bookmarkStart w:id="72" w:name="bk_anexo_b_manual_tec_4"/>
+      <w:bookmarkStart w:id="73" w:name="bk_anexo_b_manual_tec_4"/>
       <w:r>
         <w:t xml:space="preserve">3. Arranque del entorno</w:t>
       </w:r>
-      <w:bookmarkEnd w:id="72"/>
+      <w:bookmarkEnd w:id="73"/>
     </w:p>
     <w:p>
       <w:pPr>
@@ -3572,11 +3604,11 @@
       <w:pPr>
         <w:pStyle w:val="Heading3"/>
       </w:pPr>
-      <w:bookmarkStart w:id="73" w:name="bk_anexo_b_manual_tec_5"/>
+      <w:bookmarkStart w:id="74" w:name="bk_anexo_b_manual_tec_5"/>
       <w:r>
         <w:t xml:space="preserve">3.1 Backend</w:t>
       </w:r>
-      <w:bookmarkEnd w:id="73"/>
+      <w:bookmarkEnd w:id="74"/>
     </w:p>
     <w:p>
       <w:pPr>
@@ -3630,11 +3662,11 @@
       <w:pPr>
         <w:pStyle w:val="Heading3"/>
       </w:pPr>
-      <w:bookmarkStart w:id="74" w:name="bk_anexo_b_manual_tec_6"/>
+      <w:bookmarkStart w:id="75" w:name="bk_anexo_b_manual_tec_6"/>
       <w:r>
         <w:t xml:space="preserve">3.2 Frontend interno</w:t>
       </w:r>
-      <w:bookmarkEnd w:id="74"/>
+      <w:bookmarkEnd w:id="75"/>
     </w:p>
     <w:p>
       <w:pPr>
@@ -3672,11 +3704,11 @@
       <w:pPr>
         <w:pStyle w:val="Heading3"/>
       </w:pPr>
-      <w:bookmarkStart w:id="75" w:name="bk_anexo_b_manual_tec_7"/>
+      <w:bookmarkStart w:id="76" w:name="bk_anexo_b_manual_tec_7"/>
       <w:r>
         <w:t xml:space="preserve">3.3 Portal externo</w:t>
       </w:r>
-      <w:bookmarkEnd w:id="75"/>
+      <w:bookmarkEnd w:id="76"/>
     </w:p>
     <w:p>
       <w:pPr>
@@ -3714,21 +3746,21 @@
       <w:pPr>
         <w:pStyle w:val="Heading2"/>
       </w:pPr>
-      <w:bookmarkStart w:id="76" w:name="bk_anexo_b_manual_tec_8"/>
+      <w:bookmarkStart w:id="77" w:name="bk_anexo_b_manual_tec_8"/>
       <w:r>
         <w:t xml:space="preserve">4. Variables de entorno relevantes</w:t>
       </w:r>
-      <w:bookmarkEnd w:id="76"/>
+      <w:bookmarkEnd w:id="77"/>
     </w:p>
     <w:p>
       <w:pPr>
         <w:pStyle w:val="Heading3"/>
       </w:pPr>
-      <w:bookmarkStart w:id="77" w:name="bk_anexo_b_manual_tec_9"/>
+      <w:bookmarkStart w:id="78" w:name="bk_anexo_b_manual_tec_9"/>
       <w:r>
         <w:t xml:space="preserve">4.1 Backend</w:t>
       </w:r>
-      <w:bookmarkEnd w:id="77"/>
+      <w:bookmarkEnd w:id="78"/>
     </w:p>
     <w:p>
       <w:pPr>
@@ -3774,11 +3806,11 @@
       <w:pPr>
         <w:pStyle w:val="Heading3"/>
       </w:pPr>
-      <w:bookmarkStart w:id="78" w:name="bk_anexo_b_manual_tec_10"/>
+      <w:bookmarkStart w:id="79" w:name="bk_anexo_b_manual_tec_10"/>
       <w:r>
         <w:t xml:space="preserve">4.2 Frontend interno</w:t>
       </w:r>
-      <w:bookmarkEnd w:id="78"/>
+      <w:bookmarkEnd w:id="79"/>
     </w:p>
     <w:p>
       <w:pPr>
@@ -3832,11 +3864,11 @@
       <w:pPr>
         <w:pStyle w:val="Heading3"/>
       </w:pPr>
-      <w:bookmarkStart w:id="79" w:name="bk_anexo_b_manual_tec_11"/>
+      <w:bookmarkStart w:id="80" w:name="bk_anexo_b_manual_tec_11"/>
       <w:r>
         <w:t xml:space="preserve">4.3 Portal externo</w:t>
       </w:r>
-      <w:bookmarkEnd w:id="79"/>
+      <w:bookmarkEnd w:id="80"/>
     </w:p>
     <w:p>
       <w:pPr>
@@ -3874,11 +3906,11 @@
       <w:pPr>
         <w:pStyle w:val="Heading2"/>
       </w:pPr>
-      <w:bookmarkStart w:id="80" w:name="bk_anexo_b_manual_tec_12"/>
+      <w:bookmarkStart w:id="81" w:name="bk_anexo_b_manual_tec_12"/>
       <w:r>
         <w:t xml:space="preserve">5. Seguridad</w:t>
       </w:r>
-      <w:bookmarkEnd w:id="80"/>
+      <w:bookmarkEnd w:id="81"/>
     </w:p>
     <w:p>
       <w:pPr>
@@ -3940,11 +3972,11 @@
       <w:pPr>
         <w:pStyle w:val="Heading2"/>
       </w:pPr>
-      <w:bookmarkStart w:id="81" w:name="bk_anexo_b_manual_tec_13"/>
+      <w:bookmarkStart w:id="82" w:name="bk_anexo_b_manual_tec_13"/>
       <w:r>
         <w:t xml:space="preserve">6. Versiones de React</w:t>
       </w:r>
-      <w:bookmarkEnd w:id="81"/>
+      <w:bookmarkEnd w:id="82"/>
     </w:p>
     <w:p>
       <w:pPr>
@@ -3974,11 +4006,11 @@
       <w:pPr>
         <w:pStyle w:val="Heading2"/>
       </w:pPr>
-      <w:bookmarkStart w:id="82" w:name="bk_anexo_b_manual_tec_14"/>
+      <w:bookmarkStart w:id="83" w:name="bk_anexo_b_manual_tec_14"/>
       <w:r>
         <w:t xml:space="preserve">7. Persistencia</w:t>
       </w:r>
-      <w:bookmarkEnd w:id="82"/>
+      <w:bookmarkEnd w:id="83"/>
     </w:p>
     <w:p>
       <w:pPr>
@@ -4016,11 +4048,11 @@
       <w:pPr>
         <w:pStyle w:val="Heading2"/>
       </w:pPr>
-      <w:bookmarkStart w:id="83" w:name="bk_anexo_b_manual_tec_15"/>
+      <w:bookmarkStart w:id="84" w:name="bk_anexo_b_manual_tec_15"/>
       <w:r>
         <w:t xml:space="preserve">8. Estructura funcional del backend</w:t>
       </w:r>
-      <w:bookmarkEnd w:id="83"/>
+      <w:bookmarkEnd w:id="84"/>
     </w:p>
     <w:p>
       <w:pPr>
@@ -4114,11 +4146,11 @@
       <w:pPr>
         <w:pStyle w:val="Heading2"/>
       </w:pPr>
-      <w:bookmarkStart w:id="84" w:name="bk_anexo_b_manual_tec_16"/>
+      <w:bookmarkStart w:id="85" w:name="bk_anexo_b_manual_tec_16"/>
       <w:r>
         <w:t xml:space="preserve">9. Estructura funcional del frontend interno</w:t>
       </w:r>
-      <w:bookmarkEnd w:id="84"/>
+      <w:bookmarkEnd w:id="85"/>
     </w:p>
     <w:p>
       <w:pPr>
@@ -4196,11 +4228,11 @@
       <w:pPr>
         <w:pStyle w:val="Heading2"/>
       </w:pPr>
-      <w:bookmarkStart w:id="85" w:name="bk_anexo_b_manual_tec_17"/>
+      <w:bookmarkStart w:id="86" w:name="bk_anexo_b_manual_tec_17"/>
       <w:r>
         <w:t xml:space="preserve">10. Exportacion CSV</w:t>
       </w:r>
-      <w:bookmarkEnd w:id="85"/>
+      <w:bookmarkEnd w:id="86"/>
     </w:p>
     <w:p>
       <w:pPr>
@@ -4286,11 +4318,11 @@
       <w:pPr>
         <w:pStyle w:val="Heading2"/>
       </w:pPr>
-      <w:bookmarkStart w:id="86" w:name="bk_anexo_b_manual_tec_18"/>
+      <w:bookmarkStart w:id="87" w:name="bk_anexo_b_manual_tec_18"/>
       <w:r>
         <w:t xml:space="preserve">11. Validacion tecnica</w:t>
       </w:r>
-      <w:bookmarkEnd w:id="86"/>
+      <w:bookmarkEnd w:id="87"/>
     </w:p>
     <w:p>
       <w:pPr>
@@ -4352,11 +4384,11 @@
       <w:pPr>
         <w:pStyle w:val="Heading2"/>
       </w:pPr>
-      <w:bookmarkStart w:id="87" w:name="bk_anexo_b_manual_tec_19"/>
+      <w:bookmarkStart w:id="88" w:name="bk_anexo_b_manual_tec_19"/>
       <w:r>
         <w:t xml:space="preserve">12. Riesgos tecnicos abiertos</w:t>
       </w:r>
-      <w:bookmarkEnd w:id="87"/>
+      <w:bookmarkEnd w:id="88"/>
     </w:p>
     <w:p>
       <w:pPr>
@@ -4399,21 +4431,21 @@
       <w:pPr>
         <w:pStyle w:val="Heading1"/>
       </w:pPr>
-      <w:bookmarkStart w:id="88" w:name="bk_anexo_c_capturas_y_1"/>
+      <w:bookmarkStart w:id="89" w:name="bk_anexo_c_capturas_y_1"/>
       <w:r>
         <w:t xml:space="preserve">Anexo C. Capturas y evidencias</w:t>
       </w:r>
-      <w:bookmarkEnd w:id="88"/>
-    </w:p>
-    <w:p>
-      <w:pPr>
-        <w:pStyle w:val="Heading2"/>
-      </w:pPr>
-      <w:bookmarkStart w:id="89" w:name="bk_anexo_c_capturas_y_2"/>
+      <w:bookmarkEnd w:id="89"/>
+    </w:p>
+    <w:p>
+      <w:pPr>
+        <w:pStyle w:val="Heading2"/>
+      </w:pPr>
+      <w:bookmarkStart w:id="90" w:name="bk_anexo_c_capturas_y_2"/>
       <w:r>
         <w:t xml:space="preserve">Indice de capturas</w:t>
       </w:r>
-      <w:bookmarkEnd w:id="89"/>
+      <w:bookmarkEnd w:id="90"/>
     </w:p>
     <w:p>
       <w:pPr>
@@ -4475,11 +4507,11 @@
       <w:pPr>
         <w:pStyle w:val="Heading2"/>
       </w:pPr>
-      <w:bookmarkStart w:id="90" w:name="bk_anexo_c_capturas_y_3"/>
+      <w:bookmarkStart w:id="91" w:name="bk_anexo_c_capturas_y_3"/>
       <w:r>
         <w:t xml:space="preserve">Inventario de archivos incluidos</w:t>
       </w:r>
-      <w:bookmarkEnd w:id="90"/>
+      <w:bookmarkEnd w:id="91"/>
     </w:p>
     <w:p>
       <w:pPr>
@@ -4541,11 +4573,11 @@
       <w:pPr>
         <w:pStyle w:val="Heading2"/>
       </w:pPr>
-      <w:bookmarkStart w:id="91" w:name="bk_anexo_c_capturas_y_4"/>
+      <w:bookmarkStart w:id="92" w:name="bk_anexo_c_capturas_y_4"/>
       <w:r>
         <w:t xml:space="preserve">Evidencias tecnicas asociadas</w:t>
       </w:r>
-      <w:bookmarkEnd w:id="91"/>
+      <w:bookmarkEnd w:id="92"/>
     </w:p>
     <w:p>
       <w:pPr>
@@ -4599,11 +4631,11 @@
       <w:pPr>
         <w:pStyle w:val="Heading2"/>
       </w:pPr>
-      <w:bookmarkStart w:id="92" w:name="bk_anexo_c_capturas_y_5"/>
+      <w:bookmarkStart w:id="93" w:name="bk_anexo_c_capturas_y_5"/>
       <w:r>
         <w:t xml:space="preserve">Criterios de captura final</w:t>
       </w:r>
-      <w:bookmarkEnd w:id="92"/>
+      <w:bookmarkEnd w:id="93"/>
     </w:p>
     <w:p>
       <w:pPr>
@@ -4662,31 +4694,31 @@
       <w:pPr>
         <w:pStyle w:val="Heading1"/>
       </w:pPr>
-      <w:bookmarkStart w:id="93" w:name="bk_anexo_d_codigo_rel_1"/>
+      <w:bookmarkStart w:id="94" w:name="bk_anexo_d_codigo_rel_1"/>
       <w:r>
         <w:t xml:space="preserve">Anexo D. Codigo Relevante</w:t>
       </w:r>
-      <w:bookmarkEnd w:id="93"/>
-    </w:p>
-    <w:p>
-      <w:pPr>
-        <w:pStyle w:val="Heading2"/>
-      </w:pPr>
-      <w:bookmarkStart w:id="94" w:name="bk_anexo_d_codigo_rel_2"/>
+      <w:bookmarkEnd w:id="94"/>
+    </w:p>
+    <w:p>
+      <w:pPr>
+        <w:pStyle w:val="Heading2"/>
+      </w:pPr>
+      <w:bookmarkStart w:id="95" w:name="bk_anexo_d_codigo_rel_2"/>
       <w:r>
         <w:t xml:space="preserve">1. Backend</w:t>
       </w:r>
-      <w:bookmarkEnd w:id="94"/>
+      <w:bookmarkEnd w:id="95"/>
     </w:p>
     <w:p>
       <w:pPr>
         <w:pStyle w:val="Heading3"/>
       </w:pPr>
-      <w:bookmarkStart w:id="95" w:name="bk_anexo_d_codigo_rel_3"/>
+      <w:bookmarkStart w:id="96" w:name="bk_anexo_d_codigo_rel_3"/>
       <w:r>
         <w:t xml:space="preserve">Seguridad y autenticacion</w:t>
       </w:r>
-      <w:bookmarkEnd w:id="95"/>
+      <w:bookmarkEnd w:id="96"/>
     </w:p>
     <w:p>
       <w:pPr>
@@ -4716,11 +4748,11 @@
       <w:pPr>
         <w:pStyle w:val="Heading3"/>
       </w:pPr>
-      <w:bookmarkStart w:id="96" w:name="bk_anexo_d_codigo_rel_4"/>
+      <w:bookmarkStart w:id="97" w:name="bk_anexo_d_codigo_rel_4"/>
       <w:r>
         <w:t xml:space="preserve">Dominio y persistencia</w:t>
       </w:r>
-      <w:bookmarkEnd w:id="96"/>
+      <w:bookmarkEnd w:id="97"/>
     </w:p>
     <w:p>
       <w:pPr>
@@ -4782,11 +4814,11 @@
       <w:pPr>
         <w:pStyle w:val="Heading3"/>
       </w:pPr>
-      <w:bookmarkStart w:id="97" w:name="bk_anexo_d_codigo_rel_5"/>
+      <w:bookmarkStart w:id="98" w:name="bk_anexo_d_codigo_rel_5"/>
       <w:r>
         <w:t xml:space="preserve">Casos de uso principales</w:t>
       </w:r>
-      <w:bookmarkEnd w:id="97"/>
+      <w:bookmarkEnd w:id="98"/>
     </w:p>
     <w:p>
       <w:pPr>
@@ -4840,21 +4872,21 @@
       <w:pPr>
         <w:pStyle w:val="Heading2"/>
       </w:pPr>
-      <w:bookmarkStart w:id="98" w:name="bk_anexo_d_codigo_rel_6"/>
+      <w:bookmarkStart w:id="99" w:name="bk_anexo_d_codigo_rel_6"/>
       <w:r>
         <w:t xml:space="preserve">2. Frontend interno</w:t>
       </w:r>
-      <w:bookmarkEnd w:id="98"/>
+      <w:bookmarkEnd w:id="99"/>
     </w:p>
     <w:p>
       <w:pPr>
         <w:pStyle w:val="Heading3"/>
       </w:pPr>
-      <w:bookmarkStart w:id="99" w:name="bk_anexo_d_codigo_rel_7"/>
+      <w:bookmarkStart w:id="100" w:name="bk_anexo_d_codigo_rel_7"/>
       <w:r>
         <w:t xml:space="preserve">Shell principal y modulos</w:t>
       </w:r>
-      <w:bookmarkEnd w:id="99"/>
+      <w:bookmarkEnd w:id="100"/>
     </w:p>
     <w:p>
       <w:pPr>
@@ -4868,11 +4900,11 @@
       <w:pPr>
         <w:pStyle w:val="Heading3"/>
       </w:pPr>
-      <w:bookmarkStart w:id="100" w:name="bk_anexo_d_codigo_rel_8"/>
+      <w:bookmarkStart w:id="101" w:name="bk_anexo_d_codigo_rel_8"/>
       <w:r>
         <w:t xml:space="preserve">Formularios reutilizables</w:t>
       </w:r>
-      <w:bookmarkEnd w:id="100"/>
+      <w:bookmarkEnd w:id="101"/>
     </w:p>
     <w:p>
       <w:pPr>
@@ -4910,11 +4942,11 @@
       <w:pPr>
         <w:pStyle w:val="Heading3"/>
       </w:pPr>
-      <w:bookmarkStart w:id="101" w:name="bk_anexo_d_codigo_rel_9"/>
+      <w:bookmarkStart w:id="102" w:name="bk_anexo_d_codigo_rel_9"/>
       <w:r>
         <w:t xml:space="preserve">Infraestructura de UI</w:t>
       </w:r>
-      <w:bookmarkEnd w:id="101"/>
+      <w:bookmarkEnd w:id="102"/>
     </w:p>
     <w:p>
       <w:pPr>
@@ -4944,11 +4976,11 @@
       <w:pPr>
         <w:pStyle w:val="Heading3"/>
       </w:pPr>
-      <w:bookmarkStart w:id="102" w:name="bk_anexo_d_codigo_rel_10"/>
+      <w:bookmarkStart w:id="103" w:name="bk_anexo_d_codigo_rel_10"/>
       <w:r>
         <w:t xml:space="preserve">Cliente API y exportacion</w:t>
       </w:r>
-      <w:bookmarkEnd w:id="102"/>
+      <w:bookmarkEnd w:id="103"/>
     </w:p>
     <w:p>
       <w:pPr>
@@ -4970,11 +5002,11 @@
       <w:pPr>
         <w:pStyle w:val="Heading2"/>
       </w:pPr>
-      <w:bookmarkStart w:id="103" w:name="bk_anexo_d_codigo_rel_11"/>
+      <w:bookmarkStart w:id="104" w:name="bk_anexo_d_codigo_rel_11"/>
       <w:r>
         <w:t xml:space="preserve">3. Frontend externo</w:t>
       </w:r>
-      <w:bookmarkEnd w:id="103"/>
+      <w:bookmarkEnd w:id="104"/>
     </w:p>
     <w:p>
       <w:pPr>
@@ -4988,11 +5020,11 @@
       <w:pPr>
         <w:pStyle w:val="Heading2"/>
       </w:pPr>
-      <w:bookmarkStart w:id="104" w:name="bk_anexo_d_codigo_rel_12"/>
+      <w:bookmarkStart w:id="105" w:name="bk_anexo_d_codigo_rel_12"/>
       <w:r>
         <w:t xml:space="preserve">4. Suite de pruebas destacada</w:t>
       </w:r>
-      <w:bookmarkEnd w:id="104"/>
+      <w:bookmarkEnd w:id="105"/>
     </w:p>
     <w:p>
       <w:pPr>
@@ -5046,11 +5078,11 @@
       <w:pPr>
         <w:pStyle w:val="Heading2"/>
       </w:pPr>
-      <w:bookmarkStart w:id="105" w:name="bk_anexo_d_codigo_rel_13"/>
+      <w:bookmarkStart w:id="106" w:name="bk_anexo_d_codigo_rel_13"/>
       <w:r>
         <w:t xml:space="preserve">5. Criterio de seleccion</w:t>
       </w:r>
-      <w:bookmarkEnd w:id="105"/>
+      <w:bookmarkEnd w:id="106"/>
     </w:p>
     <w:p>
       <w:pPr>

</xml_diff>

<commit_message>
Preparar entrega final y presentacion de defensa
</commit_message>
<xml_diff>
--- a/docs/memoria-final.docx
+++ b/docs/memoria-final.docx
@@ -10,8 +10,8 @@
   <dc:title>Memoria final TFG</dc:title>
   <dc:creator>Luis Angel</dc:creator>
   <cp:lastModifiedBy>Codex</cp:lastModifiedBy>
-  <dcterms:created xsi:type="dcterms:W3CDTF">2026-03-29T22:06:50.299Z</dcterms:created>
-  <dcterms:modified xsi:type="dcterms:W3CDTF">2026-03-29T22:06:50.299Z</dcterms:modified>
+  <dcterms:created xsi:type="dcterms:W3CDTF">2026-04-26T19:07:16.923Z</dcterms:created>
+  <dcterms:modified xsi:type="dcterms:W3CDTF">2026-04-26T19:07:16.923Z</dcterms:modified>
 </cp:coreProperties>
 </file>
 
@@ -355,6 +355,20 @@
           <w:rPr>
             <w:rStyle w:val="Hyperlink"/>
           </w:rPr>
+          <w:t xml:space="preserve">Flujo de trabajo operativo</w:t>
+        </w:r>
+      </w:hyperlink>
+    </w:p>
+    <w:p>
+      <w:pPr>
+        <w:pStyle w:val="TocEntry"/>
+        <w:ind w:left="360"/>
+      </w:pPr>
+      <w:hyperlink w:anchor="bk_memoria_final_21" w:history="1">
+        <w:r>
+          <w:rPr>
+            <w:rStyle w:val="Hyperlink"/>
+          </w:rPr>
           <w:t xml:space="preserve">Diseno de interfaz</w:t>
         </w:r>
       </w:hyperlink>
@@ -363,7 +377,7 @@
       <w:pPr>
         <w:pStyle w:val="TocEntry"/>
       </w:pPr>
-      <w:hyperlink w:anchor="bk_memoria_final_21" w:history="1">
+      <w:hyperlink w:anchor="bk_memoria_final_22" w:history="1">
         <w:r>
           <w:rPr>
             <w:rStyle w:val="Hyperlink"/>
@@ -377,7 +391,7 @@
         <w:pStyle w:val="TocEntry"/>
         <w:ind w:left="360"/>
       </w:pPr>
-      <w:hyperlink w:anchor="bk_memoria_final_22" w:history="1">
+      <w:hyperlink w:anchor="bk_memoria_final_23" w:history="1">
         <w:r>
           <w:rPr>
             <w:rStyle w:val="Hyperlink"/>
@@ -391,7 +405,7 @@
         <w:pStyle w:val="TocEntry"/>
         <w:ind w:left="360"/>
       </w:pPr>
-      <w:hyperlink w:anchor="bk_memoria_final_23" w:history="1">
+      <w:hyperlink w:anchor="bk_memoria_final_24" w:history="1">
         <w:r>
           <w:rPr>
             <w:rStyle w:val="Hyperlink"/>
@@ -405,7 +419,7 @@
         <w:pStyle w:val="TocEntry"/>
         <w:ind w:left="360"/>
       </w:pPr>
-      <w:hyperlink w:anchor="bk_memoria_final_24" w:history="1">
+      <w:hyperlink w:anchor="bk_memoria_final_25" w:history="1">
         <w:r>
           <w:rPr>
             <w:rStyle w:val="Hyperlink"/>
@@ -419,7 +433,7 @@
         <w:pStyle w:val="TocEntry"/>
         <w:ind w:left="360"/>
       </w:pPr>
-      <w:hyperlink w:anchor="bk_memoria_final_25" w:history="1">
+      <w:hyperlink w:anchor="bk_memoria_final_26" w:history="1">
         <w:r>
           <w:rPr>
             <w:rStyle w:val="Hyperlink"/>
@@ -433,7 +447,7 @@
         <w:pStyle w:val="TocEntry"/>
         <w:ind w:left="360"/>
       </w:pPr>
-      <w:hyperlink w:anchor="bk_memoria_final_26" w:history="1">
+      <w:hyperlink w:anchor="bk_memoria_final_27" w:history="1">
         <w:r>
           <w:rPr>
             <w:rStyle w:val="Hyperlink"/>
@@ -446,7 +460,7 @@
       <w:pPr>
         <w:pStyle w:val="TocEntry"/>
       </w:pPr>
-      <w:hyperlink w:anchor="bk_memoria_final_27" w:history="1">
+      <w:hyperlink w:anchor="bk_memoria_final_28" w:history="1">
         <w:r>
           <w:rPr>
             <w:rStyle w:val="Hyperlink"/>
@@ -460,7 +474,7 @@
         <w:pStyle w:val="TocEntry"/>
         <w:ind w:left="360"/>
       </w:pPr>
-      <w:hyperlink w:anchor="bk_memoria_final_28" w:history="1">
+      <w:hyperlink w:anchor="bk_memoria_final_29" w:history="1">
         <w:r>
           <w:rPr>
             <w:rStyle w:val="Hyperlink"/>
@@ -474,7 +488,7 @@
         <w:pStyle w:val="TocEntry"/>
         <w:ind w:left="360"/>
       </w:pPr>
-      <w:hyperlink w:anchor="bk_memoria_final_29" w:history="1">
+      <w:hyperlink w:anchor="bk_memoria_final_30" w:history="1">
         <w:r>
           <w:rPr>
             <w:rStyle w:val="Hyperlink"/>
@@ -488,7 +502,7 @@
         <w:pStyle w:val="TocEntry"/>
         <w:ind w:left="360"/>
       </w:pPr>
-      <w:hyperlink w:anchor="bk_memoria_final_30" w:history="1">
+      <w:hyperlink w:anchor="bk_memoria_final_31" w:history="1">
         <w:r>
           <w:rPr>
             <w:rStyle w:val="Hyperlink"/>
@@ -500,8 +514,22 @@
     <w:p>
       <w:pPr>
         <w:pStyle w:val="TocEntry"/>
-      </w:pPr>
-      <w:hyperlink w:anchor="bk_memoria_final_31" w:history="1">
+        <w:ind w:left="360"/>
+      </w:pPr>
+      <w:hyperlink w:anchor="bk_memoria_final_32" w:history="1">
+        <w:r>
+          <w:rPr>
+            <w:rStyle w:val="Hyperlink"/>
+          </w:rPr>
+          <w:t xml:space="preserve">Acceso para evaluacion externa</w:t>
+        </w:r>
+      </w:hyperlink>
+    </w:p>
+    <w:p>
+      <w:pPr>
+        <w:pStyle w:val="TocEntry"/>
+      </w:pPr>
+      <w:hyperlink w:anchor="bk_memoria_final_33" w:history="1">
         <w:r>
           <w:rPr>
             <w:rStyle w:val="Hyperlink"/>
@@ -515,7 +543,7 @@
         <w:pStyle w:val="TocEntry"/>
         <w:ind w:left="360"/>
       </w:pPr>
-      <w:hyperlink w:anchor="bk_memoria_final_32" w:history="1">
+      <w:hyperlink w:anchor="bk_memoria_final_34" w:history="1">
         <w:r>
           <w:rPr>
             <w:rStyle w:val="Hyperlink"/>
@@ -529,7 +557,7 @@
         <w:pStyle w:val="TocEntry"/>
         <w:ind w:left="360"/>
       </w:pPr>
-      <w:hyperlink w:anchor="bk_memoria_final_33" w:history="1">
+      <w:hyperlink w:anchor="bk_memoria_final_35" w:history="1">
         <w:r>
           <w:rPr>
             <w:rStyle w:val="Hyperlink"/>
@@ -543,7 +571,7 @@
         <w:pStyle w:val="TocEntry"/>
         <w:ind w:left="360"/>
       </w:pPr>
-      <w:hyperlink w:anchor="bk_memoria_final_34" w:history="1">
+      <w:hyperlink w:anchor="bk_memoria_final_36" w:history="1">
         <w:r>
           <w:rPr>
             <w:rStyle w:val="Hyperlink"/>
@@ -557,7 +585,7 @@
         <w:pStyle w:val="TocEntry"/>
         <w:ind w:left="360"/>
       </w:pPr>
-      <w:hyperlink w:anchor="bk_memoria_final_35" w:history="1">
+      <w:hyperlink w:anchor="bk_memoria_final_37" w:history="1">
         <w:r>
           <w:rPr>
             <w:rStyle w:val="Hyperlink"/>
@@ -571,7 +599,7 @@
         <w:pStyle w:val="TocEntry"/>
         <w:ind w:left="360"/>
       </w:pPr>
-      <w:hyperlink w:anchor="bk_memoria_final_36" w:history="1">
+      <w:hyperlink w:anchor="bk_memoria_final_38" w:history="1">
         <w:r>
           <w:rPr>
             <w:rStyle w:val="Hyperlink"/>
@@ -584,7 +612,7 @@
       <w:pPr>
         <w:pStyle w:val="TocEntry"/>
       </w:pPr>
-      <w:hyperlink w:anchor="bk_memoria_final_37" w:history="1">
+      <w:hyperlink w:anchor="bk_memoria_final_39" w:history="1">
         <w:r>
           <w:rPr>
             <w:rStyle w:val="Hyperlink"/>
@@ -598,7 +626,7 @@
         <w:pStyle w:val="TocEntry"/>
         <w:ind w:left="360"/>
       </w:pPr>
-      <w:hyperlink w:anchor="bk_memoria_final_38" w:history="1">
+      <w:hyperlink w:anchor="bk_memoria_final_40" w:history="1">
         <w:r>
           <w:rPr>
             <w:rStyle w:val="Hyperlink"/>
@@ -612,7 +640,7 @@
         <w:pStyle w:val="TocEntry"/>
         <w:ind w:left="360"/>
       </w:pPr>
-      <w:hyperlink w:anchor="bk_memoria_final_39" w:history="1">
+      <w:hyperlink w:anchor="bk_memoria_final_41" w:history="1">
         <w:r>
           <w:rPr>
             <w:rStyle w:val="Hyperlink"/>
@@ -625,7 +653,7 @@
       <w:pPr>
         <w:pStyle w:val="TocEntry"/>
       </w:pPr>
-      <w:hyperlink w:anchor="bk_memoria_final_40" w:history="1">
+      <w:hyperlink w:anchor="bk_memoria_final_42" w:history="1">
         <w:r>
           <w:rPr>
             <w:rStyle w:val="Hyperlink"/>
@@ -638,7 +666,7 @@
       <w:pPr>
         <w:pStyle w:val="TocEntry"/>
       </w:pPr>
-      <w:hyperlink w:anchor="bk_memoria_final_41" w:history="1">
+      <w:hyperlink w:anchor="bk_memoria_final_43" w:history="1">
         <w:r>
           <w:rPr>
             <w:rStyle w:val="Hyperlink"/>
@@ -651,7 +679,7 @@
       <w:pPr>
         <w:pStyle w:val="TocEntry"/>
       </w:pPr>
-      <w:hyperlink w:anchor="bk_memoria_final_42" w:history="1">
+      <w:hyperlink w:anchor="bk_memoria_final_44" w:history="1">
         <w:r>
           <w:rPr>
             <w:rStyle w:val="Hyperlink"/>
@@ -665,7 +693,7 @@
         <w:pStyle w:val="TocEntry"/>
         <w:ind w:left="360"/>
       </w:pPr>
-      <w:hyperlink w:anchor="bk_memoria_final_43" w:history="1">
+      <w:hyperlink w:anchor="bk_memoria_final_45" w:history="1">
         <w:r>
           <w:rPr>
             <w:rStyle w:val="Hyperlink"/>
@@ -679,7 +707,7 @@
         <w:pStyle w:val="TocEntry"/>
         <w:ind w:left="360"/>
       </w:pPr>
-      <w:hyperlink w:anchor="bk_memoria_final_44" w:history="1">
+      <w:hyperlink w:anchor="bk_memoria_final_46" w:history="1">
         <w:r>
           <w:rPr>
             <w:rStyle w:val="Hyperlink"/>
@@ -693,7 +721,7 @@
         <w:pStyle w:val="TocEntry"/>
         <w:ind w:left="360"/>
       </w:pPr>
-      <w:hyperlink w:anchor="bk_memoria_final_45" w:history="1">
+      <w:hyperlink w:anchor="bk_memoria_final_47" w:history="1">
         <w:r>
           <w:rPr>
             <w:rStyle w:val="Hyperlink"/>
@@ -707,7 +735,7 @@
         <w:pStyle w:val="TocEntry"/>
         <w:ind w:left="360"/>
       </w:pPr>
-      <w:hyperlink w:anchor="bk_memoria_final_46" w:history="1">
+      <w:hyperlink w:anchor="bk_memoria_final_48" w:history="1">
         <w:r>
           <w:rPr>
             <w:rStyle w:val="Hyperlink"/>
@@ -776,7 +804,7 @@
         <w:pStyle w:val="TocEntry"/>
         <w:ind w:left="360"/>
       </w:pPr>
-      <w:hyperlink w:anchor="bk_anexo_a_manual_usu_9" w:history="1">
+      <w:hyperlink w:anchor="bk_anexo_a_manual_usu_10" w:history="1">
         <w:r>
           <w:rPr>
             <w:rStyle w:val="Hyperlink"/>
@@ -790,7 +818,7 @@
         <w:pStyle w:val="TocEntry"/>
         <w:ind w:left="360"/>
       </w:pPr>
-      <w:hyperlink w:anchor="bk_anexo_a_manual_usu_10" w:history="1">
+      <w:hyperlink w:anchor="bk_anexo_a_manual_usu_11" w:history="1">
         <w:r>
           <w:rPr>
             <w:rStyle w:val="Hyperlink"/>
@@ -804,7 +832,7 @@
         <w:pStyle w:val="TocEntry"/>
         <w:ind w:left="360"/>
       </w:pPr>
-      <w:hyperlink w:anchor="bk_anexo_a_manual_usu_11" w:history="1">
+      <w:hyperlink w:anchor="bk_anexo_a_manual_usu_12" w:history="1">
         <w:r>
           <w:rPr>
             <w:rStyle w:val="Hyperlink"/>
@@ -818,7 +846,7 @@
         <w:pStyle w:val="TocEntry"/>
         <w:ind w:left="360"/>
       </w:pPr>
-      <w:hyperlink w:anchor="bk_anexo_a_manual_usu_12" w:history="1">
+      <w:hyperlink w:anchor="bk_anexo_a_manual_usu_13" w:history="1">
         <w:r>
           <w:rPr>
             <w:rStyle w:val="Hyperlink"/>
@@ -832,7 +860,7 @@
         <w:pStyle w:val="TocEntry"/>
         <w:ind w:left="360"/>
       </w:pPr>
-      <w:hyperlink w:anchor="bk_anexo_a_manual_usu_13" w:history="1">
+      <w:hyperlink w:anchor="bk_anexo_a_manual_usu_14" w:history="1">
         <w:r>
           <w:rPr>
             <w:rStyle w:val="Hyperlink"/>
@@ -846,7 +874,7 @@
         <w:pStyle w:val="TocEntry"/>
         <w:ind w:left="360"/>
       </w:pPr>
-      <w:hyperlink w:anchor="bk_anexo_a_manual_usu_14" w:history="1">
+      <w:hyperlink w:anchor="bk_anexo_a_manual_usu_15" w:history="1">
         <w:r>
           <w:rPr>
             <w:rStyle w:val="Hyperlink"/>
@@ -860,7 +888,7 @@
         <w:pStyle w:val="TocEntry"/>
         <w:ind w:left="360"/>
       </w:pPr>
-      <w:hyperlink w:anchor="bk_anexo_a_manual_usu_15" w:history="1">
+      <w:hyperlink w:anchor="bk_anexo_a_manual_usu_16" w:history="1">
         <w:r>
           <w:rPr>
             <w:rStyle w:val="Hyperlink"/>
@@ -874,7 +902,7 @@
         <w:pStyle w:val="TocEntry"/>
         <w:ind w:left="360"/>
       </w:pPr>
-      <w:hyperlink w:anchor="bk_anexo_a_manual_usu_16" w:history="1">
+      <w:hyperlink w:anchor="bk_anexo_a_manual_usu_17" w:history="1">
         <w:r>
           <w:rPr>
             <w:rStyle w:val="Hyperlink"/>
@@ -888,7 +916,7 @@
         <w:pStyle w:val="TocEntry"/>
         <w:ind w:left="360"/>
       </w:pPr>
-      <w:hyperlink w:anchor="bk_anexo_a_manual_usu_17" w:history="1">
+      <w:hyperlink w:anchor="bk_anexo_a_manual_usu_18" w:history="1">
         <w:r>
           <w:rPr>
             <w:rStyle w:val="Hyperlink"/>
@@ -902,7 +930,7 @@
         <w:pStyle w:val="TocEntry"/>
         <w:ind w:left="360"/>
       </w:pPr>
-      <w:hyperlink w:anchor="bk_anexo_a_manual_usu_18" w:history="1">
+      <w:hyperlink w:anchor="bk_anexo_a_manual_usu_19" w:history="1">
         <w:r>
           <w:rPr>
             <w:rStyle w:val="Hyperlink"/>
@@ -916,7 +944,7 @@
         <w:pStyle w:val="TocEntry"/>
         <w:ind w:left="360"/>
       </w:pPr>
-      <w:hyperlink w:anchor="bk_anexo_a_manual_usu_19" w:history="1">
+      <w:hyperlink w:anchor="bk_anexo_a_manual_usu_20" w:history="1">
         <w:r>
           <w:rPr>
             <w:rStyle w:val="Hyperlink"/>
@@ -930,7 +958,7 @@
         <w:pStyle w:val="TocEntry"/>
         <w:ind w:left="360"/>
       </w:pPr>
-      <w:hyperlink w:anchor="bk_anexo_a_manual_usu_20" w:history="1">
+      <w:hyperlink w:anchor="bk_anexo_a_manual_usu_21" w:history="1">
         <w:r>
           <w:rPr>
             <w:rStyle w:val="Hyperlink"/>
@@ -999,7 +1027,7 @@
         <w:pStyle w:val="TocEntry"/>
         <w:ind w:left="360"/>
       </w:pPr>
-      <w:hyperlink w:anchor="bk_anexo_b_manual_tec_9" w:history="1">
+      <w:hyperlink w:anchor="bk_anexo_b_manual_tec_10" w:history="1">
         <w:r>
           <w:rPr>
             <w:rStyle w:val="Hyperlink"/>
@@ -1013,7 +1041,7 @@
         <w:pStyle w:val="TocEntry"/>
         <w:ind w:left="360"/>
       </w:pPr>
-      <w:hyperlink w:anchor="bk_anexo_b_manual_tec_13" w:history="1">
+      <w:hyperlink w:anchor="bk_anexo_b_manual_tec_14" w:history="1">
         <w:r>
           <w:rPr>
             <w:rStyle w:val="Hyperlink"/>
@@ -1027,7 +1055,7 @@
         <w:pStyle w:val="TocEntry"/>
         <w:ind w:left="360"/>
       </w:pPr>
-      <w:hyperlink w:anchor="bk_anexo_b_manual_tec_16" w:history="1">
+      <w:hyperlink w:anchor="bk_anexo_b_manual_tec_17" w:history="1">
         <w:r>
           <w:rPr>
             <w:rStyle w:val="Hyperlink"/>
@@ -1041,7 +1069,7 @@
         <w:pStyle w:val="TocEntry"/>
         <w:ind w:left="360"/>
       </w:pPr>
-      <w:hyperlink w:anchor="bk_anexo_b_manual_tec_17" w:history="1">
+      <w:hyperlink w:anchor="bk_anexo_b_manual_tec_18" w:history="1">
         <w:r>
           <w:rPr>
             <w:rStyle w:val="Hyperlink"/>
@@ -1055,7 +1083,7 @@
         <w:pStyle w:val="TocEntry"/>
         <w:ind w:left="360"/>
       </w:pPr>
-      <w:hyperlink w:anchor="bk_anexo_b_manual_tec_18" w:history="1">
+      <w:hyperlink w:anchor="bk_anexo_b_manual_tec_19" w:history="1">
         <w:r>
           <w:rPr>
             <w:rStyle w:val="Hyperlink"/>
@@ -1069,7 +1097,7 @@
         <w:pStyle w:val="TocEntry"/>
         <w:ind w:left="360"/>
       </w:pPr>
-      <w:hyperlink w:anchor="bk_anexo_b_manual_tec_19" w:history="1">
+      <w:hyperlink w:anchor="bk_anexo_b_manual_tec_20" w:history="1">
         <w:r>
           <w:rPr>
             <w:rStyle w:val="Hyperlink"/>
@@ -1083,7 +1111,7 @@
         <w:pStyle w:val="TocEntry"/>
         <w:ind w:left="360"/>
       </w:pPr>
-      <w:hyperlink w:anchor="bk_anexo_b_manual_tec_20" w:history="1">
+      <w:hyperlink w:anchor="bk_anexo_b_manual_tec_21" w:history="1">
         <w:r>
           <w:rPr>
             <w:rStyle w:val="Hyperlink"/>
@@ -1097,7 +1125,7 @@
         <w:pStyle w:val="TocEntry"/>
         <w:ind w:left="360"/>
       </w:pPr>
-      <w:hyperlink w:anchor="bk_anexo_b_manual_tec_21" w:history="1">
+      <w:hyperlink w:anchor="bk_anexo_b_manual_tec_22" w:history="1">
         <w:r>
           <w:rPr>
             <w:rStyle w:val="Hyperlink"/>
@@ -1111,7 +1139,7 @@
         <w:pStyle w:val="TocEntry"/>
         <w:ind w:left="360"/>
       </w:pPr>
-      <w:hyperlink w:anchor="bk_anexo_b_manual_tec_22" w:history="1">
+      <w:hyperlink w:anchor="bk_anexo_b_manual_tec_23" w:history="1">
         <w:r>
           <w:rPr>
             <w:rStyle w:val="Hyperlink"/>
@@ -1125,7 +1153,7 @@
         <w:pStyle w:val="TocEntry"/>
         <w:ind w:left="360"/>
       </w:pPr>
-      <w:hyperlink w:anchor="bk_anexo_b_manual_tec_23" w:history="1">
+      <w:hyperlink w:anchor="bk_anexo_b_manual_tec_24" w:history="1">
         <w:r>
           <w:rPr>
             <w:rStyle w:val="Hyperlink"/>
@@ -1139,7 +1167,7 @@
         <w:pStyle w:val="TocEntry"/>
         <w:ind w:left="360"/>
       </w:pPr>
-      <w:hyperlink w:anchor="bk_anexo_b_manual_tec_24" w:history="1">
+      <w:hyperlink w:anchor="bk_anexo_b_manual_tec_25" w:history="1">
         <w:r>
           <w:rPr>
             <w:rStyle w:val="Hyperlink"/>
@@ -2073,9 +2101,43 @@
       </w:pPr>
       <w:bookmarkStart w:id="22" w:name="bk_memoria_final_20"/>
       <w:r>
+        <w:t xml:space="preserve">Flujo de trabajo operativo</w:t>
+      </w:r>
+      <w:bookmarkEnd w:id="22"/>
+    </w:p>
+    <w:p>
+      <w:pPr>
+        <w:pStyle w:val="Normal"/>
+      </w:pPr>
+      <w:r>
+        <w:t xml:space="preserve">La plataforma no se ha planteado como una suma de CRUD aislados, sino como un flujo de negocio secuencial. El recorrido recomendado comienza en el portal externo: la empresa registra una solicitud, valida su correo y espera revision interna. Ese paso no crea automaticamente una operativa academica completa, sino una entrada controlada para que el centro revise la informacion antes de activar la relacion.</w:t>
+      </w:r>
+    </w:p>
+    <w:p>
+      <w:pPr>
+        <w:pStyle w:val="Normal"/>
+      </w:pPr>
+      <w:r>
+        <w:t xml:space="preserve">Una vez dentro del portal interno, el primer paso correcto es revisar la solicitud o crear manualmente una empresa ya contrastada. Solo cuando la empresa queda en estado activo tiene sentido registrar un convenio. El convenio sigue su propio ciclo de maduracion, desde borrador hasta firmado o vigente. Sobre esa base ya validada se registran estudiantes y tutores, y solo entonces se planifica la asignacion.</w:t>
+      </w:r>
+    </w:p>
+    <w:p>
+      <w:pPr>
+        <w:pStyle w:val="Normal"/>
+      </w:pPr>
+      <w:r>
+        <w:t xml:space="preserve">Este orden no es solo recomendable desde el punto de vista funcional, sino que tambien se ha reforzado a nivel de aplicacion. En la revision final se ha ajustado el flujo para que los convenios se creen sobre empresas activas y para que las asignaciones solo puedan registrarse sobre empresas activas y convenios firmados, vigentes o en renovacion. De este modo se evita introducir practicas sobre datos todavia pendientes de validar y se mantiene una coherencia real entre solicitud, empresa, convenio y asignacion.</w:t>
+      </w:r>
+    </w:p>
+    <w:p>
+      <w:pPr>
+        <w:pStyle w:val="Heading2"/>
+      </w:pPr>
+      <w:bookmarkStart w:id="23" w:name="bk_memoria_final_21"/>
+      <w:r>
         <w:t xml:space="preserve">Diseno de interfaz</w:t>
       </w:r>
-      <w:bookmarkEnd w:id="22"/>
+      <w:bookmarkEnd w:id="23"/>
     </w:p>
     <w:p>
       <w:pPr>
@@ -2136,11 +2198,11 @@
         <w:pStyle w:val="Caption"/>
         <w:jc w:val="center"/>
       </w:pPr>
-      <w:bookmarkStart w:id="23" w:name="fig_memoria_final_3"/>
+      <w:bookmarkStart w:id="24" w:name="fig_memoria_final_3"/>
       <w:r>
         <w:t xml:space="preserve">Figura 3. Panel interno, vista dashboard con KPI y exportacion.</w:t>
       </w:r>
-      <w:bookmarkEnd w:id="23"/>
+      <w:bookmarkEnd w:id="24"/>
     </w:p>
     <w:p>
       <w:pPr>
@@ -2149,7 +2211,7 @@
       <w:r>
         <w:drawing>
           <wp:inline xmlns:wp="http://schemas.openxmlformats.org/drawingml/2006/wordprocessingDrawing" distT="0" distB="0" distL="0" distR="0">
-            <wp:extent cx="5669280" cy="3188970"/>
+            <wp:extent cx="5669280" cy="4212984"/>
             <wp:docPr id="4" name="04-panel-interno-bandeja.png"/>
             <a:graphic xmlns:a="http://schemas.openxmlformats.org/drawingml/2006/main">
               <a:graphicData uri="http://schemas.openxmlformats.org/drawingml/2006/picture">
@@ -2167,7 +2229,7 @@
                   <pic:spPr>
                     <a:xfrm>
                       <a:off x="0" y="0"/>
-                      <a:ext cx="5669280" cy="3188970"/>
+                      <a:ext cx="5669280" cy="4212984"/>
                     </a:xfrm>
                     <a:prstGeom prst="rect">
                       <a:avLst/>
@@ -2185,11 +2247,11 @@
         <w:pStyle w:val="Caption"/>
         <w:jc w:val="center"/>
       </w:pPr>
-      <w:bookmarkStart w:id="24" w:name="fig_memoria_final_4"/>
+      <w:bookmarkStart w:id="25" w:name="fig_memoria_final_4"/>
       <w:r>
         <w:t xml:space="preserve">Figura 4. Panel interno, bandeja unificada de mensajes con empresas.</w:t>
       </w:r>
-      <w:bookmarkEnd w:id="24"/>
+      <w:bookmarkEnd w:id="25"/>
     </w:p>
     <w:p>
       <w:pPr>
@@ -2234,11 +2296,11 @@
         <w:pStyle w:val="Caption"/>
         <w:jc w:val="center"/>
       </w:pPr>
-      <w:bookmarkStart w:id="25" w:name="fig_memoria_final_5"/>
+      <w:bookmarkStart w:id="26" w:name="fig_memoria_final_5"/>
       <w:r>
         <w:t xml:space="preserve">Figura 5. Portal externo con acceso de empresa y flujo de colaboracion.</w:t>
       </w:r>
-      <w:bookmarkEnd w:id="25"/>
+      <w:bookmarkEnd w:id="26"/>
     </w:p>
     <w:p>
       <w:pPr>
@@ -2247,7 +2309,7 @@
       <w:r>
         <w:drawing>
           <wp:inline xmlns:wp="http://schemas.openxmlformats.org/drawingml/2006/wordprocessingDrawing" distT="0" distB="0" distL="0" distR="0">
-            <wp:extent cx="5669280" cy="3188970"/>
+            <wp:extent cx="5632426" cy="7406640"/>
             <wp:docPr id="6" name="06-documentacion-guia.png"/>
             <a:graphic xmlns:a="http://schemas.openxmlformats.org/drawingml/2006/main">
               <a:graphicData uri="http://schemas.openxmlformats.org/drawingml/2006/picture">
@@ -2265,7 +2327,7 @@
                   <pic:spPr>
                     <a:xfrm>
                       <a:off x="0" y="0"/>
-                      <a:ext cx="5669280" cy="3188970"/>
+                      <a:ext cx="5632426" cy="7406640"/>
                     </a:xfrm>
                     <a:prstGeom prst="rect">
                       <a:avLst/>
@@ -2283,11 +2345,11 @@
         <w:pStyle w:val="Caption"/>
         <w:jc w:val="center"/>
       </w:pPr>
-      <w:bookmarkStart w:id="26" w:name="fig_memoria_final_6"/>
+      <w:bookmarkStart w:id="27" w:name="fig_memoria_final_6"/>
       <w:r>
         <w:t xml:space="preserve">Figura 6. Guia funcional de la plataforma.</w:t>
       </w:r>
-      <w:bookmarkEnd w:id="26"/>
+      <w:bookmarkEnd w:id="27"/>
     </w:p>
     <w:p>
       <w:pPr>
@@ -2332,31 +2394,31 @@
         <w:pStyle w:val="Caption"/>
         <w:jc w:val="center"/>
       </w:pPr>
-      <w:bookmarkStart w:id="27" w:name="fig_memoria_final_7"/>
+      <w:bookmarkStart w:id="28" w:name="fig_memoria_final_7"/>
       <w:r>
         <w:t xml:space="preserve">Figura 7. Monitor operativo privado con MFA y control de acceso.</w:t>
       </w:r>
-      <w:bookmarkEnd w:id="27"/>
+      <w:bookmarkEnd w:id="28"/>
     </w:p>
     <w:p>
       <w:pPr>
         <w:pStyle w:val="Heading1"/>
       </w:pPr>
-      <w:bookmarkStart w:id="28" w:name="bk_memoria_final_21"/>
+      <w:bookmarkStart w:id="29" w:name="bk_memoria_final_22"/>
       <w:r>
         <w:t xml:space="preserve">Implementacion</w:t>
       </w:r>
-      <w:bookmarkEnd w:id="28"/>
-    </w:p>
-    <w:p>
-      <w:pPr>
-        <w:pStyle w:val="Heading2"/>
-      </w:pPr>
-      <w:bookmarkStart w:id="29" w:name="bk_memoria_final_22"/>
+      <w:bookmarkEnd w:id="29"/>
+    </w:p>
+    <w:p>
+      <w:pPr>
+        <w:pStyle w:val="Heading2"/>
+      </w:pPr>
+      <w:bookmarkStart w:id="30" w:name="bk_memoria_final_23"/>
       <w:r>
         <w:t xml:space="preserve">Backend Symfony</w:t>
       </w:r>
-      <w:bookmarkEnd w:id="29"/>
+      <w:bookmarkEnd w:id="30"/>
     </w:p>
     <w:p>
       <w:pPr>
@@ -2370,29 +2432,29 @@
       <w:pPr>
         <w:pStyle w:val="Heading2"/>
       </w:pPr>
-      <w:bookmarkStart w:id="30" w:name="bk_memoria_final_23"/>
+      <w:bookmarkStart w:id="31" w:name="bk_memoria_final_24"/>
       <w:r>
         <w:t xml:space="preserve">Portal interno</w:t>
       </w:r>
-      <w:bookmarkEnd w:id="30"/>
-    </w:p>
-    <w:p>
-      <w:pPr>
-        <w:pStyle w:val="Normal"/>
-      </w:pPr>
-      <w:r>
-        <w:t xml:space="preserve">El portal interno funciona como shell de gestion academica y administrativa. Desde ahi se consultan KPI, se gestionan entidades principales, se revisan solicitudes, se accede a fichas 360 de empresas y convenios, se trabaja con seguimientos y se lanzan exportaciones CSV. El panel incorpora una pagina de acceso profesional, una bandeja unificada de mensajeria para conversaciones empresa-centro y un monitor privado separado del resto del uso operativo.</w:t>
-      </w:r>
-    </w:p>
-    <w:p>
-      <w:pPr>
-        <w:pStyle w:val="Heading2"/>
-      </w:pPr>
-      <w:bookmarkStart w:id="31" w:name="bk_memoria_final_24"/>
+      <w:bookmarkEnd w:id="31"/>
+    </w:p>
+    <w:p>
+      <w:pPr>
+        <w:pStyle w:val="Normal"/>
+      </w:pPr>
+      <w:r>
+        <w:t xml:space="preserve">El portal interno funciona como shell de gestion academica y administrativa. Desde ahi se consultan KPI, se gestionan entidades principales, se revisan solicitudes, se accede a fichas 360 de empresas y convenios, se trabaja con seguimientos y se lanzan exportaciones CSV. El panel incorpora una pagina de acceso profesional, una bandeja unificada de mensajeria para conversaciones empresa-centro y un monitor privado separado del resto del uso operativo. Para reforzar la coherencia del proceso, la campana superior concentra tanto las solicitudes pendientes como el acceso a la bandeja, mientras que los formularios filtran y validan las entidades operativas antes de permitir convenios o asignaciones.</w:t>
+      </w:r>
+    </w:p>
+    <w:p>
+      <w:pPr>
+        <w:pStyle w:val="Heading2"/>
+      </w:pPr>
+      <w:bookmarkStart w:id="32" w:name="bk_memoria_final_25"/>
       <w:r>
         <w:t xml:space="preserve">Portal externo</w:t>
       </w:r>
-      <w:bookmarkEnd w:id="31"/>
+      <w:bookmarkEnd w:id="32"/>
     </w:p>
     <w:p>
       <w:pPr>
@@ -2406,11 +2468,11 @@
       <w:pPr>
         <w:pStyle w:val="Heading2"/>
       </w:pPr>
-      <w:bookmarkStart w:id="32" w:name="bk_memoria_final_25"/>
+      <w:bookmarkStart w:id="33" w:name="bk_memoria_final_26"/>
       <w:r>
         <w:t xml:space="preserve">Seguimientos y evaluacion final</w:t>
       </w:r>
-      <w:bookmarkEnd w:id="32"/>
+      <w:bookmarkEnd w:id="33"/>
     </w:p>
     <w:p>
       <w:pPr>
@@ -2424,11 +2486,11 @@
       <w:pPr>
         <w:pStyle w:val="Heading2"/>
       </w:pPr>
-      <w:bookmarkStart w:id="33" w:name="bk_memoria_final_26"/>
+      <w:bookmarkStart w:id="34" w:name="bk_memoria_final_27"/>
       <w:r>
         <w:t xml:space="preserve">Control documental y exportacion CSV</w:t>
       </w:r>
-      <w:bookmarkEnd w:id="33"/>
+      <w:bookmarkEnd w:id="34"/>
     </w:p>
     <w:p>
       <w:pPr>
@@ -2442,21 +2504,21 @@
       <w:pPr>
         <w:pStyle w:val="Heading1"/>
       </w:pPr>
-      <w:bookmarkStart w:id="34" w:name="bk_memoria_final_27"/>
+      <w:bookmarkStart w:id="35" w:name="bk_memoria_final_28"/>
       <w:r>
         <w:t xml:space="preserve">Despliegue y operacion</w:t>
       </w:r>
-      <w:bookmarkEnd w:id="34"/>
-    </w:p>
-    <w:p>
-      <w:pPr>
-        <w:pStyle w:val="Heading2"/>
-      </w:pPr>
-      <w:bookmarkStart w:id="35" w:name="bk_memoria_final_28"/>
+      <w:bookmarkEnd w:id="35"/>
+    </w:p>
+    <w:p>
+      <w:pPr>
+        <w:pStyle w:val="Heading2"/>
+      </w:pPr>
+      <w:bookmarkStart w:id="36" w:name="bk_memoria_final_29"/>
       <w:r>
         <w:t xml:space="preserve">Requisitos del entorno</w:t>
       </w:r>
-      <w:bookmarkEnd w:id="35"/>
+      <w:bookmarkEnd w:id="36"/>
     </w:p>
     <w:p>
       <w:pPr>
@@ -2470,11 +2532,11 @@
       <w:pPr>
         <w:pStyle w:val="Heading2"/>
       </w:pPr>
-      <w:bookmarkStart w:id="36" w:name="bk_memoria_final_29"/>
+      <w:bookmarkStart w:id="37" w:name="bk_memoria_final_30"/>
       <w:r>
         <w:t xml:space="preserve">Configuracion</w:t>
       </w:r>
-      <w:bookmarkEnd w:id="36"/>
+      <w:bookmarkEnd w:id="37"/>
     </w:p>
     <w:p>
       <w:pPr>
@@ -2496,11 +2558,11 @@
       <w:pPr>
         <w:pStyle w:val="Heading2"/>
       </w:pPr>
-      <w:bookmarkStart w:id="37" w:name="bk_memoria_final_30"/>
+      <w:bookmarkStart w:id="38" w:name="bk_memoria_final_31"/>
       <w:r>
         <w:t xml:space="preserve">Publicacion integrada</w:t>
       </w:r>
-      <w:bookmarkEnd w:id="37"/>
+      <w:bookmarkEnd w:id="38"/>
     </w:p>
     <w:p>
       <w:pPr>
@@ -2512,23 +2574,81 @@
     </w:p>
     <w:p>
       <w:pPr>
+        <w:pStyle w:val="Heading2"/>
+      </w:pPr>
+      <w:bookmarkStart w:id="39" w:name="bk_memoria_final_32"/>
+      <w:r>
+        <w:t xml:space="preserve">Acceso para evaluacion externa</w:t>
+      </w:r>
+      <w:bookmarkEnd w:id="39"/>
+    </w:p>
+    <w:p>
+      <w:pPr>
+        <w:pStyle w:val="Normal"/>
+      </w:pPr>
+      <w:r>
+        <w:t xml:space="preserve">Para que la profesora pueda probar la aplicacion no es necesario que instale PHP, Composer, Node.js ni npm si el entorno de demostracion esta ya levantado en el equipo del alumno. En ese caso se comparte una URL publica temporal generada con cloudflared, con el formato https://...trycloudflare.com, y desde esa misma direccion se accede a los cuatro espacios de la entrega:</w:t>
+      </w:r>
+    </w:p>
+    <w:p>
+      <w:pPr>
+        <w:pStyle w:val="List"/>
+      </w:pPr>
+      <w:r>
+        <w:t xml:space="preserve">- URL/app para el panel interno;</w:t>
+      </w:r>
+    </w:p>
+    <w:p>
+      <w:pPr>
+        <w:pStyle w:val="List"/>
+      </w:pPr>
+      <w:r>
+        <w:t xml:space="preserve">- URL/externo para el portal de empresa;</w:t>
+      </w:r>
+    </w:p>
+    <w:p>
+      <w:pPr>
+        <w:pStyle w:val="List"/>
+      </w:pPr>
+      <w:r>
+        <w:t xml:space="preserve">- URL/documentacion para la guia funcional;</w:t>
+      </w:r>
+    </w:p>
+    <w:p>
+      <w:pPr>
+        <w:pStyle w:val="List"/>
+      </w:pPr>
+      <w:r>
+        <w:t xml:space="preserve">- URL/monitor para la supervision tecnica, protegida con autenticacion y MFA.</w:t>
+      </w:r>
+    </w:p>
+    <w:p>
+      <w:pPr>
+        <w:pStyle w:val="Normal"/>
+      </w:pPr>
+      <w:r>
+        <w:t xml:space="preserve">La profesora solo tendria que abrir la URL vigente en el navegador y usar las credenciales demo del panel interno cuando quiera revisar la parte privada. La instalacion local queda como alternativa de respaldo para reproducir el proyecto desde el repositorio, pero no es el camino previsto para una prueba rapida durante la evaluacion. La limitacion principal de este metodo es que la URL temporal solo funciona mientras el equipo local, el backend y el tunel publico permanecen activos.</w:t>
+      </w:r>
+    </w:p>
+    <w:p>
+      <w:pPr>
         <w:pStyle w:val="Heading1"/>
       </w:pPr>
-      <w:bookmarkStart w:id="38" w:name="bk_memoria_final_31"/>
+      <w:bookmarkStart w:id="40" w:name="bk_memoria_final_33"/>
       <w:r>
         <w:t xml:space="preserve">Pruebas y validacion</w:t>
       </w:r>
-      <w:bookmarkEnd w:id="38"/>
-    </w:p>
-    <w:p>
-      <w:pPr>
-        <w:pStyle w:val="Heading2"/>
-      </w:pPr>
-      <w:bookmarkStart w:id="39" w:name="bk_memoria_final_32"/>
+      <w:bookmarkEnd w:id="40"/>
+    </w:p>
+    <w:p>
+      <w:pPr>
+        <w:pStyle w:val="Heading2"/>
+      </w:pPr>
+      <w:bookmarkStart w:id="41" w:name="bk_memoria_final_34"/>
       <w:r>
         <w:t xml:space="preserve">Validaciones ejecutadas</w:t>
       </w:r>
-      <w:bookmarkEnd w:id="39"/>
+      <w:bookmarkEnd w:id="41"/>
     </w:p>
     <w:p>
       <w:pPr>
@@ -2542,11 +2662,11 @@
       <w:pPr>
         <w:pStyle w:val="Heading2"/>
       </w:pPr>
-      <w:bookmarkStart w:id="40" w:name="bk_memoria_final_33"/>
+      <w:bookmarkStart w:id="42" w:name="bk_memoria_final_35"/>
       <w:r>
         <w:t xml:space="preserve">Resultados observados</w:t>
       </w:r>
-      <w:bookmarkEnd w:id="40"/>
+      <w:bookmarkEnd w:id="42"/>
     </w:p>
     <w:p>
       <w:pPr>
@@ -2558,13 +2678,21 @@
     </w:p>
     <w:p>
       <w:pPr>
-        <w:pStyle w:val="Heading2"/>
-      </w:pPr>
-      <w:bookmarkStart w:id="41" w:name="bk_memoria_final_34"/>
+        <w:pStyle w:val="Normal"/>
+      </w:pPr>
+      <w:r>
+        <w:t xml:space="preserve">De cara a la entrega, los artefactos de apoyo a la defensa, como el video demostrativo y la muestra CSV/Excel utilizada para explicar la exportacion, se han regenerado con datos anonimizados. Esto permite apoyar la exposicion con evidencias reales del sistema sin exponer direcciones de correo u otros datos personales innecesarios.</w:t>
+      </w:r>
+    </w:p>
+    <w:p>
+      <w:pPr>
+        <w:pStyle w:val="Heading2"/>
+      </w:pPr>
+      <w:bookmarkStart w:id="43" w:name="bk_memoria_final_36"/>
       <w:r>
         <w:t xml:space="preserve">Rendimiento operativo</w:t>
       </w:r>
-      <w:bookmarkEnd w:id="41"/>
+      <w:bookmarkEnd w:id="43"/>
     </w:p>
     <w:p>
       <w:pPr>
@@ -2578,11 +2706,11 @@
       <w:pPr>
         <w:pStyle w:val="Heading2"/>
       </w:pPr>
-      <w:bookmarkStart w:id="42" w:name="bk_memoria_final_35"/>
+      <w:bookmarkStart w:id="44" w:name="bk_memoria_final_37"/>
       <w:r>
         <w:t xml:space="preserve">Estado tecnico de validacion</w:t>
       </w:r>
-      <w:bookmarkEnd w:id="42"/>
+      <w:bookmarkEnd w:id="44"/>
     </w:p>
     <w:p>
       <w:pPr>
@@ -2644,11 +2772,11 @@
       <w:pPr>
         <w:pStyle w:val="Heading2"/>
       </w:pPr>
-      <w:bookmarkStart w:id="43" w:name="bk_memoria_final_36"/>
+      <w:bookmarkStart w:id="45" w:name="bk_memoria_final_38"/>
       <w:r>
         <w:t xml:space="preserve">Limitaciones actuales</w:t>
       </w:r>
-      <w:bookmarkEnd w:id="43"/>
+      <w:bookmarkEnd w:id="45"/>
     </w:p>
     <w:p>
       <w:pPr>
@@ -2694,21 +2822,21 @@
       <w:pPr>
         <w:pStyle w:val="Heading1"/>
       </w:pPr>
-      <w:bookmarkStart w:id="44" w:name="bk_memoria_final_37"/>
+      <w:bookmarkStart w:id="46" w:name="bk_memoria_final_39"/>
       <w:r>
         <w:t xml:space="preserve">Resultados, limitaciones y lineas futuras</w:t>
       </w:r>
-      <w:bookmarkEnd w:id="44"/>
-    </w:p>
-    <w:p>
-      <w:pPr>
-        <w:pStyle w:val="Heading2"/>
-      </w:pPr>
-      <w:bookmarkStart w:id="45" w:name="bk_memoria_final_38"/>
+      <w:bookmarkEnd w:id="46"/>
+    </w:p>
+    <w:p>
+      <w:pPr>
+        <w:pStyle w:val="Heading2"/>
+      </w:pPr>
+      <w:bookmarkStart w:id="47" w:name="bk_memoria_final_40"/>
       <w:r>
         <w:t xml:space="preserve">Resultados principales</w:t>
       </w:r>
-      <w:bookmarkEnd w:id="45"/>
+      <w:bookmarkEnd w:id="47"/>
     </w:p>
     <w:p>
       <w:pPr>
@@ -2722,11 +2850,11 @@
       <w:pPr>
         <w:pStyle w:val="Heading2"/>
       </w:pPr>
-      <w:bookmarkStart w:id="46" w:name="bk_memoria_final_39"/>
+      <w:bookmarkStart w:id="48" w:name="bk_memoria_final_41"/>
       <w:r>
         <w:t xml:space="preserve">Lineas futuras</w:t>
       </w:r>
-      <w:bookmarkEnd w:id="46"/>
+      <w:bookmarkEnd w:id="48"/>
     </w:p>
     <w:p>
       <w:pPr>
@@ -2740,11 +2868,11 @@
       <w:pPr>
         <w:pStyle w:val="Heading1"/>
       </w:pPr>
-      <w:bookmarkStart w:id="47" w:name="bk_memoria_final_40"/>
+      <w:bookmarkStart w:id="49" w:name="bk_memoria_final_42"/>
       <w:r>
         <w:t xml:space="preserve">Conclusiones</w:t>
       </w:r>
-      <w:bookmarkEnd w:id="47"/>
+      <w:bookmarkEnd w:id="49"/>
     </w:p>
     <w:p>
       <w:pPr>
@@ -2758,11 +2886,11 @@
       <w:pPr>
         <w:pStyle w:val="Heading1"/>
       </w:pPr>
-      <w:bookmarkStart w:id="48" w:name="bk_memoria_final_41"/>
+      <w:bookmarkStart w:id="50" w:name="bk_memoria_final_43"/>
       <w:r>
         <w:t xml:space="preserve">Referencias</w:t>
       </w:r>
-      <w:bookmarkEnd w:id="48"/>
+      <w:bookmarkEnd w:id="50"/>
     </w:p>
     <w:p>
       <w:pPr>
@@ -2816,21 +2944,21 @@
       <w:pPr>
         <w:pStyle w:val="Heading1"/>
       </w:pPr>
-      <w:bookmarkStart w:id="49" w:name="bk_memoria_final_42"/>
+      <w:bookmarkStart w:id="51" w:name="bk_memoria_final_44"/>
       <w:r>
         <w:t xml:space="preserve">Anexos</w:t>
       </w:r>
-      <w:bookmarkEnd w:id="49"/>
-    </w:p>
-    <w:p>
-      <w:pPr>
-        <w:pStyle w:val="Heading2"/>
-      </w:pPr>
-      <w:bookmarkStart w:id="50" w:name="bk_memoria_final_43"/>
+      <w:bookmarkEnd w:id="51"/>
+    </w:p>
+    <w:p>
+      <w:pPr>
+        <w:pStyle w:val="Heading2"/>
+      </w:pPr>
+      <w:bookmarkStart w:id="52" w:name="bk_memoria_final_45"/>
       <w:r>
         <w:t xml:space="preserve">Anexo A. Manual de usuario</w:t>
       </w:r>
-      <w:bookmarkEnd w:id="50"/>
+      <w:bookmarkEnd w:id="52"/>
     </w:p>
     <w:p>
       <w:pPr>
@@ -2844,11 +2972,11 @@
       <w:pPr>
         <w:pStyle w:val="Heading2"/>
       </w:pPr>
-      <w:bookmarkStart w:id="51" w:name="bk_memoria_final_44"/>
+      <w:bookmarkStart w:id="53" w:name="bk_memoria_final_46"/>
       <w:r>
         <w:t xml:space="preserve">Anexo B. Manual tecnico</w:t>
       </w:r>
-      <w:bookmarkEnd w:id="51"/>
+      <w:bookmarkEnd w:id="53"/>
     </w:p>
     <w:p>
       <w:pPr>
@@ -2862,11 +2990,11 @@
       <w:pPr>
         <w:pStyle w:val="Heading2"/>
       </w:pPr>
-      <w:bookmarkStart w:id="52" w:name="bk_memoria_final_45"/>
+      <w:bookmarkStart w:id="54" w:name="bk_memoria_final_47"/>
       <w:r>
         <w:t xml:space="preserve">Anexo C. Capturas y evidencias</w:t>
       </w:r>
-      <w:bookmarkEnd w:id="52"/>
+      <w:bookmarkEnd w:id="54"/>
     </w:p>
     <w:p>
       <w:pPr>
@@ -2880,11 +3008,11 @@
       <w:pPr>
         <w:pStyle w:val="Heading2"/>
       </w:pPr>
-      <w:bookmarkStart w:id="53" w:name="bk_memoria_final_46"/>
+      <w:bookmarkStart w:id="55" w:name="bk_memoria_final_48"/>
       <w:r>
         <w:t xml:space="preserve">Anexo D. Codigo relevante y artefactos de apoyo</w:t>
       </w:r>
-      <w:bookmarkEnd w:id="53"/>
+      <w:bookmarkEnd w:id="55"/>
     </w:p>
     <w:p>
       <w:pPr>
@@ -2927,21 +3055,21 @@
       <w:pPr>
         <w:pStyle w:val="Heading1"/>
       </w:pPr>
-      <w:bookmarkStart w:id="54" w:name="bk_anexo_a_manual_usu_1"/>
+      <w:bookmarkStart w:id="56" w:name="bk_anexo_a_manual_usu_1"/>
       <w:r>
         <w:t xml:space="preserve">Anexo A. Manual de Usuario</w:t>
       </w:r>
-      <w:bookmarkEnd w:id="54"/>
-    </w:p>
-    <w:p>
-      <w:pPr>
-        <w:pStyle w:val="Heading2"/>
-      </w:pPr>
-      <w:bookmarkStart w:id="55" w:name="bk_anexo_a_manual_usu_2"/>
+      <w:bookmarkEnd w:id="56"/>
+    </w:p>
+    <w:p>
+      <w:pPr>
+        <w:pStyle w:val="Heading2"/>
+      </w:pPr>
+      <w:bookmarkStart w:id="57" w:name="bk_anexo_a_manual_usu_2"/>
       <w:r>
         <w:t xml:space="preserve">1. Objetivo</w:t>
       </w:r>
-      <w:bookmarkEnd w:id="55"/>
+      <w:bookmarkEnd w:id="57"/>
     </w:p>
     <w:p>
       <w:pPr>
@@ -2955,11 +3083,11 @@
       <w:pPr>
         <w:pStyle w:val="Heading2"/>
       </w:pPr>
-      <w:bookmarkStart w:id="56" w:name="bk_anexo_a_manual_usu_3"/>
+      <w:bookmarkStart w:id="58" w:name="bk_anexo_a_manual_usu_3"/>
       <w:r>
         <w:t xml:space="preserve">2. Perfiles de uso</w:t>
       </w:r>
-      <w:bookmarkEnd w:id="56"/>
+      <w:bookmarkEnd w:id="58"/>
     </w:p>
     <w:p>
       <w:pPr>
@@ -3013,21 +3141,79 @@
       <w:pPr>
         <w:pStyle w:val="Heading2"/>
       </w:pPr>
-      <w:bookmarkStart w:id="57" w:name="bk_anexo_a_manual_usu_4"/>
+      <w:bookmarkStart w:id="59" w:name="bk_anexo_a_manual_usu_4"/>
       <w:r>
         <w:t xml:space="preserve">3. Acceso al sistema</w:t>
       </w:r>
-      <w:bookmarkEnd w:id="57"/>
+      <w:bookmarkEnd w:id="59"/>
     </w:p>
     <w:p>
       <w:pPr>
         <w:pStyle w:val="Heading3"/>
       </w:pPr>
-      <w:bookmarkStart w:id="58" w:name="bk_anexo_a_manual_usu_5"/>
+      <w:bookmarkStart w:id="60" w:name="bk_anexo_a_manual_usu_5"/>
+      <w:r>
+        <w:t xml:space="preserve">3.0 Acceso externo para evaluacion</w:t>
+      </w:r>
+      <w:bookmarkEnd w:id="60"/>
+    </w:p>
+    <w:p>
+      <w:pPr>
+        <w:pStyle w:val="Normal"/>
+      </w:pPr>
+      <w:r>
+        <w:t xml:space="preserve">Durante la evaluacion, si el alumno mantiene activo el entorno de demostracion, la profesora no necesita descargar ni instalar dependencias del proyecto. Se le puede facilitar una URL publica temporal generada con cloudflared, por ejemplo https://...trycloudflare.com, y sobre esa misma URL abrir:</w:t>
+      </w:r>
+    </w:p>
+    <w:p>
+      <w:pPr>
+        <w:pStyle w:val="List"/>
+      </w:pPr>
+      <w:r>
+        <w:t xml:space="preserve">- /app para el panel interno;</w:t>
+      </w:r>
+    </w:p>
+    <w:p>
+      <w:pPr>
+        <w:pStyle w:val="List"/>
+      </w:pPr>
+      <w:r>
+        <w:t xml:space="preserve">- /externo para el portal de empresa;</w:t>
+      </w:r>
+    </w:p>
+    <w:p>
+      <w:pPr>
+        <w:pStyle w:val="List"/>
+      </w:pPr>
+      <w:r>
+        <w:t xml:space="preserve">- /documentacion para la guia funcional;</w:t>
+      </w:r>
+    </w:p>
+    <w:p>
+      <w:pPr>
+        <w:pStyle w:val="List"/>
+      </w:pPr>
+      <w:r>
+        <w:t xml:space="preserve">- /monitor para el monitor privado.</w:t>
+      </w:r>
+    </w:p>
+    <w:p>
+      <w:pPr>
+        <w:pStyle w:val="Normal"/>
+      </w:pPr>
+      <w:r>
+        <w:t xml:space="preserve">Este acceso remoto depende de que el equipo local del alumno, el servidor Symfony y el tunel publico sigan levantados. Si el tunel se cierra, la URL deja de ser valida y hay que generar una nueva. La instalacion local solo seria necesaria si se quiere reproducir el proyecto desde cero a partir del repositorio.</w:t>
+      </w:r>
+    </w:p>
+    <w:p>
+      <w:pPr>
+        <w:pStyle w:val="Heading3"/>
+      </w:pPr>
+      <w:bookmarkStart w:id="61" w:name="bk_anexo_a_manual_usu_6"/>
       <w:r>
         <w:t xml:space="preserve">3.1 Panel interno integrado</w:t>
       </w:r>
-      <w:bookmarkEnd w:id="58"/>
+      <w:bookmarkEnd w:id="61"/>
     </w:p>
     <w:p>
       <w:pPr>
@@ -3057,11 +3243,11 @@
       <w:pPr>
         <w:pStyle w:val="Heading3"/>
       </w:pPr>
-      <w:bookmarkStart w:id="59" w:name="bk_anexo_a_manual_usu_6"/>
+      <w:bookmarkStart w:id="62" w:name="bk_anexo_a_manual_usu_7"/>
       <w:r>
         <w:t xml:space="preserve">3.2 Documentacion publica</w:t>
       </w:r>
-      <w:bookmarkEnd w:id="59"/>
+      <w:bookmarkEnd w:id="62"/>
     </w:p>
     <w:p>
       <w:pPr>
@@ -3083,11 +3269,11 @@
       <w:pPr>
         <w:pStyle w:val="Heading3"/>
       </w:pPr>
-      <w:bookmarkStart w:id="60" w:name="bk_anexo_a_manual_usu_7"/>
+      <w:bookmarkStart w:id="63" w:name="bk_anexo_a_manual_usu_8"/>
       <w:r>
         <w:t xml:space="preserve">3.3 Monitor privado</w:t>
       </w:r>
-      <w:bookmarkEnd w:id="60"/>
+      <w:bookmarkEnd w:id="63"/>
     </w:p>
     <w:p>
       <w:pPr>
@@ -3109,11 +3295,11 @@
       <w:pPr>
         <w:pStyle w:val="Heading3"/>
       </w:pPr>
-      <w:bookmarkStart w:id="61" w:name="bk_anexo_a_manual_usu_8"/>
+      <w:bookmarkStart w:id="64" w:name="bk_anexo_a_manual_usu_9"/>
       <w:r>
         <w:t xml:space="preserve">3.4 Portal externo</w:t>
       </w:r>
-      <w:bookmarkEnd w:id="61"/>
+      <w:bookmarkEnd w:id="64"/>
     </w:p>
     <w:p>
       <w:pPr>
@@ -3143,11 +3329,11 @@
       <w:pPr>
         <w:pStyle w:val="Heading2"/>
       </w:pPr>
-      <w:bookmarkStart w:id="62" w:name="bk_anexo_a_manual_usu_9"/>
+      <w:bookmarkStart w:id="65" w:name="bk_anexo_a_manual_usu_10"/>
       <w:r>
         <w:t xml:space="preserve">4. Navegacion principal del panel interno</w:t>
       </w:r>
-      <w:bookmarkEnd w:id="62"/>
+      <w:bookmarkEnd w:id="65"/>
     </w:p>
     <w:p>
       <w:pPr>
@@ -3233,11 +3419,11 @@
       <w:pPr>
         <w:pStyle w:val="Heading2"/>
       </w:pPr>
-      <w:bookmarkStart w:id="63" w:name="bk_anexo_a_manual_usu_10"/>
+      <w:bookmarkStart w:id="66" w:name="bk_anexo_a_manual_usu_11"/>
       <w:r>
         <w:t xml:space="preserve">5. Dashboard</w:t>
       </w:r>
-      <w:bookmarkEnd w:id="63"/>
+      <w:bookmarkEnd w:id="66"/>
     </w:p>
     <w:p>
       <w:pPr>
@@ -3283,11 +3469,11 @@
       <w:pPr>
         <w:pStyle w:val="Heading2"/>
       </w:pPr>
-      <w:bookmarkStart w:id="64" w:name="bk_anexo_a_manual_usu_11"/>
+      <w:bookmarkStart w:id="67" w:name="bk_anexo_a_manual_usu_12"/>
       <w:r>
         <w:t xml:space="preserve">6. Gestion de empresas</w:t>
       </w:r>
-      <w:bookmarkEnd w:id="64"/>
+      <w:bookmarkEnd w:id="67"/>
     </w:p>
     <w:p>
       <w:pPr>
@@ -3381,11 +3567,11 @@
       <w:pPr>
         <w:pStyle w:val="Heading2"/>
       </w:pPr>
-      <w:bookmarkStart w:id="65" w:name="bk_anexo_a_manual_usu_12"/>
+      <w:bookmarkStart w:id="68" w:name="bk_anexo_a_manual_usu_13"/>
       <w:r>
         <w:t xml:space="preserve">7. Gestion de convenios</w:t>
       </w:r>
-      <w:bookmarkEnd w:id="65"/>
+      <w:bookmarkEnd w:id="68"/>
     </w:p>
     <w:p>
       <w:pPr>
@@ -3455,11 +3641,11 @@
       <w:pPr>
         <w:pStyle w:val="Heading2"/>
       </w:pPr>
-      <w:bookmarkStart w:id="66" w:name="bk_anexo_a_manual_usu_13"/>
+      <w:bookmarkStart w:id="69" w:name="bk_anexo_a_manual_usu_14"/>
       <w:r>
         <w:t xml:space="preserve">8. Gestion de estudiantes</w:t>
       </w:r>
-      <w:bookmarkEnd w:id="66"/>
+      <w:bookmarkEnd w:id="69"/>
     </w:p>
     <w:p>
       <w:pPr>
@@ -3513,11 +3699,11 @@
       <w:pPr>
         <w:pStyle w:val="Heading2"/>
       </w:pPr>
-      <w:bookmarkStart w:id="67" w:name="bk_anexo_a_manual_usu_14"/>
+      <w:bookmarkStart w:id="70" w:name="bk_anexo_a_manual_usu_15"/>
       <w:r>
         <w:t xml:space="preserve">9. Gestion de asignaciones, seguimientos y evaluacion final</w:t>
       </w:r>
-      <w:bookmarkEnd w:id="67"/>
+      <w:bookmarkEnd w:id="70"/>
     </w:p>
     <w:p>
       <w:pPr>
@@ -3611,11 +3797,11 @@
       <w:pPr>
         <w:pStyle w:val="Heading2"/>
       </w:pPr>
-      <w:bookmarkStart w:id="68" w:name="bk_anexo_a_manual_usu_15"/>
+      <w:bookmarkStart w:id="71" w:name="bk_anexo_a_manual_usu_16"/>
       <w:r>
         <w:t xml:space="preserve">10. Gestion de tutores</w:t>
       </w:r>
-      <w:bookmarkEnd w:id="68"/>
+      <w:bookmarkEnd w:id="71"/>
     </w:p>
     <w:p>
       <w:pPr>
@@ -3661,11 +3847,11 @@
       <w:pPr>
         <w:pStyle w:val="Heading2"/>
       </w:pPr>
-      <w:bookmarkStart w:id="69" w:name="bk_anexo_a_manual_usu_16"/>
+      <w:bookmarkStart w:id="72" w:name="bk_anexo_a_manual_usu_17"/>
       <w:r>
         <w:t xml:space="preserve">11. Solicitudes y bandeja de mensajes</w:t>
       </w:r>
-      <w:bookmarkEnd w:id="69"/>
+      <w:bookmarkEnd w:id="72"/>
     </w:p>
     <w:p>
       <w:pPr>
@@ -3759,11 +3945,11 @@
       <w:pPr>
         <w:pStyle w:val="Heading2"/>
       </w:pPr>
-      <w:bookmarkStart w:id="70" w:name="bk_anexo_a_manual_usu_17"/>
+      <w:bookmarkStart w:id="73" w:name="bk_anexo_a_manual_usu_18"/>
       <w:r>
         <w:t xml:space="preserve">12. Monitor privado</w:t>
       </w:r>
-      <w:bookmarkEnd w:id="70"/>
+      <w:bookmarkEnd w:id="73"/>
     </w:p>
     <w:p>
       <w:pPr>
@@ -3825,11 +4011,11 @@
       <w:pPr>
         <w:pStyle w:val="Heading2"/>
       </w:pPr>
-      <w:bookmarkStart w:id="71" w:name="bk_anexo_a_manual_usu_18"/>
+      <w:bookmarkStart w:id="74" w:name="bk_anexo_a_manual_usu_19"/>
       <w:r>
         <w:t xml:space="preserve">13. Portal externo</w:t>
       </w:r>
-      <w:bookmarkEnd w:id="71"/>
+      <w:bookmarkEnd w:id="74"/>
     </w:p>
     <w:p>
       <w:pPr>
@@ -3899,11 +4085,11 @@
       <w:pPr>
         <w:pStyle w:val="Heading2"/>
       </w:pPr>
-      <w:bookmarkStart w:id="72" w:name="bk_anexo_a_manual_usu_19"/>
+      <w:bookmarkStart w:id="75" w:name="bk_anexo_a_manual_usu_20"/>
       <w:r>
         <w:t xml:space="preserve">14. Errores y validaciones comunes</w:t>
       </w:r>
-      <w:bookmarkEnd w:id="72"/>
+      <w:bookmarkEnd w:id="75"/>
     </w:p>
     <w:p>
       <w:pPr>
@@ -3949,11 +4135,11 @@
       <w:pPr>
         <w:pStyle w:val="Heading2"/>
       </w:pPr>
-      <w:bookmarkStart w:id="73" w:name="bk_anexo_a_manual_usu_20"/>
+      <w:bookmarkStart w:id="76" w:name="bk_anexo_a_manual_usu_21"/>
       <w:r>
         <w:t xml:space="preserve">15. Recomendaciones de uso</w:t>
       </w:r>
-      <w:bookmarkEnd w:id="73"/>
+      <w:bookmarkEnd w:id="76"/>
     </w:p>
     <w:p>
       <w:pPr>
@@ -3996,21 +4182,21 @@
       <w:pPr>
         <w:pStyle w:val="Heading1"/>
       </w:pPr>
-      <w:bookmarkStart w:id="74" w:name="bk_anexo_b_manual_tec_1"/>
+      <w:bookmarkStart w:id="77" w:name="bk_anexo_b_manual_tec_1"/>
       <w:r>
         <w:t xml:space="preserve">Anexo B. Manual Tecnico</w:t>
       </w:r>
-      <w:bookmarkEnd w:id="74"/>
-    </w:p>
-    <w:p>
-      <w:pPr>
-        <w:pStyle w:val="Heading2"/>
-      </w:pPr>
-      <w:bookmarkStart w:id="75" w:name="bk_anexo_b_manual_tec_2"/>
+      <w:bookmarkEnd w:id="77"/>
+    </w:p>
+    <w:p>
+      <w:pPr>
+        <w:pStyle w:val="Heading2"/>
+      </w:pPr>
+      <w:bookmarkStart w:id="78" w:name="bk_anexo_b_manual_tec_2"/>
       <w:r>
         <w:t xml:space="preserve">1. Arquitectura general</w:t>
       </w:r>
-      <w:bookmarkEnd w:id="75"/>
+      <w:bookmarkEnd w:id="78"/>
     </w:p>
     <w:p>
       <w:pPr>
@@ -4064,11 +4250,11 @@
       <w:pPr>
         <w:pStyle w:val="Heading2"/>
       </w:pPr>
-      <w:bookmarkStart w:id="76" w:name="bk_anexo_b_manual_tec_3"/>
+      <w:bookmarkStart w:id="79" w:name="bk_anexo_b_manual_tec_3"/>
       <w:r>
         <w:t xml:space="preserve">2. Requisitos locales</w:t>
       </w:r>
-      <w:bookmarkEnd w:id="76"/>
+      <w:bookmarkEnd w:id="79"/>
     </w:p>
     <w:p>
       <w:pPr>
@@ -4122,11 +4308,11 @@
       <w:pPr>
         <w:pStyle w:val="Heading2"/>
       </w:pPr>
-      <w:bookmarkStart w:id="77" w:name="bk_anexo_b_manual_tec_4"/>
+      <w:bookmarkStart w:id="80" w:name="bk_anexo_b_manual_tec_4"/>
       <w:r>
         <w:t xml:space="preserve">3. Arranque del entorno</w:t>
       </w:r>
-      <w:bookmarkEnd w:id="77"/>
+      <w:bookmarkEnd w:id="80"/>
     </w:p>
     <w:p>
       <w:pPr>
@@ -4140,11 +4326,11 @@
       <w:pPr>
         <w:pStyle w:val="Heading3"/>
       </w:pPr>
-      <w:bookmarkStart w:id="78" w:name="bk_anexo_b_manual_tec_5"/>
+      <w:bookmarkStart w:id="81" w:name="bk_anexo_b_manual_tec_5"/>
       <w:r>
         <w:t xml:space="preserve">3.1 Backend</w:t>
       </w:r>
-      <w:bookmarkEnd w:id="78"/>
+      <w:bookmarkEnd w:id="81"/>
     </w:p>
     <w:p>
       <w:pPr>
@@ -4198,11 +4384,11 @@
       <w:pPr>
         <w:pStyle w:val="Heading3"/>
       </w:pPr>
-      <w:bookmarkStart w:id="79" w:name="bk_anexo_b_manual_tec_6"/>
+      <w:bookmarkStart w:id="82" w:name="bk_anexo_b_manual_tec_6"/>
       <w:r>
         <w:t xml:space="preserve">3.2 Frontend interno en desarrollo</w:t>
       </w:r>
-      <w:bookmarkEnd w:id="79"/>
+      <w:bookmarkEnd w:id="82"/>
     </w:p>
     <w:p>
       <w:pPr>
@@ -4240,11 +4426,11 @@
       <w:pPr>
         <w:pStyle w:val="Heading3"/>
       </w:pPr>
-      <w:bookmarkStart w:id="80" w:name="bk_anexo_b_manual_tec_7"/>
+      <w:bookmarkStart w:id="83" w:name="bk_anexo_b_manual_tec_7"/>
       <w:r>
         <w:t xml:space="preserve">3.3 Portal externo en desarrollo</w:t>
       </w:r>
-      <w:bookmarkEnd w:id="80"/>
+      <w:bookmarkEnd w:id="83"/>
     </w:p>
     <w:p>
       <w:pPr>
@@ -4282,11 +4468,11 @@
       <w:pPr>
         <w:pStyle w:val="Heading3"/>
       </w:pPr>
-      <w:bookmarkStart w:id="81" w:name="bk_anexo_b_manual_tec_8"/>
+      <w:bookmarkStart w:id="84" w:name="bk_anexo_b_manual_tec_8"/>
       <w:r>
         <w:t xml:space="preserve">3.4 Build integrada</w:t>
       </w:r>
-      <w:bookmarkEnd w:id="81"/>
+      <w:bookmarkEnd w:id="84"/>
     </w:p>
     <w:p>
       <w:pPr>
@@ -4370,23 +4556,49 @@
     </w:p>
     <w:p>
       <w:pPr>
-        <w:pStyle w:val="Heading2"/>
-      </w:pPr>
-      <w:bookmarkStart w:id="82" w:name="bk_anexo_b_manual_tec_9"/>
+        <w:pStyle w:val="Heading3"/>
+      </w:pPr>
+      <w:bookmarkStart w:id="85" w:name="bk_anexo_b_manual_tec_9"/>
+      <w:r>
+        <w:t xml:space="preserve">3.5 Prueba remota sin instalacion local</w:t>
+      </w:r>
+      <w:bookmarkEnd w:id="85"/>
+    </w:p>
+    <w:p>
+      <w:pPr>
+        <w:pStyle w:val="Normal"/>
+      </w:pPr>
+      <w:r>
+        <w:t xml:space="preserve">Para una revision externa rapida, la persona evaluadora no tiene que instalar el entorno si el alumno mantiene la demo activa. El alumno ejecuta start-demo-public.bat, espera a que cloudflared muestre una URL https://...trycloudflare.com y comparte esa direccion. La evaluadora accede desde el navegador a URL/app, URL/externo, URL/documentacion o URL/monitor.</w:t>
+      </w:r>
+    </w:p>
+    <w:p>
+      <w:pPr>
+        <w:pStyle w:val="Normal"/>
+      </w:pPr>
+      <w:r>
+        <w:t xml:space="preserve">Este modo no sustituye al despliegue permanente: depende del equipo local, del backend en ejecucion y del tunel temporal. Si cualquiera de esos elementos se detiene, la URL deja de responder y debe levantarse de nuevo.</w:t>
+      </w:r>
+    </w:p>
+    <w:p>
+      <w:pPr>
+        <w:pStyle w:val="Heading2"/>
+      </w:pPr>
+      <w:bookmarkStart w:id="86" w:name="bk_anexo_b_manual_tec_10"/>
       <w:r>
         <w:t xml:space="preserve">4. Variables de entorno relevantes</w:t>
       </w:r>
-      <w:bookmarkEnd w:id="82"/>
+      <w:bookmarkEnd w:id="86"/>
     </w:p>
     <w:p>
       <w:pPr>
         <w:pStyle w:val="Heading3"/>
       </w:pPr>
-      <w:bookmarkStart w:id="83" w:name="bk_anexo_b_manual_tec_10"/>
+      <w:bookmarkStart w:id="87" w:name="bk_anexo_b_manual_tec_11"/>
       <w:r>
         <w:t xml:space="preserve">4.1 Backend</w:t>
       </w:r>
-      <w:bookmarkEnd w:id="83"/>
+      <w:bookmarkEnd w:id="87"/>
     </w:p>
     <w:p>
       <w:pPr>
@@ -4464,11 +4676,11 @@
       <w:pPr>
         <w:pStyle w:val="Heading3"/>
       </w:pPr>
-      <w:bookmarkStart w:id="84" w:name="bk_anexo_b_manual_tec_11"/>
+      <w:bookmarkStart w:id="88" w:name="bk_anexo_b_manual_tec_12"/>
       <w:r>
         <w:t xml:space="preserve">4.2 Frontend interno</w:t>
       </w:r>
-      <w:bookmarkEnd w:id="84"/>
+      <w:bookmarkEnd w:id="88"/>
     </w:p>
     <w:p>
       <w:pPr>
@@ -4498,11 +4710,11 @@
       <w:pPr>
         <w:pStyle w:val="Heading3"/>
       </w:pPr>
-      <w:bookmarkStart w:id="85" w:name="bk_anexo_b_manual_tec_12"/>
+      <w:bookmarkStart w:id="89" w:name="bk_anexo_b_manual_tec_13"/>
       <w:r>
         <w:t xml:space="preserve">4.3 Portal externo</w:t>
       </w:r>
-      <w:bookmarkEnd w:id="85"/>
+      <w:bookmarkEnd w:id="89"/>
     </w:p>
     <w:p>
       <w:pPr>
@@ -4516,11 +4728,11 @@
       <w:pPr>
         <w:pStyle w:val="Heading2"/>
       </w:pPr>
-      <w:bookmarkStart w:id="86" w:name="bk_anexo_b_manual_tec_13"/>
+      <w:bookmarkStart w:id="90" w:name="bk_anexo_b_manual_tec_14"/>
       <w:r>
         <w:t xml:space="preserve">5. Seguridad</w:t>
       </w:r>
-      <w:bookmarkEnd w:id="86"/>
+      <w:bookmarkEnd w:id="90"/>
     </w:p>
     <w:p>
       <w:pPr>
@@ -4582,11 +4794,11 @@
       <w:pPr>
         <w:pStyle w:val="Heading3"/>
       </w:pPr>
-      <w:bookmarkStart w:id="87" w:name="bk_anexo_b_manual_tec_14"/>
+      <w:bookmarkStart w:id="91" w:name="bk_anexo_b_manual_tec_15"/>
       <w:r>
         <w:t xml:space="preserve">5.1 Jerarquia de roles interna</w:t>
       </w:r>
-      <w:bookmarkEnd w:id="87"/>
+      <w:bookmarkEnd w:id="91"/>
     </w:p>
     <w:p>
       <w:pPr>
@@ -4648,11 +4860,11 @@
       <w:pPr>
         <w:pStyle w:val="Heading3"/>
       </w:pPr>
-      <w:bookmarkStart w:id="88" w:name="bk_anexo_b_manual_tec_15"/>
+      <w:bookmarkStart w:id="92" w:name="bk_anexo_b_manual_tec_16"/>
       <w:r>
         <w:t xml:space="preserve">5.2 Rol externo</w:t>
       </w:r>
-      <w:bookmarkEnd w:id="88"/>
+      <w:bookmarkEnd w:id="92"/>
     </w:p>
     <w:p>
       <w:pPr>
@@ -4666,11 +4878,11 @@
       <w:pPr>
         <w:pStyle w:val="Heading2"/>
       </w:pPr>
-      <w:bookmarkStart w:id="89" w:name="bk_anexo_b_manual_tec_16"/>
+      <w:bookmarkStart w:id="93" w:name="bk_anexo_b_manual_tec_17"/>
       <w:r>
         <w:t xml:space="preserve">6. Persistencia</w:t>
       </w:r>
-      <w:bookmarkEnd w:id="89"/>
+      <w:bookmarkEnd w:id="93"/>
     </w:p>
     <w:p>
       <w:pPr>
@@ -4716,11 +4928,11 @@
       <w:pPr>
         <w:pStyle w:val="Heading2"/>
       </w:pPr>
-      <w:bookmarkStart w:id="90" w:name="bk_anexo_b_manual_tec_17"/>
+      <w:bookmarkStart w:id="94" w:name="bk_anexo_b_manual_tec_18"/>
       <w:r>
         <w:t xml:space="preserve">7. Correo saliente</w:t>
       </w:r>
-      <w:bookmarkEnd w:id="90"/>
+      <w:bookmarkEnd w:id="94"/>
     </w:p>
     <w:p>
       <w:pPr>
@@ -4774,11 +4986,11 @@
       <w:pPr>
         <w:pStyle w:val="Heading2"/>
       </w:pPr>
-      <w:bookmarkStart w:id="91" w:name="bk_anexo_b_manual_tec_18"/>
+      <w:bookmarkStart w:id="95" w:name="bk_anexo_b_manual_tec_19"/>
       <w:r>
         <w:t xml:space="preserve">8. Control documental</w:t>
       </w:r>
-      <w:bookmarkEnd w:id="91"/>
+      <w:bookmarkEnd w:id="95"/>
     </w:p>
     <w:p>
       <w:pPr>
@@ -4840,11 +5052,11 @@
       <w:pPr>
         <w:pStyle w:val="Heading2"/>
       </w:pPr>
-      <w:bookmarkStart w:id="92" w:name="bk_anexo_b_manual_tec_19"/>
+      <w:bookmarkStart w:id="96" w:name="bk_anexo_b_manual_tec_20"/>
       <w:r>
         <w:t xml:space="preserve">9. Estructura funcional del backend</w:t>
       </w:r>
-      <w:bookmarkEnd w:id="92"/>
+      <w:bookmarkEnd w:id="96"/>
     </w:p>
     <w:p>
       <w:pPr>
@@ -5018,11 +5230,11 @@
       <w:pPr>
         <w:pStyle w:val="Heading2"/>
       </w:pPr>
-      <w:bookmarkStart w:id="93" w:name="bk_anexo_b_manual_tec_20"/>
+      <w:bookmarkStart w:id="97" w:name="bk_anexo_b_manual_tec_21"/>
       <w:r>
         <w:t xml:space="preserve">10. Estructura funcional del frontend interno</w:t>
       </w:r>
-      <w:bookmarkEnd w:id="93"/>
+      <w:bookmarkEnd w:id="97"/>
     </w:p>
     <w:p>
       <w:pPr>
@@ -5100,11 +5312,11 @@
       <w:pPr>
         <w:pStyle w:val="Heading2"/>
       </w:pPr>
-      <w:bookmarkStart w:id="94" w:name="bk_anexo_b_manual_tec_21"/>
+      <w:bookmarkStart w:id="98" w:name="bk_anexo_b_manual_tec_22"/>
       <w:r>
         <w:t xml:space="preserve">11. Estructura funcional del portal externo</w:t>
       </w:r>
-      <w:bookmarkEnd w:id="94"/>
+      <w:bookmarkEnd w:id="98"/>
     </w:p>
     <w:p>
       <w:pPr>
@@ -5150,11 +5362,11 @@
       <w:pPr>
         <w:pStyle w:val="Heading2"/>
       </w:pPr>
-      <w:bookmarkStart w:id="95" w:name="bk_anexo_b_manual_tec_22"/>
+      <w:bookmarkStart w:id="99" w:name="bk_anexo_b_manual_tec_23"/>
       <w:r>
         <w:t xml:space="preserve">12. Exportacion CSV</w:t>
       </w:r>
-      <w:bookmarkEnd w:id="95"/>
+      <w:bookmarkEnd w:id="99"/>
     </w:p>
     <w:p>
       <w:pPr>
@@ -5248,11 +5460,11 @@
       <w:pPr>
         <w:pStyle w:val="Heading2"/>
       </w:pPr>
-      <w:bookmarkStart w:id="96" w:name="bk_anexo_b_manual_tec_23"/>
+      <w:bookmarkStart w:id="100" w:name="bk_anexo_b_manual_tec_24"/>
       <w:r>
         <w:t xml:space="preserve">13. Validacion tecnica</w:t>
       </w:r>
-      <w:bookmarkEnd w:id="96"/>
+      <w:bookmarkEnd w:id="100"/>
     </w:p>
     <w:p>
       <w:pPr>
@@ -5330,11 +5542,11 @@
       <w:pPr>
         <w:pStyle w:val="Heading2"/>
       </w:pPr>
-      <w:bookmarkStart w:id="97" w:name="bk_anexo_b_manual_tec_24"/>
+      <w:bookmarkStart w:id="101" w:name="bk_anexo_b_manual_tec_25"/>
       <w:r>
         <w:t xml:space="preserve">14. Riesgos tecnicos abiertos</w:t>
       </w:r>
-      <w:bookmarkEnd w:id="97"/>
+      <w:bookmarkEnd w:id="101"/>
     </w:p>
     <w:p>
       <w:pPr>
@@ -5377,21 +5589,21 @@
       <w:pPr>
         <w:pStyle w:val="Heading1"/>
       </w:pPr>
-      <w:bookmarkStart w:id="98" w:name="bk_anexo_c_capturas_y_1"/>
+      <w:bookmarkStart w:id="102" w:name="bk_anexo_c_capturas_y_1"/>
       <w:r>
         <w:t xml:space="preserve">Anexo C. Capturas y evidencias</w:t>
       </w:r>
-      <w:bookmarkEnd w:id="98"/>
-    </w:p>
-    <w:p>
-      <w:pPr>
-        <w:pStyle w:val="Heading2"/>
-      </w:pPr>
-      <w:bookmarkStart w:id="99" w:name="bk_anexo_c_capturas_y_2"/>
+      <w:bookmarkEnd w:id="102"/>
+    </w:p>
+    <w:p>
+      <w:pPr>
+        <w:pStyle w:val="Heading2"/>
+      </w:pPr>
+      <w:bookmarkStart w:id="103" w:name="bk_anexo_c_capturas_y_2"/>
       <w:r>
         <w:t xml:space="preserve">Indice de capturas</w:t>
       </w:r>
-      <w:bookmarkEnd w:id="99"/>
+      <w:bookmarkEnd w:id="103"/>
     </w:p>
     <w:p>
       <w:pPr>
@@ -5453,11 +5665,11 @@
       <w:pPr>
         <w:pStyle w:val="Heading2"/>
       </w:pPr>
-      <w:bookmarkStart w:id="100" w:name="bk_anexo_c_capturas_y_3"/>
+      <w:bookmarkStart w:id="104" w:name="bk_anexo_c_capturas_y_3"/>
       <w:r>
         <w:t xml:space="preserve">Inventario de archivos incluidos</w:t>
       </w:r>
-      <w:bookmarkEnd w:id="100"/>
+      <w:bookmarkEnd w:id="104"/>
     </w:p>
     <w:p>
       <w:pPr>
@@ -5519,11 +5731,11 @@
       <w:pPr>
         <w:pStyle w:val="Heading2"/>
       </w:pPr>
-      <w:bookmarkStart w:id="101" w:name="bk_anexo_c_capturas_y_4"/>
+      <w:bookmarkStart w:id="105" w:name="bk_anexo_c_capturas_y_4"/>
       <w:r>
         <w:t xml:space="preserve">Evidencias tecnicas asociadas</w:t>
       </w:r>
-      <w:bookmarkEnd w:id="101"/>
+      <w:bookmarkEnd w:id="105"/>
     </w:p>
     <w:p>
       <w:pPr>
@@ -5570,6 +5782,14 @@
         <w:pStyle w:val="List"/>
       </w:pPr>
       <w:r>
+        <w:t xml:space="preserve">- regeneracion del video de demo y de la muestra CSV/Excel con datos anonimizados para la entrega;</w:t>
+      </w:r>
+    </w:p>
+    <w:p>
+      <w:pPr>
+        <w:pStyle w:val="List"/>
+      </w:pPr>
+      <w:r>
         <w:t xml:space="preserve">- verificacion del flujo de registro, verificacion, activacion y acceso de empresa;</w:t>
       </w:r>
     </w:p>
@@ -5593,11 +5813,11 @@
       <w:pPr>
         <w:pStyle w:val="Heading2"/>
       </w:pPr>
-      <w:bookmarkStart w:id="102" w:name="bk_anexo_c_capturas_y_5"/>
+      <w:bookmarkStart w:id="106" w:name="bk_anexo_c_capturas_y_5"/>
       <w:r>
         <w:t xml:space="preserve">Criterios de captura final</w:t>
       </w:r>
-      <w:bookmarkEnd w:id="102"/>
+      <w:bookmarkEnd w:id="106"/>
     </w:p>
     <w:p>
       <w:pPr>
@@ -5656,31 +5876,31 @@
       <w:pPr>
         <w:pStyle w:val="Heading1"/>
       </w:pPr>
-      <w:bookmarkStart w:id="103" w:name="bk_anexo_d_codigo_rel_1"/>
+      <w:bookmarkStart w:id="107" w:name="bk_anexo_d_codigo_rel_1"/>
       <w:r>
         <w:t xml:space="preserve">Anexo D. Codigo Relevante</w:t>
       </w:r>
-      <w:bookmarkEnd w:id="103"/>
-    </w:p>
-    <w:p>
-      <w:pPr>
-        <w:pStyle w:val="Heading2"/>
-      </w:pPr>
-      <w:bookmarkStart w:id="104" w:name="bk_anexo_d_codigo_rel_2"/>
+      <w:bookmarkEnd w:id="107"/>
+    </w:p>
+    <w:p>
+      <w:pPr>
+        <w:pStyle w:val="Heading2"/>
+      </w:pPr>
+      <w:bookmarkStart w:id="108" w:name="bk_anexo_d_codigo_rel_2"/>
       <w:r>
         <w:t xml:space="preserve">1. Backend</w:t>
       </w:r>
-      <w:bookmarkEnd w:id="104"/>
+      <w:bookmarkEnd w:id="108"/>
     </w:p>
     <w:p>
       <w:pPr>
         <w:pStyle w:val="Heading3"/>
       </w:pPr>
-      <w:bookmarkStart w:id="105" w:name="bk_anexo_d_codigo_rel_3"/>
+      <w:bookmarkStart w:id="109" w:name="bk_anexo_d_codigo_rel_3"/>
       <w:r>
         <w:t xml:space="preserve">Seguridad y autenticacion</w:t>
       </w:r>
-      <w:bookmarkEnd w:id="105"/>
+      <w:bookmarkEnd w:id="109"/>
     </w:p>
     <w:p>
       <w:pPr>
@@ -5710,11 +5930,11 @@
       <w:pPr>
         <w:pStyle w:val="Heading3"/>
       </w:pPr>
-      <w:bookmarkStart w:id="106" w:name="bk_anexo_d_codigo_rel_4"/>
+      <w:bookmarkStart w:id="110" w:name="bk_anexo_d_codigo_rel_4"/>
       <w:r>
         <w:t xml:space="preserve">Dominio y persistencia</w:t>
       </w:r>
-      <w:bookmarkEnd w:id="106"/>
+      <w:bookmarkEnd w:id="110"/>
     </w:p>
     <w:p>
       <w:pPr>
@@ -5776,11 +5996,11 @@
       <w:pPr>
         <w:pStyle w:val="Heading3"/>
       </w:pPr>
-      <w:bookmarkStart w:id="107" w:name="bk_anexo_d_codigo_rel_5"/>
+      <w:bookmarkStart w:id="111" w:name="bk_anexo_d_codigo_rel_5"/>
       <w:r>
         <w:t xml:space="preserve">Casos de uso principales</w:t>
       </w:r>
-      <w:bookmarkEnd w:id="107"/>
+      <w:bookmarkEnd w:id="111"/>
     </w:p>
     <w:p>
       <w:pPr>
@@ -5834,21 +6054,21 @@
       <w:pPr>
         <w:pStyle w:val="Heading2"/>
       </w:pPr>
-      <w:bookmarkStart w:id="108" w:name="bk_anexo_d_codigo_rel_6"/>
+      <w:bookmarkStart w:id="112" w:name="bk_anexo_d_codigo_rel_6"/>
       <w:r>
         <w:t xml:space="preserve">2. Frontend interno</w:t>
       </w:r>
-      <w:bookmarkEnd w:id="108"/>
+      <w:bookmarkEnd w:id="112"/>
     </w:p>
     <w:p>
       <w:pPr>
         <w:pStyle w:val="Heading3"/>
       </w:pPr>
-      <w:bookmarkStart w:id="109" w:name="bk_anexo_d_codigo_rel_7"/>
+      <w:bookmarkStart w:id="113" w:name="bk_anexo_d_codigo_rel_7"/>
       <w:r>
         <w:t xml:space="preserve">Shell principal y modulos</w:t>
       </w:r>
-      <w:bookmarkEnd w:id="109"/>
+      <w:bookmarkEnd w:id="113"/>
     </w:p>
     <w:p>
       <w:pPr>
@@ -5862,11 +6082,11 @@
       <w:pPr>
         <w:pStyle w:val="Heading3"/>
       </w:pPr>
-      <w:bookmarkStart w:id="110" w:name="bk_anexo_d_codigo_rel_8"/>
+      <w:bookmarkStart w:id="114" w:name="bk_anexo_d_codigo_rel_8"/>
       <w:r>
         <w:t xml:space="preserve">Formularios reutilizables</w:t>
       </w:r>
-      <w:bookmarkEnd w:id="110"/>
+      <w:bookmarkEnd w:id="114"/>
     </w:p>
     <w:p>
       <w:pPr>
@@ -5904,11 +6124,11 @@
       <w:pPr>
         <w:pStyle w:val="Heading3"/>
       </w:pPr>
-      <w:bookmarkStart w:id="111" w:name="bk_anexo_d_codigo_rel_9"/>
+      <w:bookmarkStart w:id="115" w:name="bk_anexo_d_codigo_rel_9"/>
       <w:r>
         <w:t xml:space="preserve">Infraestructura de UI</w:t>
       </w:r>
-      <w:bookmarkEnd w:id="111"/>
+      <w:bookmarkEnd w:id="115"/>
     </w:p>
     <w:p>
       <w:pPr>
@@ -5938,11 +6158,11 @@
       <w:pPr>
         <w:pStyle w:val="Heading3"/>
       </w:pPr>
-      <w:bookmarkStart w:id="112" w:name="bk_anexo_d_codigo_rel_10"/>
+      <w:bookmarkStart w:id="116" w:name="bk_anexo_d_codigo_rel_10"/>
       <w:r>
         <w:t xml:space="preserve">Cliente API y exportacion</w:t>
       </w:r>
-      <w:bookmarkEnd w:id="112"/>
+      <w:bookmarkEnd w:id="116"/>
     </w:p>
     <w:p>
       <w:pPr>
@@ -5964,11 +6184,11 @@
       <w:pPr>
         <w:pStyle w:val="Heading2"/>
       </w:pPr>
-      <w:bookmarkStart w:id="113" w:name="bk_anexo_d_codigo_rel_11"/>
+      <w:bookmarkStart w:id="117" w:name="bk_anexo_d_codigo_rel_11"/>
       <w:r>
         <w:t xml:space="preserve">3. Frontend externo</w:t>
       </w:r>
-      <w:bookmarkEnd w:id="113"/>
+      <w:bookmarkEnd w:id="117"/>
     </w:p>
     <w:p>
       <w:pPr>
@@ -5982,11 +6202,11 @@
       <w:pPr>
         <w:pStyle w:val="Heading2"/>
       </w:pPr>
-      <w:bookmarkStart w:id="114" w:name="bk_anexo_d_codigo_rel_12"/>
+      <w:bookmarkStart w:id="118" w:name="bk_anexo_d_codigo_rel_12"/>
       <w:r>
         <w:t xml:space="preserve">4. Suite de pruebas destacada</w:t>
       </w:r>
-      <w:bookmarkEnd w:id="114"/>
+      <w:bookmarkEnd w:id="118"/>
     </w:p>
     <w:p>
       <w:pPr>
@@ -6040,11 +6260,11 @@
       <w:pPr>
         <w:pStyle w:val="Heading2"/>
       </w:pPr>
-      <w:bookmarkStart w:id="115" w:name="bk_anexo_d_codigo_rel_13"/>
+      <w:bookmarkStart w:id="119" w:name="bk_anexo_d_codigo_rel_13"/>
       <w:r>
         <w:t xml:space="preserve">5. Criterio de seleccion</w:t>
       </w:r>
-      <w:bookmarkEnd w:id="115"/>
+      <w:bookmarkEnd w:id="119"/>
     </w:p>
     <w:p>
       <w:pPr>

</xml_diff>

<commit_message>
Oculta sincronizacion tecnica del portal
</commit_message>
<xml_diff>
--- a/docs/memoria-final.docx
+++ b/docs/memoria-final.docx
@@ -10,8 +10,8 @@
   <dc:title>Memoria final TFG</dc:title>
   <dc:creator>Luis Angel</dc:creator>
   <cp:lastModifiedBy>Codex</cp:lastModifiedBy>
-  <dcterms:created xsi:type="dcterms:W3CDTF">2026-04-26T19:07:16.923Z</dcterms:created>
-  <dcterms:modified xsi:type="dcterms:W3CDTF">2026-04-26T19:07:16.923Z</dcterms:modified>
+  <dcterms:created xsi:type="dcterms:W3CDTF">2026-04-27T19:30:59.051Z</dcterms:created>
+  <dcterms:modified xsi:type="dcterms:W3CDTF">2026-04-27T19:30:59.051Z</dcterms:modified>
 </cp:coreProperties>
 </file>
 
@@ -2211,7 +2211,7 @@
       <w:r>
         <w:drawing>
           <wp:inline xmlns:wp="http://schemas.openxmlformats.org/drawingml/2006/wordprocessingDrawing" distT="0" distB="0" distL="0" distR="0">
-            <wp:extent cx="5669280" cy="4212984"/>
+            <wp:extent cx="5669280" cy="3188970"/>
             <wp:docPr id="4" name="04-panel-interno-bandeja.png"/>
             <a:graphic xmlns:a="http://schemas.openxmlformats.org/drawingml/2006/main">
               <a:graphicData uri="http://schemas.openxmlformats.org/drawingml/2006/picture">
@@ -2229,7 +2229,7 @@
                   <pic:spPr>
                     <a:xfrm>
                       <a:off x="0" y="0"/>
-                      <a:ext cx="5669280" cy="4212984"/>
+                      <a:ext cx="5669280" cy="3188970"/>
                     </a:xfrm>
                     <a:prstGeom prst="rect">
                       <a:avLst/>
@@ -2309,7 +2309,7 @@
       <w:r>
         <w:drawing>
           <wp:inline xmlns:wp="http://schemas.openxmlformats.org/drawingml/2006/wordprocessingDrawing" distT="0" distB="0" distL="0" distR="0">
-            <wp:extent cx="5632426" cy="7406640"/>
+            <wp:extent cx="5669280" cy="3188970"/>
             <wp:docPr id="6" name="06-documentacion-guia.png"/>
             <a:graphic xmlns:a="http://schemas.openxmlformats.org/drawingml/2006/main">
               <a:graphicData uri="http://schemas.openxmlformats.org/drawingml/2006/picture">
@@ -2327,7 +2327,7 @@
                   <pic:spPr>
                     <a:xfrm>
                       <a:off x="0" y="0"/>
-                      <a:ext cx="5632426" cy="7406640"/>
+                      <a:ext cx="5669280" cy="3188970"/>
                     </a:xfrm>
                     <a:prstGeom prst="rect">
                       <a:avLst/>
@@ -2443,7 +2443,7 @@
         <w:pStyle w:val="Normal"/>
       </w:pPr>
       <w:r>
-        <w:t xml:space="preserve">El portal interno funciona como shell de gestion academica y administrativa. Desde ahi se consultan KPI, se gestionan entidades principales, se revisan solicitudes, se accede a fichas 360 de empresas y convenios, se trabaja con seguimientos y se lanzan exportaciones CSV. El panel incorpora una pagina de acceso profesional, una bandeja unificada de mensajeria para conversaciones empresa-centro y un monitor privado separado del resto del uso operativo. Para reforzar la coherencia del proceso, la campana superior concentra tanto las solicitudes pendientes como el acceso a la bandeja, mientras que los formularios filtran y validan las entidades operativas antes de permitir convenios o asignaciones.</w:t>
+        <w:t xml:space="preserve">El portal interno funciona como shell de gestion academica y administrativa. Desde ahi se consultan KPI, se gestionan entidades principales, se revisan solicitudes, se accede a fichas 360 de empresas y convenios, se trabaja con seguimientos y se lanzan exportaciones CSV. El panel incorpora una pagina de acceso profesional, una bandeja unificada de mensajeria para conversaciones empresa-centro y un monitor privado separado del resto del uso operativo. En la version final, la sincronizacion del portal funcional es automatica y silenciosa: se refresca de forma periodica y tambien cuando el navegador recupera el foco, sin mostrar la URL tecnica de la API ni un boton manual de sincronizacion durante la demo. Para reforzar la coherencia del proceso, la campana superior concentra tanto las solicitudes pendientes como el acceso a la bandeja, mientras que los formularios filtran y validan las entidades operativas antes de permitir convenios o asignaciones.</w:t>
       </w:r>
     </w:p>
     <w:p>
@@ -2673,7 +2673,7 @@
         <w:pStyle w:val="Normal"/>
       </w:pPr>
       <w:r>
-        <w:t xml:space="preserve">La build integrada de los dos frontends se genera correctamente y se publica en las rutas del backend. El panel interno, el portal externo, la documentacion y el monitor privado quedan accesibles desde la URL local integrada. El flujo de empresa cubre registro, verificacion, revision interna, activacion de cuenta y acceso posterior. El monitor privado valida el estado de servicios, el correo saliente, la documentacion previsualizable y el control del acceso publico con MFA.</w:t>
+        <w:t xml:space="preserve">La build integrada de los dos frontends se genera correctamente y se publica en las rutas del backend. El panel interno, el portal externo, la documentacion y el monitor privado quedan accesibles desde la URL local integrada. El flujo de empresa cubre registro, verificacion, revision interna, activacion de cuenta y acceso posterior. El monitor privado valida el estado de servicios, el correo saliente, la documentacion previsualizable, la sincronizacion manual de supervision y el control del acceso publico con MFA.</w:t>
       </w:r>
     </w:p>
     <w:p>
@@ -3463,6 +3463,14 @@
       </w:pPr>
       <w:r>
         <w:t xml:space="preserve">- exportar un CSV de resumen con indicadores y analitica.</w:t>
+      </w:r>
+    </w:p>
+    <w:p>
+      <w:pPr>
+        <w:pStyle w:val="Normal"/>
+      </w:pPr>
+      <w:r>
+        <w:t xml:space="preserve">La sincronizacion del panel interno se realiza de forma automatica en segundo plano. En la version final no se muestra la URL tecnica de la API ni un boton de sincronizacion en el dashboard o en la barra superior; el control manual queda reservado al monitor privado, donde se usa como herramienta de supervision durante la demo tecnica.</w:t>
       </w:r>
     </w:p>
     <w:p>

</xml_diff>

<commit_message>
Pulido final de entrega TFG
</commit_message>
<xml_diff>
--- a/docs/memoria-final.docx
+++ b/docs/memoria-final.docx
@@ -10,8 +10,8 @@
   <dc:title>Memoria final TFG</dc:title>
   <dc:creator>Luis Angel</dc:creator>
   <cp:lastModifiedBy>Codex</cp:lastModifiedBy>
-  <dcterms:created xsi:type="dcterms:W3CDTF">2026-04-27T19:30:59.051Z</dcterms:created>
-  <dcterms:modified xsi:type="dcterms:W3CDTF">2026-04-27T19:30:59.051Z</dcterms:modified>
+  <dcterms:created xsi:type="dcterms:W3CDTF">2026-05-03T19:11:43.490Z</dcterms:created>
+  <dcterms:modified xsi:type="dcterms:W3CDTF">2026-05-03T19:11:43.490Z</dcterms:modified>
 </cp:coreProperties>
 </file>
 

</xml_diff>

<commit_message>
Refresh public smoke and memory deliverables
</commit_message>
<xml_diff>
--- a/docs/memoria-final.docx
+++ b/docs/memoria-final.docx
@@ -10,8 +10,8 @@
   <dc:title>Memoria final TFG</dc:title>
   <dc:creator>Luis Angel</dc:creator>
   <cp:lastModifiedBy>Codex</cp:lastModifiedBy>
-  <dcterms:created xsi:type="dcterms:W3CDTF">2026-05-17T22:39:19.722Z</dcterms:created>
-  <dcterms:modified xsi:type="dcterms:W3CDTF">2026-05-17T22:39:19.722Z</dcterms:modified>
+  <dcterms:created xsi:type="dcterms:W3CDTF">2026-05-17T23:57:26.724Z</dcterms:created>
+  <dcterms:modified xsi:type="dcterms:W3CDTF">2026-05-17T23:57:26.724Z</dcterms:modified>
 </cp:coreProperties>
 </file>
 
@@ -322,7 +322,7 @@
         <w:pStyle w:val="TocEntry"/>
         <w:ind w:left="360"/>
       </w:pPr>
-      <w:hyperlink w:anchor="bk_memoria_final_18" w:history="1">
+      <w:hyperlink w:anchor="bk_memoria_final_19" w:history="1">
         <w:r>
           <w:rPr>
             <w:rStyle w:val="Hyperlink"/>
@@ -336,7 +336,7 @@
         <w:pStyle w:val="TocEntry"/>
         <w:ind w:left="360"/>
       </w:pPr>
-      <w:hyperlink w:anchor="bk_memoria_final_19" w:history="1">
+      <w:hyperlink w:anchor="bk_memoria_final_20" w:history="1">
         <w:r>
           <w:rPr>
             <w:rStyle w:val="Hyperlink"/>
@@ -350,7 +350,7 @@
         <w:pStyle w:val="TocEntry"/>
         <w:ind w:left="360"/>
       </w:pPr>
-      <w:hyperlink w:anchor="bk_memoria_final_20" w:history="1">
+      <w:hyperlink w:anchor="bk_memoria_final_22" w:history="1">
         <w:r>
           <w:rPr>
             <w:rStyle w:val="Hyperlink"/>
@@ -364,7 +364,7 @@
         <w:pStyle w:val="TocEntry"/>
         <w:ind w:left="360"/>
       </w:pPr>
-      <w:hyperlink w:anchor="bk_memoria_final_21" w:history="1">
+      <w:hyperlink w:anchor="bk_memoria_final_23" w:history="1">
         <w:r>
           <w:rPr>
             <w:rStyle w:val="Hyperlink"/>
@@ -378,7 +378,7 @@
         <w:pStyle w:val="TocEntry"/>
         <w:ind w:left="360"/>
       </w:pPr>
-      <w:hyperlink w:anchor="bk_memoria_final_22" w:history="1">
+      <w:hyperlink w:anchor="bk_memoria_final_25" w:history="1">
         <w:r>
           <w:rPr>
             <w:rStyle w:val="Hyperlink"/>
@@ -391,7 +391,7 @@
       <w:pPr>
         <w:pStyle w:val="TocEntry"/>
       </w:pPr>
-      <w:hyperlink w:anchor="bk_memoria_final_23" w:history="1">
+      <w:hyperlink w:anchor="bk_memoria_final_26" w:history="1">
         <w:r>
           <w:rPr>
             <w:rStyle w:val="Hyperlink"/>
@@ -405,7 +405,7 @@
         <w:pStyle w:val="TocEntry"/>
         <w:ind w:left="360"/>
       </w:pPr>
-      <w:hyperlink w:anchor="bk_memoria_final_24" w:history="1">
+      <w:hyperlink w:anchor="bk_memoria_final_27" w:history="1">
         <w:r>
           <w:rPr>
             <w:rStyle w:val="Hyperlink"/>
@@ -419,7 +419,7 @@
         <w:pStyle w:val="TocEntry"/>
         <w:ind w:left="360"/>
       </w:pPr>
-      <w:hyperlink w:anchor="bk_memoria_final_25" w:history="1">
+      <w:hyperlink w:anchor="bk_memoria_final_28" w:history="1">
         <w:r>
           <w:rPr>
             <w:rStyle w:val="Hyperlink"/>
@@ -433,7 +433,7 @@
         <w:pStyle w:val="TocEntry"/>
         <w:ind w:left="360"/>
       </w:pPr>
-      <w:hyperlink w:anchor="bk_memoria_final_26" w:history="1">
+      <w:hyperlink w:anchor="bk_memoria_final_29" w:history="1">
         <w:r>
           <w:rPr>
             <w:rStyle w:val="Hyperlink"/>
@@ -447,7 +447,7 @@
         <w:pStyle w:val="TocEntry"/>
         <w:ind w:left="360"/>
       </w:pPr>
-      <w:hyperlink w:anchor="bk_memoria_final_27" w:history="1">
+      <w:hyperlink w:anchor="bk_memoria_final_30" w:history="1">
         <w:r>
           <w:rPr>
             <w:rStyle w:val="Hyperlink"/>
@@ -461,7 +461,7 @@
         <w:pStyle w:val="TocEntry"/>
         <w:ind w:left="360"/>
       </w:pPr>
-      <w:hyperlink w:anchor="bk_memoria_final_28" w:history="1">
+      <w:hyperlink w:anchor="bk_memoria_final_31" w:history="1">
         <w:r>
           <w:rPr>
             <w:rStyle w:val="Hyperlink"/>
@@ -474,7 +474,7 @@
       <w:pPr>
         <w:pStyle w:val="TocEntry"/>
       </w:pPr>
-      <w:hyperlink w:anchor="bk_memoria_final_29" w:history="1">
+      <w:hyperlink w:anchor="bk_memoria_final_32" w:history="1">
         <w:r>
           <w:rPr>
             <w:rStyle w:val="Hyperlink"/>
@@ -488,7 +488,7 @@
         <w:pStyle w:val="TocEntry"/>
         <w:ind w:left="360"/>
       </w:pPr>
-      <w:hyperlink w:anchor="bk_memoria_final_30" w:history="1">
+      <w:hyperlink w:anchor="bk_memoria_final_33" w:history="1">
         <w:r>
           <w:rPr>
             <w:rStyle w:val="Hyperlink"/>
@@ -502,7 +502,7 @@
         <w:pStyle w:val="TocEntry"/>
         <w:ind w:left="360"/>
       </w:pPr>
-      <w:hyperlink w:anchor="bk_memoria_final_31" w:history="1">
+      <w:hyperlink w:anchor="bk_memoria_final_34" w:history="1">
         <w:r>
           <w:rPr>
             <w:rStyle w:val="Hyperlink"/>
@@ -516,7 +516,7 @@
         <w:pStyle w:val="TocEntry"/>
         <w:ind w:left="360"/>
       </w:pPr>
-      <w:hyperlink w:anchor="bk_memoria_final_32" w:history="1">
+      <w:hyperlink w:anchor="bk_memoria_final_35" w:history="1">
         <w:r>
           <w:rPr>
             <w:rStyle w:val="Hyperlink"/>
@@ -530,7 +530,7 @@
         <w:pStyle w:val="TocEntry"/>
         <w:ind w:left="360"/>
       </w:pPr>
-      <w:hyperlink w:anchor="bk_memoria_final_33" w:history="1">
+      <w:hyperlink w:anchor="bk_memoria_final_36" w:history="1">
         <w:r>
           <w:rPr>
             <w:rStyle w:val="Hyperlink"/>
@@ -544,7 +544,7 @@
         <w:pStyle w:val="TocEntry"/>
         <w:ind w:left="360"/>
       </w:pPr>
-      <w:hyperlink w:anchor="bk_memoria_final_34" w:history="1">
+      <w:hyperlink w:anchor="bk_memoria_final_37" w:history="1">
         <w:r>
           <w:rPr>
             <w:rStyle w:val="Hyperlink"/>
@@ -557,7 +557,7 @@
       <w:pPr>
         <w:pStyle w:val="TocEntry"/>
       </w:pPr>
-      <w:hyperlink w:anchor="bk_memoria_final_35" w:history="1">
+      <w:hyperlink w:anchor="bk_memoria_final_38" w:history="1">
         <w:r>
           <w:rPr>
             <w:rStyle w:val="Hyperlink"/>
@@ -571,7 +571,7 @@
         <w:pStyle w:val="TocEntry"/>
         <w:ind w:left="360"/>
       </w:pPr>
-      <w:hyperlink w:anchor="bk_memoria_final_36" w:history="1">
+      <w:hyperlink w:anchor="bk_memoria_final_39" w:history="1">
         <w:r>
           <w:rPr>
             <w:rStyle w:val="Hyperlink"/>
@@ -585,7 +585,7 @@
         <w:pStyle w:val="TocEntry"/>
         <w:ind w:left="360"/>
       </w:pPr>
-      <w:hyperlink w:anchor="bk_memoria_final_37" w:history="1">
+      <w:hyperlink w:anchor="bk_memoria_final_40" w:history="1">
         <w:r>
           <w:rPr>
             <w:rStyle w:val="Hyperlink"/>
@@ -599,7 +599,7 @@
         <w:pStyle w:val="TocEntry"/>
         <w:ind w:left="360"/>
       </w:pPr>
-      <w:hyperlink w:anchor="bk_memoria_final_38" w:history="1">
+      <w:hyperlink w:anchor="bk_memoria_final_41" w:history="1">
         <w:r>
           <w:rPr>
             <w:rStyle w:val="Hyperlink"/>
@@ -613,7 +613,7 @@
         <w:pStyle w:val="TocEntry"/>
         <w:ind w:left="360"/>
       </w:pPr>
-      <w:hyperlink w:anchor="bk_memoria_final_39" w:history="1">
+      <w:hyperlink w:anchor="bk_memoria_final_42" w:history="1">
         <w:r>
           <w:rPr>
             <w:rStyle w:val="Hyperlink"/>
@@ -627,7 +627,7 @@
         <w:pStyle w:val="TocEntry"/>
         <w:ind w:left="360"/>
       </w:pPr>
-      <w:hyperlink w:anchor="bk_memoria_final_40" w:history="1">
+      <w:hyperlink w:anchor="bk_memoria_final_43" w:history="1">
         <w:r>
           <w:rPr>
             <w:rStyle w:val="Hyperlink"/>
@@ -641,7 +641,7 @@
         <w:pStyle w:val="TocEntry"/>
         <w:ind w:left="360"/>
       </w:pPr>
-      <w:hyperlink w:anchor="bk_memoria_final_41" w:history="1">
+      <w:hyperlink w:anchor="bk_memoria_final_44" w:history="1">
         <w:r>
           <w:rPr>
             <w:rStyle w:val="Hyperlink"/>
@@ -654,7 +654,7 @@
       <w:pPr>
         <w:pStyle w:val="TocEntry"/>
       </w:pPr>
-      <w:hyperlink w:anchor="bk_memoria_final_42" w:history="1">
+      <w:hyperlink w:anchor="bk_memoria_final_45" w:history="1">
         <w:r>
           <w:rPr>
             <w:rStyle w:val="Hyperlink"/>
@@ -668,7 +668,7 @@
         <w:pStyle w:val="TocEntry"/>
         <w:ind w:left="360"/>
       </w:pPr>
-      <w:hyperlink w:anchor="bk_memoria_final_43" w:history="1">
+      <w:hyperlink w:anchor="bk_memoria_final_46" w:history="1">
         <w:r>
           <w:rPr>
             <w:rStyle w:val="Hyperlink"/>
@@ -682,7 +682,7 @@
         <w:pStyle w:val="TocEntry"/>
         <w:ind w:left="360"/>
       </w:pPr>
-      <w:hyperlink w:anchor="bk_memoria_final_44" w:history="1">
+      <w:hyperlink w:anchor="bk_memoria_final_47" w:history="1">
         <w:r>
           <w:rPr>
             <w:rStyle w:val="Hyperlink"/>
@@ -695,7 +695,7 @@
       <w:pPr>
         <w:pStyle w:val="TocEntry"/>
       </w:pPr>
-      <w:hyperlink w:anchor="bk_memoria_final_45" w:history="1">
+      <w:hyperlink w:anchor="bk_memoria_final_48" w:history="1">
         <w:r>
           <w:rPr>
             <w:rStyle w:val="Hyperlink"/>
@@ -708,7 +708,7 @@
       <w:pPr>
         <w:pStyle w:val="TocEntry"/>
       </w:pPr>
-      <w:hyperlink w:anchor="bk_memoria_final_46" w:history="1">
+      <w:hyperlink w:anchor="bk_memoria_final_49" w:history="1">
         <w:r>
           <w:rPr>
             <w:rStyle w:val="Hyperlink"/>
@@ -721,7 +721,7 @@
       <w:pPr>
         <w:pStyle w:val="TocEntry"/>
       </w:pPr>
-      <w:hyperlink w:anchor="bk_memoria_final_47" w:history="1">
+      <w:hyperlink w:anchor="bk_memoria_final_50" w:history="1">
         <w:r>
           <w:rPr>
             <w:rStyle w:val="Hyperlink"/>
@@ -735,7 +735,7 @@
         <w:pStyle w:val="TocEntry"/>
         <w:ind w:left="360"/>
       </w:pPr>
-      <w:hyperlink w:anchor="bk_memoria_final_48" w:history="1">
+      <w:hyperlink w:anchor="bk_memoria_final_51" w:history="1">
         <w:r>
           <w:rPr>
             <w:rStyle w:val="Hyperlink"/>
@@ -749,7 +749,7 @@
         <w:pStyle w:val="TocEntry"/>
         <w:ind w:left="360"/>
       </w:pPr>
-      <w:hyperlink w:anchor="bk_memoria_final_49" w:history="1">
+      <w:hyperlink w:anchor="bk_memoria_final_52" w:history="1">
         <w:r>
           <w:rPr>
             <w:rStyle w:val="Hyperlink"/>
@@ -763,7 +763,7 @@
         <w:pStyle w:val="TocEntry"/>
         <w:ind w:left="360"/>
       </w:pPr>
-      <w:hyperlink w:anchor="bk_memoria_final_50" w:history="1">
+      <w:hyperlink w:anchor="bk_memoria_final_53" w:history="1">
         <w:r>
           <w:rPr>
             <w:rStyle w:val="Hyperlink"/>
@@ -777,7 +777,7 @@
         <w:pStyle w:val="TocEntry"/>
         <w:ind w:left="360"/>
       </w:pPr>
-      <w:hyperlink w:anchor="bk_memoria_final_51" w:history="1">
+      <w:hyperlink w:anchor="bk_memoria_final_54" w:history="1">
         <w:r>
           <w:rPr>
             <w:rStyle w:val="Hyperlink"/>
@@ -1552,7 +1552,7 @@
         <w:pStyle w:val="Normal"/>
       </w:pPr>
       <w:r>
-        <w:t xml:space="preserve">Este proyecto desarrolla una plataforma para gestionar empresas colaboradoras, convenios, estudiantes, tutores, seguimientos y solicitudes externas en un entorno de FP Dual. La solucion se compone de una API en Symfony, un portal interno en React y TypeScript, un portal externo orientado a empresas interesadas en colaborar con el centro, una guia documental separada, una capa privada de supervision tecnica y una app de escritorio para operacion local. La aplicacion cubre el ciclo operativo completo: alta de empresas, verificacion por correo, revision interna, activacion de cuentas persistentes de empresa, gestion de convenios, asignacion de estudiantes, seguimiento con evidencias, evaluacion final, control documental versionado, exportacion CSV y control local de servicios con pruebas y backups. La entrega final prioriza mantenibilidad, separacion clara de responsabilidades, despliegue integrado y publicacion reproducible tanto en local como en una VM publica, y una base funcional suficientemente solida para su defensa academica.</w:t>
+        <w:t xml:space="preserve">Este proyecto desarrolla una plataforma para gestionar empresas colaboradoras, convenios, estudiantes, tutores, seguimientos y solicitudes externas en un entorno de FP Dual. La solucion se compone de una API en Symfony, un portal interno en React y TypeScript, un portal externo orientado a empresas interesadas en colaborar con el centro, una guia documental separada, una capa privada de supervision tecnica y una app de escritorio para operacion local. La aplicacion cubre el ciclo operativo completo: preregistro de cuentas de empresa, envio de solicitudes corporativas, verificacion por correo, revision interna, continuidad de acceso antes y despues de la aprobacion, gestion de convenios, asignacion de estudiantes, seguimiento con evidencias, evaluacion final, control documental versionado, exportacion CSV y control local de servicios con pruebas y backups. La entrega final prioriza mantenibilidad, separacion clara de responsabilidades, despliegue integrado y publicacion reproducible tanto en local como en una VM publica, y una base funcional suficientemente solida para su defensa academica.</w:t>
       </w:r>
     </w:p>
     <w:p>
@@ -1682,7 +1682,7 @@
         <w:pStyle w:val="List"/>
       </w:pPr>
       <w:r>
-        <w:t xml:space="preserve">4. Incorporar un portal de empresa postaprobacion con cuenta persistente, acceso y recuperacion de contrasena.</w:t>
+        <w:t xml:space="preserve">4. Incorporar un portal de empresa con cuenta persistente previa a la solicitud, acceso continuo, verificacion y recuperacion de contrasena.</w:t>
       </w:r>
     </w:p>
     <w:p>
@@ -1732,7 +1732,7 @@
         <w:pStyle w:val="Normal"/>
       </w:pPr>
       <w:r>
-        <w:t xml:space="preserve">Dentro del alcance actual se incluyen el portal interno, el portal externo, la API REST, la persistencia relacional, la autenticacion interna, el registro externo, la verificacion por correo, la aprobacion interna, la activacion de cuentas de empresa, la mensajeria empresa-centro, la bandeja unificada, el seguimiento con evidencias, la evaluacion final, el control documental versionado, la exportacion CSV, un monitor privado con MFA para operaciones sensibles, una app de escritorio capaz de levantar servicios, ejecutar pruebas, revisar logs y gestionar backups SQLite, y un despliegue funcional en Google Cloud Compute Engine con Docker Compose y PostgreSQL. Quedan fuera de alcance, en esta entrega, la firma electronica avanzada, las integraciones corporativas con ERP o directorios institucionales, el endurecimiento completo de produccion con HTTPS y dominio propio, y el almacenamiento documental en nube gestionada.</w:t>
+        <w:t xml:space="preserve">Dentro del alcance actual se incluyen el portal interno, el portal externo, la API REST, la persistencia relacional, la autenticacion interna, el preregistro externo de cuentas de empresa, la verificacion por correo, la aprobacion interna, la mensajeria empresa-centro, la bandeja unificada, el seguimiento con evidencias, la evaluacion final, el control documental versionado, la exportacion CSV, un monitor privado con MFA para operaciones sensibles, una app de escritorio capaz de levantar servicios, ejecutar pruebas, revisar logs y gestionar backups SQLite, y un despliegue funcional en Google Cloud Compute Engine con Docker Compose y PostgreSQL. Quedan fuera de alcance, en esta entrega, la firma electronica avanzada, las integraciones corporativas con ERP o directorios institucionales, el endurecimiento completo de produccion con HTTPS y dominio propio, y el almacenamiento documental en nube gestionada.</w:t>
       </w:r>
     </w:p>
     <w:p>
@@ -1818,7 +1818,7 @@
         <w:pStyle w:val="List"/>
       </w:pPr>
       <w:r>
-        <w:t xml:space="preserve">- Empresas ya aprobadas con cuenta persistente en el portal externo.</w:t>
+        <w:t xml:space="preserve">- Empresas con cuenta persistente en el portal externo antes y despues de la aprobacion.</w:t>
       </w:r>
     </w:p>
     <w:p>
@@ -1860,7 +1860,7 @@
         <w:pStyle w:val="List"/>
       </w:pPr>
       <w:r>
-        <w:t xml:space="preserve">- Verificar el correo de contacto de la empresa y habilitar una cuenta persistente tras la aprobacion.</w:t>
+        <w:t xml:space="preserve">- Verificar el correo de contacto de la empresa y mantener una cuenta persistente desde el preregistro hasta la operativa posterior.</w:t>
       </w:r>
     </w:p>
     <w:p>
@@ -2114,13 +2114,407 @@
     </w:p>
     <w:p>
       <w:pPr>
+        <w:pStyle w:val="Heading3"/>
+      </w:pPr>
+      <w:bookmarkStart w:id="19" w:name="bk_memoria_final_18"/>
+      <w:r>
+        <w:t xml:space="preserve">Esquema detallado de arquitectura</w:t>
+      </w:r>
+      <w:bookmarkEnd w:id="19"/>
+    </w:p>
+    <w:p>
+      <w:pPr>
+        <w:pStyle w:val="Normal"/>
+      </w:pPr>
+      <w:r>
+        <w:t xml:space="preserve">En la defensa resulta mas claro bajar un nivel adicional y expresar la arquitectura como un recorrido tecnico de extremo a extremo:</w:t>
+      </w:r>
+    </w:p>
+    <w:p>
+      <w:pPr>
+        <w:pStyle w:val="Code"/>
+      </w:pPr>
+      <w:r>
+        <w:t xml:space="preserve">Navegador empresa</w:t>
+      </w:r>
+    </w:p>
+    <w:p>
+      <w:pPr>
+        <w:pStyle w:val="Code"/>
+      </w:pPr>
+      <w:r>
+        <w:t xml:space="preserve">  -&gt; SPA React externa (/externo)</w:t>
+      </w:r>
+    </w:p>
+    <w:p>
+      <w:pPr>
+        <w:pStyle w:val="Code"/>
+      </w:pPr>
+      <w:r>
+        <w:t xml:space="preserve">     -&gt; /portal-auth/register, /portal-auth/login, /portal-auth/me</w:t>
+      </w:r>
+    </w:p>
+    <w:p>
+      <w:pPr>
+        <w:pStyle w:val="Code"/>
+      </w:pPr>
+      <w:r>
+        <w:t xml:space="preserve">     -&gt; /api/portal-company/request, /api/portal-company/overview, /api/portal-company/messages</w:t>
+      </w:r>
+    </w:p>
+    <w:p>
+      <w:pPr>
+        <w:pStyle w:val="Code"/>
+      </w:pPr>
+      <w:r>
+        <w:t xml:space="preserve">     -&gt; /portal/solicitudes/{token} y /registro-empresa/confirmar para enlaces publicos y verificacion</w:t>
+      </w:r>
+    </w:p>
+    <w:p>
+      <w:pPr>
+        <w:pStyle w:val="Code"/>
+      </w:pPr>
+      <w:r>
+        <w:t xml:space="preserve"/>
+      </w:r>
+    </w:p>
+    <w:p>
+      <w:pPr>
+        <w:pStyle w:val="Code"/>
+      </w:pPr>
+      <w:r>
+        <w:t xml:space="preserve">Navegador centro</w:t>
+      </w:r>
+    </w:p>
+    <w:p>
+      <w:pPr>
+        <w:pStyle w:val="Code"/>
+      </w:pPr>
+      <w:r>
+        <w:t xml:space="preserve">  -&gt; SPA React interna (/app)</w:t>
+      </w:r>
+    </w:p>
+    <w:p>
+      <w:pPr>
+        <w:pStyle w:val="Code"/>
+      </w:pPr>
+      <w:r>
+        <w:t xml:space="preserve">     -&gt; /api/login, /api/me, /api/bootstrap</w:t>
+      </w:r>
+    </w:p>
+    <w:p>
+      <w:pPr>
+        <w:pStyle w:val="Code"/>
+      </w:pPr>
+      <w:r>
+        <w:t xml:space="preserve">     -&gt; /api/empresa-solicitudes, /api/empresa-solicitudes/{id}/aprobar, /api/empresa-solicitudes/{id}/rechazar</w:t>
+      </w:r>
+    </w:p>
+    <w:p>
+      <w:pPr>
+        <w:pStyle w:val="Code"/>
+      </w:pPr>
+      <w:r>
+        <w:t xml:space="preserve">     -&gt; /api/empresa-solicitudes/bandeja y /api/empresa-solicitudes/{id}/mensajes</w:t>
+      </w:r>
+    </w:p>
+    <w:p>
+      <w:pPr>
+        <w:pStyle w:val="Code"/>
+      </w:pPr>
+      <w:r>
+        <w:t xml:space="preserve">     -&gt; /api/empresas, /api/convenios, /api/estudiantes, /api/asignaciones</w:t>
+      </w:r>
+    </w:p>
+    <w:p>
+      <w:pPr>
+        <w:pStyle w:val="Code"/>
+      </w:pPr>
+      <w:r>
+        <w:t xml:space="preserve"/>
+      </w:r>
+    </w:p>
+    <w:p>
+      <w:pPr>
+        <w:pStyle w:val="Code"/>
+      </w:pPr>
+      <w:r>
+        <w:t xml:space="preserve">Ambos recorridos</w:t>
+      </w:r>
+    </w:p>
+    <w:p>
+      <w:pPr>
+        <w:pStyle w:val="Code"/>
+      </w:pPr>
+      <w:r>
+        <w:t xml:space="preserve">  -&gt; Apache/PHP en contenedor Docker</w:t>
+      </w:r>
+    </w:p>
+    <w:p>
+      <w:pPr>
+        <w:pStyle w:val="Code"/>
+      </w:pPr>
+      <w:r>
+        <w:t xml:space="preserve">     -&gt; Symfony 7 (controladores + servicios + seguridad + auditoria + MFA)</w:t>
+      </w:r>
+    </w:p>
+    <w:p>
+      <w:pPr>
+        <w:pStyle w:val="Code"/>
+      </w:pPr>
+      <w:r>
+        <w:t xml:space="preserve">        -&gt; Doctrine ORM</w:t>
+      </w:r>
+    </w:p>
+    <w:p>
+      <w:pPr>
+        <w:pStyle w:val="Code"/>
+      </w:pPr>
+      <w:r>
+        <w:t xml:space="preserve">           -&gt; PostgreSQL 16 en VM publica</w:t>
+      </w:r>
+    </w:p>
+    <w:p>
+      <w:pPr>
+        <w:pStyle w:val="Code"/>
+      </w:pPr>
+      <w:r>
+        <w:t xml:space="preserve">        -&gt; Mailer Symfony</w:t>
+      </w:r>
+    </w:p>
+    <w:p>
+      <w:pPr>
+        <w:pStyle w:val="Code"/>
+      </w:pPr>
+      <w:r>
+        <w:t xml:space="preserve">           -&gt; Brevo para verificacion, rechazos, reseteo y MFA</w:t>
+      </w:r>
+    </w:p>
+    <w:p>
+      <w:pPr>
+        <w:pStyle w:val="Code"/>
+      </w:pPr>
+      <w:r>
+        <w:t xml:space="preserve">        -&gt; almacenamiento documental</w:t>
+      </w:r>
+    </w:p>
+    <w:p>
+      <w:pPr>
+        <w:pStyle w:val="Code"/>
+      </w:pPr>
+      <w:r>
+        <w:t xml:space="preserve">           -&gt; volumen persistente montado en la VM</w:t>
+      </w:r>
+    </w:p>
+    <w:p>
+      <w:pPr>
+        <w:pStyle w:val="Code"/>
+      </w:pPr>
+      <w:r>
+        <w:t xml:space="preserve"/>
+      </w:r>
+    </w:p>
+    <w:p>
+      <w:pPr>
+        <w:pStyle w:val="Code"/>
+      </w:pPr>
+      <w:r>
+        <w:t xml:space="preserve">Servicios auxiliares</w:t>
+      </w:r>
+    </w:p>
+    <w:p>
+      <w:pPr>
+        <w:pStyle w:val="Code"/>
+      </w:pPr>
+      <w:r>
+        <w:t xml:space="preserve">  -&gt; /documentacion como shell publica separada</w:t>
+      </w:r>
+    </w:p>
+    <w:p>
+      <w:pPr>
+        <w:pStyle w:val="Code"/>
+      </w:pPr>
+      <w:r>
+        <w:t xml:space="preserve">  -&gt; /monitor como area tecnica privada</w:t>
+      </w:r>
+    </w:p>
+    <w:p>
+      <w:pPr>
+        <w:pStyle w:val="Code"/>
+      </w:pPr>
+      <w:r>
+        <w:t xml:space="preserve">  -&gt; Agora Desktop como capa local de soporte, pruebas y empaquetado</w:t>
+      </w:r>
+    </w:p>
+    <w:p>
+      <w:pPr>
+        <w:pStyle w:val="Normal"/>
+      </w:pPr>
+      <w:r>
+        <w:t xml:space="preserve">Este esquema deja claro un punto importante para la defensa: el portal externo no es una pagina estatica conectada de forma superficial a la API, sino un cliente autenticado con su propio firewall, su propio proveedor de usuarios y un flujo separado del panel interno, aunque ambos compartan el mismo nucleo de negocio.</w:t>
+      </w:r>
+    </w:p>
+    <w:p>
+      <w:pPr>
+        <w:pStyle w:val="Normal"/>
+      </w:pPr>
+      <w:r>
+        <w:t xml:space="preserve">Si se quiere explicar tambien el despliegue remoto con mas precision, conviene proyectar el siguiente esquema de nodos:</w:t>
+      </w:r>
+    </w:p>
+    <w:p>
+      <w:pPr>
+        <w:pStyle w:val="Code"/>
+      </w:pPr>
+      <w:r>
+        <w:t xml:space="preserve">Internet</w:t>
+      </w:r>
+    </w:p>
+    <w:p>
+      <w:pPr>
+        <w:pStyle w:val="Code"/>
+      </w:pPr>
+      <w:r>
+        <w:t xml:space="preserve">  -&gt; DNS wildcard nip.io / dominio publico</w:t>
+      </w:r>
+    </w:p>
+    <w:p>
+      <w:pPr>
+        <w:pStyle w:val="Code"/>
+      </w:pPr>
+      <w:r>
+        <w:t xml:space="preserve">     -&gt; VM publica Google Cloud Compute Engine</w:t>
+      </w:r>
+    </w:p>
+    <w:p>
+      <w:pPr>
+        <w:pStyle w:val="Code"/>
+      </w:pPr>
+      <w:r>
+        <w:t xml:space="preserve">        -&gt; reglas firewall 80/443 + SSH administrado</w:t>
+      </w:r>
+    </w:p>
+    <w:p>
+      <w:pPr>
+        <w:pStyle w:val="Code"/>
+      </w:pPr>
+      <w:r>
+        <w:t xml:space="preserve">        -&gt; Docker network "agora"</w:t>
+      </w:r>
+    </w:p>
+    <w:p>
+      <w:pPr>
+        <w:pStyle w:val="Code"/>
+      </w:pPr>
+      <w:r>
+        <w:t xml:space="preserve">           -&gt; contenedor app</w:t>
+      </w:r>
+    </w:p>
+    <w:p>
+      <w:pPr>
+        <w:pStyle w:val="Code"/>
+      </w:pPr>
+      <w:r>
+        <w:t xml:space="preserve">              -&gt; Apache 2.4</w:t>
+      </w:r>
+    </w:p>
+    <w:p>
+      <w:pPr>
+        <w:pStyle w:val="Code"/>
+      </w:pPr>
+      <w:r>
+        <w:t xml:space="preserve">              -&gt; PHP 8.2</w:t>
+      </w:r>
+    </w:p>
+    <w:p>
+      <w:pPr>
+        <w:pStyle w:val="Code"/>
+      </w:pPr>
+      <w:r>
+        <w:t xml:space="preserve">              -&gt; Symfony 7</w:t>
+      </w:r>
+    </w:p>
+    <w:p>
+      <w:pPr>
+        <w:pStyle w:val="Code"/>
+      </w:pPr>
+      <w:r>
+        <w:t xml:space="preserve">              -&gt; build integrada de /app y /externo</w:t>
+      </w:r>
+    </w:p>
+    <w:p>
+      <w:pPr>
+        <w:pStyle w:val="Code"/>
+      </w:pPr>
+      <w:r>
+        <w:t xml:space="preserve">              -&gt; directorios var/cache, var/log y almacenamiento documental</w:t>
+      </w:r>
+    </w:p>
+    <w:p>
+      <w:pPr>
+        <w:pStyle w:val="Code"/>
+      </w:pPr>
+      <w:r>
+        <w:t xml:space="preserve">           -&gt; contenedor db</w:t>
+      </w:r>
+    </w:p>
+    <w:p>
+      <w:pPr>
+        <w:pStyle w:val="Code"/>
+      </w:pPr>
+      <w:r>
+        <w:t xml:space="preserve">              -&gt; PostgreSQL 16</w:t>
+      </w:r>
+    </w:p>
+    <w:p>
+      <w:pPr>
+        <w:pStyle w:val="Code"/>
+      </w:pPr>
+      <w:r>
+        <w:t xml:space="preserve">        -&gt; volumen persistente PostgreSQL</w:t>
+      </w:r>
+    </w:p>
+    <w:p>
+      <w:pPr>
+        <w:pStyle w:val="Code"/>
+      </w:pPr>
+      <w:r>
+        <w:t xml:space="preserve">        -&gt; volumen persistente documentos</w:t>
+      </w:r>
+    </w:p>
+    <w:p>
+      <w:pPr>
+        <w:pStyle w:val="Code"/>
+      </w:pPr>
+      <w:r>
+        <w:t xml:space="preserve">        -&gt; salida SMTP/API</w:t>
+      </w:r>
+    </w:p>
+    <w:p>
+      <w:pPr>
+        <w:pStyle w:val="Code"/>
+      </w:pPr>
+      <w:r>
+        <w:t xml:space="preserve">           -&gt; Brevo</w:t>
+      </w:r>
+    </w:p>
+    <w:p>
+      <w:pPr>
+        <w:pStyle w:val="Normal"/>
+      </w:pPr>
+      <w:r>
+        <w:t xml:space="preserve">Este segundo nivel ayuda a defender que la solucion ya no depende del portatil de desarrollo. La URL publica termina en una VM aislada, el backend y la base de datos quedan encapsulados en contenedores, los documentos persisten fuera del ciclo de vida del contenedor y el correo transaccional sale por un proveedor externo dedicado.</w:t>
+      </w:r>
+    </w:p>
+    <w:p>
+      <w:pPr>
         <w:pStyle w:val="Heading2"/>
       </w:pPr>
-      <w:bookmarkStart w:id="19" w:name="bk_memoria_final_18"/>
+      <w:bookmarkStart w:id="20" w:name="bk_memoria_final_19"/>
       <w:r>
         <w:t xml:space="preserve">Justificacion tecnica de la separacion</w:t>
       </w:r>
-      <w:bookmarkEnd w:id="19"/>
+      <w:bookmarkEnd w:id="20"/>
     </w:p>
     <w:p>
       <w:pPr>
@@ -2150,11 +2544,11 @@
       <w:pPr>
         <w:pStyle w:val="Heading2"/>
       </w:pPr>
-      <w:bookmarkStart w:id="20" w:name="bk_memoria_final_19"/>
+      <w:bookmarkStart w:id="21" w:name="bk_memoria_final_20"/>
       <w:r>
         <w:t xml:space="preserve">Modelo de datos</w:t>
       </w:r>
-      <w:bookmarkEnd w:id="20"/>
+      <w:bookmarkEnd w:id="21"/>
     </w:p>
     <w:p>
       <w:pPr>
@@ -2207,21 +2601,271 @@
         <w:pStyle w:val="Caption"/>
         <w:jc w:val="center"/>
       </w:pPr>
-      <w:bookmarkStart w:id="21" w:name="fig_memoria_final_2"/>
+      <w:bookmarkStart w:id="22" w:name="fig_memoria_final_2"/>
       <w:r>
         <w:t xml:space="preserve">Figura 2. Esquema relacional de la base de datos.</w:t>
       </w:r>
-      <w:bookmarkEnd w:id="21"/>
+      <w:bookmarkEnd w:id="22"/>
+    </w:p>
+    <w:p>
+      <w:pPr>
+        <w:pStyle w:val="Heading3"/>
+      </w:pPr>
+      <w:bookmarkStart w:id="23" w:name="bk_memoria_final_21"/>
+      <w:r>
+        <w:t xml:space="preserve">Relacion detallada entre cuenta, solicitud y mensajeria</w:t>
+      </w:r>
+      <w:bookmarkEnd w:id="23"/>
+    </w:p>
+    <w:p>
+      <w:pPr>
+        <w:pStyle w:val="Normal"/>
+      </w:pPr>
+      <w:r>
+        <w:t xml:space="preserve">La parte que mas conviene explicar con detalle en la memoria y en la defensa es la relacion entre la cuenta de empresa, la solicitud y el canal de mensajes, porque ese eje es el que da continuidad al flujo externo.</w:t>
+      </w:r>
+    </w:p>
+    <w:p>
+      <w:pPr>
+        <w:pStyle w:val="Code"/>
+      </w:pPr>
+      <w:r>
+        <w:t xml:space="preserve">empresa_portal_cuenta</w:t>
+      </w:r>
+    </w:p>
+    <w:p>
+      <w:pPr>
+        <w:pStyle w:val="Code"/>
+      </w:pPr>
+      <w:r>
+        <w:t xml:space="preserve">  PK id</w:t>
+      </w:r>
+    </w:p>
+    <w:p>
+      <w:pPr>
+        <w:pStyle w:val="Code"/>
+      </w:pPr>
+      <w:r>
+        <w:t xml:space="preserve">  email + password_hash + activated_at + last_login_at</w:t>
+      </w:r>
+    </w:p>
+    <w:p>
+      <w:pPr>
+        <w:pStyle w:val="Code"/>
+      </w:pPr>
+      <w:r>
+        <w:t xml:space="preserve">  0..1 empresa_colaboradora asociada tras aprobacion</w:t>
+      </w:r>
+    </w:p>
+    <w:p>
+      <w:pPr>
+        <w:pStyle w:val="Code"/>
+      </w:pPr>
+      <w:r>
+        <w:t xml:space="preserve">  0..1 empresa_solicitud asociada mientras existe el proceso de alta</w:t>
+      </w:r>
+    </w:p>
+    <w:p>
+      <w:pPr>
+        <w:pStyle w:val="Code"/>
+      </w:pPr>
+      <w:r>
+        <w:t xml:space="preserve"/>
+      </w:r>
+    </w:p>
+    <w:p>
+      <w:pPr>
+        <w:pStyle w:val="Code"/>
+      </w:pPr>
+      <w:r>
+        <w:t xml:space="preserve">empresa_solicitud</w:t>
+      </w:r>
+    </w:p>
+    <w:p>
+      <w:pPr>
+        <w:pStyle w:val="Code"/>
+      </w:pPr>
+      <w:r>
+        <w:t xml:space="preserve">  PK id</w:t>
+      </w:r>
+    </w:p>
+    <w:p>
+      <w:pPr>
+        <w:pStyle w:val="Code"/>
+      </w:pPr>
+      <w:r>
+        <w:t xml:space="preserve">  token + portal_token + estado + email_verificado_en + aprobado_en</w:t>
+      </w:r>
+    </w:p>
+    <w:p>
+      <w:pPr>
+        <w:pStyle w:val="Code"/>
+      </w:pPr>
+      <w:r>
+        <w:t xml:space="preserve">  datos corporativos y datos de contacto</w:t>
+      </w:r>
+    </w:p>
+    <w:p>
+      <w:pPr>
+        <w:pStyle w:val="Code"/>
+      </w:pPr>
+      <w:r>
+        <w:t xml:space="preserve">  1 cuenta portal asociada</w:t>
+      </w:r>
+    </w:p>
+    <w:p>
+      <w:pPr>
+        <w:pStyle w:val="Code"/>
+      </w:pPr>
+      <w:r>
+        <w:t xml:space="preserve">  0..n empresa_mensaje</w:t>
+      </w:r>
+    </w:p>
+    <w:p>
+      <w:pPr>
+        <w:pStyle w:val="Code"/>
+      </w:pPr>
+      <w:r>
+        <w:t xml:space="preserve"/>
+      </w:r>
+    </w:p>
+    <w:p>
+      <w:pPr>
+        <w:pStyle w:val="Code"/>
+      </w:pPr>
+      <w:r>
+        <w:t xml:space="preserve">empresa_mensaje</w:t>
+      </w:r>
+    </w:p>
+    <w:p>
+      <w:pPr>
+        <w:pStyle w:val="Code"/>
+      </w:pPr>
+      <w:r>
+        <w:t xml:space="preserve">  PK id</w:t>
+      </w:r>
+    </w:p>
+    <w:p>
+      <w:pPr>
+        <w:pStyle w:val="Code"/>
+      </w:pPr>
+      <w:r>
+        <w:t xml:space="preserve">  autor + texto + created_at</w:t>
+      </w:r>
+    </w:p>
+    <w:p>
+      <w:pPr>
+        <w:pStyle w:val="Code"/>
+      </w:pPr>
+      <w:r>
+        <w:t xml:space="preserve">  1 solicitud</w:t>
+      </w:r>
+    </w:p>
+    <w:p>
+      <w:pPr>
+        <w:pStyle w:val="Code"/>
+      </w:pPr>
+      <w:r>
+        <w:t xml:space="preserve">  autor = empresa | centro</w:t>
+      </w:r>
+    </w:p>
+    <w:p>
+      <w:pPr>
+        <w:pStyle w:val="Code"/>
+      </w:pPr>
+      <w:r>
+        <w:t xml:space="preserve">  orden cronologico compartido para ambos lados</w:t>
+      </w:r>
+    </w:p>
+    <w:p>
+      <w:pPr>
+        <w:pStyle w:val="Code"/>
+      </w:pPr>
+      <w:r>
+        <w:t xml:space="preserve"/>
+      </w:r>
+    </w:p>
+    <w:p>
+      <w:pPr>
+        <w:pStyle w:val="Code"/>
+      </w:pPr>
+      <w:r>
+        <w:t xml:space="preserve">empresa_colaboradora</w:t>
+      </w:r>
+    </w:p>
+    <w:p>
+      <w:pPr>
+        <w:pStyle w:val="Code"/>
+      </w:pPr>
+      <w:r>
+        <w:t xml:space="preserve">  PK id</w:t>
+      </w:r>
+    </w:p>
+    <w:p>
+      <w:pPr>
+        <w:pStyle w:val="Code"/>
+      </w:pPr>
+      <w:r>
+        <w:t xml:space="preserve">  1 empresa aprobada en el dominio interno</w:t>
+      </w:r>
+    </w:p>
+    <w:p>
+      <w:pPr>
+        <w:pStyle w:val="Code"/>
+      </w:pPr>
+      <w:r>
+        <w:t xml:space="preserve">  1 cuenta portal asociada si el acceso externo sigue activo</w:t>
+      </w:r>
+    </w:p>
+    <w:p>
+      <w:pPr>
+        <w:pStyle w:val="Code"/>
+      </w:pPr>
+      <w:r>
+        <w:t xml:space="preserve">  0..n convenio</w:t>
+      </w:r>
+    </w:p>
+    <w:p>
+      <w:pPr>
+        <w:pStyle w:val="Code"/>
+      </w:pPr>
+      <w:r>
+        <w:t xml:space="preserve">  0..n empresa_documento</w:t>
+      </w:r>
+    </w:p>
+    <w:p>
+      <w:pPr>
+        <w:pStyle w:val="Code"/>
+      </w:pPr>
+      <w:r>
+        <w:t xml:space="preserve">  0..n asignacion_practica</w:t>
+      </w:r>
+    </w:p>
+    <w:p>
+      <w:pPr>
+        <w:pStyle w:val="Normal"/>
+      </w:pPr>
+      <w:r>
+        <w:t xml:space="preserve">Dicho de otra forma, el sistema ya no fuerza un salto brusco entre una “solicitud anonima” y una “cuenta creada despues”. Primero existe la EmpresaPortalCuenta, luego la EmpresaSolicitud queda ligada a esa cuenta, y finalmente, cuando el centro aprueba, aparece la EmpresaColaboradora asociada al mismo acceso. Ese encadenamiento reduce friccion, conserva el historial de mensajes y evita pedir una contrasena tardia solo para poder continuar el proceso.</w:t>
+      </w:r>
+    </w:p>
+    <w:p>
+      <w:pPr>
+        <w:pStyle w:val="Normal"/>
+      </w:pPr>
+      <w:r>
+        <w:t xml:space="preserve">La relacion de mensajeria merece un matiz adicional. El chat no cuelga de EmpresaColaboradora, sino de EmpresaSolicitud. Esa decision permite que el canal exista desde la primera revision, siga operativo mientras la empresa esta pendiente o verificada y permanezca visible cuando el centro aprueba y ya existe la ficha interna. En la practica, la empresa escribe siempre con la misma cuenta; lo unico que cambia es el contexto de negocio que el panel muestra alrededor del canal.</w:t>
+      </w:r>
     </w:p>
     <w:p>
       <w:pPr>
         <w:pStyle w:val="Heading2"/>
       </w:pPr>
-      <w:bookmarkStart w:id="22" w:name="bk_memoria_final_20"/>
+      <w:bookmarkStart w:id="24" w:name="bk_memoria_final_22"/>
       <w:r>
         <w:t xml:space="preserve">Seguridad y control de acceso</w:t>
       </w:r>
-      <w:bookmarkEnd w:id="22"/>
+      <w:bookmarkEnd w:id="24"/>
     </w:p>
     <w:p>
       <w:pPr>
@@ -2236,25 +2880,25 @@
         <w:pStyle w:val="Normal"/>
       </w:pPr>
       <w:r>
-        <w:t xml:space="preserve">El portal externo dispone de un flujo independiente: alta publica, verificacion por correo, aprobacion interna, activacion de cuenta, login persistente y recuperacion de contrasena. Esta separacion evita mezclar el acceso corporativo externo con las credenciales del panel interno.</w:t>
+        <w:t xml:space="preserve">El portal externo dispone de un flujo independiente con su propio firewall y su propio proveedor EmpresaPortalCuenta. La cuenta de empresa se crea antes de enviar la solicitud, el login externo queda separado del panel interno y la verificacion por correo se aplica sobre la solicitud corporativa. Esta separacion evita mezclar credenciales, conserva contexto de mensajes y mantiene un unico acceso empresarial antes y despues de la aprobacion.</w:t>
       </w:r>
     </w:p>
     <w:p>
       <w:pPr>
         <w:pStyle w:val="Heading2"/>
       </w:pPr>
-      <w:bookmarkStart w:id="23" w:name="bk_memoria_final_21"/>
+      <w:bookmarkStart w:id="25" w:name="bk_memoria_final_23"/>
       <w:r>
         <w:t xml:space="preserve">Flujo de trabajo operativo</w:t>
       </w:r>
-      <w:bookmarkEnd w:id="23"/>
-    </w:p>
-    <w:p>
-      <w:pPr>
-        <w:pStyle w:val="Normal"/>
-      </w:pPr>
-      <w:r>
-        <w:t xml:space="preserve">La plataforma no se ha planteado como una suma de CRUD aislados, sino como un flujo de negocio secuencial. El recorrido recomendado comienza en el portal externo: la empresa registra una solicitud, valida su correo y espera revision interna. Ese paso no crea automaticamente una operativa academica completa, sino una entrada controlada para que el centro revise la informacion antes de activar la relacion.</w:t>
+      <w:bookmarkEnd w:id="25"/>
+    </w:p>
+    <w:p>
+      <w:pPr>
+        <w:pStyle w:val="Normal"/>
+      </w:pPr>
+      <w:r>
+        <w:t xml:space="preserve">La plataforma no se ha planteado como una suma de CRUD aislados, sino como un flujo de negocio secuencial. El recorrido recomendado comienza en el portal externo con un preregistro de cuenta de empresa. A partir de ese acceso, la empresa completa la solicitud corporativa, valida su correo y espera revision interna. Ese paso no crea automaticamente una operativa academica completa, sino una entrada controlada para que el centro revise la informacion antes de activar la relacion.</w:t>
       </w:r>
     </w:p>
     <w:p>
@@ -2270,18 +2914,428 @@
         <w:pStyle w:val="Normal"/>
       </w:pPr>
       <w:r>
-        <w:t xml:space="preserve">Este orden no es solo recomendable desde el punto de vista funcional, sino que tambien se ha reforzado a nivel de aplicacion. En la revision final se ha ajustado el flujo para que los convenios se creen sobre empresas activas y para que las asignaciones solo puedan registrarse sobre empresas activas y convenios firmados, vigentes o en renovacion. De este modo se evita introducir practicas sobre datos todavia pendientes de validar y se mantiene una coherencia real entre solicitud, empresa, convenio y asignacion.</w:t>
+        <w:t xml:space="preserve">Este orden no es solo recomendable desde el punto de vista funcional, sino que tambien se ha reforzado a nivel de aplicacion. En la revision final se ha ajustado el flujo para que la cuenta de empresa exista antes de la solicitud, los convenios se creen solo sobre empresas activas y las asignaciones solo puedan registrarse sobre empresas activas y convenios firmados, vigentes o en renovacion. De este modo se evita introducir practicas sobre datos todavia pendientes de validar y se mantiene una coherencia real entre cuenta, solicitud, empresa, convenio y asignacion.</w:t>
+      </w:r>
+    </w:p>
+    <w:p>
+      <w:pPr>
+        <w:pStyle w:val="Heading3"/>
+      </w:pPr>
+      <w:bookmarkStart w:id="26" w:name="bk_memoria_final_24"/>
+      <w:r>
+        <w:t xml:space="preserve">Esquema detallado del flujo de trabajo</w:t>
+      </w:r>
+      <w:bookmarkEnd w:id="26"/>
+    </w:p>
+    <w:p>
+      <w:pPr>
+        <w:pStyle w:val="Code"/>
+      </w:pPr>
+      <w:r>
+        <w:t xml:space="preserve">1. Preregistro de cuenta externa</w:t>
+      </w:r>
+    </w:p>
+    <w:p>
+      <w:pPr>
+        <w:pStyle w:val="Code"/>
+      </w:pPr>
+      <w:r>
+        <w:t xml:space="preserve">   Empresa -&gt; /portal-auth/register -&gt; empresa_portal_cuenta</w:t>
+      </w:r>
+    </w:p>
+    <w:p>
+      <w:pPr>
+        <w:pStyle w:val="Code"/>
+      </w:pPr>
+      <w:r>
+        <w:t xml:space="preserve"/>
+      </w:r>
+    </w:p>
+    <w:p>
+      <w:pPr>
+        <w:pStyle w:val="Code"/>
+      </w:pPr>
+      <w:r>
+        <w:t xml:space="preserve">2. Acceso al panel privado de empresa</w:t>
+      </w:r>
+    </w:p>
+    <w:p>
+      <w:pPr>
+        <w:pStyle w:val="Code"/>
+      </w:pPr>
+      <w:r>
+        <w:t xml:space="preserve">   Empresa -&gt; /portal-auth/login -&gt; sesion de navegador externa</w:t>
+      </w:r>
+    </w:p>
+    <w:p>
+      <w:pPr>
+        <w:pStyle w:val="Code"/>
+      </w:pPr>
+      <w:r>
+        <w:t xml:space="preserve"/>
+      </w:r>
+    </w:p>
+    <w:p>
+      <w:pPr>
+        <w:pStyle w:val="Code"/>
+      </w:pPr>
+      <w:r>
+        <w:t xml:space="preserve">3. Registro de la solicitud corporativa</w:t>
+      </w:r>
+    </w:p>
+    <w:p>
+      <w:pPr>
+        <w:pStyle w:val="Code"/>
+      </w:pPr>
+      <w:r>
+        <w:t xml:space="preserve">   Empresa -&gt; /api/portal-company/request -&gt; empresa_solicitud asociada a empresa_portal_cuenta</w:t>
+      </w:r>
+    </w:p>
+    <w:p>
+      <w:pPr>
+        <w:pStyle w:val="Code"/>
+      </w:pPr>
+      <w:r>
+        <w:t xml:space="preserve"/>
+      </w:r>
+    </w:p>
+    <w:p>
+      <w:pPr>
+        <w:pStyle w:val="Code"/>
+      </w:pPr>
+      <w:r>
+        <w:t xml:space="preserve">4. Verificacion del correo de la solicitud</w:t>
+      </w:r>
+    </w:p>
+    <w:p>
+      <w:pPr>
+        <w:pStyle w:val="Code"/>
+      </w:pPr>
+      <w:r>
+        <w:t xml:space="preserve">   Empresa -&gt; enlace /registro-empresa/confirmar?token=...</w:t>
+      </w:r>
+    </w:p>
+    <w:p>
+      <w:pPr>
+        <w:pStyle w:val="Code"/>
+      </w:pPr>
+      <w:r>
+        <w:t xml:space="preserve">   Resultado -&gt; empresa_solicitud.estado = email_verificado</w:t>
+      </w:r>
+    </w:p>
+    <w:p>
+      <w:pPr>
+        <w:pStyle w:val="Code"/>
+      </w:pPr>
+      <w:r>
+        <w:t xml:space="preserve"/>
+      </w:r>
+    </w:p>
+    <w:p>
+      <w:pPr>
+        <w:pStyle w:val="Code"/>
+      </w:pPr>
+      <w:r>
+        <w:t xml:space="preserve">5. Revision interna</w:t>
+      </w:r>
+    </w:p>
+    <w:p>
+      <w:pPr>
+        <w:pStyle w:val="Code"/>
+      </w:pPr>
+      <w:r>
+        <w:t xml:space="preserve">   Centro -&gt; /app -&gt; /api/empresa-solicitudes, bandeja y mensajes</w:t>
+      </w:r>
+    </w:p>
+    <w:p>
+      <w:pPr>
+        <w:pStyle w:val="Code"/>
+      </w:pPr>
+      <w:r>
+        <w:t xml:space="preserve"/>
+      </w:r>
+    </w:p>
+    <w:p>
+      <w:pPr>
+        <w:pStyle w:val="Code"/>
+      </w:pPr>
+      <w:r>
+        <w:t xml:space="preserve">6. Aprobacion</w:t>
+      </w:r>
+    </w:p>
+    <w:p>
+      <w:pPr>
+        <w:pStyle w:val="Code"/>
+      </w:pPr>
+      <w:r>
+        <w:t xml:space="preserve">   Centro -&gt; /api/empresa-solicitudes/{id}/aprobar</w:t>
+      </w:r>
+    </w:p>
+    <w:p>
+      <w:pPr>
+        <w:pStyle w:val="Code"/>
+      </w:pPr>
+      <w:r>
+        <w:t xml:space="preserve">   Resultado -&gt;</w:t>
+      </w:r>
+    </w:p>
+    <w:p>
+      <w:pPr>
+        <w:pStyle w:val="Code"/>
+      </w:pPr>
+      <w:r>
+        <w:t xml:space="preserve">     - se crea empresa_colaboradora</w:t>
+      </w:r>
+    </w:p>
+    <w:p>
+      <w:pPr>
+        <w:pStyle w:val="Code"/>
+      </w:pPr>
+      <w:r>
+        <w:t xml:space="preserve">     - se crea contacto_empresa inicial</w:t>
+      </w:r>
+    </w:p>
+    <w:p>
+      <w:pPr>
+        <w:pStyle w:val="Code"/>
+      </w:pPr>
+      <w:r>
+        <w:t xml:space="preserve">     - empresa_portal_cuenta se asocia a empresa_colaboradora</w:t>
+      </w:r>
+    </w:p>
+    <w:p>
+      <w:pPr>
+        <w:pStyle w:val="Code"/>
+      </w:pPr>
+      <w:r>
+        <w:t xml:space="preserve">     - la cuenta conserva el mismo acceso</w:t>
+      </w:r>
+    </w:p>
+    <w:p>
+      <w:pPr>
+        <w:pStyle w:val="Code"/>
+      </w:pPr>
+      <w:r>
+        <w:t xml:space="preserve"/>
+      </w:r>
+    </w:p>
+    <w:p>
+      <w:pPr>
+        <w:pStyle w:val="Code"/>
+      </w:pPr>
+      <w:r>
+        <w:t xml:space="preserve">7. Operativa posterior</w:t>
+      </w:r>
+    </w:p>
+    <w:p>
+      <w:pPr>
+        <w:pStyle w:val="Code"/>
+      </w:pPr>
+      <w:r>
+        <w:t xml:space="preserve">   Empresa -&gt; /api/portal-company/overview, /messages, /documents</w:t>
+      </w:r>
+    </w:p>
+    <w:p>
+      <w:pPr>
+        <w:pStyle w:val="Code"/>
+      </w:pPr>
+      <w:r>
+        <w:t xml:space="preserve">   Centro  -&gt; convenios, asignaciones, seguimientos, evaluacion y bandeja</w:t>
+      </w:r>
+    </w:p>
+    <w:p>
+      <w:pPr>
+        <w:pStyle w:val="Normal"/>
+      </w:pPr>
+      <w:r>
+        <w:t xml:space="preserve">Este esquema es el que conviene proyectar durante la defensa cuando se explique que la mensajeria no es un modulo aislado. El chat nace en la solicitud, pero sobrevive al alta de empresa porque la cuenta externa y la solicitud quedan enlazadas desde el principio.</w:t>
+      </w:r>
+    </w:p>
+    <w:p>
+      <w:pPr>
+        <w:pStyle w:val="Normal"/>
+      </w:pPr>
+      <w:r>
+        <w:t xml:space="preserve">Si se necesita una version todavia mas operativa para exponer el flujo diario, puede resumirse asi:</w:t>
+      </w:r>
+    </w:p>
+    <w:p>
+      <w:pPr>
+        <w:pStyle w:val="Code"/>
+      </w:pPr>
+      <w:r>
+        <w:t xml:space="preserve">Estado 1: cuenta creada, sin solicitud</w:t>
+      </w:r>
+    </w:p>
+    <w:p>
+      <w:pPr>
+        <w:pStyle w:val="Code"/>
+      </w:pPr>
+      <w:r>
+        <w:t xml:space="preserve">  - la empresa puede iniciar sesion</w:t>
+      </w:r>
+    </w:p>
+    <w:p>
+      <w:pPr>
+        <w:pStyle w:val="Code"/>
+      </w:pPr>
+      <w:r>
+        <w:t xml:space="preserve">  - el panel privado muestra formulario de alta</w:t>
+      </w:r>
+    </w:p>
+    <w:p>
+      <w:pPr>
+        <w:pStyle w:val="Code"/>
+      </w:pPr>
+      <w:r>
+        <w:t xml:space="preserve"/>
+      </w:r>
+    </w:p>
+    <w:p>
+      <w:pPr>
+        <w:pStyle w:val="Code"/>
+      </w:pPr>
+      <w:r>
+        <w:t xml:space="preserve">Estado 2: solicitud enviada, correo pendiente</w:t>
+      </w:r>
+    </w:p>
+    <w:p>
+      <w:pPr>
+        <w:pStyle w:val="Code"/>
+      </w:pPr>
+      <w:r>
+        <w:t xml:space="preserve">  - la empresa ve el estado de la solicitud</w:t>
+      </w:r>
+    </w:p>
+    <w:p>
+      <w:pPr>
+        <w:pStyle w:val="Code"/>
+      </w:pPr>
+      <w:r>
+        <w:t xml:space="preserve">  - el sistema envia verificacion por Brevo</w:t>
+      </w:r>
+    </w:p>
+    <w:p>
+      <w:pPr>
+        <w:pStyle w:val="Code"/>
+      </w:pPr>
+      <w:r>
+        <w:t xml:space="preserve"/>
+      </w:r>
+    </w:p>
+    <w:p>
+      <w:pPr>
+        <w:pStyle w:val="Code"/>
+      </w:pPr>
+      <w:r>
+        <w:t xml:space="preserve">Estado 3: correo verificado, pendiente de revision</w:t>
+      </w:r>
+    </w:p>
+    <w:p>
+      <w:pPr>
+        <w:pStyle w:val="Code"/>
+      </w:pPr>
+      <w:r>
+        <w:t xml:space="preserve">  - la empresa ya puede usar el canal de mensajes</w:t>
+      </w:r>
+    </w:p>
+    <w:p>
+      <w:pPr>
+        <w:pStyle w:val="Code"/>
+      </w:pPr>
+      <w:r>
+        <w:t xml:space="preserve">  - el centro revisa desde /api/empresa-solicitudes y su bandeja</w:t>
+      </w:r>
+    </w:p>
+    <w:p>
+      <w:pPr>
+        <w:pStyle w:val="Code"/>
+      </w:pPr>
+      <w:r>
+        <w:t xml:space="preserve"/>
+      </w:r>
+    </w:p>
+    <w:p>
+      <w:pPr>
+        <w:pStyle w:val="Code"/>
+      </w:pPr>
+      <w:r>
+        <w:t xml:space="preserve">Estado 4: aprobada</w:t>
+      </w:r>
+    </w:p>
+    <w:p>
+      <w:pPr>
+        <w:pStyle w:val="Code"/>
+      </w:pPr>
+      <w:r>
+        <w:t xml:space="preserve">  - se crea empresa_colaboradora</w:t>
+      </w:r>
+    </w:p>
+    <w:p>
+      <w:pPr>
+        <w:pStyle w:val="Code"/>
+      </w:pPr>
+      <w:r>
+        <w:t xml:space="preserve">  - la misma cuenta externa pasa a ver convenios, asignaciones y documentos</w:t>
+      </w:r>
+    </w:p>
+    <w:p>
+      <w:pPr>
+        <w:pStyle w:val="Code"/>
+      </w:pPr>
+      <w:r>
+        <w:t xml:space="preserve">  - los mensajes anteriores siguen visibles</w:t>
+      </w:r>
+    </w:p>
+    <w:p>
+      <w:pPr>
+        <w:pStyle w:val="Code"/>
+      </w:pPr>
+      <w:r>
+        <w:t xml:space="preserve"/>
+      </w:r>
+    </w:p>
+    <w:p>
+      <w:pPr>
+        <w:pStyle w:val="Code"/>
+      </w:pPr>
+      <w:r>
+        <w:t xml:space="preserve">Estado 5: rechazada</w:t>
+      </w:r>
+    </w:p>
+    <w:p>
+      <w:pPr>
+        <w:pStyle w:val="Code"/>
+      </w:pPr>
+      <w:r>
+        <w:t xml:space="preserve">  - la cuenta sigue existiendo</w:t>
+      </w:r>
+    </w:p>
+    <w:p>
+      <w:pPr>
+        <w:pStyle w:val="Code"/>
+      </w:pPr>
+      <w:r>
+        <w:t xml:space="preserve">  - el portal muestra motivo de rechazo y trazabilidad del intercambio previo</w:t>
+      </w:r>
+    </w:p>
+    <w:p>
+      <w:pPr>
+        <w:pStyle w:val="Normal"/>
+      </w:pPr>
+      <w:r>
+        <w:t xml:space="preserve">Con esta lectura por estados se entiende mejor por que el refresco automatico de mensajes se resuelve en el portal externo con polling corto sobre overview: no se trata de un chat independiente, sino de una vista continua del mismo expediente empresarial a lo largo de todo su ciclo.</w:t>
       </w:r>
     </w:p>
     <w:p>
       <w:pPr>
         <w:pStyle w:val="Heading2"/>
       </w:pPr>
-      <w:bookmarkStart w:id="24" w:name="bk_memoria_final_22"/>
+      <w:bookmarkStart w:id="27" w:name="bk_memoria_final_25"/>
       <w:r>
         <w:t xml:space="preserve">Diseno de interfaz</w:t>
       </w:r>
-      <w:bookmarkEnd w:id="24"/>
+      <w:bookmarkEnd w:id="27"/>
     </w:p>
     <w:p>
       <w:pPr>
@@ -2342,11 +3396,11 @@
         <w:pStyle w:val="Caption"/>
         <w:jc w:val="center"/>
       </w:pPr>
-      <w:bookmarkStart w:id="25" w:name="fig_memoria_final_3"/>
+      <w:bookmarkStart w:id="28" w:name="fig_memoria_final_3"/>
       <w:r>
         <w:t xml:space="preserve">Figura 3. Panel interno, vista dashboard con KPI y exportacion.</w:t>
       </w:r>
-      <w:bookmarkEnd w:id="25"/>
+      <w:bookmarkEnd w:id="28"/>
     </w:p>
     <w:p>
       <w:pPr>
@@ -2391,11 +3445,11 @@
         <w:pStyle w:val="Caption"/>
         <w:jc w:val="center"/>
       </w:pPr>
-      <w:bookmarkStart w:id="26" w:name="fig_memoria_final_4"/>
+      <w:bookmarkStart w:id="29" w:name="fig_memoria_final_4"/>
       <w:r>
         <w:t xml:space="preserve">Figura 4. Panel interno, bandeja unificada de mensajes con empresas.</w:t>
       </w:r>
-      <w:bookmarkEnd w:id="26"/>
+      <w:bookmarkEnd w:id="29"/>
     </w:p>
     <w:p>
       <w:pPr>
@@ -2440,11 +3494,11 @@
         <w:pStyle w:val="Caption"/>
         <w:jc w:val="center"/>
       </w:pPr>
-      <w:bookmarkStart w:id="27" w:name="fig_memoria_final_5"/>
+      <w:bookmarkStart w:id="30" w:name="fig_memoria_final_5"/>
       <w:r>
         <w:t xml:space="preserve">Figura 5. Portal externo con acceso de empresa y flujo de colaboracion.</w:t>
       </w:r>
-      <w:bookmarkEnd w:id="27"/>
+      <w:bookmarkEnd w:id="30"/>
     </w:p>
     <w:p>
       <w:pPr>
@@ -2489,11 +3543,11 @@
         <w:pStyle w:val="Caption"/>
         <w:jc w:val="center"/>
       </w:pPr>
-      <w:bookmarkStart w:id="28" w:name="fig_memoria_final_6"/>
+      <w:bookmarkStart w:id="31" w:name="fig_memoria_final_6"/>
       <w:r>
         <w:t xml:space="preserve">Figura 6. Guia funcional de la plataforma.</w:t>
       </w:r>
-      <w:bookmarkEnd w:id="28"/>
+      <w:bookmarkEnd w:id="31"/>
     </w:p>
     <w:p>
       <w:pPr>
@@ -2538,31 +3592,31 @@
         <w:pStyle w:val="Caption"/>
         <w:jc w:val="center"/>
       </w:pPr>
-      <w:bookmarkStart w:id="29" w:name="fig_memoria_final_7"/>
+      <w:bookmarkStart w:id="32" w:name="fig_memoria_final_7"/>
       <w:r>
         <w:t xml:space="preserve">Figura 7. Monitor operativo privado con MFA y control de acceso.</w:t>
       </w:r>
-      <w:bookmarkEnd w:id="29"/>
+      <w:bookmarkEnd w:id="32"/>
     </w:p>
     <w:p>
       <w:pPr>
         <w:pStyle w:val="Heading1"/>
       </w:pPr>
-      <w:bookmarkStart w:id="30" w:name="bk_memoria_final_23"/>
+      <w:bookmarkStart w:id="33" w:name="bk_memoria_final_26"/>
       <w:r>
         <w:t xml:space="preserve">Implementacion</w:t>
       </w:r>
-      <w:bookmarkEnd w:id="30"/>
+      <w:bookmarkEnd w:id="33"/>
     </w:p>
     <w:p>
       <w:pPr>
         <w:pStyle w:val="Heading2"/>
       </w:pPr>
-      <w:bookmarkStart w:id="31" w:name="bk_memoria_final_24"/>
+      <w:bookmarkStart w:id="34" w:name="bk_memoria_final_27"/>
       <w:r>
         <w:t xml:space="preserve">Backend Symfony</w:t>
       </w:r>
-      <w:bookmarkEnd w:id="31"/>
+      <w:bookmarkEnd w:id="34"/>
     </w:p>
     <w:p>
       <w:pPr>
@@ -2576,11 +3630,11 @@
       <w:pPr>
         <w:pStyle w:val="Heading2"/>
       </w:pPr>
-      <w:bookmarkStart w:id="32" w:name="bk_memoria_final_25"/>
+      <w:bookmarkStart w:id="35" w:name="bk_memoria_final_28"/>
       <w:r>
         <w:t xml:space="preserve">Portal interno</w:t>
       </w:r>
-      <w:bookmarkEnd w:id="32"/>
+      <w:bookmarkEnd w:id="35"/>
     </w:p>
     <w:p>
       <w:pPr>
@@ -2594,29 +3648,29 @@
       <w:pPr>
         <w:pStyle w:val="Heading2"/>
       </w:pPr>
-      <w:bookmarkStart w:id="33" w:name="bk_memoria_final_26"/>
+      <w:bookmarkStart w:id="36" w:name="bk_memoria_final_29"/>
       <w:r>
         <w:t xml:space="preserve">Portal externo</w:t>
       </w:r>
-      <w:bookmarkEnd w:id="33"/>
-    </w:p>
-    <w:p>
-      <w:pPr>
-        <w:pStyle w:val="Normal"/>
-      </w:pPr>
-      <w:r>
-        <w:t xml:space="preserve">El portal externo ofrece dos momentos de uso claramente diferenciados. En el primero, una empresa interesada completa el alta, revisa el correo de verificacion y consulta el estado de la solicitud. En el segundo, tras la aprobacion del centro, la empresa activa su cuenta, puede iniciar sesion, solicitar recuperacion de contrasena, revisar convenios y asignaciones asociados, descargar documentos y mantener la conversacion con el centro desde un panel privado. En la revision final se ha reforzado ademas el comportamiento de mensajeria para que tanto la bandeja interna como el chat del portal externo se refresquen de forma automatica en segundo plano y al recuperar el foco del navegador, mejorando la percepcion de continuidad operativa durante la demostracion.</w:t>
+      <w:bookmarkEnd w:id="36"/>
+    </w:p>
+    <w:p>
+      <w:pPr>
+        <w:pStyle w:val="Normal"/>
+      </w:pPr>
+      <w:r>
+        <w:t xml:space="preserve">El portal externo ofrece ahora dos momentos de uso enlazados por la misma cuenta. En el primero, una empresa interesada crea un acceso previo con correo y contrasena, entra en su panel privado y desde ahi registra la solicitud corporativa. Despues revisa el correo de verificacion y consulta el estado de la propuesta sin perder el mismo acceso. En el segundo, tras la aprobacion del centro, esa misma cuenta queda asociada a la empresa aprobada y pasa a servir para revisar convenios y asignaciones, descargar documentos y mantener la conversacion con el centro desde un panel privado ya operativo. En la revision final se ha reforzado ademas el comportamiento de mensajeria para que tanto la bandeja interna como el chat del portal externo se refresquen de forma automatica en segundo plano y al recuperar el foco del navegador, mejorando la percepcion de continuidad operativa durante la demostracion.</w:t>
       </w:r>
     </w:p>
     <w:p>
       <w:pPr>
         <w:pStyle w:val="Heading2"/>
       </w:pPr>
-      <w:bookmarkStart w:id="34" w:name="bk_memoria_final_27"/>
+      <w:bookmarkStart w:id="37" w:name="bk_memoria_final_30"/>
       <w:r>
         <w:t xml:space="preserve">Seguimientos y evaluacion final</w:t>
       </w:r>
-      <w:bookmarkEnd w:id="34"/>
+      <w:bookmarkEnd w:id="37"/>
     </w:p>
     <w:p>
       <w:pPr>
@@ -2630,11 +3684,11 @@
       <w:pPr>
         <w:pStyle w:val="Heading2"/>
       </w:pPr>
-      <w:bookmarkStart w:id="35" w:name="bk_memoria_final_28"/>
+      <w:bookmarkStart w:id="38" w:name="bk_memoria_final_31"/>
       <w:r>
         <w:t xml:space="preserve">Control documental y exportacion CSV</w:t>
       </w:r>
-      <w:bookmarkEnd w:id="35"/>
+      <w:bookmarkEnd w:id="38"/>
     </w:p>
     <w:p>
       <w:pPr>
@@ -2648,21 +3702,21 @@
       <w:pPr>
         <w:pStyle w:val="Heading1"/>
       </w:pPr>
-      <w:bookmarkStart w:id="36" w:name="bk_memoria_final_29"/>
+      <w:bookmarkStart w:id="39" w:name="bk_memoria_final_32"/>
       <w:r>
         <w:t xml:space="preserve">Despliegue y operacion</w:t>
       </w:r>
-      <w:bookmarkEnd w:id="36"/>
+      <w:bookmarkEnd w:id="39"/>
     </w:p>
     <w:p>
       <w:pPr>
         <w:pStyle w:val="Heading2"/>
       </w:pPr>
-      <w:bookmarkStart w:id="37" w:name="bk_memoria_final_30"/>
+      <w:bookmarkStart w:id="40" w:name="bk_memoria_final_33"/>
       <w:r>
         <w:t xml:space="preserve">Requisitos del entorno</w:t>
       </w:r>
-      <w:bookmarkEnd w:id="37"/>
+      <w:bookmarkEnd w:id="40"/>
     </w:p>
     <w:p>
       <w:pPr>
@@ -2676,11 +3730,11 @@
       <w:pPr>
         <w:pStyle w:val="Heading2"/>
       </w:pPr>
-      <w:bookmarkStart w:id="38" w:name="bk_memoria_final_31"/>
+      <w:bookmarkStart w:id="41" w:name="bk_memoria_final_34"/>
       <w:r>
         <w:t xml:space="preserve">Configuracion</w:t>
       </w:r>
-      <w:bookmarkEnd w:id="38"/>
+      <w:bookmarkEnd w:id="41"/>
     </w:p>
     <w:p>
       <w:pPr>
@@ -2702,11 +3756,11 @@
       <w:pPr>
         <w:pStyle w:val="Heading2"/>
       </w:pPr>
-      <w:bookmarkStart w:id="39" w:name="bk_memoria_final_32"/>
+      <w:bookmarkStart w:id="42" w:name="bk_memoria_final_35"/>
       <w:r>
         <w:t xml:space="preserve">Publicacion integrada</w:t>
       </w:r>
-      <w:bookmarkEnd w:id="39"/>
+      <w:bookmarkEnd w:id="42"/>
     </w:p>
     <w:p>
       <w:pPr>
@@ -2728,11 +3782,11 @@
       <w:pPr>
         <w:pStyle w:val="Heading2"/>
       </w:pPr>
-      <w:bookmarkStart w:id="40" w:name="bk_memoria_final_33"/>
+      <w:bookmarkStart w:id="43" w:name="bk_memoria_final_36"/>
       <w:r>
         <w:t xml:space="preserve">Acceso para evaluacion externa</w:t>
       </w:r>
-      <w:bookmarkEnd w:id="40"/>
+      <w:bookmarkEnd w:id="43"/>
     </w:p>
     <w:p>
       <w:pPr>
@@ -2794,11 +3848,11 @@
       <w:pPr>
         <w:pStyle w:val="Heading2"/>
       </w:pPr>
-      <w:bookmarkStart w:id="41" w:name="bk_memoria_final_34"/>
+      <w:bookmarkStart w:id="44" w:name="bk_memoria_final_37"/>
       <w:r>
         <w:t xml:space="preserve">Despliegue permanente previsto</w:t>
       </w:r>
-      <w:bookmarkEnd w:id="41"/>
+      <w:bookmarkEnd w:id="44"/>
     </w:p>
     <w:p>
       <w:pPr>
@@ -2820,21 +3874,21 @@
       <w:pPr>
         <w:pStyle w:val="Heading1"/>
       </w:pPr>
-      <w:bookmarkStart w:id="42" w:name="bk_memoria_final_35"/>
+      <w:bookmarkStart w:id="45" w:name="bk_memoria_final_38"/>
       <w:r>
         <w:t xml:space="preserve">Pruebas y validacion</w:t>
       </w:r>
-      <w:bookmarkEnd w:id="42"/>
+      <w:bookmarkEnd w:id="45"/>
     </w:p>
     <w:p>
       <w:pPr>
         <w:pStyle w:val="Heading2"/>
       </w:pPr>
-      <w:bookmarkStart w:id="43" w:name="bk_memoria_final_36"/>
+      <w:bookmarkStart w:id="46" w:name="bk_memoria_final_39"/>
       <w:r>
         <w:t xml:space="preserve">Validaciones ejecutadas</w:t>
       </w:r>
-      <w:bookmarkEnd w:id="43"/>
+      <w:bookmarkEnd w:id="46"/>
     </w:p>
     <w:p>
       <w:pPr>
@@ -2848,18 +3902,18 @@
       <w:pPr>
         <w:pStyle w:val="Heading2"/>
       </w:pPr>
-      <w:bookmarkStart w:id="44" w:name="bk_memoria_final_37"/>
+      <w:bookmarkStart w:id="47" w:name="bk_memoria_final_40"/>
       <w:r>
         <w:t xml:space="preserve">Resultados observados</w:t>
       </w:r>
-      <w:bookmarkEnd w:id="44"/>
-    </w:p>
-    <w:p>
-      <w:pPr>
-        <w:pStyle w:val="Normal"/>
-      </w:pPr>
-      <w:r>
-        <w:t xml:space="preserve">La build integrada de los dos frontends se genera correctamente y se publica en las rutas del backend. El panel interno, el portal externo, la documentacion y el monitor privado quedan accesibles tanto en la URL local integrada como en el despliegue remoto de Google Cloud. El flujo de empresa cubre registro, verificacion, revision interna, activacion de cuenta y acceso posterior. La revision final ha confirmado tambien la correccion de exportaciones CSV, validacion de contrasenas del portal externo, detalle de convenios, detalle de asignaciones, edicion de tutores, relacion entre tutores profesionales y empresa, contador de tutores en tarjetas, almacenamiento documental privado de empresa, refresco automatico de mensajeria, notificacion de rechazo por correo y operativa de la app de escritorio.</w:t>
+      <w:bookmarkEnd w:id="47"/>
+    </w:p>
+    <w:p>
+      <w:pPr>
+        <w:pStyle w:val="Normal"/>
+      </w:pPr>
+      <w:r>
+        <w:t xml:space="preserve">La build integrada de los dos frontends se genera correctamente y se publica en las rutas del backend. El panel interno, el portal externo, la documentacion y el monitor privado quedan accesibles tanto en la URL local integrada como en el despliegue remoto de Google Cloud. El flujo de empresa cubre preregistro de cuenta, solicitud corporativa, verificacion, revision interna, continuidad de acceso y operativa posterior. La revision final ha confirmado tambien la correccion de exportaciones CSV, validacion de contrasenas del portal externo, detalle de convenios, detalle de asignaciones, edicion de tutores, relacion entre tutores profesionales y empresa, contador de tutores en tarjetas, almacenamiento documental privado de empresa, refresco automatico de mensajeria, notificacion de rechazo por correo y operativa de la app de escritorio.</w:t>
       </w:r>
     </w:p>
     <w:p>
@@ -2874,11 +3928,11 @@
       <w:pPr>
         <w:pStyle w:val="Heading2"/>
       </w:pPr>
-      <w:bookmarkStart w:id="45" w:name="bk_memoria_final_38"/>
+      <w:bookmarkStart w:id="48" w:name="bk_memoria_final_41"/>
       <w:r>
         <w:t xml:space="preserve">Rendimiento operativo</w:t>
       </w:r>
-      <w:bookmarkEnd w:id="45"/>
+      <w:bookmarkEnd w:id="48"/>
     </w:p>
     <w:p>
       <w:pPr>
@@ -2892,11 +3946,11 @@
       <w:pPr>
         <w:pStyle w:val="Heading2"/>
       </w:pPr>
-      <w:bookmarkStart w:id="46" w:name="bk_memoria_final_39"/>
+      <w:bookmarkStart w:id="49" w:name="bk_memoria_final_42"/>
       <w:r>
         <w:t xml:space="preserve">Revision comparativa y auditoria final</w:t>
       </w:r>
-      <w:bookmarkEnd w:id="46"/>
+      <w:bookmarkEnd w:id="49"/>
     </w:p>
     <w:p>
       <w:pPr>
@@ -2935,7 +3989,7 @@
         <w:pStyle w:val="List"/>
       </w:pPr>
       <w:r>
-        <w:t xml:space="preserve">3. Seguridad del portal externo: las cuentas de empresa se activan por token y contrasena.</w:t>
+        <w:t xml:space="preserve">3. Seguridad del portal externo: la cuenta de empresa se preregistra, mantiene su sesion separada y conserva el mismo acceso durante solicitud, mensajeria y aprobacion.</w:t>
       </w:r>
     </w:p>
     <w:p>
@@ -3086,11 +4140,11 @@
       <w:pPr>
         <w:pStyle w:val="Heading2"/>
       </w:pPr>
-      <w:bookmarkStart w:id="47" w:name="bk_memoria_final_40"/>
+      <w:bookmarkStart w:id="50" w:name="bk_memoria_final_43"/>
       <w:r>
         <w:t xml:space="preserve">Estado tecnico de validacion</w:t>
       </w:r>
-      <w:bookmarkEnd w:id="47"/>
+      <w:bookmarkEnd w:id="50"/>
     </w:p>
     <w:p>
       <w:pPr>
@@ -3168,11 +4222,11 @@
       <w:pPr>
         <w:pStyle w:val="Heading2"/>
       </w:pPr>
-      <w:bookmarkStart w:id="48" w:name="bk_memoria_final_41"/>
+      <w:bookmarkStart w:id="51" w:name="bk_memoria_final_44"/>
       <w:r>
         <w:t xml:space="preserve">Limitaciones actuales</w:t>
       </w:r>
-      <w:bookmarkEnd w:id="48"/>
+      <w:bookmarkEnd w:id="51"/>
     </w:p>
     <w:p>
       <w:pPr>
@@ -3218,21 +4272,21 @@
       <w:pPr>
         <w:pStyle w:val="Heading1"/>
       </w:pPr>
-      <w:bookmarkStart w:id="49" w:name="bk_memoria_final_42"/>
+      <w:bookmarkStart w:id="52" w:name="bk_memoria_final_45"/>
       <w:r>
         <w:t xml:space="preserve">Resultados, limitaciones y lineas futuras</w:t>
       </w:r>
-      <w:bookmarkEnd w:id="49"/>
+      <w:bookmarkEnd w:id="52"/>
     </w:p>
     <w:p>
       <w:pPr>
         <w:pStyle w:val="Heading2"/>
       </w:pPr>
-      <w:bookmarkStart w:id="50" w:name="bk_memoria_final_43"/>
+      <w:bookmarkStart w:id="53" w:name="bk_memoria_final_46"/>
       <w:r>
         <w:t xml:space="preserve">Resultados principales</w:t>
       </w:r>
-      <w:bookmarkEnd w:id="50"/>
+      <w:bookmarkEnd w:id="53"/>
     </w:p>
     <w:p>
       <w:pPr>
@@ -3246,11 +4300,11 @@
       <w:pPr>
         <w:pStyle w:val="Heading2"/>
       </w:pPr>
-      <w:bookmarkStart w:id="51" w:name="bk_memoria_final_44"/>
+      <w:bookmarkStart w:id="54" w:name="bk_memoria_final_47"/>
       <w:r>
         <w:t xml:space="preserve">Lineas futuras</w:t>
       </w:r>
-      <w:bookmarkEnd w:id="51"/>
+      <w:bookmarkEnd w:id="54"/>
     </w:p>
     <w:p>
       <w:pPr>
@@ -3264,11 +4318,11 @@
       <w:pPr>
         <w:pStyle w:val="Heading1"/>
       </w:pPr>
-      <w:bookmarkStart w:id="52" w:name="bk_memoria_final_45"/>
+      <w:bookmarkStart w:id="55" w:name="bk_memoria_final_48"/>
       <w:r>
         <w:t xml:space="preserve">Conclusiones</w:t>
       </w:r>
-      <w:bookmarkEnd w:id="52"/>
+      <w:bookmarkEnd w:id="55"/>
     </w:p>
     <w:p>
       <w:pPr>
@@ -3282,11 +4336,11 @@
       <w:pPr>
         <w:pStyle w:val="Heading1"/>
       </w:pPr>
-      <w:bookmarkStart w:id="53" w:name="bk_memoria_final_46"/>
+      <w:bookmarkStart w:id="56" w:name="bk_memoria_final_49"/>
       <w:r>
         <w:t xml:space="preserve">Referencias</w:t>
       </w:r>
-      <w:bookmarkEnd w:id="53"/>
+      <w:bookmarkEnd w:id="56"/>
     </w:p>
     <w:p>
       <w:pPr>
@@ -3364,21 +4418,21 @@
       <w:pPr>
         <w:pStyle w:val="Heading1"/>
       </w:pPr>
-      <w:bookmarkStart w:id="54" w:name="bk_memoria_final_47"/>
+      <w:bookmarkStart w:id="57" w:name="bk_memoria_final_50"/>
       <w:r>
         <w:t xml:space="preserve">Anexos</w:t>
       </w:r>
-      <w:bookmarkEnd w:id="54"/>
+      <w:bookmarkEnd w:id="57"/>
     </w:p>
     <w:p>
       <w:pPr>
         <w:pStyle w:val="Heading2"/>
       </w:pPr>
-      <w:bookmarkStart w:id="55" w:name="bk_memoria_final_48"/>
+      <w:bookmarkStart w:id="58" w:name="bk_memoria_final_51"/>
       <w:r>
         <w:t xml:space="preserve">Anexo A. Manual de usuario</w:t>
       </w:r>
-      <w:bookmarkEnd w:id="55"/>
+      <w:bookmarkEnd w:id="58"/>
     </w:p>
     <w:p>
       <w:pPr>
@@ -3392,11 +4446,11 @@
       <w:pPr>
         <w:pStyle w:val="Heading2"/>
       </w:pPr>
-      <w:bookmarkStart w:id="56" w:name="bk_memoria_final_49"/>
+      <w:bookmarkStart w:id="59" w:name="bk_memoria_final_52"/>
       <w:r>
         <w:t xml:space="preserve">Anexo B. Manual tecnico</w:t>
       </w:r>
-      <w:bookmarkEnd w:id="56"/>
+      <w:bookmarkEnd w:id="59"/>
     </w:p>
     <w:p>
       <w:pPr>
@@ -3410,11 +4464,11 @@
       <w:pPr>
         <w:pStyle w:val="Heading2"/>
       </w:pPr>
-      <w:bookmarkStart w:id="57" w:name="bk_memoria_final_50"/>
+      <w:bookmarkStart w:id="60" w:name="bk_memoria_final_53"/>
       <w:r>
         <w:t xml:space="preserve">Anexo C. Capturas y evidencias</w:t>
       </w:r>
-      <w:bookmarkEnd w:id="57"/>
+      <w:bookmarkEnd w:id="60"/>
     </w:p>
     <w:p>
       <w:pPr>
@@ -3428,11 +4482,11 @@
       <w:pPr>
         <w:pStyle w:val="Heading2"/>
       </w:pPr>
-      <w:bookmarkStart w:id="58" w:name="bk_memoria_final_51"/>
+      <w:bookmarkStart w:id="61" w:name="bk_memoria_final_54"/>
       <w:r>
         <w:t xml:space="preserve">Anexo D. Codigo relevante y artefactos de apoyo</w:t>
       </w:r>
-      <w:bookmarkEnd w:id="58"/>
+      <w:bookmarkEnd w:id="61"/>
     </w:p>
     <w:p>
       <w:pPr>
@@ -3475,21 +4529,21 @@
       <w:pPr>
         <w:pStyle w:val="Heading1"/>
       </w:pPr>
-      <w:bookmarkStart w:id="59" w:name="bk_anexo_a_manual_usu_1"/>
+      <w:bookmarkStart w:id="62" w:name="bk_anexo_a_manual_usu_1"/>
       <w:r>
         <w:t xml:space="preserve">Anexo A. Manual de Usuario</w:t>
       </w:r>
-      <w:bookmarkEnd w:id="59"/>
+      <w:bookmarkEnd w:id="62"/>
     </w:p>
     <w:p>
       <w:pPr>
         <w:pStyle w:val="Heading2"/>
       </w:pPr>
-      <w:bookmarkStart w:id="60" w:name="bk_anexo_a_manual_usu_2"/>
+      <w:bookmarkStart w:id="63" w:name="bk_anexo_a_manual_usu_2"/>
       <w:r>
         <w:t xml:space="preserve">1. Objetivo</w:t>
       </w:r>
-      <w:bookmarkEnd w:id="60"/>
+      <w:bookmarkEnd w:id="63"/>
     </w:p>
     <w:p>
       <w:pPr>
@@ -3503,11 +4557,11 @@
       <w:pPr>
         <w:pStyle w:val="Heading2"/>
       </w:pPr>
-      <w:bookmarkStart w:id="61" w:name="bk_anexo_a_manual_usu_3"/>
+      <w:bookmarkStart w:id="64" w:name="bk_anexo_a_manual_usu_3"/>
       <w:r>
         <w:t xml:space="preserve">2. Perfiles de uso</w:t>
       </w:r>
-      <w:bookmarkEnd w:id="61"/>
+      <w:bookmarkEnd w:id="64"/>
     </w:p>
     <w:p>
       <w:pPr>
@@ -3554,35 +4608,35 @@
         <w:pStyle w:val="List"/>
       </w:pPr>
       <w:r>
-        <w:t xml:space="preserve">- Empresa externa: uso del portal publico para registrar su interes, verificar el correo, activar cuenta y comunicarse con el centro.</w:t>
+        <w:t xml:space="preserve">- Empresa externa: uso del portal publico para crear cuenta, registrar su interes, verificar el correo y comunicarse con el centro.</w:t>
       </w:r>
     </w:p>
     <w:p>
       <w:pPr>
         <w:pStyle w:val="Heading2"/>
       </w:pPr>
-      <w:bookmarkStart w:id="62" w:name="bk_anexo_a_manual_usu_4"/>
+      <w:bookmarkStart w:id="65" w:name="bk_anexo_a_manual_usu_4"/>
       <w:r>
         <w:t xml:space="preserve">3. Acceso al sistema</w:t>
       </w:r>
-      <w:bookmarkEnd w:id="62"/>
+      <w:bookmarkEnd w:id="65"/>
     </w:p>
     <w:p>
       <w:pPr>
         <w:pStyle w:val="Heading3"/>
       </w:pPr>
-      <w:bookmarkStart w:id="63" w:name="bk_anexo_a_manual_usu_5"/>
+      <w:bookmarkStart w:id="66" w:name="bk_anexo_a_manual_usu_5"/>
       <w:r>
         <w:t xml:space="preserve">3.0 Acceso externo para evaluacion</w:t>
       </w:r>
-      <w:bookmarkEnd w:id="63"/>
-    </w:p>
-    <w:p>
-      <w:pPr>
-        <w:pStyle w:val="Normal"/>
-      </w:pPr>
-      <w:r>
-        <w:t xml:space="preserve">Durante la evaluacion, si el alumno mantiene activo el entorno de demostracion, la profesora no necesita descargar ni instalar dependencias del proyecto. Se le puede facilitar una URL publica temporal generada con cloudflared, por ejemplo https://...trycloudflare.com, y sobre esa misma URL abrir:</w:t>
+      <w:bookmarkEnd w:id="66"/>
+    </w:p>
+    <w:p>
+      <w:pPr>
+        <w:pStyle w:val="Normal"/>
+      </w:pPr>
+      <w:r>
+        <w:t xml:space="preserve">Durante la evaluacion, si el alumno mantiene activa la VM publica, la profesora no necesita descargar ni instalar dependencias del proyecto. Se le puede facilitar una URL publica como http://agora.34.175.224.87.nip.io/, y sobre esa misma direccion abrir:</w:t>
       </w:r>
     </w:p>
     <w:p>
@@ -3622,18 +4676,18 @@
         <w:pStyle w:val="Normal"/>
       </w:pPr>
       <w:r>
-        <w:t xml:space="preserve">Este acceso remoto depende de que el equipo local del alumno, el servidor Symfony y el tunel publico sigan levantados. Si el tunel se cierra, la URL deja de ser valida y hay que generar una nueva. La instalacion local solo seria necesaria si se quiere reproducir el proyecto desde cero a partir del repositorio.</w:t>
+        <w:t xml:space="preserve">Este acceso remoto depende de que la VM publica y el stack Docker sigan levantados. La instalacion local solo seria necesaria si se quiere reproducir el proyecto desde cero a partir del repositorio.</w:t>
       </w:r>
     </w:p>
     <w:p>
       <w:pPr>
         <w:pStyle w:val="Heading3"/>
       </w:pPr>
-      <w:bookmarkStart w:id="64" w:name="bk_anexo_a_manual_usu_6"/>
+      <w:bookmarkStart w:id="67" w:name="bk_anexo_a_manual_usu_6"/>
       <w:r>
         <w:t xml:space="preserve">3.1 Panel interno integrado</w:t>
       </w:r>
-      <w:bookmarkEnd w:id="64"/>
+      <w:bookmarkEnd w:id="67"/>
     </w:p>
     <w:p>
       <w:pPr>
@@ -3663,11 +4717,11 @@
       <w:pPr>
         <w:pStyle w:val="Heading3"/>
       </w:pPr>
-      <w:bookmarkStart w:id="65" w:name="bk_anexo_a_manual_usu_7"/>
+      <w:bookmarkStart w:id="68" w:name="bk_anexo_a_manual_usu_7"/>
       <w:r>
         <w:t xml:space="preserve">3.2 Documentacion publica</w:t>
       </w:r>
-      <w:bookmarkEnd w:id="65"/>
+      <w:bookmarkEnd w:id="68"/>
     </w:p>
     <w:p>
       <w:pPr>
@@ -3689,11 +4743,11 @@
       <w:pPr>
         <w:pStyle w:val="Heading3"/>
       </w:pPr>
-      <w:bookmarkStart w:id="66" w:name="bk_anexo_a_manual_usu_8"/>
+      <w:bookmarkStart w:id="69" w:name="bk_anexo_a_manual_usu_8"/>
       <w:r>
         <w:t xml:space="preserve">3.3 Monitor privado</w:t>
       </w:r>
-      <w:bookmarkEnd w:id="66"/>
+      <w:bookmarkEnd w:id="69"/>
     </w:p>
     <w:p>
       <w:pPr>
@@ -3715,11 +4769,11 @@
       <w:pPr>
         <w:pStyle w:val="Heading3"/>
       </w:pPr>
-      <w:bookmarkStart w:id="67" w:name="bk_anexo_a_manual_usu_9"/>
+      <w:bookmarkStart w:id="70" w:name="bk_anexo_a_manual_usu_9"/>
       <w:r>
         <w:t xml:space="preserve">3.4 Portal externo</w:t>
       </w:r>
-      <w:bookmarkEnd w:id="67"/>
+      <w:bookmarkEnd w:id="70"/>
     </w:p>
     <w:p>
       <w:pPr>
@@ -3734,26 +4788,26 @@
         <w:pStyle w:val="List"/>
       </w:pPr>
       <w:r>
-        <w:t xml:space="preserve">- El registro inicial es publico.</w:t>
-      </w:r>
-    </w:p>
-    <w:p>
-      <w:pPr>
-        <w:pStyle w:val="List"/>
-      </w:pPr>
-      <w:r>
-        <w:t xml:space="preserve">- El acceso persistente de empresa se habilita tras aprobacion interna.</w:t>
+        <w:t xml:space="preserve">- La cuenta inicial de empresa se crea desde el portal publico.</w:t>
+      </w:r>
+    </w:p>
+    <w:p>
+      <w:pPr>
+        <w:pStyle w:val="List"/>
+      </w:pPr>
+      <w:r>
+        <w:t xml:space="preserve">- La solicitud corporativa se completa despues, ya dentro del panel privado de empresa.</w:t>
       </w:r>
     </w:p>
     <w:p>
       <w:pPr>
         <w:pStyle w:val="Heading3"/>
       </w:pPr>
-      <w:bookmarkStart w:id="68" w:name="bk_anexo_a_manual_usu_10"/>
+      <w:bookmarkStart w:id="71" w:name="bk_anexo_a_manual_usu_10"/>
       <w:r>
         <w:t xml:space="preserve">3.5 Agora Desktop</w:t>
       </w:r>
-      <w:bookmarkEnd w:id="68"/>
+      <w:bookmarkEnd w:id="71"/>
     </w:p>
     <w:p>
       <w:pPr>
@@ -3783,11 +4837,11 @@
       <w:pPr>
         <w:pStyle w:val="Heading2"/>
       </w:pPr>
-      <w:bookmarkStart w:id="69" w:name="bk_anexo_a_manual_usu_11"/>
+      <w:bookmarkStart w:id="72" w:name="bk_anexo_a_manual_usu_11"/>
       <w:r>
         <w:t xml:space="preserve">4. Navegacion principal del panel interno</w:t>
       </w:r>
-      <w:bookmarkEnd w:id="69"/>
+      <w:bookmarkEnd w:id="72"/>
     </w:p>
     <w:p>
       <w:pPr>
@@ -3873,11 +4927,11 @@
       <w:pPr>
         <w:pStyle w:val="Heading2"/>
       </w:pPr>
-      <w:bookmarkStart w:id="70" w:name="bk_anexo_a_manual_usu_12"/>
+      <w:bookmarkStart w:id="73" w:name="bk_anexo_a_manual_usu_12"/>
       <w:r>
         <w:t xml:space="preserve">5. Dashboard</w:t>
       </w:r>
-      <w:bookmarkEnd w:id="70"/>
+      <w:bookmarkEnd w:id="73"/>
     </w:p>
     <w:p>
       <w:pPr>
@@ -3931,11 +4985,11 @@
       <w:pPr>
         <w:pStyle w:val="Heading2"/>
       </w:pPr>
-      <w:bookmarkStart w:id="71" w:name="bk_anexo_a_manual_usu_13"/>
+      <w:bookmarkStart w:id="74" w:name="bk_anexo_a_manual_usu_13"/>
       <w:r>
         <w:t xml:space="preserve">6. Gestion de empresas</w:t>
       </w:r>
-      <w:bookmarkEnd w:id="71"/>
+      <w:bookmarkEnd w:id="74"/>
     </w:p>
     <w:p>
       <w:pPr>
@@ -4029,11 +5083,11 @@
       <w:pPr>
         <w:pStyle w:val="Heading2"/>
       </w:pPr>
-      <w:bookmarkStart w:id="72" w:name="bk_anexo_a_manual_usu_14"/>
+      <w:bookmarkStart w:id="75" w:name="bk_anexo_a_manual_usu_14"/>
       <w:r>
         <w:t xml:space="preserve">7. Gestion de convenios</w:t>
       </w:r>
-      <w:bookmarkEnd w:id="72"/>
+      <w:bookmarkEnd w:id="75"/>
     </w:p>
     <w:p>
       <w:pPr>
@@ -4103,11 +5157,11 @@
       <w:pPr>
         <w:pStyle w:val="Heading2"/>
       </w:pPr>
-      <w:bookmarkStart w:id="73" w:name="bk_anexo_a_manual_usu_15"/>
+      <w:bookmarkStart w:id="76" w:name="bk_anexo_a_manual_usu_15"/>
       <w:r>
         <w:t xml:space="preserve">8. Gestion de estudiantes</w:t>
       </w:r>
-      <w:bookmarkEnd w:id="73"/>
+      <w:bookmarkEnd w:id="76"/>
     </w:p>
     <w:p>
       <w:pPr>
@@ -4161,11 +5215,11 @@
       <w:pPr>
         <w:pStyle w:val="Heading2"/>
       </w:pPr>
-      <w:bookmarkStart w:id="74" w:name="bk_anexo_a_manual_usu_16"/>
+      <w:bookmarkStart w:id="77" w:name="bk_anexo_a_manual_usu_16"/>
       <w:r>
         <w:t xml:space="preserve">9. Gestion de asignaciones, seguimientos y evaluacion final</w:t>
       </w:r>
-      <w:bookmarkEnd w:id="74"/>
+      <w:bookmarkEnd w:id="77"/>
     </w:p>
     <w:p>
       <w:pPr>
@@ -4259,11 +5313,11 @@
       <w:pPr>
         <w:pStyle w:val="Heading2"/>
       </w:pPr>
-      <w:bookmarkStart w:id="75" w:name="bk_anexo_a_manual_usu_17"/>
+      <w:bookmarkStart w:id="78" w:name="bk_anexo_a_manual_usu_17"/>
       <w:r>
         <w:t xml:space="preserve">10. Gestion de tutores</w:t>
       </w:r>
-      <w:bookmarkEnd w:id="75"/>
+      <w:bookmarkEnd w:id="78"/>
     </w:p>
     <w:p>
       <w:pPr>
@@ -4309,11 +5363,11 @@
       <w:pPr>
         <w:pStyle w:val="Heading2"/>
       </w:pPr>
-      <w:bookmarkStart w:id="76" w:name="bk_anexo_a_manual_usu_18"/>
+      <w:bookmarkStart w:id="79" w:name="bk_anexo_a_manual_usu_18"/>
       <w:r>
         <w:t xml:space="preserve">11. Solicitudes y bandeja de mensajes</w:t>
       </w:r>
-      <w:bookmarkEnd w:id="76"/>
+      <w:bookmarkEnd w:id="79"/>
     </w:p>
     <w:p>
       <w:pPr>
@@ -4407,11 +5461,11 @@
       <w:pPr>
         <w:pStyle w:val="Heading2"/>
       </w:pPr>
-      <w:bookmarkStart w:id="77" w:name="bk_anexo_a_manual_usu_19"/>
+      <w:bookmarkStart w:id="80" w:name="bk_anexo_a_manual_usu_19"/>
       <w:r>
         <w:t xml:space="preserve">12. Monitor privado</w:t>
       </w:r>
-      <w:bookmarkEnd w:id="77"/>
+      <w:bookmarkEnd w:id="80"/>
     </w:p>
     <w:p>
       <w:pPr>
@@ -4473,11 +5527,11 @@
       <w:pPr>
         <w:pStyle w:val="Heading2"/>
       </w:pPr>
-      <w:bookmarkStart w:id="78" w:name="bk_anexo_a_manual_usu_20"/>
+      <w:bookmarkStart w:id="81" w:name="bk_anexo_a_manual_usu_20"/>
       <w:r>
         <w:t xml:space="preserve">12 bis. Agora Desktop</w:t>
       </w:r>
-      <w:bookmarkEnd w:id="78"/>
+      <w:bookmarkEnd w:id="81"/>
     </w:p>
     <w:p>
       <w:pPr>
@@ -4547,11 +5601,11 @@
       <w:pPr>
         <w:pStyle w:val="Heading2"/>
       </w:pPr>
-      <w:bookmarkStart w:id="79" w:name="bk_anexo_a_manual_usu_21"/>
+      <w:bookmarkStart w:id="82" w:name="bk_anexo_a_manual_usu_21"/>
       <w:r>
         <w:t xml:space="preserve">13. Portal externo</w:t>
       </w:r>
-      <w:bookmarkEnd w:id="79"/>
+      <w:bookmarkEnd w:id="82"/>
     </w:p>
     <w:p>
       <w:pPr>
@@ -4566,66 +5620,66 @@
         <w:pStyle w:val="List"/>
       </w:pPr>
       <w:r>
-        <w:t xml:space="preserve">1. La empresa completa el formulario de solicitud.</w:t>
-      </w:r>
-    </w:p>
-    <w:p>
-      <w:pPr>
-        <w:pStyle w:val="List"/>
-      </w:pPr>
-      <w:r>
-        <w:t xml:space="preserve">2. Recibe un enlace de verificacion por correo.</w:t>
-      </w:r>
-    </w:p>
-    <w:p>
-      <w:pPr>
-        <w:pStyle w:val="List"/>
-      </w:pPr>
-      <w:r>
-        <w:t xml:space="preserve">3. Consulta el estado de la solicitud.</w:t>
-      </w:r>
-    </w:p>
-    <w:p>
-      <w:pPr>
-        <w:pStyle w:val="List"/>
-      </w:pPr>
-      <w:r>
-        <w:t xml:space="preserve">4. El centro aprueba la empresa desde el panel interno.</w:t>
-      </w:r>
-    </w:p>
-    <w:p>
-      <w:pPr>
-        <w:pStyle w:val="List"/>
-      </w:pPr>
-      <w:r>
-        <w:t xml:space="preserve">5. La empresa recibe un correo de activacion de cuenta.</w:t>
-      </w:r>
-    </w:p>
-    <w:p>
-      <w:pPr>
-        <w:pStyle w:val="List"/>
-      </w:pPr>
-      <w:r>
-        <w:t xml:space="preserve">6. Activa la cuenta, inicia sesion y puede recuperar su contrasena si lo necesita.</w:t>
-      </w:r>
-    </w:p>
-    <w:p>
-      <w:pPr>
-        <w:pStyle w:val="List"/>
-      </w:pPr>
-      <w:r>
-        <w:t xml:space="preserve">7. Accede a su panel para revisar informacion, documentos y mensajes.</w:t>
+        <w:t xml:space="preserve">1. La empresa crea su cuenta con correo y contrasena.</w:t>
+      </w:r>
+    </w:p>
+    <w:p>
+      <w:pPr>
+        <w:pStyle w:val="List"/>
+      </w:pPr>
+      <w:r>
+        <w:t xml:space="preserve">2. Inicia sesion en el panel privado de empresa.</w:t>
+      </w:r>
+    </w:p>
+    <w:p>
+      <w:pPr>
+        <w:pStyle w:val="List"/>
+      </w:pPr>
+      <w:r>
+        <w:t xml:space="preserve">3. Completa el formulario de solicitud con los datos corporativos.</w:t>
+      </w:r>
+    </w:p>
+    <w:p>
+      <w:pPr>
+        <w:pStyle w:val="List"/>
+      </w:pPr>
+      <w:r>
+        <w:t xml:space="preserve">4. Recibe un enlace de verificacion por correo.</w:t>
+      </w:r>
+    </w:p>
+    <w:p>
+      <w:pPr>
+        <w:pStyle w:val="List"/>
+      </w:pPr>
+      <w:r>
+        <w:t xml:space="preserve">5. Consulta el estado de la solicitud y mantiene el canal de mensajes.</w:t>
+      </w:r>
+    </w:p>
+    <w:p>
+      <w:pPr>
+        <w:pStyle w:val="List"/>
+      </w:pPr>
+      <w:r>
+        <w:t xml:space="preserve">6. El centro aprueba o rechaza la empresa desde el panel interno.</w:t>
+      </w:r>
+    </w:p>
+    <w:p>
+      <w:pPr>
+        <w:pStyle w:val="List"/>
+      </w:pPr>
+      <w:r>
+        <w:t xml:space="preserve">7. Si se aprueba, la misma cuenta sirve para revisar informacion, documentos, convenios, asignaciones y mensajes.</w:t>
       </w:r>
     </w:p>
     <w:p>
       <w:pPr>
         <w:pStyle w:val="Heading2"/>
       </w:pPr>
-      <w:bookmarkStart w:id="80" w:name="bk_anexo_a_manual_usu_22"/>
+      <w:bookmarkStart w:id="83" w:name="bk_anexo_a_manual_usu_22"/>
       <w:r>
         <w:t xml:space="preserve">14. Errores y validaciones comunes</w:t>
       </w:r>
-      <w:bookmarkEnd w:id="80"/>
+      <w:bookmarkEnd w:id="83"/>
     </w:p>
     <w:p>
       <w:pPr>
@@ -4671,11 +5725,11 @@
       <w:pPr>
         <w:pStyle w:val="Heading2"/>
       </w:pPr>
-      <w:bookmarkStart w:id="81" w:name="bk_anexo_a_manual_usu_23"/>
+      <w:bookmarkStart w:id="84" w:name="bk_anexo_a_manual_usu_23"/>
       <w:r>
         <w:t xml:space="preserve">15. Recomendaciones de uso</w:t>
       </w:r>
-      <w:bookmarkEnd w:id="81"/>
+      <w:bookmarkEnd w:id="84"/>
     </w:p>
     <w:p>
       <w:pPr>
@@ -4718,21 +5772,21 @@
       <w:pPr>
         <w:pStyle w:val="Heading1"/>
       </w:pPr>
-      <w:bookmarkStart w:id="82" w:name="bk_anexo_b_manual_tec_1"/>
+      <w:bookmarkStart w:id="85" w:name="bk_anexo_b_manual_tec_1"/>
       <w:r>
         <w:t xml:space="preserve">Anexo B. Manual Tecnico</w:t>
       </w:r>
-      <w:bookmarkEnd w:id="82"/>
+      <w:bookmarkEnd w:id="85"/>
     </w:p>
     <w:p>
       <w:pPr>
         <w:pStyle w:val="Heading2"/>
       </w:pPr>
-      <w:bookmarkStart w:id="83" w:name="bk_anexo_b_manual_tec_2"/>
+      <w:bookmarkStart w:id="86" w:name="bk_anexo_b_manual_tec_2"/>
       <w:r>
         <w:t xml:space="preserve">1. Arquitectura general</w:t>
       </w:r>
-      <w:bookmarkEnd w:id="83"/>
+      <w:bookmarkEnd w:id="86"/>
     </w:p>
     <w:p>
       <w:pPr>
@@ -4794,21 +5848,21 @@
       <w:pPr>
         <w:pStyle w:val="Heading2"/>
       </w:pPr>
-      <w:bookmarkStart w:id="84" w:name="bk_anexo_b_manual_tec_3"/>
+      <w:bookmarkStart w:id="87" w:name="bk_anexo_b_manual_tec_3"/>
       <w:r>
         <w:t xml:space="preserve">2. Requisitos locales</w:t>
       </w:r>
-      <w:bookmarkEnd w:id="84"/>
+      <w:bookmarkEnd w:id="87"/>
     </w:p>
     <w:p>
       <w:pPr>
         <w:pStyle w:val="Heading3"/>
       </w:pPr>
-      <w:bookmarkStart w:id="85" w:name="bk_anexo_b_manual_tec_4"/>
+      <w:bookmarkStart w:id="88" w:name="bk_anexo_b_manual_tec_4"/>
       <w:r>
         <w:t xml:space="preserve">2.1 Desarrollo desde repositorio</w:t>
       </w:r>
-      <w:bookmarkEnd w:id="85"/>
+      <w:bookmarkEnd w:id="88"/>
     </w:p>
     <w:p>
       <w:pPr>
@@ -4862,11 +5916,11 @@
       <w:pPr>
         <w:pStyle w:val="Heading3"/>
       </w:pPr>
-      <w:bookmarkStart w:id="86" w:name="bk_anexo_b_manual_tec_5"/>
+      <w:bookmarkStart w:id="89" w:name="bk_anexo_b_manual_tec_5"/>
       <w:r>
         <w:t xml:space="preserve">2.2 Ejecucion empaquetada</w:t>
       </w:r>
-      <w:bookmarkEnd w:id="86"/>
+      <w:bookmarkEnd w:id="89"/>
     </w:p>
     <w:p>
       <w:pPr>
@@ -4880,11 +5934,11 @@
       <w:pPr>
         <w:pStyle w:val="Heading2"/>
       </w:pPr>
-      <w:bookmarkStart w:id="87" w:name="bk_anexo_b_manual_tec_6"/>
+      <w:bookmarkStart w:id="90" w:name="bk_anexo_b_manual_tec_6"/>
       <w:r>
         <w:t xml:space="preserve">3. Arranque del entorno</w:t>
       </w:r>
-      <w:bookmarkEnd w:id="87"/>
+      <w:bookmarkEnd w:id="90"/>
     </w:p>
     <w:p>
       <w:pPr>
@@ -4898,11 +5952,11 @@
       <w:pPr>
         <w:pStyle w:val="Heading3"/>
       </w:pPr>
-      <w:bookmarkStart w:id="88" w:name="bk_anexo_b_manual_tec_7"/>
+      <w:bookmarkStart w:id="91" w:name="bk_anexo_b_manual_tec_7"/>
       <w:r>
         <w:t xml:space="preserve">3.1 Backend</w:t>
       </w:r>
-      <w:bookmarkEnd w:id="88"/>
+      <w:bookmarkEnd w:id="91"/>
     </w:p>
     <w:p>
       <w:pPr>
@@ -4956,11 +6010,11 @@
       <w:pPr>
         <w:pStyle w:val="Heading3"/>
       </w:pPr>
-      <w:bookmarkStart w:id="89" w:name="bk_anexo_b_manual_tec_8"/>
+      <w:bookmarkStart w:id="92" w:name="bk_anexo_b_manual_tec_8"/>
       <w:r>
         <w:t xml:space="preserve">3.2 Frontend interno en desarrollo</w:t>
       </w:r>
-      <w:bookmarkEnd w:id="89"/>
+      <w:bookmarkEnd w:id="92"/>
     </w:p>
     <w:p>
       <w:pPr>
@@ -4998,11 +6052,11 @@
       <w:pPr>
         <w:pStyle w:val="Heading3"/>
       </w:pPr>
-      <w:bookmarkStart w:id="90" w:name="bk_anexo_b_manual_tec_9"/>
+      <w:bookmarkStart w:id="93" w:name="bk_anexo_b_manual_tec_9"/>
       <w:r>
         <w:t xml:space="preserve">3.3 Portal externo en desarrollo</w:t>
       </w:r>
-      <w:bookmarkEnd w:id="90"/>
+      <w:bookmarkEnd w:id="93"/>
     </w:p>
     <w:p>
       <w:pPr>
@@ -5040,11 +6094,11 @@
       <w:pPr>
         <w:pStyle w:val="Heading3"/>
       </w:pPr>
-      <w:bookmarkStart w:id="91" w:name="bk_anexo_b_manual_tec_10"/>
+      <w:bookmarkStart w:id="94" w:name="bk_anexo_b_manual_tec_10"/>
       <w:r>
         <w:t xml:space="preserve">3.4 Build integrada</w:t>
       </w:r>
-      <w:bookmarkEnd w:id="91"/>
+      <w:bookmarkEnd w:id="94"/>
     </w:p>
     <w:p>
       <w:pPr>
@@ -5130,11 +6184,11 @@
       <w:pPr>
         <w:pStyle w:val="Heading3"/>
       </w:pPr>
-      <w:bookmarkStart w:id="92" w:name="bk_anexo_b_manual_tec_11"/>
+      <w:bookmarkStart w:id="95" w:name="bk_anexo_b_manual_tec_11"/>
       <w:r>
         <w:t xml:space="preserve">3.5 Prueba remota sin instalacion local</w:t>
       </w:r>
-      <w:bookmarkEnd w:id="92"/>
+      <w:bookmarkEnd w:id="95"/>
     </w:p>
     <w:p>
       <w:pPr>
@@ -5156,11 +6210,11 @@
       <w:pPr>
         <w:pStyle w:val="Heading3"/>
       </w:pPr>
-      <w:bookmarkStart w:id="93" w:name="bk_anexo_b_manual_tec_12"/>
+      <w:bookmarkStart w:id="96" w:name="bk_anexo_b_manual_tec_12"/>
       <w:r>
         <w:t xml:space="preserve">3.6 App de escritorio empaquetada</w:t>
       </w:r>
-      <w:bookmarkEnd w:id="93"/>
+      <w:bookmarkEnd w:id="96"/>
     </w:p>
     <w:p>
       <w:pPr>
@@ -5262,21 +6316,21 @@
       <w:pPr>
         <w:pStyle w:val="Heading2"/>
       </w:pPr>
-      <w:bookmarkStart w:id="94" w:name="bk_anexo_b_manual_tec_13"/>
+      <w:bookmarkStart w:id="97" w:name="bk_anexo_b_manual_tec_13"/>
       <w:r>
         <w:t xml:space="preserve">4. Variables de entorno relevantes</w:t>
       </w:r>
-      <w:bookmarkEnd w:id="94"/>
+      <w:bookmarkEnd w:id="97"/>
     </w:p>
     <w:p>
       <w:pPr>
         <w:pStyle w:val="Heading3"/>
       </w:pPr>
-      <w:bookmarkStart w:id="95" w:name="bk_anexo_b_manual_tec_14"/>
+      <w:bookmarkStart w:id="98" w:name="bk_anexo_b_manual_tec_14"/>
       <w:r>
         <w:t xml:space="preserve">4.1 Backend</w:t>
       </w:r>
-      <w:bookmarkEnd w:id="95"/>
+      <w:bookmarkEnd w:id="98"/>
     </w:p>
     <w:p>
       <w:pPr>
@@ -5378,11 +6432,11 @@
       <w:pPr>
         <w:pStyle w:val="Heading3"/>
       </w:pPr>
-      <w:bookmarkStart w:id="96" w:name="bk_anexo_b_manual_tec_15"/>
+      <w:bookmarkStart w:id="99" w:name="bk_anexo_b_manual_tec_15"/>
       <w:r>
         <w:t xml:space="preserve">4.2 Frontend interno</w:t>
       </w:r>
-      <w:bookmarkEnd w:id="96"/>
+      <w:bookmarkEnd w:id="99"/>
     </w:p>
     <w:p>
       <w:pPr>
@@ -5412,11 +6466,11 @@
       <w:pPr>
         <w:pStyle w:val="Heading3"/>
       </w:pPr>
-      <w:bookmarkStart w:id="97" w:name="bk_anexo_b_manual_tec_16"/>
+      <w:bookmarkStart w:id="100" w:name="bk_anexo_b_manual_tec_16"/>
       <w:r>
         <w:t xml:space="preserve">4.3 Portal externo</w:t>
       </w:r>
-      <w:bookmarkEnd w:id="97"/>
+      <w:bookmarkEnd w:id="100"/>
     </w:p>
     <w:p>
       <w:pPr>
@@ -5430,11 +6484,11 @@
       <w:pPr>
         <w:pStyle w:val="Heading2"/>
       </w:pPr>
-      <w:bookmarkStart w:id="98" w:name="bk_anexo_b_manual_tec_17"/>
+      <w:bookmarkStart w:id="101" w:name="bk_anexo_b_manual_tec_17"/>
       <w:r>
         <w:t xml:space="preserve">5. Seguridad</w:t>
       </w:r>
-      <w:bookmarkEnd w:id="98"/>
+      <w:bookmarkEnd w:id="101"/>
     </w:p>
     <w:p>
       <w:pPr>
@@ -5473,7 +6527,7 @@
         <w:pStyle w:val="List"/>
       </w:pPr>
       <w:r>
-        <w:t xml:space="preserve">- Existen rutas publicas para activacion de cuenta, login, solicitud de reseteo y restablecimiento de contrasena.</w:t>
+        <w:t xml:space="preserve">- Existen rutas publicas para preregistro de cuenta, activacion legacy, login, solicitud de reseteo y restablecimiento de contrasena.</w:t>
       </w:r>
     </w:p>
     <w:p>
@@ -5496,11 +6550,11 @@
       <w:pPr>
         <w:pStyle w:val="Heading3"/>
       </w:pPr>
-      <w:bookmarkStart w:id="99" w:name="bk_anexo_b_manual_tec_18"/>
+      <w:bookmarkStart w:id="102" w:name="bk_anexo_b_manual_tec_18"/>
       <w:r>
         <w:t xml:space="preserve">5.1 Jerarquia de roles interna</w:t>
       </w:r>
-      <w:bookmarkEnd w:id="99"/>
+      <w:bookmarkEnd w:id="102"/>
     </w:p>
     <w:p>
       <w:pPr>
@@ -5562,11 +6616,11 @@
       <w:pPr>
         <w:pStyle w:val="Heading3"/>
       </w:pPr>
-      <w:bookmarkStart w:id="100" w:name="bk_anexo_b_manual_tec_19"/>
+      <w:bookmarkStart w:id="103" w:name="bk_anexo_b_manual_tec_19"/>
       <w:r>
         <w:t xml:space="preserve">5.2 Rol externo</w:t>
       </w:r>
-      <w:bookmarkEnd w:id="100"/>
+      <w:bookmarkEnd w:id="103"/>
     </w:p>
     <w:p>
       <w:pPr>
@@ -5580,11 +6634,11 @@
       <w:pPr>
         <w:pStyle w:val="Heading2"/>
       </w:pPr>
-      <w:bookmarkStart w:id="101" w:name="bk_anexo_b_manual_tec_20"/>
+      <w:bookmarkStart w:id="104" w:name="bk_anexo_b_manual_tec_20"/>
       <w:r>
         <w:t xml:space="preserve">6. Persistencia</w:t>
       </w:r>
-      <w:bookmarkEnd w:id="101"/>
+      <w:bookmarkEnd w:id="104"/>
     </w:p>
     <w:p>
       <w:pPr>
@@ -5630,11 +6684,11 @@
       <w:pPr>
         <w:pStyle w:val="Heading2"/>
       </w:pPr>
-      <w:bookmarkStart w:id="102" w:name="bk_anexo_b_manual_tec_21"/>
+      <w:bookmarkStart w:id="105" w:name="bk_anexo_b_manual_tec_21"/>
       <w:r>
         <w:t xml:space="preserve">7. Correo saliente</w:t>
       </w:r>
-      <w:bookmarkEnd w:id="102"/>
+      <w:bookmarkEnd w:id="105"/>
     </w:p>
     <w:p>
       <w:pPr>
@@ -5688,11 +6742,11 @@
       <w:pPr>
         <w:pStyle w:val="Heading2"/>
       </w:pPr>
-      <w:bookmarkStart w:id="103" w:name="bk_anexo_b_manual_tec_22"/>
+      <w:bookmarkStart w:id="106" w:name="bk_anexo_b_manual_tec_22"/>
       <w:r>
         <w:t xml:space="preserve">8. Control documental</w:t>
       </w:r>
-      <w:bookmarkEnd w:id="103"/>
+      <w:bookmarkEnd w:id="106"/>
     </w:p>
     <w:p>
       <w:pPr>
@@ -5754,11 +6808,11 @@
       <w:pPr>
         <w:pStyle w:val="Heading2"/>
       </w:pPr>
-      <w:bookmarkStart w:id="104" w:name="bk_anexo_b_manual_tec_23"/>
+      <w:bookmarkStart w:id="107" w:name="bk_anexo_b_manual_tec_23"/>
       <w:r>
         <w:t xml:space="preserve">9. Estructura funcional del backend</w:t>
       </w:r>
-      <w:bookmarkEnd w:id="104"/>
+      <w:bookmarkEnd w:id="107"/>
     </w:p>
     <w:p>
       <w:pPr>
@@ -5932,11 +6986,11 @@
       <w:pPr>
         <w:pStyle w:val="Heading2"/>
       </w:pPr>
-      <w:bookmarkStart w:id="105" w:name="bk_anexo_b_manual_tec_24"/>
+      <w:bookmarkStart w:id="108" w:name="bk_anexo_b_manual_tec_24"/>
       <w:r>
         <w:t xml:space="preserve">10. Estructura funcional del frontend interno</w:t>
       </w:r>
-      <w:bookmarkEnd w:id="105"/>
+      <w:bookmarkEnd w:id="108"/>
     </w:p>
     <w:p>
       <w:pPr>
@@ -6014,11 +7068,11 @@
       <w:pPr>
         <w:pStyle w:val="Heading2"/>
       </w:pPr>
-      <w:bookmarkStart w:id="106" w:name="bk_anexo_b_manual_tec_25"/>
+      <w:bookmarkStart w:id="109" w:name="bk_anexo_b_manual_tec_25"/>
       <w:r>
         <w:t xml:space="preserve">11. Estructura funcional del portal externo</w:t>
       </w:r>
-      <w:bookmarkEnd w:id="106"/>
+      <w:bookmarkEnd w:id="109"/>
     </w:p>
     <w:p>
       <w:pPr>
@@ -6057,6 +7111,86 @@
         <w:pStyle w:val="List"/>
       </w:pPr>
       <w:r>
+        <w:t xml:space="preserve">- backend/src/Entity/EmpresaPortalCuenta.php</w:t>
+      </w:r>
+    </w:p>
+    <w:p>
+      <w:pPr>
+        <w:pStyle w:val="List"/>
+      </w:pPr>
+      <w:r>
+        <w:t xml:space="preserve">- backend/src/Entity/EmpresaSolicitud.php</w:t>
+      </w:r>
+    </w:p>
+    <w:p>
+      <w:pPr>
+        <w:pStyle w:val="List"/>
+      </w:pPr>
+      <w:r>
+        <w:t xml:space="preserve">- backend/src/Entity/EmpresaMensaje.php</w:t>
+      </w:r>
+    </w:p>
+    <w:p>
+      <w:pPr>
+        <w:pStyle w:val="Normal"/>
+      </w:pPr>
+      <w:r>
+        <w:t xml:space="preserve">El flujo tecnico del portal externo queda asi:</w:t>
+      </w:r>
+    </w:p>
+    <w:p>
+      <w:pPr>
+        <w:pStyle w:val="List"/>
+      </w:pPr>
+      <w:r>
+        <w:t xml:space="preserve">1. POST /portal-auth/register crea EmpresaPortalCuenta.</w:t>
+      </w:r>
+    </w:p>
+    <w:p>
+      <w:pPr>
+        <w:pStyle w:val="List"/>
+      </w:pPr>
+      <w:r>
+        <w:t xml:space="preserve">2. POST /portal-auth/login abre la sesion del firewall externo.</w:t>
+      </w:r>
+    </w:p>
+    <w:p>
+      <w:pPr>
+        <w:pStyle w:val="List"/>
+      </w:pPr>
+      <w:r>
+        <w:t xml:space="preserve">3. POST /api/portal-company/request crea EmpresaSolicitud asociada a la cuenta.</w:t>
+      </w:r>
+    </w:p>
+    <w:p>
+      <w:pPr>
+        <w:pStyle w:val="List"/>
+      </w:pPr>
+      <w:r>
+        <w:t xml:space="preserve">4. GET /registro-empresa/confirmar?token=... verifica el correo de la solicitud.</w:t>
+      </w:r>
+    </w:p>
+    <w:p>
+      <w:pPr>
+        <w:pStyle w:val="List"/>
+      </w:pPr>
+      <w:r>
+        <w:t xml:space="preserve">5. GET /api/portal-company/overview devuelve cuenta, solicitud, mensajes y, cuando ya existe, la empresa aprobada.</w:t>
+      </w:r>
+    </w:p>
+    <w:p>
+      <w:pPr>
+        <w:pStyle w:val="List"/>
+      </w:pPr>
+      <w:r>
+        <w:t xml:space="preserve">6. POST /api/portal-company/messages mantiene la conversacion desde la misma cuenta antes y despues de la aprobacion.</w:t>
+      </w:r>
+    </w:p>
+    <w:p>
+      <w:pPr>
+        <w:pStyle w:val="List"/>
+      </w:pPr>
+      <w:r>
         <w:t xml:space="preserve">- backend/src/Service/PortalCompanyAccountManager.php</w:t>
       </w:r>
     </w:p>
@@ -6064,11 +7198,11 @@
       <w:pPr>
         <w:pStyle w:val="Heading2"/>
       </w:pPr>
-      <w:bookmarkStart w:id="107" w:name="bk_anexo_b_manual_tec_26"/>
+      <w:bookmarkStart w:id="110" w:name="bk_anexo_b_manual_tec_26"/>
       <w:r>
         <w:t xml:space="preserve">12. App de escritorio</w:t>
       </w:r>
-      <w:bookmarkEnd w:id="107"/>
+      <w:bookmarkEnd w:id="110"/>
     </w:p>
     <w:p>
       <w:pPr>
@@ -6202,11 +7336,11 @@
       <w:pPr>
         <w:pStyle w:val="Heading2"/>
       </w:pPr>
-      <w:bookmarkStart w:id="108" w:name="bk_anexo_b_manual_tec_27"/>
+      <w:bookmarkStart w:id="111" w:name="bk_anexo_b_manual_tec_27"/>
       <w:r>
         <w:t xml:space="preserve">13. Exportacion CSV</w:t>
       </w:r>
-      <w:bookmarkEnd w:id="108"/>
+      <w:bookmarkEnd w:id="111"/>
     </w:p>
     <w:p>
       <w:pPr>
@@ -6300,11 +7434,11 @@
       <w:pPr>
         <w:pStyle w:val="Heading2"/>
       </w:pPr>
-      <w:bookmarkStart w:id="109" w:name="bk_anexo_b_manual_tec_28"/>
+      <w:bookmarkStart w:id="112" w:name="bk_anexo_b_manual_tec_28"/>
       <w:r>
         <w:t xml:space="preserve">14. Validacion tecnica</w:t>
       </w:r>
-      <w:bookmarkEnd w:id="109"/>
+      <w:bookmarkEnd w:id="112"/>
     </w:p>
     <w:p>
       <w:pPr>
@@ -6382,11 +7516,11 @@
       <w:pPr>
         <w:pStyle w:val="Heading2"/>
       </w:pPr>
-      <w:bookmarkStart w:id="110" w:name="bk_anexo_b_manual_tec_29"/>
+      <w:bookmarkStart w:id="113" w:name="bk_anexo_b_manual_tec_29"/>
       <w:r>
         <w:t xml:space="preserve">15. Riesgos tecnicos abiertos</w:t>
       </w:r>
-      <w:bookmarkEnd w:id="110"/>
+      <w:bookmarkEnd w:id="113"/>
     </w:p>
     <w:p>
       <w:pPr>
@@ -6429,21 +7563,21 @@
       <w:pPr>
         <w:pStyle w:val="Heading1"/>
       </w:pPr>
-      <w:bookmarkStart w:id="111" w:name="bk_anexo_c_capturas_y_1"/>
+      <w:bookmarkStart w:id="114" w:name="bk_anexo_c_capturas_y_1"/>
       <w:r>
         <w:t xml:space="preserve">Anexo C. Capturas y evidencias</w:t>
       </w:r>
-      <w:bookmarkEnd w:id="111"/>
+      <w:bookmarkEnd w:id="114"/>
     </w:p>
     <w:p>
       <w:pPr>
         <w:pStyle w:val="Heading2"/>
       </w:pPr>
-      <w:bookmarkStart w:id="112" w:name="bk_anexo_c_capturas_y_2"/>
+      <w:bookmarkStart w:id="115" w:name="bk_anexo_c_capturas_y_2"/>
       <w:r>
         <w:t xml:space="preserve">Indice de capturas</w:t>
       </w:r>
-      <w:bookmarkEnd w:id="112"/>
+      <w:bookmarkEnd w:id="115"/>
     </w:p>
     <w:p>
       <w:pPr>
@@ -6505,11 +7639,11 @@
       <w:pPr>
         <w:pStyle w:val="Heading2"/>
       </w:pPr>
-      <w:bookmarkStart w:id="113" w:name="bk_anexo_c_capturas_y_3"/>
+      <w:bookmarkStart w:id="116" w:name="bk_anexo_c_capturas_y_3"/>
       <w:r>
         <w:t xml:space="preserve">Inventario de archivos incluidos</w:t>
       </w:r>
-      <w:bookmarkEnd w:id="113"/>
+      <w:bookmarkEnd w:id="116"/>
     </w:p>
     <w:p>
       <w:pPr>
@@ -6571,11 +7705,11 @@
       <w:pPr>
         <w:pStyle w:val="Heading2"/>
       </w:pPr>
-      <w:bookmarkStart w:id="114" w:name="bk_anexo_c_capturas_y_4"/>
+      <w:bookmarkStart w:id="117" w:name="bk_anexo_c_capturas_y_4"/>
       <w:r>
         <w:t xml:space="preserve">Evidencias tecnicas asociadas</w:t>
       </w:r>
-      <w:bookmarkEnd w:id="114"/>
+      <w:bookmarkEnd w:id="117"/>
     </w:p>
     <w:p>
       <w:pPr>
@@ -6653,11 +7787,11 @@
       <w:pPr>
         <w:pStyle w:val="Heading2"/>
       </w:pPr>
-      <w:bookmarkStart w:id="115" w:name="bk_anexo_c_capturas_y_5"/>
+      <w:bookmarkStart w:id="118" w:name="bk_anexo_c_capturas_y_5"/>
       <w:r>
         <w:t xml:space="preserve">Criterios de captura final</w:t>
       </w:r>
-      <w:bookmarkEnd w:id="115"/>
+      <w:bookmarkEnd w:id="118"/>
     </w:p>
     <w:p>
       <w:pPr>
@@ -6716,31 +7850,31 @@
       <w:pPr>
         <w:pStyle w:val="Heading1"/>
       </w:pPr>
-      <w:bookmarkStart w:id="116" w:name="bk_anexo_d_codigo_rel_1"/>
+      <w:bookmarkStart w:id="119" w:name="bk_anexo_d_codigo_rel_1"/>
       <w:r>
         <w:t xml:space="preserve">Anexo D. Codigo Relevante</w:t>
       </w:r>
-      <w:bookmarkEnd w:id="116"/>
+      <w:bookmarkEnd w:id="119"/>
     </w:p>
     <w:p>
       <w:pPr>
         <w:pStyle w:val="Heading2"/>
       </w:pPr>
-      <w:bookmarkStart w:id="117" w:name="bk_anexo_d_codigo_rel_2"/>
+      <w:bookmarkStart w:id="120" w:name="bk_anexo_d_codigo_rel_2"/>
       <w:r>
         <w:t xml:space="preserve">1. Backend</w:t>
       </w:r>
-      <w:bookmarkEnd w:id="117"/>
+      <w:bookmarkEnd w:id="120"/>
     </w:p>
     <w:p>
       <w:pPr>
         <w:pStyle w:val="Heading3"/>
       </w:pPr>
-      <w:bookmarkStart w:id="118" w:name="bk_anexo_d_codigo_rel_3"/>
+      <w:bookmarkStart w:id="121" w:name="bk_anexo_d_codigo_rel_3"/>
       <w:r>
         <w:t xml:space="preserve">Seguridad y autenticacion</w:t>
       </w:r>
-      <w:bookmarkEnd w:id="118"/>
+      <w:bookmarkEnd w:id="121"/>
     </w:p>
     <w:p>
       <w:pPr>
@@ -6770,11 +7904,11 @@
       <w:pPr>
         <w:pStyle w:val="Heading3"/>
       </w:pPr>
-      <w:bookmarkStart w:id="119" w:name="bk_anexo_d_codigo_rel_4"/>
+      <w:bookmarkStart w:id="122" w:name="bk_anexo_d_codigo_rel_4"/>
       <w:r>
         <w:t xml:space="preserve">Dominio y persistencia</w:t>
       </w:r>
-      <w:bookmarkEnd w:id="119"/>
+      <w:bookmarkEnd w:id="122"/>
     </w:p>
     <w:p>
       <w:pPr>
@@ -6836,11 +7970,11 @@
       <w:pPr>
         <w:pStyle w:val="Heading3"/>
       </w:pPr>
-      <w:bookmarkStart w:id="120" w:name="bk_anexo_d_codigo_rel_5"/>
+      <w:bookmarkStart w:id="123" w:name="bk_anexo_d_codigo_rel_5"/>
       <w:r>
         <w:t xml:space="preserve">Casos de uso principales</w:t>
       </w:r>
-      <w:bookmarkEnd w:id="120"/>
+      <w:bookmarkEnd w:id="123"/>
     </w:p>
     <w:p>
       <w:pPr>
@@ -6894,21 +8028,21 @@
       <w:pPr>
         <w:pStyle w:val="Heading2"/>
       </w:pPr>
-      <w:bookmarkStart w:id="121" w:name="bk_anexo_d_codigo_rel_6"/>
+      <w:bookmarkStart w:id="124" w:name="bk_anexo_d_codigo_rel_6"/>
       <w:r>
         <w:t xml:space="preserve">2. Frontend interno</w:t>
       </w:r>
-      <w:bookmarkEnd w:id="121"/>
+      <w:bookmarkEnd w:id="124"/>
     </w:p>
     <w:p>
       <w:pPr>
         <w:pStyle w:val="Heading3"/>
       </w:pPr>
-      <w:bookmarkStart w:id="122" w:name="bk_anexo_d_codigo_rel_7"/>
+      <w:bookmarkStart w:id="125" w:name="bk_anexo_d_codigo_rel_7"/>
       <w:r>
         <w:t xml:space="preserve">Shell principal y modulos</w:t>
       </w:r>
-      <w:bookmarkEnd w:id="122"/>
+      <w:bookmarkEnd w:id="125"/>
     </w:p>
     <w:p>
       <w:pPr>
@@ -6922,11 +8056,11 @@
       <w:pPr>
         <w:pStyle w:val="Heading3"/>
       </w:pPr>
-      <w:bookmarkStart w:id="123" w:name="bk_anexo_d_codigo_rel_8"/>
+      <w:bookmarkStart w:id="126" w:name="bk_anexo_d_codigo_rel_8"/>
       <w:r>
         <w:t xml:space="preserve">Formularios reutilizables</w:t>
       </w:r>
-      <w:bookmarkEnd w:id="123"/>
+      <w:bookmarkEnd w:id="126"/>
     </w:p>
     <w:p>
       <w:pPr>
@@ -6964,11 +8098,11 @@
       <w:pPr>
         <w:pStyle w:val="Heading3"/>
       </w:pPr>
-      <w:bookmarkStart w:id="124" w:name="bk_anexo_d_codigo_rel_9"/>
+      <w:bookmarkStart w:id="127" w:name="bk_anexo_d_codigo_rel_9"/>
       <w:r>
         <w:t xml:space="preserve">Infraestructura de UI</w:t>
       </w:r>
-      <w:bookmarkEnd w:id="124"/>
+      <w:bookmarkEnd w:id="127"/>
     </w:p>
     <w:p>
       <w:pPr>
@@ -6998,11 +8132,11 @@
       <w:pPr>
         <w:pStyle w:val="Heading3"/>
       </w:pPr>
-      <w:bookmarkStart w:id="125" w:name="bk_anexo_d_codigo_rel_10"/>
+      <w:bookmarkStart w:id="128" w:name="bk_anexo_d_codigo_rel_10"/>
       <w:r>
         <w:t xml:space="preserve">Cliente API y exportacion</w:t>
       </w:r>
-      <w:bookmarkEnd w:id="125"/>
+      <w:bookmarkEnd w:id="128"/>
     </w:p>
     <w:p>
       <w:pPr>
@@ -7024,11 +8158,11 @@
       <w:pPr>
         <w:pStyle w:val="Heading2"/>
       </w:pPr>
-      <w:bookmarkStart w:id="126" w:name="bk_anexo_d_codigo_rel_11"/>
+      <w:bookmarkStart w:id="129" w:name="bk_anexo_d_codigo_rel_11"/>
       <w:r>
         <w:t xml:space="preserve">3. Frontend externo</w:t>
       </w:r>
-      <w:bookmarkEnd w:id="126"/>
+      <w:bookmarkEnd w:id="129"/>
     </w:p>
     <w:p>
       <w:pPr>
@@ -7042,11 +8176,11 @@
       <w:pPr>
         <w:pStyle w:val="Heading2"/>
       </w:pPr>
-      <w:bookmarkStart w:id="127" w:name="bk_anexo_d_codigo_rel_12"/>
+      <w:bookmarkStart w:id="130" w:name="bk_anexo_d_codigo_rel_12"/>
       <w:r>
         <w:t xml:space="preserve">4. Suite de pruebas destacada</w:t>
       </w:r>
-      <w:bookmarkEnd w:id="127"/>
+      <w:bookmarkEnd w:id="130"/>
     </w:p>
     <w:p>
       <w:pPr>
@@ -7100,11 +8234,11 @@
       <w:pPr>
         <w:pStyle w:val="Heading2"/>
       </w:pPr>
-      <w:bookmarkStart w:id="128" w:name="bk_anexo_d_codigo_rel_13"/>
+      <w:bookmarkStart w:id="131" w:name="bk_anexo_d_codigo_rel_13"/>
       <w:r>
         <w:t xml:space="preserve">5. Criterio de seleccion</w:t>
       </w:r>
-      <w:bookmarkEnd w:id="128"/>
+      <w:bookmarkEnd w:id="131"/>
     </w:p>
     <w:p>
       <w:pPr>

</xml_diff>

<commit_message>
Unify desktop cloud ops and refresh defense assets
</commit_message>
<xml_diff>
--- a/docs/memoria-final.docx
+++ b/docs/memoria-final.docx
@@ -10,8 +10,8 @@
   <dc:title>Memoria final TFG</dc:title>
   <dc:creator>Luis Angel</dc:creator>
   <cp:lastModifiedBy>Codex</cp:lastModifiedBy>
-  <dcterms:created xsi:type="dcterms:W3CDTF">2026-05-17T23:57:26.724Z</dcterms:created>
-  <dcterms:modified xsi:type="dcterms:W3CDTF">2026-05-17T23:57:26.724Z</dcterms:modified>
+  <dcterms:created xsi:type="dcterms:W3CDTF">2026-05-18T21:17:30.575Z</dcterms:created>
+  <dcterms:modified xsi:type="dcterms:W3CDTF">2026-05-18T21:17:30.575Z</dcterms:modified>
 </cp:coreProperties>
 </file>
 
@@ -1416,7 +1416,7 @@
           <w:rPr>
             <w:rStyle w:val="Hyperlink"/>
           </w:rPr>
-          <w:t xml:space="preserve">Figura 1. Esquema de bloques de funcionalidad del sistema.</w:t>
+          <w:t xml:space="preserve">Figura 1. Arquitectura operativa y de despliegue del sistema.</w:t>
         </w:r>
       </w:hyperlink>
     </w:p>
@@ -1430,7 +1430,7 @@
           <w:rPr>
             <w:rStyle w:val="Hyperlink"/>
           </w:rPr>
-          <w:t xml:space="preserve">Figura 2. Esquema relacional de la base de datos.</w:t>
+          <w:t xml:space="preserve">Figura 2. Esquema relacional del nucleo empresa-centro y operativa academica.</w:t>
         </w:r>
       </w:hyperlink>
     </w:p>
@@ -1732,7 +1732,7 @@
         <w:pStyle w:val="Normal"/>
       </w:pPr>
       <w:r>
-        <w:t xml:space="preserve">Dentro del alcance actual se incluyen el portal interno, el portal externo, la API REST, la persistencia relacional, la autenticacion interna, el preregistro externo de cuentas de empresa, la verificacion por correo, la aprobacion interna, la mensajeria empresa-centro, la bandeja unificada, el seguimiento con evidencias, la evaluacion final, el control documental versionado, la exportacion CSV, un monitor privado con MFA para operaciones sensibles, una app de escritorio capaz de levantar servicios, ejecutar pruebas, revisar logs y gestionar backups SQLite, y un despliegue funcional en Google Cloud Compute Engine con Docker Compose y PostgreSQL. Quedan fuera de alcance, en esta entrega, la firma electronica avanzada, las integraciones corporativas con ERP o directorios institucionales, el endurecimiento completo de produccion con HTTPS y dominio propio, y el almacenamiento documental en nube gestionada.</w:t>
+        <w:t xml:space="preserve">Dentro del alcance actual se incluyen el portal interno, el portal externo, la API REST, la persistencia relacional, la autenticacion interna, el preregistro externo de cuentas de empresa, la verificacion por correo, la aprobacion interna, la mensajeria empresa-centro, la bandeja unificada, el seguimiento con evidencias, la evaluacion final, el control documental versionado, la exportacion CSV, una app de escritorio para operacion tecnica en local o en cloud, y un despliegue funcional en Google Cloud Compute Engine con Docker Compose, PostgreSQL, proxy HTTPS y correo transaccional operativo. Se mantiene ademas un monitor privado y el flujo local con MFA para acceso publico temporal, pero ya no forman parte del recorrido principal de la demo cloud. Quedan fuera de alcance, en esta entrega, la firma electronica avanzada, las integraciones corporativas con ERP o directorios institucionales, el almacenamiento documental en nube gestionada, un cliente de escritorio completo para toda la operativa funcional del negocio y una instrumentacion avanzada de produccion con alta disponibilidad.</w:t>
       </w:r>
     </w:p>
     <w:p>
@@ -1978,15 +1978,15 @@
         <w:pStyle w:val="Normal"/>
       </w:pPr>
       <w:r>
-        <w:t xml:space="preserve">La solucion se estructura en seis bloques principales. El primero es una API REST construida con Symfony, responsable de seguridad, logica de negocio, persistencia, auditoria y exposicion de endpoints. El segundo es un portal interno desarrollado con React, TypeScript y Vite, orientado a coordinacion academica y gestion operativa. El tercero es un portal externo, tambien basado en React y TypeScript, que cubre tanto el registro inicial como el area posterior de empresa aprobada. El cuarto es una guia documental publica separada del uso operativo. El quinto es un monitor privado para supervision tecnica y control del acceso externo. El sexto es Agora Desktop, una app Electron para operacion local, monitor integrado, automatizacion de pruebas, diagnostico y empaquetado Windows.</w:t>
-      </w:r>
-    </w:p>
-    <w:p>
-      <w:pPr>
-        <w:pStyle w:val="Normal"/>
-      </w:pPr>
-      <w:r>
-        <w:t xml:space="preserve">El backend publica rutas protegidas bajo /api, rutas publicas para el registro y la verificacion externa, rutas de autenticacion para cuentas de empresa y una shell integrada para servir los dos frontends. En la entrega integrada, el panel interno se sirve bajo /app, la documentacion bajo /documentacion, el monitor privado bajo /monitor y el portal externo bajo /externo. La app de escritorio trabaja sobre esas mismas rutas locales y no introduce una logica paralela distinta, sino una capa de control sobre el mismo backend.</w:t>
+        <w:t xml:space="preserve">La solucion se estructura en seis bloques principales. El primero es una API REST construida con Symfony, responsable de seguridad, logica de negocio, persistencia, auditoria y exposicion de endpoints. El segundo es un portal interno desarrollado con React, TypeScript y Vite, orientado a coordinacion academica y gestion operativa. El tercero es un portal externo, tambien basado en React y TypeScript, que cubre tanto el preregistro inicial como el area posterior de empresa aprobada. El cuarto es una guia documental publica separada del uso operativo. El quinto es una capa de supervision tecnica formada por un monitor web de respaldo y por una consola de escritorio. El sexto es Agora Desktop, una app Electron para operacion tecnica local o remota, automatizacion de pruebas, diagnostico, logs, reinicios y empaquetado Windows.</w:t>
+      </w:r>
+    </w:p>
+    <w:p>
+      <w:pPr>
+        <w:pStyle w:val="Normal"/>
+      </w:pPr>
+      <w:r>
+        <w:t xml:space="preserve">El backend publica rutas protegidas bajo /api, rutas publicas acotadas para preregistro y verificacion externa, rutas de autenticacion para cuentas de empresa y una shell integrada para servir los dos frontends. En la entrega integrada, el panel interno se sirve bajo /app, la documentacion bajo /documentacion, el monitor web de respaldo bajo /legacy/monitor y el portal externo bajo /externo. La app de escritorio trabaja sobre esas mismas rutas, pero no replica la logica funcional del portal interno: se limita deliberadamente a la supervision tecnica, la ejecucion de pruebas, la lectura de logs y ciertas operaciones de infraestructura local o remota.</w:t>
       </w:r>
     </w:p>
     <w:p>
@@ -1996,7 +1996,7 @@
       <w:r>
         <w:drawing>
           <wp:inline xmlns:wp="http://schemas.openxmlformats.org/drawingml/2006/wordprocessingDrawing" distT="0" distB="0" distL="0" distR="0">
-            <wp:extent cx="5669280" cy="3779520"/>
+            <wp:extent cx="5669280" cy="3472434"/>
             <wp:docPr id="1" name="01-bloques-funcionalidad.png"/>
             <a:graphic xmlns:a="http://schemas.openxmlformats.org/drawingml/2006/main">
               <a:graphicData uri="http://schemas.openxmlformats.org/drawingml/2006/picture">
@@ -2014,7 +2014,7 @@
                   <pic:spPr>
                     <a:xfrm>
                       <a:off x="0" y="0"/>
-                      <a:ext cx="5669280" cy="3779520"/>
+                      <a:ext cx="5669280" cy="3472434"/>
                     </a:xfrm>
                     <a:prstGeom prst="rect">
                       <a:avLst/>
@@ -2034,7 +2034,7 @@
       </w:pPr>
       <w:bookmarkStart w:id="17" w:name="fig_memoria_final_1"/>
       <w:r>
-        <w:t xml:space="preserve">Figura 1. Esquema de bloques de funcionalidad del sistema.</w:t>
+        <w:t xml:space="preserve">Figura 1. Arquitectura operativa y de despliegue del sistema.</w:t>
       </w:r>
       <w:bookmarkEnd w:id="17"/>
     </w:p>
@@ -2093,23 +2093,23 @@
         <w:pStyle w:val="List"/>
       </w:pPr>
       <w:r>
-        <w:t xml:space="preserve">5. Capa documental y operativa: documentacion publica, monitor privado y app de escritorio para soporte tecnico, pruebas y empaquetado.</w:t>
-      </w:r>
-    </w:p>
-    <w:p>
-      <w:pPr>
-        <w:pStyle w:val="List"/>
-      </w:pPr>
-      <w:r>
-        <w:t xml:space="preserve">6. Capa de infraestructura: VM publica en cloud o entorno local empaquetado, contenedores Docker, almacenamiento persistente para documentos, servicio de correo transaccional y resolucion publica por dominio o DNS wildcard.</w:t>
-      </w:r>
-    </w:p>
-    <w:p>
-      <w:pPr>
-        <w:pStyle w:val="Normal"/>
-      </w:pPr>
-      <w:r>
-        <w:t xml:space="preserve">Esta explicacion es especialmente util para la defensa, porque permite exponer la aplicacion mediante esquemas y responsabilidades en lugar de entrar en codigo fuente. Tambien deja claro que el sistema ya no depende conceptualmente de una unica maquina local, sino de componentes desacoplados que pueden redistribuirse en un servidor o cloud.</w:t>
+        <w:t xml:space="preserve">5. Capa documental y operativa: documentacion publica, monitor web de respaldo y app de escritorio para soporte tecnico, pruebas y empaquetado.</w:t>
+      </w:r>
+    </w:p>
+    <w:p>
+      <w:pPr>
+        <w:pStyle w:val="List"/>
+      </w:pPr>
+      <w:r>
+        <w:t xml:space="preserve">6. Capa de infraestructura: VM publica en Google Cloud Compute Engine o entorno local empaquetado, contenedores Docker, proxy HTTPS, almacenamiento persistente para documentos, servicio de correo transaccional y resolucion publica por DNS wildcard.</w:t>
+      </w:r>
+    </w:p>
+    <w:p>
+      <w:pPr>
+        <w:pStyle w:val="Normal"/>
+      </w:pPr>
+      <w:r>
+        <w:t xml:space="preserve">Esta explicacion es especialmente util para la defensa, porque permite exponer la aplicacion mediante esquemas y responsabilidades en lugar de entrar en codigo fuente. Tambien deja claro que el sistema ya no depende conceptualmente de una unica maquina local, sino de componentes desacoplados que pueden redistribuirse en un servidor o cloud. La Figura 1 resume precisamente esa topologia final: dos clientes web, una consola tecnica, un borde HTTPS y un backend contenedorizado sobre infraestructura persistente.</w:t>
       </w:r>
     </w:p>
     <w:p>
@@ -2127,7 +2127,7 @@
         <w:pStyle w:val="Normal"/>
       </w:pPr>
       <w:r>
-        <w:t xml:space="preserve">En la defensa resulta mas claro bajar un nivel adicional y expresar la arquitectura como un recorrido tecnico de extremo a extremo:</w:t>
+        <w:t xml:space="preserve">En la defensa resulta mas claro bajar un nivel adicional y expresar la arquitectura como un recorrido tecnico de extremo a extremo. El esquema visual de la Figura 1 se complementa con este recorrido textual para justificar que la misma raiz publica sirve los dos portales, la documentacion y la shell legacy, mientras la consola de escritorio opera por API y SSH:</w:t>
       </w:r>
     </w:p>
     <w:p>
@@ -2335,7 +2335,7 @@
         <w:pStyle w:val="Code"/>
       </w:pPr>
       <w:r>
-        <w:t xml:space="preserve">  -&gt; /monitor como area tecnica privada</w:t>
+        <w:t xml:space="preserve">  -&gt; /legacy/monitor como area tecnica de respaldo</w:t>
       </w:r>
     </w:p>
     <w:p>
@@ -2565,7 +2565,7 @@
       <w:r>
         <w:drawing>
           <wp:inline xmlns:wp="http://schemas.openxmlformats.org/drawingml/2006/wordprocessingDrawing" distT="0" distB="0" distL="0" distR="0">
-            <wp:extent cx="5669280" cy="3595153"/>
+            <wp:extent cx="5669280" cy="3527552"/>
             <wp:docPr id="2" name="02-esquema-relacional.png"/>
             <a:graphic xmlns:a="http://schemas.openxmlformats.org/drawingml/2006/main">
               <a:graphicData uri="http://schemas.openxmlformats.org/drawingml/2006/picture">
@@ -2583,7 +2583,7 @@
                   <pic:spPr>
                     <a:xfrm>
                       <a:off x="0" y="0"/>
-                      <a:ext cx="5669280" cy="3595153"/>
+                      <a:ext cx="5669280" cy="3527552"/>
                     </a:xfrm>
                     <a:prstGeom prst="rect">
                       <a:avLst/>
@@ -2603,7 +2603,7 @@
       </w:pPr>
       <w:bookmarkStart w:id="22" w:name="fig_memoria_final_2"/>
       <w:r>
-        <w:t xml:space="preserve">Figura 2. Esquema relacional de la base de datos.</w:t>
+        <w:t xml:space="preserve">Figura 2. Esquema relacional del nucleo empresa-centro y operativa academica.</w:t>
       </w:r>
       <w:bookmarkEnd w:id="22"/>
     </w:p>
@@ -2622,7 +2622,7 @@
         <w:pStyle w:val="Normal"/>
       </w:pPr>
       <w:r>
-        <w:t xml:space="preserve">La parte que mas conviene explicar con detalle en la memoria y en la defensa es la relacion entre la cuenta de empresa, la solicitud y el canal de mensajes, porque ese eje es el que da continuidad al flujo externo.</w:t>
+        <w:t xml:space="preserve">La parte que mas conviene explicar con detalle en la memoria y en la defensa es la relacion entre la cuenta de empresa, la solicitud y el canal de mensajes, porque ese eje es el que da continuidad al flujo externo. La Figura 2 ya no se limita al esquema academico basico: incorpora tambien EmpresaPortalCuenta, EmpresaSolicitud, EmpresaMensaje, EmpresaDocumento, ContactoEmpresa y los satelites de Convenio para reflejar la operativa real del despliegue final.</w:t>
       </w:r>
     </w:p>
     <w:p>
@@ -2872,7 +2872,7 @@
         <w:pStyle w:val="Normal"/>
       </w:pPr>
       <w:r>
-        <w:t xml:space="preserve">La seguridad del entorno interno se apoya en autenticacion Symfony, jerarquia de roles y una combinacion de json_login y sesion de navegador. El sistema diferencia perfiles de administracion, coordinacion, documentacion, monitorizacion y auditoria. Las operaciones sensibles del monitor, como levantar o detener el acceso externo, requieren MFA por correo. Ademas, las acciones relevantes se registran mediante auditoria interna.</w:t>
+        <w:t xml:space="preserve">La seguridad del entorno interno se apoya en autenticacion Symfony, jerarquia de roles y una combinacion de json_login y sesion de navegador. El sistema diferencia perfiles de administracion, coordinacion, documentacion, monitorizacion y auditoria. En el despliegue cloud, la exposicion publica se sirve tras un proxy HTTPS con certificados de Let's Encrypt, encabezados de seguridad, cookies seguras y limitacion de peticiones. Las operaciones sensibles del flujo local de acceso publico temporal siguen requiriendo MFA por correo. Ademas, las acciones relevantes se registran mediante auditoria interna.</w:t>
       </w:r>
     </w:p>
     <w:p>
@@ -3741,7 +3741,7 @@
         <w:pStyle w:val="Normal"/>
       </w:pPr>
       <w:r>
-        <w:t xml:space="preserve">La configuracion se apoya en variables de entorno para base de datos, correo saliente, credenciales del panel, destino MFA, URL base y opciones de desarrollo. Esta aproximacion evita credenciales embebidas y permite reproducir el entorno con mayor control. En la entrega final se ha dejado preparado Brevo como proveedor de correo transaccional para verificacion de empresas, activacion y recuperacion de cuentas de empresa, MFA interno y avisos de rechazo de solicitudes externas.</w:t>
+        <w:t xml:space="preserve">La configuracion se apoya en variables de entorno para base de datos, correo saliente, credenciales del panel, destino MFA, URL base y opciones de desarrollo. Esta aproximacion evita credenciales embebidas y permite reproducir el entorno con mayor control. En la entrega final se ha dejado preparado Brevo como proveedor de correo transaccional para verificacion de empresas, recuperacion de cuentas de empresa, MFA interno y avisos de rechazo de solicitudes externas.</w:t>
       </w:r>
     </w:p>
     <w:p>
@@ -3767,15 +3767,15 @@
         <w:pStyle w:val="Normal"/>
       </w:pPr>
       <w:r>
-        <w:t xml:space="preserve">La entrega se mantiene integrada bajo una unica raiz HTTP: /app para el portal interno, /externo para el portal externo, /documentacion para la guia funcional y /monitor para la supervision tecnica. En la revision final esa integracion ya no se limita al equipo local: se ha publicado en una VM Ubuntu de Google Cloud Compute Engine con Docker Compose, PostgreSQL y volumen persistente para documentos, de modo que los dos portales quedan accesibles desde el exterior sin depender del portatil del alumno. En paralelo, Agora Desktop sigue existiendo como alternativa local autocontenida para diagnostico, empaquetado y demostracion offline.</w:t>
-      </w:r>
-    </w:p>
-    <w:p>
-      <w:pPr>
-        <w:pStyle w:val="Normal"/>
-      </w:pPr>
-      <w:r>
-        <w:t xml:space="preserve">Durante la revision final se ha corregido ademas un aspecto importante de acceso externo: los enlaces de verificacion, activacion y recuperacion ya no quedan ligados a 127.0.0.1 ni a una IP local cuando el flujo se prueba desde fuera. Si se define APP_EXTERNAL_BASE_URL, el backend genera esas URLs con el origen publico correcto. En el despliegue actual se ha usado un hostname gratuito basado en nip.io, con formato agora.&lt;IP_PUBLICA&gt;.nip.io, para evitar comprar dominio solo con fines de validacion academica y mantener un nombre estable para la demo.</w:t>
+        <w:t xml:space="preserve">La entrega se mantiene integrada bajo una unica raiz: /app para el portal interno, /externo para el portal externo, /documentacion para la guia funcional y /legacy/monitor como shell tecnica de respaldo. En la revision final esa integracion ya no se limita al equipo local: se ha publicado en una VM Ubuntu de Google Cloud Compute Engine con Docker Compose, PostgreSQL, volumen persistente para documentos y un proxy HTTPS delante de la aplicacion. De este modo los dos portales quedan accesibles desde el exterior sin depender del portatil del alumno. En paralelo, Agora Desktop sigue existiendo como alternativa local autocontenida para diagnostico, empaquetado y demostracion offline, y como consola tecnica remota para la VM.</w:t>
+      </w:r>
+    </w:p>
+    <w:p>
+      <w:pPr>
+        <w:pStyle w:val="Normal"/>
+      </w:pPr>
+      <w:r>
+        <w:t xml:space="preserve">Durante la revision final se ha corregido ademas un aspecto importante de acceso externo: los enlaces de verificacion y recuperacion ya no quedan ligados a 127.0.0.1 ni a una IP local cuando el flujo se prueba desde fuera. Si se define APP_EXTERNAL_BASE_URL, el backend genera esas URLs con el origen publico correcto. En el despliegue actual se ha usado un hostname gratuito basado en nip.io, con formato agora.&lt;IP_PUBLICA&gt;.nip.io, para evitar comprar dominio solo con fines de validacion academica y mantener un nombre estable para la demo.</w:t>
       </w:r>
     </w:p>
     <w:p>
@@ -3793,7 +3793,7 @@
         <w:pStyle w:val="Normal"/>
       </w:pPr>
       <w:r>
-        <w:t xml:space="preserve">Para que la profesora pueda probar la aplicacion no es necesario que instale PHP, Composer, Node.js ni npm. La via principal es el despliegue publico en Google Cloud, accesible por IP publica o por un hostname nip.io derivado de esa IP. Desde esa misma direccion se accede a los espacios principales de la entrega:</w:t>
+        <w:t xml:space="preserve">Para que la profesora pueda probar la aplicacion no es necesario que instale PHP, Composer, Node.js ni npm. La via principal es el despliegue publico en Google Cloud, accesible por HTTPS mediante un hostname nip.io derivado de la IP publica. Desde esa misma direccion se accede a los espacios principales de la entrega:</w:t>
       </w:r>
     </w:p>
     <w:p>
@@ -3825,7 +3825,7 @@
         <w:pStyle w:val="List"/>
       </w:pPr>
       <w:r>
-        <w:t xml:space="preserve">- URL/monitor para la supervision tecnica, protegida con autenticacion y MFA.</w:t>
+        <w:t xml:space="preserve">- URL/legacy/monitor como fallback tecnico protegido, aunque la supervision ordinaria se realiza ya desde Agora Desktop.</w:t>
       </w:r>
     </w:p>
     <w:p>
@@ -3859,15 +3859,15 @@
         <w:pStyle w:val="Normal"/>
       </w:pPr>
       <w:r>
-        <w:t xml:space="preserve">Aunque la entrega sigue siendo academica, la arquitectura ya se ha llevado a un despliegue remoto funcional. La opcion aplicada en esta revision ha sido una VM Linux en Google Cloud Compute Engine con Docker Compose, Apache/PHP en contenedor, PostgreSQL 16 y volumen persistente. Esta base encaja bien con el proyecto porque reutiliza la estructura actual sin reescribir Agora hacia servicios mas opinionados como Cloud Run o Cloud SQL. En este escenario, SQLite deja de ser la base recomendada y pasa a utilizarse solo como soporte de desarrollo o demo local.</w:t>
-      </w:r>
-    </w:p>
-    <w:p>
-      <w:pPr>
-        <w:pStyle w:val="Normal"/>
-      </w:pPr>
-      <w:r>
-        <w:t xml:space="preserve">Como mejora posterior seguiria siendo recomendable sustituir el hostname wildcard gratuito por un dominio propio con HTTPS, declarar proxies confiables para que Symfony resuelva correctamente encabezados reenviados y conectar credenciales reales de Brevo para correo transaccional. Estas necesidades no implican rehacer la aplicacion, sino completar la capa de infraestructura y endurecimiento para un uso continuo fuera del entorno academico.</w:t>
+        <w:t xml:space="preserve">Aunque la entrega sigue siendo academica, la arquitectura ya se ha llevado a un despliegue remoto funcional. La opcion aplicada en esta revision ha sido una VM Linux en Google Cloud Compute Engine con Docker Compose, proxy Caddy con certificados de Let's Encrypt, Apache/PHP en contenedor, PostgreSQL 16 y volumen persistente. Esta base encaja bien con el proyecto porque reutiliza la estructura actual sin reescribir Agora hacia servicios mas opinionados como Cloud Run o Cloud SQL. En este escenario, SQLite deja de ser la base recomendada y pasa a utilizarse solo como soporte de desarrollo o demo local.</w:t>
+      </w:r>
+    </w:p>
+    <w:p>
+      <w:pPr>
+        <w:pStyle w:val="Normal"/>
+      </w:pPr>
+      <w:r>
+        <w:t xml:space="preserve">Como mejora posterior seguiria siendo recomendable sustituir el hostname wildcard gratuito por un dominio institucional propio, automatizar rotacion de secretos y backups fuera de la propia VM, y mover el almacenamiento documental a un servicio gestionado con politicas de retencion. Estas necesidades no implican rehacer la aplicacion, sino completar la capa de infraestructura y endurecimiento para un uso continuo fuera del entorno academico.</w:t>
       </w:r>
     </w:p>
     <w:p>
@@ -3997,15 +3997,15 @@
         <w:pStyle w:val="List"/>
       </w:pPr>
       <w:r>
-        <w:t xml:space="preserve">4. Contrasenas: la activacion y recuperacion de empresa exigen longitud minima, mayusculas, minusculas y numeros.</w:t>
-      </w:r>
-    </w:p>
-    <w:p>
-      <w:pPr>
-        <w:pStyle w:val="List"/>
-      </w:pPr>
-      <w:r>
-        <w:t xml:space="preserve">5. Tokens: los enlaces de activacion, recuperacion y portal se tratan como valores opacos y se codifican al enviarlos por URL.</w:t>
+        <w:t xml:space="preserve">4. Contrasenas: el preregistro y la recuperacion de empresa exigen longitud minima, mayusculas, minusculas y numeros.</w:t>
+      </w:r>
+    </w:p>
+    <w:p>
+      <w:pPr>
+        <w:pStyle w:val="List"/>
+      </w:pPr>
+      <w:r>
+        <w:t xml:space="preserve">5. Tokens: los enlaces de verificacion y recuperacion se tratan como valores opacos y se codifican al enviarlos por URL.</w:t>
       </w:r>
     </w:p>
     <w:p>
@@ -4207,7 +4207,7 @@
         <w:pStyle w:val="List"/>
       </w:pPr>
       <w:r>
-        <w:t xml:space="preserve">- comprobaciones HTTP de /app, /externo, /documentacion, /monitor, /api/bootstrap, /api/monitor y /api/empresa-solicitudes/bandeja.</w:t>
+        <w:t xml:space="preserve">- comprobaciones HTTP de /app, /externo, /documentacion, /legacy/monitor, /api/bootstrap, /api/monitor y /api/empresa-solicitudes/bandeja.</w:t>
       </w:r>
     </w:p>
     <w:p>
@@ -4241,14 +4241,6 @@
         <w:pStyle w:val="List"/>
       </w:pPr>
       <w:r>
-        <w:t xml:space="preserve">- el correo transaccional real todavia depende de conectar credenciales validas de Brevo en la VM;</w:t>
-      </w:r>
-    </w:p>
-    <w:p>
-      <w:pPr>
-        <w:pStyle w:val="List"/>
-      </w:pPr>
-      <w:r>
         <w:t xml:space="preserve">- no existe todavia integracion con identidad corporativa o SSO institucional;</w:t>
       </w:r>
     </w:p>
@@ -4257,15 +4249,23 @@
         <w:pStyle w:val="List"/>
       </w:pPr>
       <w:r>
-        <w:t xml:space="preserve">- el almacenamiento documental general sigue siendo local, aunque los nuevos documentos privados de empresa ya pueden quedar embebidos en base de datos;</w:t>
-      </w:r>
-    </w:p>
-    <w:p>
-      <w:pPr>
-        <w:pStyle w:val="List"/>
-      </w:pPr>
-      <w:r>
-        <w:t xml:space="preserve">- el rendimiento ha mejorado de forma clara, pero no se ha realizado un perfilado profundo en infraestructura de produccion ni se ha incorporado HTTPS con dominio propio.</w:t>
+        <w:t xml:space="preserve">- el almacenamiento documental general sigue apoyandose en volumen local de la VM, aunque los documentos privados de empresa ya puedan embebirse en base de datos;</w:t>
+      </w:r>
+    </w:p>
+    <w:p>
+      <w:pPr>
+        <w:pStyle w:val="List"/>
+      </w:pPr>
+      <w:r>
+        <w:t xml:space="preserve">- la app de escritorio ya cubre supervision tecnica local y remota, pero no absorbe aun toda la operativa funcional del portal interno;</w:t>
+      </w:r>
+    </w:p>
+    <w:p>
+      <w:pPr>
+        <w:pStyle w:val="List"/>
+      </w:pPr>
+      <w:r>
+        <w:t xml:space="preserve">- el rendimiento ha mejorado de forma clara, pero no se ha realizado todavia un perfilado profundo con carga concurrente, observabilidad completa ni estrategia de alta disponibilidad.</w:t>
       </w:r>
     </w:p>
     <w:p>
@@ -4293,7 +4293,7 @@
         <w:pStyle w:val="Normal"/>
       </w:pPr>
       <w:r>
-        <w:t xml:space="preserve">El proyecto cumple el objetivo principal de centralizar la gestion de empresas colaboradoras y practicas en una sola plataforma, diferenciando correctamente el espacio interno, el externo, la documentacion, la supervision tecnica y la operacion local desde escritorio. Ademas, deja preparado un flujo demostrable y comprensible para la defensa: registro externo, verificacion por correo, seguimiento del estado, activacion de cuenta, revision interna, gestion de entidades, control documental, exportacion CSV y arranque autocontenido mediante app Windows.</w:t>
+        <w:t xml:space="preserve">El proyecto cumple el objetivo principal de centralizar la gestion de empresas colaboradoras y practicas en una sola plataforma, diferenciando correctamente el espacio interno, el externo, la documentacion, la supervision tecnica y la operacion desde escritorio. Ademas, deja preparado un flujo demostrable y comprensible para la defensa: preregistro externo, verificacion por correo, seguimiento del estado, revision interna, gestion de entidades, control documental, exportacion CSV, despliegue cloud accesible por HTTPS y consola tecnica de soporte en Windows.</w:t>
       </w:r>
     </w:p>
     <w:p>
@@ -4311,7 +4311,63 @@
         <w:pStyle w:val="Normal"/>
       </w:pPr>
       <w:r>
-        <w:t xml:space="preserve">Las siguientes iteraciones deberian priorizar, por este orden, el despliegue sobre infraestructura permanente, la integracion con identidad corporativa, el almacenamiento documental en nube con politicas de retencion, la ampliacion de cuadros de mando por perfil, hojas de horas con aprobacion de empresa, matching basico entre estudiantes y convenios, firma electronica avanzada y una instrumentacion de rendimiento mas profunda.</w:t>
+        <w:t xml:space="preserve">Las siguientes iteraciones deberian priorizar mejoras secundarias o de evolucion, no bloqueantes para la entrega actual:</w:t>
+      </w:r>
+    </w:p>
+    <w:p>
+      <w:pPr>
+        <w:pStyle w:val="List"/>
+      </w:pPr>
+      <w:r>
+        <w:t xml:space="preserve">1. consolidar Agora Desktop como cliente tecnico principal y decidir si la shell web /legacy/monitor debe retirarse por completo cuando ya no aporte valor operativo;</w:t>
+      </w:r>
+    </w:p>
+    <w:p>
+      <w:pPr>
+        <w:pStyle w:val="List"/>
+      </w:pPr>
+      <w:r>
+        <w:t xml:space="preserve">2. decidir si el escritorio debe seguir siendo solo consola tecnica o si debe incorporar bandeja, aprobaciones y mensajeria del negocio;</w:t>
+      </w:r>
+    </w:p>
+    <w:p>
+      <w:pPr>
+        <w:pStyle w:val="List"/>
+      </w:pPr>
+      <w:r>
+        <w:t xml:space="preserve">3. integrar identidad corporativa o SSO institucional para evitar cuentas aisladas del centro;</w:t>
+      </w:r>
+    </w:p>
+    <w:p>
+      <w:pPr>
+        <w:pStyle w:val="List"/>
+      </w:pPr>
+      <w:r>
+        <w:t xml:space="preserve">4. mover almacenamiento documental y copias de seguridad a servicios gestionados con politicas de retencion;</w:t>
+      </w:r>
+    </w:p>
+    <w:p>
+      <w:pPr>
+        <w:pStyle w:val="List"/>
+      </w:pPr>
+      <w:r>
+        <w:t xml:space="preserve">5. sustituir el hostname nip.io por un dominio institucional propio y formalizar la gestion de secretos;</w:t>
+      </w:r>
+    </w:p>
+    <w:p>
+      <w:pPr>
+        <w:pStyle w:val="List"/>
+      </w:pPr>
+      <w:r>
+        <w:t xml:space="preserve">6. ampliar la suite de regresion automatica y el perfilado de rendimiento con carga concurrente;</w:t>
+      </w:r>
+    </w:p>
+    <w:p>
+      <w:pPr>
+        <w:pStyle w:val="List"/>
+      </w:pPr>
+      <w:r>
+        <w:t xml:space="preserve">7. valorar firma electronica avanzada, hojas de horas, matching entre estudiantes y convenios y cuadros de mando por perfil como ampliaciones funcionales posteriores.</w:t>
       </w:r>
     </w:p>
     <w:p>
@@ -6177,7 +6233,7 @@
         <w:pStyle w:val="List"/>
       </w:pPr>
       <w:r>
-        <w:t xml:space="preserve">- http://127.0.0.1:8000/monitor</w:t>
+        <w:t xml:space="preserve">- http://127.0.0.1:8000/legacy/monitor</w:t>
       </w:r>
     </w:p>
     <w:p>
@@ -6195,7 +6251,7 @@
         <w:pStyle w:val="Normal"/>
       </w:pPr>
       <w:r>
-        <w:t xml:space="preserve">Para una revision externa rapida, la persona evaluadora no tiene que instalar el entorno si la VM publica esta activa. La ruta usada en la revision final es una VM Ubuntu de Google Cloud Compute Engine publicada por HTTP y resuelta con un hostname wildcard nip.io, por ejemplo http://agora.34.175.224.87.nip.io/. Desde esa direccion se accede a URL/app/, URL/externo/, URL/documentacion/ o URL/monitor/.</w:t>
+        <w:t xml:space="preserve">Para una revision externa rapida, la persona evaluadora no tiene que instalar el entorno si la VM publica esta activa. La ruta usada en la revision final es una VM Ubuntu de Google Cloud Compute Engine publicada por HTTPS y resuelta con un hostname wildcard nip.io, por ejemplo https://agora.34.175.224.87.nip.io/. Desde esa direccion se accede a URL/app/, URL/externo/, URL/documentacion/ o URL/legacy/monitor/.</w:t>
       </w:r>
     </w:p>
     <w:p>
@@ -6277,7 +6333,7 @@
         <w:pStyle w:val="Normal"/>
       </w:pPr>
       <w:r>
-        <w:t xml:space="preserve">La build incluye resources/backend, resources/tools/cloudflared.exe y resources/php/php.exe. En tiempo de ejecucion la app controla migraciones, SQLite, acceso externo local, pruebas, logs, backups y restauracion desde su propia interfaz.</w:t>
+        <w:t xml:space="preserve">La build incluye resources/backend, resources/tools/cloudflared.exe y resources/php/php.exe. En tiempo de ejecucion la app controla migraciones, SQLite, acceso externo local, pruebas, logs, backups y restauracion desde su propia interfaz. Ademas, el modo cloud permite consumir el monitor remoto, abrir portales desplegados, leer logs por SSH y ejecutar pruebas de smoke contra la instancia publica.</w:t>
       </w:r>
     </w:p>
     <w:p>
@@ -6511,7 +6567,7 @@
         <w:pStyle w:val="List"/>
       </w:pPr>
       <w:r>
-        <w:t xml:space="preserve">- El backend mantiene http_basic como soporte operativo para pruebas y utilidades.</w:t>
+        <w:t xml:space="preserve">- El backend mantiene http_basic como soporte operativo para pruebas y utilidades tecnicas controladas.</w:t>
       </w:r>
     </w:p>
     <w:p>
@@ -6527,15 +6583,15 @@
         <w:pStyle w:val="List"/>
       </w:pPr>
       <w:r>
-        <w:t xml:space="preserve">- Existen rutas publicas para preregistro de cuenta, activacion legacy, login, solicitud de reseteo y restablecimiento de contrasena.</w:t>
-      </w:r>
-    </w:p>
-    <w:p>
-      <w:pPr>
-        <w:pStyle w:val="List"/>
-      </w:pPr>
-      <w:r>
-        <w:t xml:space="preserve">- El monitor privado exige rol de monitorizacion y MFA para activar o detener el acceso publico.</w:t>
+        <w:t xml:space="preserve">- Existen rutas publicas para preregistro de cuenta, login del portal externo, confirmacion de solicitud y solicitud de reseteo o restablecimiento de contrasena.</w:t>
+      </w:r>
+    </w:p>
+    <w:p>
+      <w:pPr>
+        <w:pStyle w:val="List"/>
+      </w:pPr>
+      <w:r>
+        <w:t xml:space="preserve">- El monitor privado exige rol de monitorizacion y MFA para activar o detener el acceso publico local temporal.</w:t>
       </w:r>
     </w:p>
     <w:p>
@@ -6711,14 +6767,6 @@
         <w:pStyle w:val="List"/>
       </w:pPr>
       <w:r>
-        <w:t xml:space="preserve">- activacion de cuentas de empresa;</w:t>
-      </w:r>
-    </w:p>
-    <w:p>
-      <w:pPr>
-        <w:pStyle w:val="List"/>
-      </w:pPr>
-      <w:r>
         <w:t xml:space="preserve">- reseteo de contrasena;</w:t>
       </w:r>
     </w:p>
@@ -7281,31 +7329,55 @@
         <w:pStyle w:val="List"/>
       </w:pPr>
       <w:r>
-        <w:t xml:space="preserve">- activar y desactivar acceso externo con MFA;</w:t>
-      </w:r>
-    </w:p>
-    <w:p>
-      <w:pPr>
-        <w:pStyle w:val="List"/>
-      </w:pPr>
-      <w:r>
-        <w:t xml:space="preserve">- abrir portal interno, externo y monitor;</w:t>
-      </w:r>
-    </w:p>
-    <w:p>
-      <w:pPr>
-        <w:pStyle w:val="List"/>
-      </w:pPr>
-      <w:r>
-        <w:t xml:space="preserve">- ejecutar baterias de pruebas;</w:t>
-      </w:r>
-    </w:p>
-    <w:p>
-      <w:pPr>
-        <w:pStyle w:val="List"/>
-      </w:pPr>
-      <w:r>
-        <w:t xml:space="preserve">- abrir logs, diagnosticar dependencias;</w:t>
+        <w:t xml:space="preserve">- activar y desactivar acceso externo local con MFA;</w:t>
+      </w:r>
+    </w:p>
+    <w:p>
+      <w:pPr>
+        <w:pStyle w:val="List"/>
+      </w:pPr>
+      <w:r>
+        <w:t xml:space="preserve">- abrir portal interno, externo y monitor en local;</w:t>
+      </w:r>
+    </w:p>
+    <w:p>
+      <w:pPr>
+        <w:pStyle w:val="List"/>
+      </w:pPr>
+      <w:r>
+        <w:t xml:space="preserve">- guardar perfiles remotos cloud;</w:t>
+      </w:r>
+    </w:p>
+    <w:p>
+      <w:pPr>
+        <w:pStyle w:val="List"/>
+      </w:pPr>
+      <w:r>
+        <w:t xml:space="preserve">- abrir portal interno y externo desplegados;</w:t>
+      </w:r>
+    </w:p>
+    <w:p>
+      <w:pPr>
+        <w:pStyle w:val="List"/>
+      </w:pPr>
+      <w:r>
+        <w:t xml:space="preserve">- consultar monitor y logs remotos;</w:t>
+      </w:r>
+    </w:p>
+    <w:p>
+      <w:pPr>
+        <w:pStyle w:val="List"/>
+      </w:pPr>
+      <w:r>
+        <w:t xml:space="preserve">- reiniciar contenedores remotos y generar backups PostgreSQL;</w:t>
+      </w:r>
+    </w:p>
+    <w:p>
+      <w:pPr>
+        <w:pStyle w:val="List"/>
+      </w:pPr>
+      <w:r>
+        <w:t xml:space="preserve">- ejecutar baterias de pruebas y smoke workflows;</w:t>
       </w:r>
     </w:p>
     <w:p>
@@ -7321,14 +7393,6 @@
         <w:pStyle w:val="List"/>
       </w:pPr>
       <w:r>
-        <w:t xml:space="preserve">- ejecutar un smoke workflow extremo a extremo;</w:t>
-      </w:r>
-    </w:p>
-    <w:p>
-      <w:pPr>
-        <w:pStyle w:val="List"/>
-      </w:pPr>
-      <w:r>
         <w:t xml:space="preserve">- empaquetar la app con PHP portable.</w:t>
       </w:r>
     </w:p>
@@ -7527,7 +7591,7 @@
         <w:pStyle w:val="List"/>
       </w:pPr>
       <w:r>
-        <w:t xml:space="preserve">- el acceso publico depende de una maquina local y de un tunel temporal;</w:t>
+        <w:t xml:space="preserve">- el acceso publico principal ya no depende del equipo local, pero el modo local con tunel temporal sigue existiendo como soporte tecnico;</w:t>
       </w:r>
     </w:p>
     <w:p>
@@ -7543,15 +7607,15 @@
         <w:pStyle w:val="List"/>
       </w:pPr>
       <w:r>
-        <w:t xml:space="preserve">- el almacenamiento documental sigue siendo local aunque el binario de nuevos documentos de empresa ya queda embebido en base de datos;</w:t>
-      </w:r>
-    </w:p>
-    <w:p>
-      <w:pPr>
-        <w:pStyle w:val="List"/>
-      </w:pPr>
-      <w:r>
-        <w:t xml:space="preserve">- la optimizacion de rendimiento puede profundizarse con perfilado adicional en produccion real.</w:t>
+        <w:t xml:space="preserve">- el almacenamiento documental sigue dependiendo de volumen local de la VM aunque el binario de nuevos documentos de empresa ya quede embebido en base de datos;</w:t>
+      </w:r>
+    </w:p>
+    <w:p>
+      <w:pPr>
+        <w:pStyle w:val="List"/>
+      </w:pPr>
+      <w:r>
+        <w:t xml:space="preserve">- la optimizacion de rendimiento puede profundizarse con perfilado adicional, observabilidad y pruebas de carga en produccion real.</w:t>
       </w:r>
     </w:p>
     <w:p>
@@ -7584,15 +7648,15 @@
         <w:pStyle w:val="List"/>
       </w:pPr>
       <w:r>
-        <w:t xml:space="preserve">1. Figura 1. Esquema de bloques de funcionalidad del sistema.</w:t>
-      </w:r>
-    </w:p>
-    <w:p>
-      <w:pPr>
-        <w:pStyle w:val="List"/>
-      </w:pPr>
-      <w:r>
-        <w:t xml:space="preserve">2. Figura 2. Esquema relacional de la base de datos.</w:t>
+        <w:t xml:space="preserve">1. Figura 1. Arquitectura operativa y de despliegue del sistema.</w:t>
+      </w:r>
+    </w:p>
+    <w:p>
+      <w:pPr>
+        <w:pStyle w:val="List"/>
+      </w:pPr>
+      <w:r>
+        <w:t xml:space="preserve">2. Figura 2. Esquema relacional del nucleo empresa-centro y operativa academica.</w:t>
       </w:r>
     </w:p>
     <w:p>
@@ -7740,7 +7804,7 @@
         <w:pStyle w:val="List"/>
       </w:pPr>
       <w:r>
-        <w:t xml:space="preserve">- validacion de rutas integradas bajo /app, /externo, /documentacion y /monitor;</w:t>
+        <w:t xml:space="preserve">- validacion de rutas integradas bajo /app, /externo, /documentacion y /legacy/monitor;</w:t>
       </w:r>
     </w:p>
     <w:p>

</xml_diff>

<commit_message>
Align final docs with desktop-only technical ops
</commit_message>
<xml_diff>
--- a/docs/memoria-final.docx
+++ b/docs/memoria-final.docx
@@ -10,8 +10,8 @@
   <dc:title>Memoria final TFG</dc:title>
   <dc:creator>Luis Angel</dc:creator>
   <cp:lastModifiedBy>Codex</cp:lastModifiedBy>
-  <dcterms:created xsi:type="dcterms:W3CDTF">2026-05-18T22:00:02.555Z</dcterms:created>
-  <dcterms:modified xsi:type="dcterms:W3CDTF">2026-05-18T22:00:02.555Z</dcterms:modified>
+  <dcterms:created xsi:type="dcterms:W3CDTF">2026-05-18T22:17:11.529Z</dcterms:created>
+  <dcterms:modified xsi:type="dcterms:W3CDTF">2026-05-18T22:17:11.529Z</dcterms:modified>
 </cp:coreProperties>
 </file>
 
@@ -3928,7 +3928,7 @@
         <w:pStyle w:val="List"/>
       </w:pPr>
       <w:r>
-        <w:t xml:space="preserve">1. Arquitectura general: backend, panel interno, portal externo, documentacion y monitor tienen responsabilidades separadas.</w:t>
+        <w:t xml:space="preserve">1. Arquitectura general: backend, panel interno, portal externo, documentacion y Agora Desktop tienen responsabilidades separadas.</w:t>
       </w:r>
     </w:p>
     <w:p>
@@ -4056,7 +4056,7 @@
         <w:pStyle w:val="List"/>
       </w:pPr>
       <w:r>
-        <w:t xml:space="preserve">17. Monitorizacion: el monitor separa supervision tecnica de gestion funcional.</w:t>
+        <w:t xml:space="preserve">17. Supervision tecnica: Agora Desktop separa operacion tecnica de gestion funcional.</w:t>
       </w:r>
     </w:p>
     <w:p>

</xml_diff>

<commit_message>
Refresh final docs for desktop cloud ops
</commit_message>
<xml_diff>
--- a/docs/memoria-final.docx
+++ b/docs/memoria-final.docx
@@ -10,8 +10,8 @@
   <dc:title>Memoria final TFG</dc:title>
   <dc:creator>Luis Angel</dc:creator>
   <cp:lastModifiedBy>Codex</cp:lastModifiedBy>
-  <dcterms:created xsi:type="dcterms:W3CDTF">2026-05-18T22:17:11.529Z</dcterms:created>
-  <dcterms:modified xsi:type="dcterms:W3CDTF">2026-05-18T22:17:11.529Z</dcterms:modified>
+  <dcterms:created xsi:type="dcterms:W3CDTF">2026-05-19T14:49:09.910Z</dcterms:created>
+  <dcterms:modified xsi:type="dcterms:W3CDTF">2026-05-19T14:49:09.910Z</dcterms:modified>
 </cp:coreProperties>
 </file>
 
@@ -1941,7 +1941,7 @@
         <w:pStyle w:val="Normal"/>
       </w:pPr>
       <w:r>
-        <w:t xml:space="preserve">El backend publica rutas protegidas bajo /api, rutas publicas acotadas para preregistro y verificacion externa, rutas de autenticacion para cuentas de empresa y una shell integrada para servir los dos frontends. En la entrega integrada, el panel interno se sirve bajo /app, la documentacion bajo /documentacion y el portal externo bajo /externo. La app de escritorio trabaja sobre la misma raiz publica y sobre la API de monitorizacion, pero no replica la logica funcional del portal interno: se limita deliberadamente a la supervision tecnica, la ejecucion de pruebas, la lectura de logs y ciertas operaciones de infraestructura local o remota.</w:t>
+        <w:t xml:space="preserve">El backend publica rutas protegidas bajo /api, rutas publicas acotadas para preregistro y verificacion externa, rutas de autenticacion para cuentas de empresa y una shell integrada para servir los dos frontends. En la entrega integrada, el panel interno se sirve bajo /app, la documentacion bajo /documentacion y el portal externo bajo /externo. La app de escritorio trabaja sobre la misma raiz publica, consume /api/monitor y complementa esa telemetria con operaciones remotas por SSH sobre la VM. No replica la logica funcional del portal interno: se limita deliberadamente a la supervision tecnica, la ejecucion de pruebas, la lectura de logs, la deteccion de la URL cloud efectiva y ciertas operaciones de infraestructura local o remota, como el control de agora.service.</w:t>
       </w:r>
     </w:p>
     <w:p>
@@ -2298,7 +2298,7 @@
         <w:pStyle w:val="Code"/>
       </w:pPr>
       <w:r>
-        <w:t xml:space="preserve">  -&gt; Agora Desktop como capa local de soporte, pruebas, logs y empaquetado</w:t>
+        <w:t xml:space="preserve">  -&gt; Agora Desktop como capa local de soporte, pruebas, logs, lectura de URL cloud y operaciones SSH</w:t>
       </w:r>
     </w:p>
     <w:p>
@@ -2330,7 +2330,7 @@
         <w:pStyle w:val="Code"/>
       </w:pPr>
       <w:r>
-        <w:t xml:space="preserve">  -&gt; DNS wildcard nip.io / dominio publico</w:t>
+        <w:t xml:space="preserve">  -&gt; DNS wildcard nip.io / dominio publico efectivo</w:t>
       </w:r>
     </w:p>
     <w:p>
@@ -2347,6 +2347,14 @@
       </w:pPr>
       <w:r>
         <w:t xml:space="preserve">        -&gt; reglas firewall 80/443 + SSH administrado</w:t>
+      </w:r>
+    </w:p>
+    <w:p>
+      <w:pPr>
+        <w:pStyle w:val="Code"/>
+      </w:pPr>
+      <w:r>
+        <w:t xml:space="preserve">        -&gt; servicio systemd agora.service para arranque automatico</w:t>
       </w:r>
     </w:p>
     <w:p>
@@ -3730,7 +3738,7 @@
         <w:pStyle w:val="Normal"/>
       </w:pPr>
       <w:r>
-        <w:t xml:space="preserve">Durante la revision final se ha corregido ademas un aspecto importante de acceso externo: los enlaces de verificacion y recuperacion ya no quedan ligados a 127.0.0.1 ni a una IP local cuando el flujo se prueba desde fuera. Si se define APP_EXTERNAL_BASE_URL, el backend genera esas URLs con el origen publico correcto. En el despliegue actual se ha usado un hostname gratuito basado en nip.io, con formato agora.&lt;IP_PUBLICA&gt;.nip.io, para evitar comprar dominio solo con fines de validacion academica y mantener un nombre estable para la demo.</w:t>
+        <w:t xml:space="preserve">Durante la revision final se ha corregido ademas un aspecto importante de acceso externo: los enlaces de verificacion y recuperacion ya no quedan ligados a 127.0.0.1 ni a una IP local cuando el flujo se prueba desde fuera. Si se define APP_EXTERNAL_BASE_URL, el backend genera esas URLs con el origen publico correcto. En el despliegue actual se ha usado un hostname gratuito basado en nip.io, con formato agora.&lt;IP_PUBLICA&gt;.nip.io, para evitar comprar dominio solo con fines de validacion academica y mantener un nombre estable para la demo. Para evitar dependencia manual tras reinicios, la VM arranca Agora mediante agora.service y recalcula la URL efectiva si la IP publica cambia; esa URL queda visible en Agora Desktop junto con el estado del servicio.</w:t>
       </w:r>
     </w:p>
     <w:p>
@@ -3850,7 +3858,7 @@
         <w:pStyle w:val="Normal"/>
       </w:pPr>
       <w:r>
-        <w:t xml:space="preserve">La validacion del proyecto combina compilacion de ambos frontends, pruebas automatizadas de backend, pruebas unitarias del frontend interno, pruebas E2E de flujos criticos con Playwright, comprobaciones HTTP sobre las rutas integradas, smoke tests del launcher de escritorio y revisiones funcionales de correo, monitorizacion, documentacion, mensajeria, exportacion CSV, convenios, asignaciones, tutores y documentos privados de empresa.</w:t>
+        <w:t xml:space="preserve">La validacion del proyecto combina compilacion de ambos frontends, pruebas automatizadas de backend, pruebas unitarias del frontend interno, pruebas E2E de flujos criticos con Playwright, comprobaciones HTTP sobre las rutas integradas, smoke tests del launcher de escritorio y revisiones funcionales de correo, monitorizacion tecnica, documentacion, mensajeria, exportacion CSV, convenios, asignaciones, tutores, documentos privados de empresa y recuperacion tras reinicio de la VM.</w:t>
       </w:r>
     </w:p>
     <w:p>

</xml_diff>

<commit_message>
Refresh final defense assets and delivery docs
</commit_message>
<xml_diff>
--- a/docs/memoria-final.docx
+++ b/docs/memoria-final.docx
@@ -10,8 +10,8 @@
   <dc:title>Memoria final TFG</dc:title>
   <dc:creator>Luis Angel</dc:creator>
   <cp:lastModifiedBy>Codex</cp:lastModifiedBy>
-  <dcterms:created xsi:type="dcterms:W3CDTF">2026-05-22T18:12:58.728Z</dcterms:created>
-  <dcterms:modified xsi:type="dcterms:W3CDTF">2026-05-22T18:12:58.728Z</dcterms:modified>
+  <dcterms:created xsi:type="dcterms:W3CDTF">2026-05-27T16:54:31.952Z</dcterms:created>
+  <dcterms:modified xsi:type="dcterms:W3CDTF">2026-05-27T16:54:31.952Z</dcterms:modified>
 </cp:coreProperties>
 </file>
 
@@ -60,7 +60,7 @@
         <w:jc w:val="center"/>
       </w:pPr>
       <w:r>
-        <w:t xml:space="preserve">Fecha de revision: 19/05/2026</w:t>
+        <w:t xml:space="preserve">Fecha de revision: 27/05/2026</w:t>
       </w:r>
     </w:p>
     <w:p>
@@ -348,7 +348,7 @@
         <w:pStyle w:val="TocEntry"/>
         <w:ind w:left="360"/>
       </w:pPr>
-      <w:hyperlink w:anchor="bk_memoria_final_21" w:history="1">
+      <w:hyperlink w:anchor="bk_memoria_final_22" w:history="1">
         <w:r>
           <w:rPr>
             <w:rStyle w:val="Hyperlink"/>
@@ -362,7 +362,7 @@
         <w:pStyle w:val="TocEntry"/>
         <w:ind w:left="360"/>
       </w:pPr>
-      <w:hyperlink w:anchor="bk_memoria_final_22" w:history="1">
+      <w:hyperlink w:anchor="bk_memoria_final_23" w:history="1">
         <w:r>
           <w:rPr>
             <w:rStyle w:val="Hyperlink"/>
@@ -376,7 +376,7 @@
         <w:pStyle w:val="TocEntry"/>
         <w:ind w:left="360"/>
       </w:pPr>
-      <w:hyperlink w:anchor="bk_memoria_final_24" w:history="1">
+      <w:hyperlink w:anchor="bk_memoria_final_25" w:history="1">
         <w:r>
           <w:rPr>
             <w:rStyle w:val="Hyperlink"/>
@@ -390,7 +390,7 @@
         <w:pStyle w:val="TocEntry"/>
         <w:ind w:left="360"/>
       </w:pPr>
-      <w:hyperlink w:anchor="bk_memoria_final_25" w:history="1">
+      <w:hyperlink w:anchor="bk_memoria_final_26" w:history="1">
         <w:r>
           <w:rPr>
             <w:rStyle w:val="Hyperlink"/>
@@ -404,7 +404,7 @@
         <w:pStyle w:val="TocEntry"/>
         <w:ind w:left="360"/>
       </w:pPr>
-      <w:hyperlink w:anchor="bk_memoria_final_27" w:history="1">
+      <w:hyperlink w:anchor="bk_memoria_final_28" w:history="1">
         <w:r>
           <w:rPr>
             <w:rStyle w:val="Hyperlink"/>
@@ -417,7 +417,7 @@
       <w:pPr>
         <w:pStyle w:val="TocEntry"/>
       </w:pPr>
-      <w:hyperlink w:anchor="bk_memoria_final_28" w:history="1">
+      <w:hyperlink w:anchor="bk_memoria_final_29" w:history="1">
         <w:r>
           <w:rPr>
             <w:rStyle w:val="Hyperlink"/>
@@ -431,7 +431,7 @@
         <w:pStyle w:val="TocEntry"/>
         <w:ind w:left="360"/>
       </w:pPr>
-      <w:hyperlink w:anchor="bk_memoria_final_29" w:history="1">
+      <w:hyperlink w:anchor="bk_memoria_final_30" w:history="1">
         <w:r>
           <w:rPr>
             <w:rStyle w:val="Hyperlink"/>
@@ -445,7 +445,7 @@
         <w:pStyle w:val="TocEntry"/>
         <w:ind w:left="360"/>
       </w:pPr>
-      <w:hyperlink w:anchor="bk_memoria_final_30" w:history="1">
+      <w:hyperlink w:anchor="bk_memoria_final_31" w:history="1">
         <w:r>
           <w:rPr>
             <w:rStyle w:val="Hyperlink"/>
@@ -459,7 +459,7 @@
         <w:pStyle w:val="TocEntry"/>
         <w:ind w:left="360"/>
       </w:pPr>
-      <w:hyperlink w:anchor="bk_memoria_final_31" w:history="1">
+      <w:hyperlink w:anchor="bk_memoria_final_32" w:history="1">
         <w:r>
           <w:rPr>
             <w:rStyle w:val="Hyperlink"/>
@@ -473,7 +473,7 @@
         <w:pStyle w:val="TocEntry"/>
         <w:ind w:left="360"/>
       </w:pPr>
-      <w:hyperlink w:anchor="bk_memoria_final_32" w:history="1">
+      <w:hyperlink w:anchor="bk_memoria_final_33" w:history="1">
         <w:r>
           <w:rPr>
             <w:rStyle w:val="Hyperlink"/>
@@ -487,7 +487,7 @@
         <w:pStyle w:val="TocEntry"/>
         <w:ind w:left="360"/>
       </w:pPr>
-      <w:hyperlink w:anchor="bk_memoria_final_33" w:history="1">
+      <w:hyperlink w:anchor="bk_memoria_final_34" w:history="1">
         <w:r>
           <w:rPr>
             <w:rStyle w:val="Hyperlink"/>
@@ -500,7 +500,7 @@
       <w:pPr>
         <w:pStyle w:val="TocEntry"/>
       </w:pPr>
-      <w:hyperlink w:anchor="bk_memoria_final_34" w:history="1">
+      <w:hyperlink w:anchor="bk_memoria_final_35" w:history="1">
         <w:r>
           <w:rPr>
             <w:rStyle w:val="Hyperlink"/>
@@ -514,7 +514,7 @@
         <w:pStyle w:val="TocEntry"/>
         <w:ind w:left="360"/>
       </w:pPr>
-      <w:hyperlink w:anchor="bk_memoria_final_35" w:history="1">
+      <w:hyperlink w:anchor="bk_memoria_final_36" w:history="1">
         <w:r>
           <w:rPr>
             <w:rStyle w:val="Hyperlink"/>
@@ -528,7 +528,7 @@
         <w:pStyle w:val="TocEntry"/>
         <w:ind w:left="360"/>
       </w:pPr>
-      <w:hyperlink w:anchor="bk_memoria_final_36" w:history="1">
+      <w:hyperlink w:anchor="bk_memoria_final_37" w:history="1">
         <w:r>
           <w:rPr>
             <w:rStyle w:val="Hyperlink"/>
@@ -542,7 +542,7 @@
         <w:pStyle w:val="TocEntry"/>
         <w:ind w:left="360"/>
       </w:pPr>
-      <w:hyperlink w:anchor="bk_memoria_final_37" w:history="1">
+      <w:hyperlink w:anchor="bk_memoria_final_38" w:history="1">
         <w:r>
           <w:rPr>
             <w:rStyle w:val="Hyperlink"/>
@@ -556,7 +556,7 @@
         <w:pStyle w:val="TocEntry"/>
         <w:ind w:left="360"/>
       </w:pPr>
-      <w:hyperlink w:anchor="bk_memoria_final_38" w:history="1">
+      <w:hyperlink w:anchor="bk_memoria_final_39" w:history="1">
         <w:r>
           <w:rPr>
             <w:rStyle w:val="Hyperlink"/>
@@ -570,7 +570,7 @@
         <w:pStyle w:val="TocEntry"/>
         <w:ind w:left="360"/>
       </w:pPr>
-      <w:hyperlink w:anchor="bk_memoria_final_39" w:history="1">
+      <w:hyperlink w:anchor="bk_memoria_final_40" w:history="1">
         <w:r>
           <w:rPr>
             <w:rStyle w:val="Hyperlink"/>
@@ -583,7 +583,7 @@
       <w:pPr>
         <w:pStyle w:val="TocEntry"/>
       </w:pPr>
-      <w:hyperlink w:anchor="bk_memoria_final_40" w:history="1">
+      <w:hyperlink w:anchor="bk_memoria_final_41" w:history="1">
         <w:r>
           <w:rPr>
             <w:rStyle w:val="Hyperlink"/>
@@ -597,7 +597,7 @@
         <w:pStyle w:val="TocEntry"/>
         <w:ind w:left="360"/>
       </w:pPr>
-      <w:hyperlink w:anchor="bk_memoria_final_41" w:history="1">
+      <w:hyperlink w:anchor="bk_memoria_final_42" w:history="1">
         <w:r>
           <w:rPr>
             <w:rStyle w:val="Hyperlink"/>
@@ -611,7 +611,7 @@
         <w:pStyle w:val="TocEntry"/>
         <w:ind w:left="360"/>
       </w:pPr>
-      <w:hyperlink w:anchor="bk_memoria_final_42" w:history="1">
+      <w:hyperlink w:anchor="bk_memoria_final_43" w:history="1">
         <w:r>
           <w:rPr>
             <w:rStyle w:val="Hyperlink"/>
@@ -625,7 +625,7 @@
         <w:pStyle w:val="TocEntry"/>
         <w:ind w:left="360"/>
       </w:pPr>
-      <w:hyperlink w:anchor="bk_memoria_final_43" w:history="1">
+      <w:hyperlink w:anchor="bk_memoria_final_44" w:history="1">
         <w:r>
           <w:rPr>
             <w:rStyle w:val="Hyperlink"/>
@@ -639,7 +639,7 @@
         <w:pStyle w:val="TocEntry"/>
         <w:ind w:left="360"/>
       </w:pPr>
-      <w:hyperlink w:anchor="bk_memoria_final_44" w:history="1">
+      <w:hyperlink w:anchor="bk_memoria_final_45" w:history="1">
         <w:r>
           <w:rPr>
             <w:rStyle w:val="Hyperlink"/>
@@ -653,7 +653,7 @@
         <w:pStyle w:val="TocEntry"/>
         <w:ind w:left="360"/>
       </w:pPr>
-      <w:hyperlink w:anchor="bk_memoria_final_45" w:history="1">
+      <w:hyperlink w:anchor="bk_memoria_final_46" w:history="1">
         <w:r>
           <w:rPr>
             <w:rStyle w:val="Hyperlink"/>
@@ -667,7 +667,7 @@
         <w:pStyle w:val="TocEntry"/>
         <w:ind w:left="360"/>
       </w:pPr>
-      <w:hyperlink w:anchor="bk_memoria_final_46" w:history="1">
+      <w:hyperlink w:anchor="bk_memoria_final_47" w:history="1">
         <w:r>
           <w:rPr>
             <w:rStyle w:val="Hyperlink"/>
@@ -680,7 +680,7 @@
       <w:pPr>
         <w:pStyle w:val="TocEntry"/>
       </w:pPr>
-      <w:hyperlink w:anchor="bk_memoria_final_47" w:history="1">
+      <w:hyperlink w:anchor="bk_memoria_final_48" w:history="1">
         <w:r>
           <w:rPr>
             <w:rStyle w:val="Hyperlink"/>
@@ -694,7 +694,7 @@
         <w:pStyle w:val="TocEntry"/>
         <w:ind w:left="360"/>
       </w:pPr>
-      <w:hyperlink w:anchor="bk_memoria_final_48" w:history="1">
+      <w:hyperlink w:anchor="bk_memoria_final_49" w:history="1">
         <w:r>
           <w:rPr>
             <w:rStyle w:val="Hyperlink"/>
@@ -708,7 +708,7 @@
         <w:pStyle w:val="TocEntry"/>
         <w:ind w:left="360"/>
       </w:pPr>
-      <w:hyperlink w:anchor="bk_memoria_final_51" w:history="1">
+      <w:hyperlink w:anchor="bk_memoria_final_52" w:history="1">
         <w:r>
           <w:rPr>
             <w:rStyle w:val="Hyperlink"/>
@@ -721,7 +721,7 @@
       <w:pPr>
         <w:pStyle w:val="TocEntry"/>
       </w:pPr>
-      <w:hyperlink w:anchor="bk_memoria_final_52" w:history="1">
+      <w:hyperlink w:anchor="bk_memoria_final_53" w:history="1">
         <w:r>
           <w:rPr>
             <w:rStyle w:val="Hyperlink"/>
@@ -734,7 +734,7 @@
       <w:pPr>
         <w:pStyle w:val="TocEntry"/>
       </w:pPr>
-      <w:hyperlink w:anchor="bk_memoria_final_53" w:history="1">
+      <w:hyperlink w:anchor="bk_memoria_final_54" w:history="1">
         <w:r>
           <w:rPr>
             <w:rStyle w:val="Hyperlink"/>
@@ -747,7 +747,7 @@
       <w:pPr>
         <w:pStyle w:val="TocEntry"/>
       </w:pPr>
-      <w:hyperlink w:anchor="bk_memoria_final_54" w:history="1">
+      <w:hyperlink w:anchor="bk_memoria_final_55" w:history="1">
         <w:r>
           <w:rPr>
             <w:rStyle w:val="Hyperlink"/>
@@ -761,7 +761,7 @@
         <w:pStyle w:val="TocEntry"/>
         <w:ind w:left="360"/>
       </w:pPr>
-      <w:hyperlink w:anchor="bk_memoria_final_55" w:history="1">
+      <w:hyperlink w:anchor="bk_memoria_final_56" w:history="1">
         <w:r>
           <w:rPr>
             <w:rStyle w:val="Hyperlink"/>
@@ -775,7 +775,7 @@
         <w:pStyle w:val="TocEntry"/>
         <w:ind w:left="360"/>
       </w:pPr>
-      <w:hyperlink w:anchor="bk_memoria_final_56" w:history="1">
+      <w:hyperlink w:anchor="bk_memoria_final_57" w:history="1">
         <w:r>
           <w:rPr>
             <w:rStyle w:val="Hyperlink"/>
@@ -789,7 +789,7 @@
         <w:pStyle w:val="TocEntry"/>
         <w:ind w:left="360"/>
       </w:pPr>
-      <w:hyperlink w:anchor="bk_memoria_final_57" w:history="1">
+      <w:hyperlink w:anchor="bk_memoria_final_58" w:history="1">
         <w:r>
           <w:rPr>
             <w:rStyle w:val="Hyperlink"/>
@@ -803,7 +803,7 @@
         <w:pStyle w:val="TocEntry"/>
         <w:ind w:left="360"/>
       </w:pPr>
-      <w:hyperlink w:anchor="bk_memoria_final_58" w:history="1">
+      <w:hyperlink w:anchor="bk_memoria_final_59" w:history="1">
         <w:r>
           <w:rPr>
             <w:rStyle w:val="Hyperlink"/>
@@ -2290,9 +2290,99 @@
       </w:pPr>
       <w:bookmarkStart w:id="21" w:name="bk_memoria_final_20"/>
       <w:r>
+        <w:t xml:space="preserve">Tecnologias utilizadas y justificacion</w:t>
+      </w:r>
+      <w:bookmarkEnd w:id="21"/>
+    </w:p>
+    <w:p>
+      <w:pPr>
+        <w:pStyle w:val="Normal"/>
+      </w:pPr>
+      <w:r>
+        <w:t xml:space="preserve">De cara a la defensa conviene justificar no solo que tecnologias se han usado, sino por que encajan con el problema real y con el tiempo disponible de la entrega:</w:t>
+      </w:r>
+    </w:p>
+    <w:p>
+      <w:pPr>
+        <w:pStyle w:val="List"/>
+      </w:pPr>
+      <w:r>
+        <w:t xml:space="preserve">- Symfony 7 + PHP 8.2 en el backend porque ofrecen una base madura para seguridad, validacion, controladores REST, Doctrine, sesiones y correo sin tener que reinventar infraestructura transversal.</w:t>
+      </w:r>
+    </w:p>
+    <w:p>
+      <w:pPr>
+        <w:pStyle w:val="List"/>
+      </w:pPr>
+      <w:r>
+        <w:t xml:space="preserve">- Doctrine ORM porque permite modelar entidades como empresa, solicitud, convenio, asignacion y mensaje con relaciones expresivas, migraciones y repositorios mantenibles.</w:t>
+      </w:r>
+    </w:p>
+    <w:p>
+      <w:pPr>
+        <w:pStyle w:val="List"/>
+      </w:pPr>
+      <w:r>
+        <w:t xml:space="preserve">- React + TypeScript + Vite en los dos portales porque separan bien experiencia interna y experiencia externa, agilizan la construccion de formularios y tablas reactivas y reducen errores de integracion gracias al tipado.</w:t>
+      </w:r>
+    </w:p>
+    <w:p>
+      <w:pPr>
+        <w:pStyle w:val="List"/>
+      </w:pPr>
+      <w:r>
+        <w:t xml:space="preserve">- PostgreSQL 16 en cloud porque da persistencia relacional robusta para un despliegue publico real, mientras que SQLite sigue siendo util como respaldo local o para la demo offline desde Agora Desktop.</w:t>
+      </w:r>
+    </w:p>
+    <w:p>
+      <w:pPr>
+        <w:pStyle w:val="List"/>
+      </w:pPr>
+      <w:r>
+        <w:t xml:space="preserve">- Docker Compose porque simplifica una publicacion reproducible del backend, la base de datos y el proxy, y facilita recuperar el entorno tras reinicios de la VM.</w:t>
+      </w:r>
+    </w:p>
+    <w:p>
+      <w:pPr>
+        <w:pStyle w:val="List"/>
+      </w:pPr>
+      <w:r>
+        <w:t xml:space="preserve">- Caddy como proxy HTTPS porque automatiza certificados de Let's Encrypt, cabeceras de seguridad y redireccion HTTP a HTTPS con muy poca configuracion operativa.</w:t>
+      </w:r>
+    </w:p>
+    <w:p>
+      <w:pPr>
+        <w:pStyle w:val="List"/>
+      </w:pPr>
+      <w:r>
+        <w:t xml:space="preserve">- Brevo como proveedor de correo porque permite cubrir verificacion, rechazo, recuperacion de cuenta y avisos transaccionales desde un servicio externo especializado.</w:t>
+      </w:r>
+    </w:p>
+    <w:p>
+      <w:pPr>
+        <w:pStyle w:val="List"/>
+      </w:pPr>
+      <w:r>
+        <w:t xml:space="preserve">- Electron en Agora Desktop porque resuelve una necesidad distinta del negocio: operar el entorno, leer logs, reiniciar servicios, ejecutar pruebas y disponer de un modo local de contingencia si la VM cloud falla.</w:t>
+      </w:r>
+    </w:p>
+    <w:p>
+      <w:pPr>
+        <w:pStyle w:val="List"/>
+      </w:pPr>
+      <w:r>
+        <w:t xml:space="preserve">- PHPUnit, Vitest y Playwright porque cubren tres niveles distintos de validacion: logica de backend, comportamiento unitario del frontend y flujos criticos integrados sobre navegador.</w:t>
+      </w:r>
+    </w:p>
+    <w:p>
+      <w:pPr>
+        <w:pStyle w:val="Heading3"/>
+      </w:pPr>
+      <w:bookmarkStart w:id="22" w:name="bk_memoria_final_21"/>
+      <w:r>
         <w:t xml:space="preserve">Esquema detallado de arquitectura</w:t>
       </w:r>
-      <w:bookmarkEnd w:id="21"/>
+      <w:bookmarkEnd w:id="22"/>
     </w:p>
     <w:p>
       <w:pPr>
@@ -2345,11 +2435,11 @@
         <w:pStyle w:val="Caption"/>
         <w:jc w:val="center"/>
       </w:pPr>
-      <w:bookmarkStart w:id="22" w:name="fig_memoria_final_2"/>
+      <w:bookmarkStart w:id="23" w:name="fig_memoria_final_2"/>
       <w:r>
         <w:t xml:space="preserve">Figura 2. Arquitectura detallada del despliegue cloud y del soporte local.</w:t>
       </w:r>
-      <w:bookmarkEnd w:id="22"/>
+      <w:bookmarkEnd w:id="23"/>
     </w:p>
     <w:p>
       <w:pPr>
@@ -2419,11 +2509,11 @@
       <w:pPr>
         <w:pStyle w:val="Heading2"/>
       </w:pPr>
-      <w:bookmarkStart w:id="23" w:name="bk_memoria_final_21"/>
+      <w:bookmarkStart w:id="24" w:name="bk_memoria_final_22"/>
       <w:r>
         <w:t xml:space="preserve">Justificacion tecnica de la separacion</w:t>
       </w:r>
-      <w:bookmarkEnd w:id="23"/>
+      <w:bookmarkEnd w:id="24"/>
     </w:p>
     <w:p>
       <w:pPr>
@@ -2453,11 +2543,11 @@
       <w:pPr>
         <w:pStyle w:val="Heading2"/>
       </w:pPr>
-      <w:bookmarkStart w:id="24" w:name="bk_memoria_final_22"/>
+      <w:bookmarkStart w:id="25" w:name="bk_memoria_final_23"/>
       <w:r>
         <w:t xml:space="preserve">Modelo de datos</w:t>
       </w:r>
-      <w:bookmarkEnd w:id="24"/>
+      <w:bookmarkEnd w:id="25"/>
     </w:p>
     <w:p>
       <w:pPr>
@@ -2510,21 +2600,21 @@
         <w:pStyle w:val="Caption"/>
         <w:jc w:val="center"/>
       </w:pPr>
-      <w:bookmarkStart w:id="25" w:name="fig_memoria_final_3"/>
+      <w:bookmarkStart w:id="26" w:name="fig_memoria_final_3"/>
       <w:r>
         <w:t xml:space="preserve">Figura 3. Esquema relacional del flujo empresa-centro y operativa academica.</w:t>
       </w:r>
-      <w:bookmarkEnd w:id="25"/>
+      <w:bookmarkEnd w:id="26"/>
     </w:p>
     <w:p>
       <w:pPr>
         <w:pStyle w:val="Heading3"/>
       </w:pPr>
-      <w:bookmarkStart w:id="26" w:name="bk_memoria_final_23"/>
+      <w:bookmarkStart w:id="27" w:name="bk_memoria_final_24"/>
       <w:r>
         <w:t xml:space="preserve">Relacion detallada entre cuenta, solicitud y mensajeria</w:t>
       </w:r>
-      <w:bookmarkEnd w:id="26"/>
+      <w:bookmarkEnd w:id="27"/>
     </w:p>
     <w:p>
       <w:pPr>
@@ -2770,11 +2860,11 @@
       <w:pPr>
         <w:pStyle w:val="Heading2"/>
       </w:pPr>
-      <w:bookmarkStart w:id="27" w:name="bk_memoria_final_24"/>
+      <w:bookmarkStart w:id="28" w:name="bk_memoria_final_25"/>
       <w:r>
         <w:t xml:space="preserve">Seguridad y control de acceso</w:t>
       </w:r>
-      <w:bookmarkEnd w:id="27"/>
+      <w:bookmarkEnd w:id="28"/>
     </w:p>
     <w:p>
       <w:pPr>
@@ -2796,11 +2886,11 @@
       <w:pPr>
         <w:pStyle w:val="Heading2"/>
       </w:pPr>
-      <w:bookmarkStart w:id="28" w:name="bk_memoria_final_25"/>
+      <w:bookmarkStart w:id="29" w:name="bk_memoria_final_26"/>
       <w:r>
         <w:t xml:space="preserve">Flujo de trabajo operativo</w:t>
       </w:r>
-      <w:bookmarkEnd w:id="28"/>
+      <w:bookmarkEnd w:id="29"/>
     </w:p>
     <w:p>
       <w:pPr>
@@ -2830,11 +2920,11 @@
       <w:pPr>
         <w:pStyle w:val="Heading3"/>
       </w:pPr>
-      <w:bookmarkStart w:id="29" w:name="bk_memoria_final_26"/>
+      <w:bookmarkStart w:id="30" w:name="bk_memoria_final_27"/>
       <w:r>
         <w:t xml:space="preserve">Esquema detallado del flujo de trabajo</w:t>
       </w:r>
-      <w:bookmarkEnd w:id="29"/>
+      <w:bookmarkEnd w:id="30"/>
     </w:p>
     <w:p>
       <w:pPr>
@@ -3248,11 +3338,11 @@
       <w:pPr>
         <w:pStyle w:val="Heading2"/>
       </w:pPr>
-      <w:bookmarkStart w:id="30" w:name="bk_memoria_final_27"/>
+      <w:bookmarkStart w:id="31" w:name="bk_memoria_final_28"/>
       <w:r>
         <w:t xml:space="preserve">Diseno de interfaz</w:t>
       </w:r>
-      <w:bookmarkEnd w:id="30"/>
+      <w:bookmarkEnd w:id="31"/>
     </w:p>
     <w:p>
       <w:pPr>
@@ -3313,11 +3403,11 @@
         <w:pStyle w:val="Caption"/>
         <w:jc w:val="center"/>
       </w:pPr>
-      <w:bookmarkStart w:id="31" w:name="fig_memoria_final_4"/>
+      <w:bookmarkStart w:id="32" w:name="fig_memoria_final_4"/>
       <w:r>
         <w:t xml:space="preserve">Figura 4. Panel interno, vista dashboard con KPI y exportacion.</w:t>
       </w:r>
-      <w:bookmarkEnd w:id="31"/>
+      <w:bookmarkEnd w:id="32"/>
     </w:p>
     <w:p>
       <w:pPr>
@@ -3362,11 +3452,11 @@
         <w:pStyle w:val="Caption"/>
         <w:jc w:val="center"/>
       </w:pPr>
-      <w:bookmarkStart w:id="32" w:name="fig_memoria_final_5"/>
+      <w:bookmarkStart w:id="33" w:name="fig_memoria_final_5"/>
       <w:r>
         <w:t xml:space="preserve">Figura 5. Panel interno, modulo de solicitudes y revision del flujo externo.</w:t>
       </w:r>
-      <w:bookmarkEnd w:id="32"/>
+      <w:bookmarkEnd w:id="33"/>
     </w:p>
     <w:p>
       <w:pPr>
@@ -3411,11 +3501,11 @@
         <w:pStyle w:val="Caption"/>
         <w:jc w:val="center"/>
       </w:pPr>
-      <w:bookmarkStart w:id="33" w:name="fig_memoria_final_6"/>
+      <w:bookmarkStart w:id="34" w:name="fig_memoria_final_6"/>
       <w:r>
         <w:t xml:space="preserve">Figura 6. Panel interno, bandeja unificada de mensajes con empresas.</w:t>
       </w:r>
-      <w:bookmarkEnd w:id="33"/>
+      <w:bookmarkEnd w:id="34"/>
     </w:p>
     <w:p>
       <w:pPr>
@@ -3460,11 +3550,11 @@
         <w:pStyle w:val="Caption"/>
         <w:jc w:val="center"/>
       </w:pPr>
-      <w:bookmarkStart w:id="34" w:name="fig_memoria_final_7"/>
+      <w:bookmarkStart w:id="35" w:name="fig_memoria_final_7"/>
       <w:r>
         <w:t xml:space="preserve">Figura 7. Portal externo con acceso de empresa y flujo de colaboracion.</w:t>
       </w:r>
-      <w:bookmarkEnd w:id="34"/>
+      <w:bookmarkEnd w:id="35"/>
     </w:p>
     <w:p>
       <w:pPr>
@@ -3509,11 +3599,11 @@
         <w:pStyle w:val="Caption"/>
         <w:jc w:val="center"/>
       </w:pPr>
-      <w:bookmarkStart w:id="35" w:name="fig_memoria_final_8"/>
+      <w:bookmarkStart w:id="36" w:name="fig_memoria_final_8"/>
       <w:r>
         <w:t xml:space="preserve">Figura 8. Guia funcional de la plataforma.</w:t>
       </w:r>
-      <w:bookmarkEnd w:id="35"/>
+      <w:bookmarkEnd w:id="36"/>
     </w:p>
     <w:p>
       <w:pPr>
@@ -3522,7 +3612,7 @@
       <w:r>
         <w:drawing>
           <wp:inline xmlns:wp="http://schemas.openxmlformats.org/drawingml/2006/wordprocessingDrawing" distT="0" distB="0" distL="0" distR="0">
-            <wp:extent cx="5623560" cy="3998976"/>
+            <wp:extent cx="5183408" cy="5257800"/>
             <wp:docPr id="9" name="07-agora-desktop-operativo.png"/>
             <a:graphic xmlns:a="http://schemas.openxmlformats.org/drawingml/2006/main">
               <a:graphicData uri="http://schemas.openxmlformats.org/drawingml/2006/picture">
@@ -3540,7 +3630,7 @@
                   <pic:spPr>
                     <a:xfrm>
                       <a:off x="0" y="0"/>
-                      <a:ext cx="5623560" cy="3998976"/>
+                      <a:ext cx="5183408" cy="5257800"/>
                     </a:xfrm>
                     <a:prstGeom prst="rect">
                       <a:avLst/>
@@ -3558,31 +3648,31 @@
         <w:pStyle w:val="Caption"/>
         <w:jc w:val="center"/>
       </w:pPr>
-      <w:bookmarkStart w:id="36" w:name="fig_memoria_final_9"/>
+      <w:bookmarkStart w:id="37" w:name="fig_memoria_final_9"/>
       <w:r>
         <w:t xml:space="preserve">Figura 9. Agora Desktop como consola tecnica local y cloud.</w:t>
       </w:r>
-      <w:bookmarkEnd w:id="36"/>
+      <w:bookmarkEnd w:id="37"/>
     </w:p>
     <w:p>
       <w:pPr>
         <w:pStyle w:val="Heading1"/>
       </w:pPr>
-      <w:bookmarkStart w:id="37" w:name="bk_memoria_final_28"/>
+      <w:bookmarkStart w:id="38" w:name="bk_memoria_final_29"/>
       <w:r>
         <w:t xml:space="preserve">Implementacion</w:t>
       </w:r>
-      <w:bookmarkEnd w:id="37"/>
+      <w:bookmarkEnd w:id="38"/>
     </w:p>
     <w:p>
       <w:pPr>
         <w:pStyle w:val="Heading2"/>
       </w:pPr>
-      <w:bookmarkStart w:id="38" w:name="bk_memoria_final_29"/>
+      <w:bookmarkStart w:id="39" w:name="bk_memoria_final_30"/>
       <w:r>
         <w:t xml:space="preserve">Backend Symfony</w:t>
       </w:r>
-      <w:bookmarkEnd w:id="38"/>
+      <w:bookmarkEnd w:id="39"/>
     </w:p>
     <w:p>
       <w:pPr>
@@ -3596,11 +3686,11 @@
       <w:pPr>
         <w:pStyle w:val="Heading2"/>
       </w:pPr>
-      <w:bookmarkStart w:id="39" w:name="bk_memoria_final_30"/>
+      <w:bookmarkStart w:id="40" w:name="bk_memoria_final_31"/>
       <w:r>
         <w:t xml:space="preserve">Portal interno</w:t>
       </w:r>
-      <w:bookmarkEnd w:id="39"/>
+      <w:bookmarkEnd w:id="40"/>
     </w:p>
     <w:p>
       <w:pPr>
@@ -3614,11 +3704,11 @@
       <w:pPr>
         <w:pStyle w:val="Heading2"/>
       </w:pPr>
-      <w:bookmarkStart w:id="40" w:name="bk_memoria_final_31"/>
+      <w:bookmarkStart w:id="41" w:name="bk_memoria_final_32"/>
       <w:r>
         <w:t xml:space="preserve">Portal externo</w:t>
       </w:r>
-      <w:bookmarkEnd w:id="40"/>
+      <w:bookmarkEnd w:id="41"/>
     </w:p>
     <w:p>
       <w:pPr>
@@ -3632,11 +3722,11 @@
       <w:pPr>
         <w:pStyle w:val="Heading2"/>
       </w:pPr>
-      <w:bookmarkStart w:id="41" w:name="bk_memoria_final_32"/>
+      <w:bookmarkStart w:id="42" w:name="bk_memoria_final_33"/>
       <w:r>
         <w:t xml:space="preserve">Seguimientos y evaluacion final</w:t>
       </w:r>
-      <w:bookmarkEnd w:id="41"/>
+      <w:bookmarkEnd w:id="42"/>
     </w:p>
     <w:p>
       <w:pPr>
@@ -3650,11 +3740,11 @@
       <w:pPr>
         <w:pStyle w:val="Heading2"/>
       </w:pPr>
-      <w:bookmarkStart w:id="42" w:name="bk_memoria_final_33"/>
+      <w:bookmarkStart w:id="43" w:name="bk_memoria_final_34"/>
       <w:r>
         <w:t xml:space="preserve">Control documental y exportacion CSV</w:t>
       </w:r>
-      <w:bookmarkEnd w:id="42"/>
+      <w:bookmarkEnd w:id="43"/>
     </w:p>
     <w:p>
       <w:pPr>
@@ -3668,21 +3758,21 @@
       <w:pPr>
         <w:pStyle w:val="Heading1"/>
       </w:pPr>
-      <w:bookmarkStart w:id="43" w:name="bk_memoria_final_34"/>
+      <w:bookmarkStart w:id="44" w:name="bk_memoria_final_35"/>
       <w:r>
         <w:t xml:space="preserve">Despliegue y operacion</w:t>
       </w:r>
-      <w:bookmarkEnd w:id="43"/>
+      <w:bookmarkEnd w:id="44"/>
     </w:p>
     <w:p>
       <w:pPr>
         <w:pStyle w:val="Heading2"/>
       </w:pPr>
-      <w:bookmarkStart w:id="44" w:name="bk_memoria_final_35"/>
+      <w:bookmarkStart w:id="45" w:name="bk_memoria_final_36"/>
       <w:r>
         <w:t xml:space="preserve">Requisitos del entorno</w:t>
       </w:r>
-      <w:bookmarkEnd w:id="44"/>
+      <w:bookmarkEnd w:id="45"/>
     </w:p>
     <w:p>
       <w:pPr>
@@ -3696,11 +3786,11 @@
       <w:pPr>
         <w:pStyle w:val="Heading2"/>
       </w:pPr>
-      <w:bookmarkStart w:id="45" w:name="bk_memoria_final_36"/>
+      <w:bookmarkStart w:id="46" w:name="bk_memoria_final_37"/>
       <w:r>
         <w:t xml:space="preserve">Configuracion</w:t>
       </w:r>
-      <w:bookmarkEnd w:id="45"/>
+      <w:bookmarkEnd w:id="46"/>
     </w:p>
     <w:p>
       <w:pPr>
@@ -3722,11 +3812,11 @@
       <w:pPr>
         <w:pStyle w:val="Heading2"/>
       </w:pPr>
-      <w:bookmarkStart w:id="46" w:name="bk_memoria_final_37"/>
+      <w:bookmarkStart w:id="47" w:name="bk_memoria_final_38"/>
       <w:r>
         <w:t xml:space="preserve">Publicacion integrada</w:t>
       </w:r>
-      <w:bookmarkEnd w:id="46"/>
+      <w:bookmarkEnd w:id="47"/>
     </w:p>
     <w:p>
       <w:pPr>
@@ -3748,11 +3838,11 @@
       <w:pPr>
         <w:pStyle w:val="Heading2"/>
       </w:pPr>
-      <w:bookmarkStart w:id="47" w:name="bk_memoria_final_38"/>
+      <w:bookmarkStart w:id="48" w:name="bk_memoria_final_39"/>
       <w:r>
         <w:t xml:space="preserve">Acceso para evaluacion externa</w:t>
       </w:r>
-      <w:bookmarkEnd w:id="47"/>
+      <w:bookmarkEnd w:id="48"/>
     </w:p>
     <w:p>
       <w:pPr>
@@ -3814,11 +3904,11 @@
       <w:pPr>
         <w:pStyle w:val="Heading2"/>
       </w:pPr>
-      <w:bookmarkStart w:id="48" w:name="bk_memoria_final_39"/>
+      <w:bookmarkStart w:id="49" w:name="bk_memoria_final_40"/>
       <w:r>
         <w:t xml:space="preserve">Despliegue permanente previsto</w:t>
       </w:r>
-      <w:bookmarkEnd w:id="48"/>
+      <w:bookmarkEnd w:id="49"/>
     </w:p>
     <w:p>
       <w:pPr>
@@ -3840,21 +3930,21 @@
       <w:pPr>
         <w:pStyle w:val="Heading1"/>
       </w:pPr>
-      <w:bookmarkStart w:id="49" w:name="bk_memoria_final_40"/>
+      <w:bookmarkStart w:id="50" w:name="bk_memoria_final_41"/>
       <w:r>
         <w:t xml:space="preserve">Pruebas y validacion</w:t>
       </w:r>
-      <w:bookmarkEnd w:id="49"/>
+      <w:bookmarkEnd w:id="50"/>
     </w:p>
     <w:p>
       <w:pPr>
         <w:pStyle w:val="Heading2"/>
       </w:pPr>
-      <w:bookmarkStart w:id="50" w:name="bk_memoria_final_41"/>
+      <w:bookmarkStart w:id="51" w:name="bk_memoria_final_42"/>
       <w:r>
         <w:t xml:space="preserve">Validaciones ejecutadas</w:t>
       </w:r>
-      <w:bookmarkEnd w:id="50"/>
+      <w:bookmarkEnd w:id="51"/>
     </w:p>
     <w:p>
       <w:pPr>
@@ -3866,13 +3956,21 @@
     </w:p>
     <w:p>
       <w:pPr>
+        <w:pStyle w:val="Normal"/>
+      </w:pPr>
+      <w:r>
+        <w:t xml:space="preserve">En la ultima pasada completa, realizada el 27/05/2026, se han rehecho ademas comprobaciones especificas que eran sensibles para la defensa: carga de documentos PDF y Excel, descarga autenticada desde el portal interno, descarga autenticada desde el portal externo, refresco automatico de la bandeja y del chat, flujo completo de correo de verificacion y recuperacion tras reinicio de la VM publica con agora.service.</w:t>
+      </w:r>
+    </w:p>
+    <w:p>
+      <w:pPr>
         <w:pStyle w:val="Heading2"/>
       </w:pPr>
-      <w:bookmarkStart w:id="51" w:name="bk_memoria_final_42"/>
+      <w:bookmarkStart w:id="52" w:name="bk_memoria_final_43"/>
       <w:r>
         <w:t xml:space="preserve">Resultados observados</w:t>
       </w:r>
-      <w:bookmarkEnd w:id="51"/>
+      <w:bookmarkEnd w:id="52"/>
     </w:p>
     <w:p>
       <w:pPr>
@@ -3894,11 +3992,11 @@
       <w:pPr>
         <w:pStyle w:val="Heading2"/>
       </w:pPr>
-      <w:bookmarkStart w:id="52" w:name="bk_memoria_final_43"/>
+      <w:bookmarkStart w:id="53" w:name="bk_memoria_final_44"/>
       <w:r>
         <w:t xml:space="preserve">Rendimiento operativo</w:t>
       </w:r>
-      <w:bookmarkEnd w:id="52"/>
+      <w:bookmarkEnd w:id="53"/>
     </w:p>
     <w:p>
       <w:pPr>
@@ -3912,11 +4010,11 @@
       <w:pPr>
         <w:pStyle w:val="Heading2"/>
       </w:pPr>
-      <w:bookmarkStart w:id="53" w:name="bk_memoria_final_44"/>
+      <w:bookmarkStart w:id="54" w:name="bk_memoria_final_45"/>
       <w:r>
         <w:t xml:space="preserve">Revision comparativa y auditoria final</w:t>
       </w:r>
-      <w:bookmarkEnd w:id="53"/>
+      <w:bookmarkEnd w:id="54"/>
     </w:p>
     <w:p>
       <w:pPr>
@@ -4106,11 +4204,11 @@
       <w:pPr>
         <w:pStyle w:val="Heading2"/>
       </w:pPr>
-      <w:bookmarkStart w:id="54" w:name="bk_memoria_final_45"/>
+      <w:bookmarkStart w:id="55" w:name="bk_memoria_final_46"/>
       <w:r>
         <w:t xml:space="preserve">Estado tecnico de validacion</w:t>
       </w:r>
-      <w:bookmarkEnd w:id="54"/>
+      <w:bookmarkEnd w:id="55"/>
     </w:p>
     <w:p>
       <w:pPr>
@@ -4188,11 +4286,11 @@
       <w:pPr>
         <w:pStyle w:val="Heading2"/>
       </w:pPr>
-      <w:bookmarkStart w:id="55" w:name="bk_memoria_final_46"/>
+      <w:bookmarkStart w:id="56" w:name="bk_memoria_final_47"/>
       <w:r>
         <w:t xml:space="preserve">Limitaciones actuales</w:t>
       </w:r>
-      <w:bookmarkEnd w:id="55"/>
+      <w:bookmarkEnd w:id="56"/>
     </w:p>
     <w:p>
       <w:pPr>
@@ -4238,21 +4336,21 @@
       <w:pPr>
         <w:pStyle w:val="Heading1"/>
       </w:pPr>
-      <w:bookmarkStart w:id="56" w:name="bk_memoria_final_47"/>
+      <w:bookmarkStart w:id="57" w:name="bk_memoria_final_48"/>
       <w:r>
         <w:t xml:space="preserve">Resultados, limitaciones y lineas futuras</w:t>
       </w:r>
-      <w:bookmarkEnd w:id="56"/>
+      <w:bookmarkEnd w:id="57"/>
     </w:p>
     <w:p>
       <w:pPr>
         <w:pStyle w:val="Heading2"/>
       </w:pPr>
-      <w:bookmarkStart w:id="57" w:name="bk_memoria_final_48"/>
+      <w:bookmarkStart w:id="58" w:name="bk_memoria_final_49"/>
       <w:r>
         <w:t xml:space="preserve">Resultados principales</w:t>
       </w:r>
-      <w:bookmarkEnd w:id="57"/>
+      <w:bookmarkEnd w:id="58"/>
     </w:p>
     <w:p>
       <w:pPr>
@@ -4266,11 +4364,11 @@
       <w:pPr>
         <w:pStyle w:val="Heading3"/>
       </w:pPr>
-      <w:bookmarkStart w:id="58" w:name="bk_memoria_final_49"/>
+      <w:bookmarkStart w:id="59" w:name="bk_memoria_final_50"/>
       <w:r>
         <w:t xml:space="preserve">Funcionalidades cerradas en esta entrega</w:t>
       </w:r>
-      <w:bookmarkEnd w:id="58"/>
+      <w:bookmarkEnd w:id="59"/>
     </w:p>
     <w:p>
       <w:pPr>
@@ -4332,11 +4430,11 @@
       <w:pPr>
         <w:pStyle w:val="Heading3"/>
       </w:pPr>
-      <w:bookmarkStart w:id="59" w:name="bk_memoria_final_50"/>
+      <w:bookmarkStart w:id="60" w:name="bk_memoria_final_51"/>
       <w:r>
         <w:t xml:space="preserve">Mejoras futuras ya identificadas</w:t>
       </w:r>
-      <w:bookmarkEnd w:id="59"/>
+      <w:bookmarkEnd w:id="60"/>
     </w:p>
     <w:p>
       <w:pPr>
@@ -4374,11 +4472,11 @@
       <w:pPr>
         <w:pStyle w:val="Heading2"/>
       </w:pPr>
-      <w:bookmarkStart w:id="60" w:name="bk_memoria_final_51"/>
+      <w:bookmarkStart w:id="61" w:name="bk_memoria_final_52"/>
       <w:r>
         <w:t xml:space="preserve">Lineas futuras</w:t>
       </w:r>
-      <w:bookmarkEnd w:id="60"/>
+      <w:bookmarkEnd w:id="61"/>
     </w:p>
     <w:p>
       <w:pPr>
@@ -4448,11 +4546,11 @@
       <w:pPr>
         <w:pStyle w:val="Heading1"/>
       </w:pPr>
-      <w:bookmarkStart w:id="61" w:name="bk_memoria_final_52"/>
+      <w:bookmarkStart w:id="62" w:name="bk_memoria_final_53"/>
       <w:r>
         <w:t xml:space="preserve">Conclusiones</w:t>
       </w:r>
-      <w:bookmarkEnd w:id="61"/>
+      <w:bookmarkEnd w:id="62"/>
     </w:p>
     <w:p>
       <w:pPr>
@@ -4466,11 +4564,11 @@
       <w:pPr>
         <w:pStyle w:val="Heading1"/>
       </w:pPr>
-      <w:bookmarkStart w:id="62" w:name="bk_memoria_final_53"/>
+      <w:bookmarkStart w:id="63" w:name="bk_memoria_final_54"/>
       <w:r>
         <w:t xml:space="preserve">Referencias</w:t>
       </w:r>
-      <w:bookmarkEnd w:id="62"/>
+      <w:bookmarkEnd w:id="63"/>
     </w:p>
     <w:p>
       <w:pPr>
@@ -4548,21 +4646,21 @@
       <w:pPr>
         <w:pStyle w:val="Heading1"/>
       </w:pPr>
-      <w:bookmarkStart w:id="63" w:name="bk_memoria_final_54"/>
+      <w:bookmarkStart w:id="64" w:name="bk_memoria_final_55"/>
       <w:r>
         <w:t xml:space="preserve">Anexos</w:t>
       </w:r>
-      <w:bookmarkEnd w:id="63"/>
+      <w:bookmarkEnd w:id="64"/>
     </w:p>
     <w:p>
       <w:pPr>
         <w:pStyle w:val="Heading2"/>
       </w:pPr>
-      <w:bookmarkStart w:id="64" w:name="bk_memoria_final_55"/>
+      <w:bookmarkStart w:id="65" w:name="bk_memoria_final_56"/>
       <w:r>
         <w:t xml:space="preserve">Anexo A. Manual de usuario</w:t>
       </w:r>
-      <w:bookmarkEnd w:id="64"/>
+      <w:bookmarkEnd w:id="65"/>
     </w:p>
     <w:p>
       <w:pPr>
@@ -4576,11 +4674,11 @@
       <w:pPr>
         <w:pStyle w:val="Heading2"/>
       </w:pPr>
-      <w:bookmarkStart w:id="65" w:name="bk_memoria_final_56"/>
+      <w:bookmarkStart w:id="66" w:name="bk_memoria_final_57"/>
       <w:r>
         <w:t xml:space="preserve">Anexo B. Manual tecnico</w:t>
       </w:r>
-      <w:bookmarkEnd w:id="65"/>
+      <w:bookmarkEnd w:id="66"/>
     </w:p>
     <w:p>
       <w:pPr>
@@ -4594,11 +4692,11 @@
       <w:pPr>
         <w:pStyle w:val="Heading2"/>
       </w:pPr>
-      <w:bookmarkStart w:id="66" w:name="bk_memoria_final_57"/>
+      <w:bookmarkStart w:id="67" w:name="bk_memoria_final_58"/>
       <w:r>
         <w:t xml:space="preserve">Anexo C. Capturas y evidencias</w:t>
       </w:r>
-      <w:bookmarkEnd w:id="66"/>
+      <w:bookmarkEnd w:id="67"/>
     </w:p>
     <w:p>
       <w:pPr>
@@ -4612,11 +4710,11 @@
       <w:pPr>
         <w:pStyle w:val="Heading2"/>
       </w:pPr>
-      <w:bookmarkStart w:id="67" w:name="bk_memoria_final_58"/>
+      <w:bookmarkStart w:id="68" w:name="bk_memoria_final_59"/>
       <w:r>
         <w:t xml:space="preserve">Anexo D. Codigo relevante y artefactos de apoyo</w:t>
       </w:r>
-      <w:bookmarkEnd w:id="67"/>
+      <w:bookmarkEnd w:id="68"/>
     </w:p>
     <w:p>
       <w:pPr>
@@ -4659,21 +4757,21 @@
       <w:pPr>
         <w:pStyle w:val="Heading1"/>
       </w:pPr>
-      <w:bookmarkStart w:id="68" w:name="bk_anexo_a_manual_usu_1"/>
+      <w:bookmarkStart w:id="69" w:name="bk_anexo_a_manual_usu_1"/>
       <w:r>
         <w:t xml:space="preserve">Anexo A. Manual de Usuario</w:t>
       </w:r>
-      <w:bookmarkEnd w:id="68"/>
+      <w:bookmarkEnd w:id="69"/>
     </w:p>
     <w:p>
       <w:pPr>
         <w:pStyle w:val="Heading2"/>
       </w:pPr>
-      <w:bookmarkStart w:id="69" w:name="bk_anexo_a_manual_usu_2"/>
+      <w:bookmarkStart w:id="70" w:name="bk_anexo_a_manual_usu_2"/>
       <w:r>
         <w:t xml:space="preserve">1. Objetivo</w:t>
       </w:r>
-      <w:bookmarkEnd w:id="69"/>
+      <w:bookmarkEnd w:id="70"/>
     </w:p>
     <w:p>
       <w:pPr>
@@ -4687,11 +4785,11 @@
       <w:pPr>
         <w:pStyle w:val="Heading2"/>
       </w:pPr>
-      <w:bookmarkStart w:id="70" w:name="bk_anexo_a_manual_usu_3"/>
+      <w:bookmarkStart w:id="71" w:name="bk_anexo_a_manual_usu_3"/>
       <w:r>
         <w:t xml:space="preserve">2. Perfiles de uso</w:t>
       </w:r>
-      <w:bookmarkEnd w:id="70"/>
+      <w:bookmarkEnd w:id="71"/>
     </w:p>
     <w:p>
       <w:pPr>
@@ -4745,21 +4843,21 @@
       <w:pPr>
         <w:pStyle w:val="Heading2"/>
       </w:pPr>
-      <w:bookmarkStart w:id="71" w:name="bk_anexo_a_manual_usu_4"/>
+      <w:bookmarkStart w:id="72" w:name="bk_anexo_a_manual_usu_4"/>
       <w:r>
         <w:t xml:space="preserve">3. Acceso al sistema</w:t>
       </w:r>
-      <w:bookmarkEnd w:id="71"/>
+      <w:bookmarkEnd w:id="72"/>
     </w:p>
     <w:p>
       <w:pPr>
         <w:pStyle w:val="Heading3"/>
       </w:pPr>
-      <w:bookmarkStart w:id="72" w:name="bk_anexo_a_manual_usu_5"/>
+      <w:bookmarkStart w:id="73" w:name="bk_anexo_a_manual_usu_5"/>
       <w:r>
         <w:t xml:space="preserve">3.0 Acceso externo para evaluacion</w:t>
       </w:r>
-      <w:bookmarkEnd w:id="72"/>
+      <w:bookmarkEnd w:id="73"/>
     </w:p>
     <w:p>
       <w:pPr>
@@ -4813,18 +4911,26 @@
       <w:pPr>
         <w:pStyle w:val="Heading3"/>
       </w:pPr>
-      <w:bookmarkStart w:id="73" w:name="bk_anexo_a_manual_usu_6"/>
+      <w:bookmarkStart w:id="74" w:name="bk_anexo_a_manual_usu_6"/>
       <w:r>
         <w:t xml:space="preserve">3.1 Panel interno integrado</w:t>
       </w:r>
-      <w:bookmarkEnd w:id="73"/>
-    </w:p>
-    <w:p>
-      <w:pPr>
-        <w:pStyle w:val="List"/>
-      </w:pPr>
-      <w:r>
-        <w:t xml:space="preserve">- URL: http://127.0.0.1:8000/app</w:t>
+      <w:bookmarkEnd w:id="74"/>
+    </w:p>
+    <w:p>
+      <w:pPr>
+        <w:pStyle w:val="List"/>
+      </w:pPr>
+      <w:r>
+        <w:t xml:space="preserve">- URL cloud principal: https://agora.34.175.225.98.nip.io/app/</w:t>
+      </w:r>
+    </w:p>
+    <w:p>
+      <w:pPr>
+        <w:pStyle w:val="List"/>
+      </w:pPr>
+      <w:r>
+        <w:t xml:space="preserve">- URL local de respaldo: http://127.0.0.1:8000/app</w:t>
       </w:r>
     </w:p>
     <w:p>
@@ -4847,18 +4953,26 @@
       <w:pPr>
         <w:pStyle w:val="Heading3"/>
       </w:pPr>
-      <w:bookmarkStart w:id="74" w:name="bk_anexo_a_manual_usu_7"/>
+      <w:bookmarkStart w:id="75" w:name="bk_anexo_a_manual_usu_7"/>
       <w:r>
         <w:t xml:space="preserve">3.2 Documentacion publica</w:t>
       </w:r>
-      <w:bookmarkEnd w:id="74"/>
-    </w:p>
-    <w:p>
-      <w:pPr>
-        <w:pStyle w:val="List"/>
-      </w:pPr>
-      <w:r>
-        <w:t xml:space="preserve">- URL: http://127.0.0.1:8000/documentacion</w:t>
+      <w:bookmarkEnd w:id="75"/>
+    </w:p>
+    <w:p>
+      <w:pPr>
+        <w:pStyle w:val="List"/>
+      </w:pPr>
+      <w:r>
+        <w:t xml:space="preserve">- URL cloud principal: https://agora.34.175.225.98.nip.io/documentacion</w:t>
+      </w:r>
+    </w:p>
+    <w:p>
+      <w:pPr>
+        <w:pStyle w:val="List"/>
+      </w:pPr>
+      <w:r>
+        <w:t xml:space="preserve">- URL local de respaldo: http://127.0.0.1:8000/documentacion</w:t>
       </w:r>
     </w:p>
     <w:p>
@@ -4873,11 +4987,11 @@
       <w:pPr>
         <w:pStyle w:val="Heading3"/>
       </w:pPr>
-      <w:bookmarkStart w:id="75" w:name="bk_anexo_a_manual_usu_8"/>
+      <w:bookmarkStart w:id="76" w:name="bk_anexo_a_manual_usu_8"/>
       <w:r>
         <w:t xml:space="preserve">3.3 Supervision tecnica con Agora Desktop</w:t>
       </w:r>
-      <w:bookmarkEnd w:id="75"/>
+      <w:bookmarkEnd w:id="76"/>
     </w:p>
     <w:p>
       <w:pPr>
@@ -4907,18 +5021,26 @@
       <w:pPr>
         <w:pStyle w:val="Heading3"/>
       </w:pPr>
-      <w:bookmarkStart w:id="76" w:name="bk_anexo_a_manual_usu_9"/>
+      <w:bookmarkStart w:id="77" w:name="bk_anexo_a_manual_usu_9"/>
       <w:r>
         <w:t xml:space="preserve">3.4 Portal externo</w:t>
       </w:r>
-      <w:bookmarkEnd w:id="76"/>
-    </w:p>
-    <w:p>
-      <w:pPr>
-        <w:pStyle w:val="List"/>
-      </w:pPr>
-      <w:r>
-        <w:t xml:space="preserve">- URL: http://127.0.0.1:8000/externo</w:t>
+      <w:bookmarkEnd w:id="77"/>
+    </w:p>
+    <w:p>
+      <w:pPr>
+        <w:pStyle w:val="List"/>
+      </w:pPr>
+      <w:r>
+        <w:t xml:space="preserve">- URL cloud principal: https://agora.34.175.225.98.nip.io/externo/</w:t>
+      </w:r>
+    </w:p>
+    <w:p>
+      <w:pPr>
+        <w:pStyle w:val="List"/>
+      </w:pPr>
+      <w:r>
+        <w:t xml:space="preserve">- URL local de respaldo: http://127.0.0.1:8000/externo</w:t>
       </w:r>
     </w:p>
     <w:p>
@@ -4941,11 +5063,11 @@
       <w:pPr>
         <w:pStyle w:val="Heading3"/>
       </w:pPr>
-      <w:bookmarkStart w:id="77" w:name="bk_anexo_a_manual_usu_10"/>
+      <w:bookmarkStart w:id="78" w:name="bk_anexo_a_manual_usu_10"/>
       <w:r>
         <w:t xml:space="preserve">3.5 Agora Desktop</w:t>
       </w:r>
-      <w:bookmarkEnd w:id="77"/>
+      <w:bookmarkEnd w:id="78"/>
     </w:p>
     <w:p>
       <w:pPr>
@@ -4975,11 +5097,11 @@
       <w:pPr>
         <w:pStyle w:val="Heading2"/>
       </w:pPr>
-      <w:bookmarkStart w:id="78" w:name="bk_anexo_a_manual_usu_11"/>
+      <w:bookmarkStart w:id="79" w:name="bk_anexo_a_manual_usu_11"/>
       <w:r>
         <w:t xml:space="preserve">4. Navegacion principal del panel interno</w:t>
       </w:r>
-      <w:bookmarkEnd w:id="78"/>
+      <w:bookmarkEnd w:id="79"/>
     </w:p>
     <w:p>
       <w:pPr>
@@ -5065,11 +5187,11 @@
       <w:pPr>
         <w:pStyle w:val="Heading2"/>
       </w:pPr>
-      <w:bookmarkStart w:id="79" w:name="bk_anexo_a_manual_usu_12"/>
+      <w:bookmarkStart w:id="80" w:name="bk_anexo_a_manual_usu_12"/>
       <w:r>
         <w:t xml:space="preserve">5. Dashboard</w:t>
       </w:r>
-      <w:bookmarkEnd w:id="79"/>
+      <w:bookmarkEnd w:id="80"/>
     </w:p>
     <w:p>
       <w:pPr>
@@ -5123,11 +5245,11 @@
       <w:pPr>
         <w:pStyle w:val="Heading2"/>
       </w:pPr>
-      <w:bookmarkStart w:id="80" w:name="bk_anexo_a_manual_usu_13"/>
+      <w:bookmarkStart w:id="81" w:name="bk_anexo_a_manual_usu_13"/>
       <w:r>
         <w:t xml:space="preserve">6. Gestion de empresas</w:t>
       </w:r>
-      <w:bookmarkEnd w:id="80"/>
+      <w:bookmarkEnd w:id="81"/>
     </w:p>
     <w:p>
       <w:pPr>
@@ -5221,11 +5343,11 @@
       <w:pPr>
         <w:pStyle w:val="Heading2"/>
       </w:pPr>
-      <w:bookmarkStart w:id="81" w:name="bk_anexo_a_manual_usu_14"/>
+      <w:bookmarkStart w:id="82" w:name="bk_anexo_a_manual_usu_14"/>
       <w:r>
         <w:t xml:space="preserve">7. Gestion de convenios</w:t>
       </w:r>
-      <w:bookmarkEnd w:id="81"/>
+      <w:bookmarkEnd w:id="82"/>
     </w:p>
     <w:p>
       <w:pPr>
@@ -5295,11 +5417,11 @@
       <w:pPr>
         <w:pStyle w:val="Heading2"/>
       </w:pPr>
-      <w:bookmarkStart w:id="82" w:name="bk_anexo_a_manual_usu_15"/>
+      <w:bookmarkStart w:id="83" w:name="bk_anexo_a_manual_usu_15"/>
       <w:r>
         <w:t xml:space="preserve">8. Gestion de estudiantes</w:t>
       </w:r>
-      <w:bookmarkEnd w:id="82"/>
+      <w:bookmarkEnd w:id="83"/>
     </w:p>
     <w:p>
       <w:pPr>
@@ -5353,11 +5475,11 @@
       <w:pPr>
         <w:pStyle w:val="Heading2"/>
       </w:pPr>
-      <w:bookmarkStart w:id="83" w:name="bk_anexo_a_manual_usu_16"/>
+      <w:bookmarkStart w:id="84" w:name="bk_anexo_a_manual_usu_16"/>
       <w:r>
         <w:t xml:space="preserve">9. Gestion de asignaciones, seguimientos y evaluacion final</w:t>
       </w:r>
-      <w:bookmarkEnd w:id="83"/>
+      <w:bookmarkEnd w:id="84"/>
     </w:p>
     <w:p>
       <w:pPr>
@@ -5451,11 +5573,11 @@
       <w:pPr>
         <w:pStyle w:val="Heading2"/>
       </w:pPr>
-      <w:bookmarkStart w:id="84" w:name="bk_anexo_a_manual_usu_17"/>
+      <w:bookmarkStart w:id="85" w:name="bk_anexo_a_manual_usu_17"/>
       <w:r>
         <w:t xml:space="preserve">10. Gestion de tutores</w:t>
       </w:r>
-      <w:bookmarkEnd w:id="84"/>
+      <w:bookmarkEnd w:id="85"/>
     </w:p>
     <w:p>
       <w:pPr>
@@ -5501,11 +5623,11 @@
       <w:pPr>
         <w:pStyle w:val="Heading2"/>
       </w:pPr>
-      <w:bookmarkStart w:id="85" w:name="bk_anexo_a_manual_usu_18"/>
+      <w:bookmarkStart w:id="86" w:name="bk_anexo_a_manual_usu_18"/>
       <w:r>
         <w:t xml:space="preserve">11. Solicitudes y bandeja de mensajes</w:t>
       </w:r>
-      <w:bookmarkEnd w:id="85"/>
+      <w:bookmarkEnd w:id="86"/>
     </w:p>
     <w:p>
       <w:pPr>
@@ -5599,11 +5721,11 @@
       <w:pPr>
         <w:pStyle w:val="Heading2"/>
       </w:pPr>
-      <w:bookmarkStart w:id="86" w:name="bk_anexo_a_manual_usu_19"/>
+      <w:bookmarkStart w:id="87" w:name="bk_anexo_a_manual_usu_19"/>
       <w:r>
         <w:t xml:space="preserve">12. Agora Desktop</w:t>
       </w:r>
-      <w:bookmarkEnd w:id="86"/>
+      <w:bookmarkEnd w:id="87"/>
     </w:p>
     <w:p>
       <w:pPr>
@@ -5681,11 +5803,11 @@
       <w:pPr>
         <w:pStyle w:val="Heading2"/>
       </w:pPr>
-      <w:bookmarkStart w:id="87" w:name="bk_anexo_a_manual_usu_20"/>
+      <w:bookmarkStart w:id="88" w:name="bk_anexo_a_manual_usu_20"/>
       <w:r>
         <w:t xml:space="preserve">13. Portal externo</w:t>
       </w:r>
-      <w:bookmarkEnd w:id="87"/>
+      <w:bookmarkEnd w:id="88"/>
     </w:p>
     <w:p>
       <w:pPr>
@@ -5755,11 +5877,11 @@
       <w:pPr>
         <w:pStyle w:val="Heading2"/>
       </w:pPr>
-      <w:bookmarkStart w:id="88" w:name="bk_anexo_a_manual_usu_21"/>
+      <w:bookmarkStart w:id="89" w:name="bk_anexo_a_manual_usu_21"/>
       <w:r>
         <w:t xml:space="preserve">14. Errores y validaciones comunes</w:t>
       </w:r>
-      <w:bookmarkEnd w:id="88"/>
+      <w:bookmarkEnd w:id="89"/>
     </w:p>
     <w:p>
       <w:pPr>
@@ -5805,11 +5927,11 @@
       <w:pPr>
         <w:pStyle w:val="Heading2"/>
       </w:pPr>
-      <w:bookmarkStart w:id="89" w:name="bk_anexo_a_manual_usu_22"/>
+      <w:bookmarkStart w:id="90" w:name="bk_anexo_a_manual_usu_22"/>
       <w:r>
         <w:t xml:space="preserve">15. Recomendaciones de uso</w:t>
       </w:r>
-      <w:bookmarkEnd w:id="89"/>
+      <w:bookmarkEnd w:id="90"/>
     </w:p>
     <w:p>
       <w:pPr>
@@ -5852,21 +5974,21 @@
       <w:pPr>
         <w:pStyle w:val="Heading1"/>
       </w:pPr>
-      <w:bookmarkStart w:id="90" w:name="bk_anexo_b_manual_tec_1"/>
+      <w:bookmarkStart w:id="91" w:name="bk_anexo_b_manual_tec_1"/>
       <w:r>
         <w:t xml:space="preserve">Anexo B. Manual Tecnico</w:t>
       </w:r>
-      <w:bookmarkEnd w:id="90"/>
+      <w:bookmarkEnd w:id="91"/>
     </w:p>
     <w:p>
       <w:pPr>
         <w:pStyle w:val="Heading2"/>
       </w:pPr>
-      <w:bookmarkStart w:id="91" w:name="bk_anexo_b_manual_tec_2"/>
+      <w:bookmarkStart w:id="92" w:name="bk_anexo_b_manual_tec_2"/>
       <w:r>
         <w:t xml:space="preserve">1. Arquitectura general</w:t>
       </w:r>
-      <w:bookmarkEnd w:id="91"/>
+      <w:bookmarkEnd w:id="92"/>
     </w:p>
     <w:p>
       <w:pPr>
@@ -5928,21 +6050,21 @@
       <w:pPr>
         <w:pStyle w:val="Heading2"/>
       </w:pPr>
-      <w:bookmarkStart w:id="92" w:name="bk_anexo_b_manual_tec_3"/>
+      <w:bookmarkStart w:id="93" w:name="bk_anexo_b_manual_tec_3"/>
       <w:r>
         <w:t xml:space="preserve">2. Requisitos locales</w:t>
       </w:r>
-      <w:bookmarkEnd w:id="92"/>
+      <w:bookmarkEnd w:id="93"/>
     </w:p>
     <w:p>
       <w:pPr>
         <w:pStyle w:val="Heading3"/>
       </w:pPr>
-      <w:bookmarkStart w:id="93" w:name="bk_anexo_b_manual_tec_4"/>
+      <w:bookmarkStart w:id="94" w:name="bk_anexo_b_manual_tec_4"/>
       <w:r>
         <w:t xml:space="preserve">2.1 Desarrollo desde repositorio</w:t>
       </w:r>
-      <w:bookmarkEnd w:id="93"/>
+      <w:bookmarkEnd w:id="94"/>
     </w:p>
     <w:p>
       <w:pPr>
@@ -5996,11 +6118,11 @@
       <w:pPr>
         <w:pStyle w:val="Heading3"/>
       </w:pPr>
-      <w:bookmarkStart w:id="94" w:name="bk_anexo_b_manual_tec_5"/>
+      <w:bookmarkStart w:id="95" w:name="bk_anexo_b_manual_tec_5"/>
       <w:r>
         <w:t xml:space="preserve">2.2 Ejecucion empaquetada</w:t>
       </w:r>
-      <w:bookmarkEnd w:id="94"/>
+      <w:bookmarkEnd w:id="95"/>
     </w:p>
     <w:p>
       <w:pPr>
@@ -6014,11 +6136,11 @@
       <w:pPr>
         <w:pStyle w:val="Heading2"/>
       </w:pPr>
-      <w:bookmarkStart w:id="95" w:name="bk_anexo_b_manual_tec_6"/>
+      <w:bookmarkStart w:id="96" w:name="bk_anexo_b_manual_tec_6"/>
       <w:r>
         <w:t xml:space="preserve">3. Arranque del entorno</w:t>
       </w:r>
-      <w:bookmarkEnd w:id="95"/>
+      <w:bookmarkEnd w:id="96"/>
     </w:p>
     <w:p>
       <w:pPr>
@@ -6032,11 +6154,11 @@
       <w:pPr>
         <w:pStyle w:val="Heading3"/>
       </w:pPr>
-      <w:bookmarkStart w:id="96" w:name="bk_anexo_b_manual_tec_7"/>
+      <w:bookmarkStart w:id="97" w:name="bk_anexo_b_manual_tec_7"/>
       <w:r>
         <w:t xml:space="preserve">3.1 Backend</w:t>
       </w:r>
-      <w:bookmarkEnd w:id="96"/>
+      <w:bookmarkEnd w:id="97"/>
     </w:p>
     <w:p>
       <w:pPr>
@@ -6090,11 +6212,11 @@
       <w:pPr>
         <w:pStyle w:val="Heading3"/>
       </w:pPr>
-      <w:bookmarkStart w:id="97" w:name="bk_anexo_b_manual_tec_8"/>
+      <w:bookmarkStart w:id="98" w:name="bk_anexo_b_manual_tec_8"/>
       <w:r>
         <w:t xml:space="preserve">3.2 Frontend interno en desarrollo</w:t>
       </w:r>
-      <w:bookmarkEnd w:id="97"/>
+      <w:bookmarkEnd w:id="98"/>
     </w:p>
     <w:p>
       <w:pPr>
@@ -6132,11 +6254,11 @@
       <w:pPr>
         <w:pStyle w:val="Heading3"/>
       </w:pPr>
-      <w:bookmarkStart w:id="98" w:name="bk_anexo_b_manual_tec_9"/>
+      <w:bookmarkStart w:id="99" w:name="bk_anexo_b_manual_tec_9"/>
       <w:r>
         <w:t xml:space="preserve">3.3 Portal externo en desarrollo</w:t>
       </w:r>
-      <w:bookmarkEnd w:id="98"/>
+      <w:bookmarkEnd w:id="99"/>
     </w:p>
     <w:p>
       <w:pPr>
@@ -6174,11 +6296,11 @@
       <w:pPr>
         <w:pStyle w:val="Heading3"/>
       </w:pPr>
-      <w:bookmarkStart w:id="99" w:name="bk_anexo_b_manual_tec_10"/>
+      <w:bookmarkStart w:id="100" w:name="bk_anexo_b_manual_tec_10"/>
       <w:r>
         <w:t xml:space="preserve">3.4 Build integrada</w:t>
       </w:r>
-      <w:bookmarkEnd w:id="99"/>
+      <w:bookmarkEnd w:id="100"/>
     </w:p>
     <w:p>
       <w:pPr>
@@ -6264,11 +6386,11 @@
       <w:pPr>
         <w:pStyle w:val="Heading3"/>
       </w:pPr>
-      <w:bookmarkStart w:id="100" w:name="bk_anexo_b_manual_tec_11"/>
+      <w:bookmarkStart w:id="101" w:name="bk_anexo_b_manual_tec_11"/>
       <w:r>
         <w:t xml:space="preserve">3.5 Prueba remota sin instalacion local</w:t>
       </w:r>
-      <w:bookmarkEnd w:id="100"/>
+      <w:bookmarkEnd w:id="101"/>
     </w:p>
     <w:p>
       <w:pPr>
@@ -6290,11 +6412,11 @@
       <w:pPr>
         <w:pStyle w:val="Heading3"/>
       </w:pPr>
-      <w:bookmarkStart w:id="101" w:name="bk_anexo_b_manual_tec_12"/>
+      <w:bookmarkStart w:id="102" w:name="bk_anexo_b_manual_tec_12"/>
       <w:r>
         <w:t xml:space="preserve">3.6 App de escritorio empaquetada</w:t>
       </w:r>
-      <w:bookmarkEnd w:id="101"/>
+      <w:bookmarkEnd w:id="102"/>
     </w:p>
     <w:p>
       <w:pPr>
@@ -6396,21 +6518,21 @@
       <w:pPr>
         <w:pStyle w:val="Heading2"/>
       </w:pPr>
-      <w:bookmarkStart w:id="102" w:name="bk_anexo_b_manual_tec_13"/>
+      <w:bookmarkStart w:id="103" w:name="bk_anexo_b_manual_tec_13"/>
       <w:r>
         <w:t xml:space="preserve">4. Variables de entorno relevantes</w:t>
       </w:r>
-      <w:bookmarkEnd w:id="102"/>
+      <w:bookmarkEnd w:id="103"/>
     </w:p>
     <w:p>
       <w:pPr>
         <w:pStyle w:val="Heading3"/>
       </w:pPr>
-      <w:bookmarkStart w:id="103" w:name="bk_anexo_b_manual_tec_14"/>
+      <w:bookmarkStart w:id="104" w:name="bk_anexo_b_manual_tec_14"/>
       <w:r>
         <w:t xml:space="preserve">4.1 Backend</w:t>
       </w:r>
-      <w:bookmarkEnd w:id="103"/>
+      <w:bookmarkEnd w:id="104"/>
     </w:p>
     <w:p>
       <w:pPr>
@@ -6512,11 +6634,11 @@
       <w:pPr>
         <w:pStyle w:val="Heading3"/>
       </w:pPr>
-      <w:bookmarkStart w:id="104" w:name="bk_anexo_b_manual_tec_15"/>
+      <w:bookmarkStart w:id="105" w:name="bk_anexo_b_manual_tec_15"/>
       <w:r>
         <w:t xml:space="preserve">4.2 Frontend interno</w:t>
       </w:r>
-      <w:bookmarkEnd w:id="104"/>
+      <w:bookmarkEnd w:id="105"/>
     </w:p>
     <w:p>
       <w:pPr>
@@ -6546,11 +6668,11 @@
       <w:pPr>
         <w:pStyle w:val="Heading3"/>
       </w:pPr>
-      <w:bookmarkStart w:id="105" w:name="bk_anexo_b_manual_tec_16"/>
+      <w:bookmarkStart w:id="106" w:name="bk_anexo_b_manual_tec_16"/>
       <w:r>
         <w:t xml:space="preserve">4.3 Portal externo</w:t>
       </w:r>
-      <w:bookmarkEnd w:id="105"/>
+      <w:bookmarkEnd w:id="106"/>
     </w:p>
     <w:p>
       <w:pPr>
@@ -6564,11 +6686,11 @@
       <w:pPr>
         <w:pStyle w:val="Heading2"/>
       </w:pPr>
-      <w:bookmarkStart w:id="106" w:name="bk_anexo_b_manual_tec_17"/>
+      <w:bookmarkStart w:id="107" w:name="bk_anexo_b_manual_tec_17"/>
       <w:r>
         <w:t xml:space="preserve">5. Seguridad</w:t>
       </w:r>
-      <w:bookmarkEnd w:id="106"/>
+      <w:bookmarkEnd w:id="107"/>
     </w:p>
     <w:p>
       <w:pPr>
@@ -6630,11 +6752,11 @@
       <w:pPr>
         <w:pStyle w:val="Heading3"/>
       </w:pPr>
-      <w:bookmarkStart w:id="107" w:name="bk_anexo_b_manual_tec_18"/>
+      <w:bookmarkStart w:id="108" w:name="bk_anexo_b_manual_tec_18"/>
       <w:r>
         <w:t xml:space="preserve">5.1 Jerarquia de roles interna</w:t>
       </w:r>
-      <w:bookmarkEnd w:id="107"/>
+      <w:bookmarkEnd w:id="108"/>
     </w:p>
     <w:p>
       <w:pPr>
@@ -6696,11 +6818,11 @@
       <w:pPr>
         <w:pStyle w:val="Heading3"/>
       </w:pPr>
-      <w:bookmarkStart w:id="108" w:name="bk_anexo_b_manual_tec_19"/>
+      <w:bookmarkStart w:id="109" w:name="bk_anexo_b_manual_tec_19"/>
       <w:r>
         <w:t xml:space="preserve">5.2 Rol externo</w:t>
       </w:r>
-      <w:bookmarkEnd w:id="108"/>
+      <w:bookmarkEnd w:id="109"/>
     </w:p>
     <w:p>
       <w:pPr>
@@ -6714,11 +6836,11 @@
       <w:pPr>
         <w:pStyle w:val="Heading2"/>
       </w:pPr>
-      <w:bookmarkStart w:id="109" w:name="bk_anexo_b_manual_tec_20"/>
+      <w:bookmarkStart w:id="110" w:name="bk_anexo_b_manual_tec_20"/>
       <w:r>
         <w:t xml:space="preserve">6. Persistencia</w:t>
       </w:r>
-      <w:bookmarkEnd w:id="109"/>
+      <w:bookmarkEnd w:id="110"/>
     </w:p>
     <w:p>
       <w:pPr>
@@ -6764,11 +6886,11 @@
       <w:pPr>
         <w:pStyle w:val="Heading2"/>
       </w:pPr>
-      <w:bookmarkStart w:id="110" w:name="bk_anexo_b_manual_tec_21"/>
+      <w:bookmarkStart w:id="111" w:name="bk_anexo_b_manual_tec_21"/>
       <w:r>
         <w:t xml:space="preserve">7. Correo saliente</w:t>
       </w:r>
-      <w:bookmarkEnd w:id="110"/>
+      <w:bookmarkEnd w:id="111"/>
     </w:p>
     <w:p>
       <w:pPr>
@@ -6814,11 +6936,11 @@
       <w:pPr>
         <w:pStyle w:val="Heading2"/>
       </w:pPr>
-      <w:bookmarkStart w:id="111" w:name="bk_anexo_b_manual_tec_22"/>
+      <w:bookmarkStart w:id="112" w:name="bk_anexo_b_manual_tec_22"/>
       <w:r>
         <w:t xml:space="preserve">8. Control documental</w:t>
       </w:r>
-      <w:bookmarkEnd w:id="111"/>
+      <w:bookmarkEnd w:id="112"/>
     </w:p>
     <w:p>
       <w:pPr>
@@ -6880,11 +7002,11 @@
       <w:pPr>
         <w:pStyle w:val="Heading2"/>
       </w:pPr>
-      <w:bookmarkStart w:id="112" w:name="bk_anexo_b_manual_tec_23"/>
+      <w:bookmarkStart w:id="113" w:name="bk_anexo_b_manual_tec_23"/>
       <w:r>
         <w:t xml:space="preserve">9. Estructura funcional del backend</w:t>
       </w:r>
-      <w:bookmarkEnd w:id="112"/>
+      <w:bookmarkEnd w:id="113"/>
     </w:p>
     <w:p>
       <w:pPr>
@@ -7058,11 +7180,11 @@
       <w:pPr>
         <w:pStyle w:val="Heading2"/>
       </w:pPr>
-      <w:bookmarkStart w:id="113" w:name="bk_anexo_b_manual_tec_24"/>
+      <w:bookmarkStart w:id="114" w:name="bk_anexo_b_manual_tec_24"/>
       <w:r>
         <w:t xml:space="preserve">10. Estructura funcional del frontend interno</w:t>
       </w:r>
-      <w:bookmarkEnd w:id="113"/>
+      <w:bookmarkEnd w:id="114"/>
     </w:p>
     <w:p>
       <w:pPr>
@@ -7140,11 +7262,11 @@
       <w:pPr>
         <w:pStyle w:val="Heading2"/>
       </w:pPr>
-      <w:bookmarkStart w:id="114" w:name="bk_anexo_b_manual_tec_25"/>
+      <w:bookmarkStart w:id="115" w:name="bk_anexo_b_manual_tec_25"/>
       <w:r>
         <w:t xml:space="preserve">11. Estructura funcional del portal externo</w:t>
       </w:r>
-      <w:bookmarkEnd w:id="114"/>
+      <w:bookmarkEnd w:id="115"/>
     </w:p>
     <w:p>
       <w:pPr>
@@ -7270,11 +7392,11 @@
       <w:pPr>
         <w:pStyle w:val="Heading2"/>
       </w:pPr>
-      <w:bookmarkStart w:id="115" w:name="bk_anexo_b_manual_tec_26"/>
+      <w:bookmarkStart w:id="116" w:name="bk_anexo_b_manual_tec_26"/>
       <w:r>
         <w:t xml:space="preserve">12. App de escritorio</w:t>
       </w:r>
-      <w:bookmarkEnd w:id="115"/>
+      <w:bookmarkEnd w:id="116"/>
     </w:p>
     <w:p>
       <w:pPr>
@@ -7424,11 +7546,11 @@
       <w:pPr>
         <w:pStyle w:val="Heading2"/>
       </w:pPr>
-      <w:bookmarkStart w:id="116" w:name="bk_anexo_b_manual_tec_27"/>
+      <w:bookmarkStart w:id="117" w:name="bk_anexo_b_manual_tec_27"/>
       <w:r>
         <w:t xml:space="preserve">13. Exportacion CSV</w:t>
       </w:r>
-      <w:bookmarkEnd w:id="116"/>
+      <w:bookmarkEnd w:id="117"/>
     </w:p>
     <w:p>
       <w:pPr>
@@ -7522,11 +7644,11 @@
       <w:pPr>
         <w:pStyle w:val="Heading2"/>
       </w:pPr>
-      <w:bookmarkStart w:id="117" w:name="bk_anexo_b_manual_tec_28"/>
+      <w:bookmarkStart w:id="118" w:name="bk_anexo_b_manual_tec_28"/>
       <w:r>
         <w:t xml:space="preserve">14. Validacion tecnica</w:t>
       </w:r>
-      <w:bookmarkEnd w:id="117"/>
+      <w:bookmarkEnd w:id="118"/>
     </w:p>
     <w:p>
       <w:pPr>
@@ -7604,11 +7726,11 @@
       <w:pPr>
         <w:pStyle w:val="Heading2"/>
       </w:pPr>
-      <w:bookmarkStart w:id="118" w:name="bk_anexo_b_manual_tec_29"/>
+      <w:bookmarkStart w:id="119" w:name="bk_anexo_b_manual_tec_29"/>
       <w:r>
         <w:t xml:space="preserve">15. Riesgos tecnicos abiertos</w:t>
       </w:r>
-      <w:bookmarkEnd w:id="118"/>
+      <w:bookmarkEnd w:id="119"/>
     </w:p>
     <w:p>
       <w:pPr>
@@ -7651,21 +7773,21 @@
       <w:pPr>
         <w:pStyle w:val="Heading1"/>
       </w:pPr>
-      <w:bookmarkStart w:id="119" w:name="bk_anexo_c_capturas_y_1"/>
+      <w:bookmarkStart w:id="120" w:name="bk_anexo_c_capturas_y_1"/>
       <w:r>
         <w:t xml:space="preserve">Anexo C. Capturas y evidencias</w:t>
       </w:r>
-      <w:bookmarkEnd w:id="119"/>
+      <w:bookmarkEnd w:id="120"/>
     </w:p>
     <w:p>
       <w:pPr>
         <w:pStyle w:val="Heading2"/>
       </w:pPr>
-      <w:bookmarkStart w:id="120" w:name="bk_anexo_c_capturas_y_2"/>
+      <w:bookmarkStart w:id="121" w:name="bk_anexo_c_capturas_y_2"/>
       <w:r>
         <w:t xml:space="preserve">Indice de capturas</w:t>
       </w:r>
-      <w:bookmarkEnd w:id="120"/>
+      <w:bookmarkEnd w:id="121"/>
     </w:p>
     <w:p>
       <w:pPr>
@@ -7743,11 +7865,11 @@
       <w:pPr>
         <w:pStyle w:val="Heading2"/>
       </w:pPr>
-      <w:bookmarkStart w:id="121" w:name="bk_anexo_c_capturas_y_3"/>
+      <w:bookmarkStart w:id="122" w:name="bk_anexo_c_capturas_y_3"/>
       <w:r>
         <w:t xml:space="preserve">Inventario de archivos incluidos</w:t>
       </w:r>
-      <w:bookmarkEnd w:id="121"/>
+      <w:bookmarkEnd w:id="122"/>
     </w:p>
     <w:p>
       <w:pPr>
@@ -7825,11 +7947,11 @@
       <w:pPr>
         <w:pStyle w:val="Heading2"/>
       </w:pPr>
-      <w:bookmarkStart w:id="122" w:name="bk_anexo_c_capturas_y_4"/>
+      <w:bookmarkStart w:id="123" w:name="bk_anexo_c_capturas_y_4"/>
       <w:r>
         <w:t xml:space="preserve">Evidencias tecnicas asociadas</w:t>
       </w:r>
-      <w:bookmarkEnd w:id="122"/>
+      <w:bookmarkEnd w:id="123"/>
     </w:p>
     <w:p>
       <w:pPr>
@@ -7892,6 +8014,14 @@
         <w:pStyle w:val="List"/>
       </w:pPr>
       <w:r>
+        <w:t xml:space="preserve">- comprobacion de carga, vista previa y descarga autenticada de documentos en los dos portales;</w:t>
+      </w:r>
+    </w:p>
+    <w:p>
+      <w:pPr>
+        <w:pStyle w:val="List"/>
+      </w:pPr>
+      <w:r>
         <w:t xml:space="preserve">- comprobacion del control MFA y del acceso publico temporal desde Agora Desktop;</w:t>
       </w:r>
     </w:p>
@@ -7907,11 +8037,11 @@
       <w:pPr>
         <w:pStyle w:val="Heading2"/>
       </w:pPr>
-      <w:bookmarkStart w:id="123" w:name="bk_anexo_c_capturas_y_5"/>
+      <w:bookmarkStart w:id="124" w:name="bk_anexo_c_capturas_y_5"/>
       <w:r>
         <w:t xml:space="preserve">Criterios de captura final</w:t>
       </w:r>
-      <w:bookmarkEnd w:id="123"/>
+      <w:bookmarkEnd w:id="124"/>
     </w:p>
     <w:p>
       <w:pPr>
@@ -7970,31 +8100,31 @@
       <w:pPr>
         <w:pStyle w:val="Heading1"/>
       </w:pPr>
-      <w:bookmarkStart w:id="124" w:name="bk_anexo_d_codigo_rel_1"/>
+      <w:bookmarkStart w:id="125" w:name="bk_anexo_d_codigo_rel_1"/>
       <w:r>
         <w:t xml:space="preserve">Anexo D. Codigo Relevante</w:t>
       </w:r>
-      <w:bookmarkEnd w:id="124"/>
+      <w:bookmarkEnd w:id="125"/>
     </w:p>
     <w:p>
       <w:pPr>
         <w:pStyle w:val="Heading2"/>
       </w:pPr>
-      <w:bookmarkStart w:id="125" w:name="bk_anexo_d_codigo_rel_2"/>
+      <w:bookmarkStart w:id="126" w:name="bk_anexo_d_codigo_rel_2"/>
       <w:r>
         <w:t xml:space="preserve">1. Backend</w:t>
       </w:r>
-      <w:bookmarkEnd w:id="125"/>
+      <w:bookmarkEnd w:id="126"/>
     </w:p>
     <w:p>
       <w:pPr>
         <w:pStyle w:val="Heading3"/>
       </w:pPr>
-      <w:bookmarkStart w:id="126" w:name="bk_anexo_d_codigo_rel_3"/>
+      <w:bookmarkStart w:id="127" w:name="bk_anexo_d_codigo_rel_3"/>
       <w:r>
         <w:t xml:space="preserve">Seguridad y autenticacion</w:t>
       </w:r>
-      <w:bookmarkEnd w:id="126"/>
+      <w:bookmarkEnd w:id="127"/>
     </w:p>
     <w:p>
       <w:pPr>
@@ -8024,11 +8154,11 @@
       <w:pPr>
         <w:pStyle w:val="Heading3"/>
       </w:pPr>
-      <w:bookmarkStart w:id="127" w:name="bk_anexo_d_codigo_rel_4"/>
+      <w:bookmarkStart w:id="128" w:name="bk_anexo_d_codigo_rel_4"/>
       <w:r>
         <w:t xml:space="preserve">Dominio y persistencia</w:t>
       </w:r>
-      <w:bookmarkEnd w:id="127"/>
+      <w:bookmarkEnd w:id="128"/>
     </w:p>
     <w:p>
       <w:pPr>
@@ -8090,11 +8220,11 @@
       <w:pPr>
         <w:pStyle w:val="Heading3"/>
       </w:pPr>
-      <w:bookmarkStart w:id="128" w:name="bk_anexo_d_codigo_rel_5"/>
+      <w:bookmarkStart w:id="129" w:name="bk_anexo_d_codigo_rel_5"/>
       <w:r>
         <w:t xml:space="preserve">Casos de uso principales</w:t>
       </w:r>
-      <w:bookmarkEnd w:id="128"/>
+      <w:bookmarkEnd w:id="129"/>
     </w:p>
     <w:p>
       <w:pPr>
@@ -8148,21 +8278,21 @@
       <w:pPr>
         <w:pStyle w:val="Heading2"/>
       </w:pPr>
-      <w:bookmarkStart w:id="129" w:name="bk_anexo_d_codigo_rel_6"/>
+      <w:bookmarkStart w:id="130" w:name="bk_anexo_d_codigo_rel_6"/>
       <w:r>
         <w:t xml:space="preserve">2. Frontend interno</w:t>
       </w:r>
-      <w:bookmarkEnd w:id="129"/>
+      <w:bookmarkEnd w:id="130"/>
     </w:p>
     <w:p>
       <w:pPr>
         <w:pStyle w:val="Heading3"/>
       </w:pPr>
-      <w:bookmarkStart w:id="130" w:name="bk_anexo_d_codigo_rel_7"/>
+      <w:bookmarkStart w:id="131" w:name="bk_anexo_d_codigo_rel_7"/>
       <w:r>
         <w:t xml:space="preserve">Shell principal y modulos</w:t>
       </w:r>
-      <w:bookmarkEnd w:id="130"/>
+      <w:bookmarkEnd w:id="131"/>
     </w:p>
     <w:p>
       <w:pPr>
@@ -8176,11 +8306,11 @@
       <w:pPr>
         <w:pStyle w:val="Heading3"/>
       </w:pPr>
-      <w:bookmarkStart w:id="131" w:name="bk_anexo_d_codigo_rel_8"/>
+      <w:bookmarkStart w:id="132" w:name="bk_anexo_d_codigo_rel_8"/>
       <w:r>
         <w:t xml:space="preserve">Formularios reutilizables</w:t>
       </w:r>
-      <w:bookmarkEnd w:id="131"/>
+      <w:bookmarkEnd w:id="132"/>
     </w:p>
     <w:p>
       <w:pPr>
@@ -8218,11 +8348,11 @@
       <w:pPr>
         <w:pStyle w:val="Heading3"/>
       </w:pPr>
-      <w:bookmarkStart w:id="132" w:name="bk_anexo_d_codigo_rel_9"/>
+      <w:bookmarkStart w:id="133" w:name="bk_anexo_d_codigo_rel_9"/>
       <w:r>
         <w:t xml:space="preserve">Infraestructura de UI</w:t>
       </w:r>
-      <w:bookmarkEnd w:id="132"/>
+      <w:bookmarkEnd w:id="133"/>
     </w:p>
     <w:p>
       <w:pPr>
@@ -8252,11 +8382,11 @@
       <w:pPr>
         <w:pStyle w:val="Heading3"/>
       </w:pPr>
-      <w:bookmarkStart w:id="133" w:name="bk_anexo_d_codigo_rel_10"/>
+      <w:bookmarkStart w:id="134" w:name="bk_anexo_d_codigo_rel_10"/>
       <w:r>
         <w:t xml:space="preserve">Cliente API y exportacion</w:t>
       </w:r>
-      <w:bookmarkEnd w:id="133"/>
+      <w:bookmarkEnd w:id="134"/>
     </w:p>
     <w:p>
       <w:pPr>
@@ -8278,11 +8408,11 @@
       <w:pPr>
         <w:pStyle w:val="Heading2"/>
       </w:pPr>
-      <w:bookmarkStart w:id="134" w:name="bk_anexo_d_codigo_rel_11"/>
+      <w:bookmarkStart w:id="135" w:name="bk_anexo_d_codigo_rel_11"/>
       <w:r>
         <w:t xml:space="preserve">3. Frontend externo</w:t>
       </w:r>
-      <w:bookmarkEnd w:id="134"/>
+      <w:bookmarkEnd w:id="135"/>
     </w:p>
     <w:p>
       <w:pPr>
@@ -8296,11 +8426,11 @@
       <w:pPr>
         <w:pStyle w:val="Heading2"/>
       </w:pPr>
-      <w:bookmarkStart w:id="135" w:name="bk_anexo_d_codigo_rel_12"/>
+      <w:bookmarkStart w:id="136" w:name="bk_anexo_d_codigo_rel_12"/>
       <w:r>
         <w:t xml:space="preserve">4. Suite de pruebas destacada</w:t>
       </w:r>
-      <w:bookmarkEnd w:id="135"/>
+      <w:bookmarkEnd w:id="136"/>
     </w:p>
     <w:p>
       <w:pPr>
@@ -8354,11 +8484,11 @@
       <w:pPr>
         <w:pStyle w:val="Heading2"/>
       </w:pPr>
-      <w:bookmarkStart w:id="136" w:name="bk_anexo_d_codigo_rel_13"/>
+      <w:bookmarkStart w:id="137" w:name="bk_anexo_d_codigo_rel_13"/>
       <w:r>
         <w:t xml:space="preserve">5. Criterio de seleccion</w:t>
       </w:r>
-      <w:bookmarkEnd w:id="136"/>
+      <w:bookmarkEnd w:id="137"/>
     </w:p>
     <w:p>
       <w:pPr>

</xml_diff>

<commit_message>
Clarify managed storage scope in defense docs
</commit_message>
<xml_diff>
--- a/docs/memoria-final.docx
+++ b/docs/memoria-final.docx
@@ -10,8 +10,8 @@
   <dc:title>Memoria final TFG</dc:title>
   <dc:creator>Luis Angel</dc:creator>
   <cp:lastModifiedBy>Codex</cp:lastModifiedBy>
-  <dcterms:created xsi:type="dcterms:W3CDTF">2026-05-27T16:54:31.952Z</dcterms:created>
-  <dcterms:modified xsi:type="dcterms:W3CDTF">2026-05-27T16:54:31.952Z</dcterms:modified>
+  <dcterms:created xsi:type="dcterms:W3CDTF">2026-06-01T19:06:30.381Z</dcterms:created>
+  <dcterms:modified xsi:type="dcterms:W3CDTF">2026-06-01T19:06:30.381Z</dcterms:modified>
 </cp:coreProperties>
 </file>
 
@@ -1772,7 +1772,7 @@
         <w:pStyle w:val="Normal"/>
       </w:pPr>
       <w:r>
-        <w:t xml:space="preserve">Dentro del alcance actual se incluyen el portal interno, el portal externo, la API REST, la persistencia relacional, la autenticacion interna, el preregistro externo de cuentas de empresa, la verificacion por correo, la aprobacion interna, la mensajeria empresa-centro, la bandeja unificada, el seguimiento con evidencias, la evaluacion final, el control documental versionado, la exportacion CSV, una app de escritorio para operacion tecnica en local o en cloud, y un despliegue funcional en Google Cloud Compute Engine con Docker Compose, PostgreSQL, proxy HTTPS y correo transaccional operativo. El flujo local con MFA para acceso publico temporal sigue existiendo dentro de Agora Desktop, pero ya no hay una pagina web de monitorizacion separada en el recorrido funcional. Quedan fuera de alcance, en esta entrega, la firma electronica avanzada, las integraciones corporativas con ERP o directorios institucionales, el almacenamiento documental en nube gestionada, un cliente de escritorio completo para toda la operativa funcional del negocio y una instrumentacion avanzada de produccion con alta disponibilidad.</w:t>
+        <w:t xml:space="preserve">Dentro del alcance actual se incluyen el portal interno, el portal externo, la API REST, la persistencia relacional, la autenticacion interna, el preregistro externo de cuentas de empresa, la verificacion por correo, la aprobacion interna, la mensajeria empresa-centro, la bandeja unificada, el seguimiento con evidencias, la evaluacion final, el control documental versionado, la exportacion CSV, una app de escritorio para operacion tecnica en local o en cloud, y un despliegue funcional en Google Cloud Compute Engine con Docker Compose, PostgreSQL, proxy HTTPS, volumen persistente para documentos y correo transaccional operativo. El flujo local con MFA para acceso publico temporal sigue existiendo dentro de Agora Desktop, pero ya no hay una pagina web de monitorizacion separada en el recorrido funcional. Quedan fuera de alcance, en esta entrega, la firma electronica avanzada, las integraciones corporativas con ERP o directorios institucionales, la migracion del almacenamiento documental a un servicio cloud gestionado independiente de la propia VM, un cliente de escritorio completo para toda la operativa funcional del negocio y una instrumentacion avanzada de produccion con alta disponibilidad.</w:t>
       </w:r>
     </w:p>
     <w:p>

</xml_diff>

<commit_message>
Finalize defense docs and launcher assets
</commit_message>
<xml_diff>
--- a/docs/memoria-final.docx
+++ b/docs/memoria-final.docx
@@ -10,8 +10,8 @@
   <dc:title>Memoria final TFG</dc:title>
   <dc:creator>Luis Angel</dc:creator>
   <cp:lastModifiedBy>Codex</cp:lastModifiedBy>
-  <dcterms:created xsi:type="dcterms:W3CDTF">2026-06-01T19:06:30.381Z</dcterms:created>
-  <dcterms:modified xsi:type="dcterms:W3CDTF">2026-06-01T19:06:30.381Z</dcterms:modified>
+  <dcterms:created xsi:type="dcterms:W3CDTF">2026-06-01T20:42:57.811Z</dcterms:created>
+  <dcterms:modified xsi:type="dcterms:W3CDTF">2026-06-01T20:42:57.811Z</dcterms:modified>
 </cp:coreProperties>
 </file>
 
@@ -2371,7 +2371,7 @@
         <w:pStyle w:val="List"/>
       </w:pPr>
       <w:r>
-        <w:t xml:space="preserve">- PHPUnit, Vitest y Playwright porque cubren tres niveles distintos de validacion: logica de backend, comportamiento unitario del frontend y flujos criticos integrados sobre navegador.</w:t>
+        <w:t xml:space="preserve">- PHPUnit, el runner nativo node:test y Playwright porque cubren tres niveles distintos de validacion: logica de backend, comportamiento unitario del frontend y flujos criticos integrados sobre navegador.</w:t>
       </w:r>
     </w:p>
     <w:p>
@@ -4231,7 +4231,7 @@
         <w:pStyle w:val="List"/>
       </w:pPr>
       <w:r>
-        <w:t xml:space="preserve">- npm test -- --run en frontend/app;</w:t>
+        <w:t xml:space="preserve">- npm test en frontend/app;</w:t>
       </w:r>
     </w:p>
     <w:p>
@@ -4864,7 +4864,7 @@
         <w:pStyle w:val="Normal"/>
       </w:pPr>
       <w:r>
-        <w:t xml:space="preserve">Durante la evaluacion, si el alumno mantiene activa la VM publica, la profesora no necesita descargar ni instalar dependencias del proyecto. Se le puede facilitar una URL publica como https://agora.34.175.225.98.nip.io/, y sobre esa misma direccion abrir:</w:t>
+        <w:t xml:space="preserve">Durante la evaluacion, si el alumno mantiene activa la VM publica, la profesora no necesita descargar ni instalar dependencias del proyecto. Se le facilita la URL cloud efectiva que muestre Agora Desktop y, sobre esa misma direccion, abrir:</w:t>
       </w:r>
     </w:p>
     <w:p>
@@ -4922,7 +4922,7 @@
         <w:pStyle w:val="List"/>
       </w:pPr>
       <w:r>
-        <w:t xml:space="preserve">- URL cloud principal: https://agora.34.175.225.98.nip.io/app/</w:t>
+        <w:t xml:space="preserve">- URL cloud principal: URL cloud efectiva + /app/</w:t>
       </w:r>
     </w:p>
     <w:p>
@@ -4964,7 +4964,7 @@
         <w:pStyle w:val="List"/>
       </w:pPr>
       <w:r>
-        <w:t xml:space="preserve">- URL cloud principal: https://agora.34.175.225.98.nip.io/documentacion</w:t>
+        <w:t xml:space="preserve">- URL cloud principal: URL cloud efectiva + /documentacion</w:t>
       </w:r>
     </w:p>
     <w:p>
@@ -5032,7 +5032,7 @@
         <w:pStyle w:val="List"/>
       </w:pPr>
       <w:r>
-        <w:t xml:space="preserve">- URL cloud principal: https://agora.34.175.225.98.nip.io/externo/</w:t>
+        <w:t xml:space="preserve">- URL cloud principal: URL cloud efectiva + /externo/</w:t>
       </w:r>
     </w:p>
     <w:p>
@@ -6205,7 +6205,7 @@
         <w:pStyle w:val="Code"/>
       </w:pPr>
       <w:r>
-        <w:t xml:space="preserve">symfony server:start --no-tls -d --port=8000</w:t>
+        <w:t xml:space="preserve">start-server.bat</w:t>
       </w:r>
     </w:p>
     <w:p>
@@ -6397,7 +6397,7 @@
         <w:pStyle w:val="Normal"/>
       </w:pPr>
       <w:r>
-        <w:t xml:space="preserve">Para una revision externa rapida, la persona evaluadora no tiene que instalar el entorno si la VM publica esta activa. La ruta usada en la revision final es una VM Ubuntu de Google Cloud Compute Engine publicada por HTTPS y resuelta con un hostname wildcard nip.io, por ejemplo https://agora.34.175.225.98.nip.io/. Desde esa direccion se accede a URL/app/, URL/externo/ o URL/documentacion/. La supervision tecnica se realiza desde Agora Desktop.</w:t>
+        <w:t xml:space="preserve">Para una revision externa rapida, la persona evaluadora no tiene que instalar el entorno si la VM publica esta activa. La ruta usada en la revision final es una VM Ubuntu de Google Cloud Compute Engine publicada por HTTPS y resuelta con un hostname wildcard nip.io. Como la IP publica puede cambiar al reiniciar la VM, la referencia buena es la URL cloud efectiva que muestra Agora Desktop. Desde esa direccion se accede a URL/app/, URL/externo/ o URL/documentacion/. La supervision tecnica se realiza desde Agora Desktop.</w:t>
       </w:r>
     </w:p>
     <w:p>
@@ -7687,7 +7687,7 @@
         <w:pStyle w:val="Code"/>
       </w:pPr>
       <w:r>
-        <w:t xml:space="preserve">npm test -- --run</w:t>
+        <w:t xml:space="preserve">npm test</w:t>
       </w:r>
     </w:p>
     <w:p>

</xml_diff>